<commit_message>
Abstraccción de la función de dibujar la extracción de keypoints para optimizar la salida del flujo de trabajo, y facilitar el debug
</commit_message>
<xml_diff>
--- a/docs/Planning.docx
+++ b/docs/Planning.docx
@@ -283,6 +283,7 @@
           <w:lang w:val="es-ES"/>
         </w:rPr>
       </w:pPr>
+      <w:proofErr w:type="spellStart"/>
       <w:r>
         <w:rPr>
           <w:lang w:val="es-ES"/>
@@ -290,6 +291,7 @@
         <w:lastRenderedPageBreak/>
         <w:t>Sprints</w:t>
       </w:r>
+      <w:proofErr w:type="spellEnd"/>
     </w:p>
     <w:p>
       <w:pPr>
@@ -327,33 +329,89 @@
         <w:rPr>
           <w:lang w:val="es-ES"/>
         </w:rPr>
-        <w:t>--&gt; Primero de todo he instalado el framework de Android studio, y he iniciado un proyecto de 0.</w:t>
-      </w:r>
-    </w:p>
-    <w:p>
-      <w:pPr>
-        <w:rPr>
-          <w:lang w:val="es-ES"/>
-        </w:rPr>
-      </w:pPr>
-      <w:r>
-        <w:rPr>
-          <w:lang w:val="es-ES"/>
-        </w:rPr>
-        <w:t>--&gt; Posteriormente he creado un repositorio en gitlab para tener un control de versiones.</w:t>
-      </w:r>
-    </w:p>
-    <w:p>
-      <w:pPr>
-        <w:rPr>
-          <w:lang w:val="es-ES"/>
-        </w:rPr>
-      </w:pPr>
-      <w:r>
-        <w:rPr>
-          <w:lang w:val="es-ES"/>
-        </w:rPr>
-        <w:t>--&gt; He trasteado un poco en el framework y he ido programando la aplicación, primero poder hacer fotos y videos y luego poder adjuntar cosas de la galería.</w:t>
+        <w:t xml:space="preserve">--&gt; Primero de todo he instalado el </w:t>
+      </w:r>
+      <w:proofErr w:type="spellStart"/>
+      <w:r>
+        <w:rPr>
+          <w:lang w:val="es-ES"/>
+        </w:rPr>
+        <w:t>framework</w:t>
+      </w:r>
+      <w:proofErr w:type="spellEnd"/>
+      <w:r>
+        <w:rPr>
+          <w:lang w:val="es-ES"/>
+        </w:rPr>
+        <w:t xml:space="preserve"> de Android </w:t>
+      </w:r>
+      <w:proofErr w:type="spellStart"/>
+      <w:r>
+        <w:rPr>
+          <w:lang w:val="es-ES"/>
+        </w:rPr>
+        <w:t>studio</w:t>
+      </w:r>
+      <w:proofErr w:type="spellEnd"/>
+      <w:r>
+        <w:rPr>
+          <w:lang w:val="es-ES"/>
+        </w:rPr>
+        <w:t>, y he iniciado un proyecto de 0.</w:t>
+      </w:r>
+    </w:p>
+    <w:p>
+      <w:pPr>
+        <w:rPr>
+          <w:lang w:val="es-ES"/>
+        </w:rPr>
+      </w:pPr>
+      <w:r>
+        <w:rPr>
+          <w:lang w:val="es-ES"/>
+        </w:rPr>
+        <w:t xml:space="preserve">--&gt; Posteriormente he creado un repositorio en </w:t>
+      </w:r>
+      <w:proofErr w:type="spellStart"/>
+      <w:r>
+        <w:rPr>
+          <w:lang w:val="es-ES"/>
+        </w:rPr>
+        <w:t>gitlab</w:t>
+      </w:r>
+      <w:proofErr w:type="spellEnd"/>
+      <w:r>
+        <w:rPr>
+          <w:lang w:val="es-ES"/>
+        </w:rPr>
+        <w:t xml:space="preserve"> para tener un control de versiones.</w:t>
+      </w:r>
+    </w:p>
+    <w:p>
+      <w:pPr>
+        <w:rPr>
+          <w:lang w:val="es-ES"/>
+        </w:rPr>
+      </w:pPr>
+      <w:r>
+        <w:rPr>
+          <w:lang w:val="es-ES"/>
+        </w:rPr>
+        <w:t xml:space="preserve">--&gt; He trasteado un poco en el </w:t>
+      </w:r>
+      <w:proofErr w:type="spellStart"/>
+      <w:r>
+        <w:rPr>
+          <w:lang w:val="es-ES"/>
+        </w:rPr>
+        <w:t>framework</w:t>
+      </w:r>
+      <w:proofErr w:type="spellEnd"/>
+      <w:r>
+        <w:rPr>
+          <w:lang w:val="es-ES"/>
+        </w:rPr>
+        <w:t xml:space="preserve"> y he ido programando la aplicación, primero poder hacer fotos y videos y luego poder adjuntar cosas de la galería.</w:t>
       </w:r>
     </w:p>
     <w:p>
@@ -379,7 +437,21 @@
         <w:rPr>
           <w:lang w:val="es-ES"/>
         </w:rPr>
-        <w:t>--&gt; la opción de poder cambiar la foto o video subido asi de enviarla al servidor.</w:t>
+        <w:t xml:space="preserve">--&gt; la opción de poder cambiar la foto o video subido </w:t>
+      </w:r>
+      <w:proofErr w:type="spellStart"/>
+      <w:r>
+        <w:rPr>
+          <w:lang w:val="es-ES"/>
+        </w:rPr>
+        <w:t>asi</w:t>
+      </w:r>
+      <w:proofErr w:type="spellEnd"/>
+      <w:r>
+        <w:rPr>
+          <w:lang w:val="es-ES"/>
+        </w:rPr>
+        <w:t xml:space="preserve"> de enviarla al servidor.</w:t>
       </w:r>
     </w:p>
     <w:p>
@@ -431,7 +503,21 @@
         <w:rPr>
           <w:lang w:val="es-ES"/>
         </w:rPr>
-        <w:t>Además, mirar alguna alternativa a openpose.</w:t>
+        <w:t xml:space="preserve">Además, mirar alguna alternativa a </w:t>
+      </w:r>
+      <w:proofErr w:type="spellStart"/>
+      <w:r>
+        <w:rPr>
+          <w:lang w:val="es-ES"/>
+        </w:rPr>
+        <w:t>openpose</w:t>
+      </w:r>
+      <w:proofErr w:type="spellEnd"/>
+      <w:r>
+        <w:rPr>
+          <w:lang w:val="es-ES"/>
+        </w:rPr>
+        <w:t>.</w:t>
       </w:r>
     </w:p>
     <w:p>
@@ -483,20 +569,132 @@
         <w:rPr>
           <w:lang w:val="es-ES"/>
         </w:rPr>
-        <w:t xml:space="preserve">En primer lugar trabajaremos con el análisis de imágenes intentando conseguir los keypoints del cuerpo humano a través de mediapipe. Para ello requiere un análisis he investigación propia, tanto de la propia docimentacion como de repositorios de github los cuales ya han usado esta técnica. </w:t>
-      </w:r>
-    </w:p>
-    <w:p>
-      <w:pPr>
-        <w:rPr>
-          <w:lang w:val="es-ES"/>
-        </w:rPr>
-      </w:pPr>
-      <w:r>
-        <w:rPr>
-          <w:lang w:val="es-ES"/>
-        </w:rPr>
-        <w:t>Una vez obtenido los 33 keypoints intentamos calcular los ángulos de las articulaciones mas importantes del cuerpo como rodilla, codo ,… Una vez obtenidos estos ángulos me doy cuenta de los siguientes problemas:</w:t>
+        <w:t xml:space="preserve">En primer </w:t>
+      </w:r>
+      <w:proofErr w:type="gramStart"/>
+      <w:r>
+        <w:rPr>
+          <w:lang w:val="es-ES"/>
+        </w:rPr>
+        <w:t>lugar</w:t>
+      </w:r>
+      <w:proofErr w:type="gramEnd"/>
+      <w:r>
+        <w:rPr>
+          <w:lang w:val="es-ES"/>
+        </w:rPr>
+        <w:t xml:space="preserve"> trabajaremos con el análisis de imágenes intentando conseguir los </w:t>
+      </w:r>
+      <w:proofErr w:type="spellStart"/>
+      <w:r>
+        <w:rPr>
+          <w:lang w:val="es-ES"/>
+        </w:rPr>
+        <w:t>keypoints</w:t>
+      </w:r>
+      <w:proofErr w:type="spellEnd"/>
+      <w:r>
+        <w:rPr>
+          <w:lang w:val="es-ES"/>
+        </w:rPr>
+        <w:t xml:space="preserve"> del cuerpo humano a través de </w:t>
+      </w:r>
+      <w:proofErr w:type="spellStart"/>
+      <w:r>
+        <w:rPr>
+          <w:lang w:val="es-ES"/>
+        </w:rPr>
+        <w:t>mediapipe</w:t>
+      </w:r>
+      <w:proofErr w:type="spellEnd"/>
+      <w:r>
+        <w:rPr>
+          <w:lang w:val="es-ES"/>
+        </w:rPr>
+        <w:t xml:space="preserve">. Para ello requiere un análisis </w:t>
+      </w:r>
+      <w:proofErr w:type="spellStart"/>
+      <w:r>
+        <w:rPr>
+          <w:lang w:val="es-ES"/>
+        </w:rPr>
+        <w:t>he</w:t>
+      </w:r>
+      <w:proofErr w:type="spellEnd"/>
+      <w:r>
+        <w:rPr>
+          <w:lang w:val="es-ES"/>
+        </w:rPr>
+        <w:t xml:space="preserve"> investigación propia, tanto de la propia </w:t>
+      </w:r>
+      <w:proofErr w:type="spellStart"/>
+      <w:r>
+        <w:rPr>
+          <w:lang w:val="es-ES"/>
+        </w:rPr>
+        <w:t>docimentacion</w:t>
+      </w:r>
+      <w:proofErr w:type="spellEnd"/>
+      <w:r>
+        <w:rPr>
+          <w:lang w:val="es-ES"/>
+        </w:rPr>
+        <w:t xml:space="preserve"> como de repositorios de </w:t>
+      </w:r>
+      <w:proofErr w:type="spellStart"/>
+      <w:r>
+        <w:rPr>
+          <w:lang w:val="es-ES"/>
+        </w:rPr>
+        <w:t>github</w:t>
+      </w:r>
+      <w:proofErr w:type="spellEnd"/>
+      <w:r>
+        <w:rPr>
+          <w:lang w:val="es-ES"/>
+        </w:rPr>
+        <w:t xml:space="preserve"> los cuales ya han usado esta técnica. </w:t>
+      </w:r>
+    </w:p>
+    <w:p>
+      <w:pPr>
+        <w:rPr>
+          <w:lang w:val="es-ES"/>
+        </w:rPr>
+      </w:pPr>
+      <w:r>
+        <w:rPr>
+          <w:lang w:val="es-ES"/>
+        </w:rPr>
+        <w:t xml:space="preserve">Una vez obtenido los 33 </w:t>
+      </w:r>
+      <w:proofErr w:type="spellStart"/>
+      <w:r>
+        <w:rPr>
+          <w:lang w:val="es-ES"/>
+        </w:rPr>
+        <w:t>keypoints</w:t>
+      </w:r>
+      <w:proofErr w:type="spellEnd"/>
+      <w:r>
+        <w:rPr>
+          <w:lang w:val="es-ES"/>
+        </w:rPr>
+        <w:t xml:space="preserve"> intentamos calcular los ángulos de las articulaciones </w:t>
+      </w:r>
+      <w:proofErr w:type="spellStart"/>
+      <w:r>
+        <w:rPr>
+          <w:lang w:val="es-ES"/>
+        </w:rPr>
+        <w:t>mas</w:t>
+      </w:r>
+      <w:proofErr w:type="spellEnd"/>
+      <w:r>
+        <w:rPr>
+          <w:lang w:val="es-ES"/>
+        </w:rPr>
+        <w:t xml:space="preserve"> importantes del cuerpo como rodilla, codo ,… Una vez obtenidos estos ángulos me doy cuenta de los siguientes problemas:</w:t>
       </w:r>
     </w:p>
     <w:p>
@@ -532,7 +730,35 @@
         <w:rPr>
           <w:lang w:val="es-ES"/>
         </w:rPr>
-        <w:t>Hay veces que medipipe, aporta ciertos valores con poca fiabilidad (la cual el propio mediapipe te indica a través de un parámetro de fiabilidad), al calcular los ángulos con parámetros poco fiables hay muchos errores, la solución propuesta, es la técnica del espejo, ya que la mayoría de valores poco fiables es debido al perfil de la cámara y la sola obtención de un perfil del usuario.</w:t>
+        <w:t xml:space="preserve">Hay veces que </w:t>
+      </w:r>
+      <w:proofErr w:type="spellStart"/>
+      <w:r>
+        <w:rPr>
+          <w:lang w:val="es-ES"/>
+        </w:rPr>
+        <w:t>medipipe</w:t>
+      </w:r>
+      <w:proofErr w:type="spellEnd"/>
+      <w:r>
+        <w:rPr>
+          <w:lang w:val="es-ES"/>
+        </w:rPr>
+        <w:t xml:space="preserve">, aporta ciertos valores con poca fiabilidad (la cual el propio </w:t>
+      </w:r>
+      <w:proofErr w:type="spellStart"/>
+      <w:r>
+        <w:rPr>
+          <w:lang w:val="es-ES"/>
+        </w:rPr>
+        <w:t>mediapipe</w:t>
+      </w:r>
+      <w:proofErr w:type="spellEnd"/>
+      <w:r>
+        <w:rPr>
+          <w:lang w:val="es-ES"/>
+        </w:rPr>
+        <w:t xml:space="preserve"> te indica a través de un parámetro de fiabilidad), al calcular los ángulos con parámetros poco fiables hay muchos errores, la solución propuesta, es la técnica del espejo, ya que la mayoría de valores poco fiables es debido al perfil de la cámara y la sola obtención de un perfil del usuario.</w:t>
       </w:r>
     </w:p>
     <w:p>
@@ -572,46 +798,385 @@
           <w:lang w:val="es-ES"/>
         </w:rPr>
         <w:lastRenderedPageBreak/>
-        <w:t>Antes de todo he decidido conversar con un experto en la materia (graduado den CACYFD) para que me aconseje sobre el trabajo que estoy realizando con respecto a al biomecanica y demás. Me ha sugerido añadir el calculo del centro de sustentación, el cual tiene una serie de ventajas y hace que se pueda profesionalizar el análisis del ejercicio.</w:t>
-      </w:r>
-    </w:p>
-    <w:p>
-      <w:pPr>
-        <w:rPr>
-          <w:lang w:val="es-ES"/>
-        </w:rPr>
-      </w:pPr>
-      <w:r>
-        <w:rPr>
-          <w:lang w:val="es-ES"/>
-        </w:rPr>
-        <w:t>Una vez que tenemos un archivo con todos los ángulos del cuerpo la idea es entrenar a una red neuronal para conseguir que obtenga ciertas conclusiones de los ángulos. Para ello hay que investigar sobre que red es la más adecuada para nuestro caso, y trazar un plan de entrenamiento o fine tunning (a poder ser).</w:t>
-      </w:r>
-    </w:p>
-    <w:p>
-      <w:pPr>
-        <w:rPr>
-          <w:lang w:val="es-ES"/>
-        </w:rPr>
-      </w:pPr>
-      <w:r>
-        <w:rPr>
-          <w:lang w:val="es-ES"/>
-        </w:rPr>
-        <w:t>Han surgido ciertos problemas a la hora de revisar el trabajo realizado y analizar el csv. Además, hablar con el experto en biomecanica me ha llevado a hacer algunos cambios en el código y en la forma de entender el proceso. En cuanto a software he decidido actualizar el código y las dependencias a la versión más nueva de medipipe, ya que ha salido recientemente y he visto que tiene bastantes mejoras, el inconveniente es que me ha tocado cambiar el código. Otro aspecto es en la forma de analizar los datos, mediapipe da un valor junto con cada keypoint de confianza, he decidido filtrar los keypoints por una confianza (variable y en pruebas), para asegurar tener una serie de datos más fiables, dejando espacios vacíos en el conjunto de datos si no se capturan bien en lugar de hacer la técnica del espejo o simplemente valores poco fiables. En cuanto a la técnica del espejo he estado investigando debido al consejo del experto, ya que hemos llegado a la conclusión de que la simetría es un aspecto importante a la hora de analizar un ejercicio y al hacer la técnica del espejo si una parte del cuerpo no se ve estamos asumiendo una simetría inventada que puede dar lugar a errores.</w:t>
-      </w:r>
-    </w:p>
-    <w:p>
-      <w:pPr>
-        <w:rPr>
-          <w:lang w:val="es-ES"/>
-        </w:rPr>
-      </w:pPr>
-      <w:r>
-        <w:rPr>
-          <w:lang w:val="es-ES"/>
-        </w:rPr>
-        <w:t>Al hablar con la tutora después de investigar un poco sobre el ML y como funciona en la parte práctica, nos hemos dado cuenta que es muy difícil entrenar una red neuronal que consiga generalizar y ofrecer técnicas correctas para todos los ejercicios. Por lo que hemos obtado por seguir une esquema híbrido en el que nuestra propia red neuronal sacará unos ciertos parámetros para analizar SOLO el movimiento de sentadilla, mientras que para analizar los demás movimientos la idea ahora es subir el archivo con los ángulos y el punto de sustentación (el cual también hemos añadido gracias al experto) y que una IA externa ya entrenada nos analice el ejercicio para poder otorgar una respuesta al usuario sea el ejercicio que sea.</w:t>
+        <w:t xml:space="preserve">Antes de todo he decidido conversar con un experto en la materia (graduado den CACYFD) para que me aconseje sobre el trabajo que estoy realizando con respecto a </w:t>
+      </w:r>
+      <w:proofErr w:type="spellStart"/>
+      <w:r>
+        <w:rPr>
+          <w:lang w:val="es-ES"/>
+        </w:rPr>
+        <w:t>al</w:t>
+      </w:r>
+      <w:proofErr w:type="spellEnd"/>
+      <w:r>
+        <w:rPr>
+          <w:lang w:val="es-ES"/>
+        </w:rPr>
+        <w:t xml:space="preserve"> </w:t>
+      </w:r>
+      <w:proofErr w:type="spellStart"/>
+      <w:r>
+        <w:rPr>
+          <w:lang w:val="es-ES"/>
+        </w:rPr>
+        <w:t>biomecanica</w:t>
+      </w:r>
+      <w:proofErr w:type="spellEnd"/>
+      <w:r>
+        <w:rPr>
+          <w:lang w:val="es-ES"/>
+        </w:rPr>
+        <w:t xml:space="preserve"> y demás. Me ha sugerido añadir el </w:t>
+      </w:r>
+      <w:proofErr w:type="spellStart"/>
+      <w:r>
+        <w:rPr>
+          <w:lang w:val="es-ES"/>
+        </w:rPr>
+        <w:t>calculo</w:t>
+      </w:r>
+      <w:proofErr w:type="spellEnd"/>
+      <w:r>
+        <w:rPr>
+          <w:lang w:val="es-ES"/>
+        </w:rPr>
+        <w:t xml:space="preserve"> del centro de sustentación, el cual tiene una serie de ventajas y hace que se pueda profesionalizar el análisis del ejercicio.</w:t>
+      </w:r>
+    </w:p>
+    <w:p>
+      <w:pPr>
+        <w:rPr>
+          <w:lang w:val="es-ES"/>
+        </w:rPr>
+      </w:pPr>
+      <w:r>
+        <w:rPr>
+          <w:lang w:val="es-ES"/>
+        </w:rPr>
+        <w:t xml:space="preserve">Una vez que tenemos un archivo con todos los ángulos del cuerpo la idea es entrenar a una red neuronal para conseguir que obtenga ciertas conclusiones de los ángulos. Para ello hay que investigar sobre que red es la más adecuada para nuestro caso, y trazar un plan de entrenamiento o fine </w:t>
+      </w:r>
+      <w:proofErr w:type="spellStart"/>
+      <w:r>
+        <w:rPr>
+          <w:lang w:val="es-ES"/>
+        </w:rPr>
+        <w:t>tunning</w:t>
+      </w:r>
+      <w:proofErr w:type="spellEnd"/>
+      <w:r>
+        <w:rPr>
+          <w:lang w:val="es-ES"/>
+        </w:rPr>
+        <w:t xml:space="preserve"> (a poder ser).</w:t>
+      </w:r>
+    </w:p>
+    <w:p>
+      <w:pPr>
+        <w:rPr>
+          <w:lang w:val="es-ES"/>
+        </w:rPr>
+      </w:pPr>
+      <w:r>
+        <w:rPr>
+          <w:lang w:val="es-ES"/>
+        </w:rPr>
+        <w:t xml:space="preserve">Han surgido ciertos problemas a la hora de revisar el trabajo realizado y analizar el </w:t>
+      </w:r>
+      <w:proofErr w:type="spellStart"/>
+      <w:r>
+        <w:rPr>
+          <w:lang w:val="es-ES"/>
+        </w:rPr>
+        <w:t>csv</w:t>
+      </w:r>
+      <w:proofErr w:type="spellEnd"/>
+      <w:r>
+        <w:rPr>
+          <w:lang w:val="es-ES"/>
+        </w:rPr>
+        <w:t xml:space="preserve">. Además, hablar con el experto en </w:t>
+      </w:r>
+      <w:proofErr w:type="spellStart"/>
+      <w:r>
+        <w:rPr>
+          <w:lang w:val="es-ES"/>
+        </w:rPr>
+        <w:t>biomecanica</w:t>
+      </w:r>
+      <w:proofErr w:type="spellEnd"/>
+      <w:r>
+        <w:rPr>
+          <w:lang w:val="es-ES"/>
+        </w:rPr>
+        <w:t xml:space="preserve"> me ha llevado a hacer algunos cambios en el código y en la forma de entender el proceso. En cuanto a software he decidido actualizar el código y las dependencias a la versión más nueva de </w:t>
+      </w:r>
+      <w:proofErr w:type="spellStart"/>
+      <w:r>
+        <w:rPr>
+          <w:lang w:val="es-ES"/>
+        </w:rPr>
+        <w:t>medipipe</w:t>
+      </w:r>
+      <w:proofErr w:type="spellEnd"/>
+      <w:r>
+        <w:rPr>
+          <w:lang w:val="es-ES"/>
+        </w:rPr>
+        <w:t xml:space="preserve">, ya que ha salido recientemente y he visto que tiene bastantes mejoras, el inconveniente es que me ha tocado cambiar el código. Otro aspecto es en la forma de analizar los datos, </w:t>
+      </w:r>
+      <w:proofErr w:type="spellStart"/>
+      <w:r>
+        <w:rPr>
+          <w:lang w:val="es-ES"/>
+        </w:rPr>
+        <w:t>mediapipe</w:t>
+      </w:r>
+      <w:proofErr w:type="spellEnd"/>
+      <w:r>
+        <w:rPr>
+          <w:lang w:val="es-ES"/>
+        </w:rPr>
+        <w:t xml:space="preserve"> da un valor junto con cada </w:t>
+      </w:r>
+      <w:proofErr w:type="spellStart"/>
+      <w:r>
+        <w:rPr>
+          <w:lang w:val="es-ES"/>
+        </w:rPr>
+        <w:t>keypoint</w:t>
+      </w:r>
+      <w:proofErr w:type="spellEnd"/>
+      <w:r>
+        <w:rPr>
+          <w:lang w:val="es-ES"/>
+        </w:rPr>
+        <w:t xml:space="preserve"> de confianza, he decidido filtrar los </w:t>
+      </w:r>
+      <w:proofErr w:type="spellStart"/>
+      <w:r>
+        <w:rPr>
+          <w:lang w:val="es-ES"/>
+        </w:rPr>
+        <w:t>keypoints</w:t>
+      </w:r>
+      <w:proofErr w:type="spellEnd"/>
+      <w:r>
+        <w:rPr>
+          <w:lang w:val="es-ES"/>
+        </w:rPr>
+        <w:t xml:space="preserve"> por una confianza (variable y en pruebas), para asegurar tener una serie de datos más fiables, dejando espacios vacíos en el conjunto de datos si no se capturan bien en lugar de hacer la técnica del espejo o simplemente valores poco fiables. En cuanto a la técnica del espejo he estado investigando debido al consejo del experto, ya que hemos llegado a la conclusión de que la simetría es un aspecto importante a la hora de analizar un ejercicio y al hacer la técnica del espejo si una parte del cuerpo no se ve estamos asumiendo una simetría inventada que puede dar lugar a errores.</w:t>
+      </w:r>
+    </w:p>
+    <w:p>
+      <w:pPr>
+        <w:rPr>
+          <w:lang w:val="es-ES"/>
+        </w:rPr>
+      </w:pPr>
+      <w:r>
+        <w:rPr>
+          <w:lang w:val="es-ES"/>
+        </w:rPr>
+        <w:t xml:space="preserve">Al hablar con la tutora después de investigar un poco sobre el ML y </w:t>
+      </w:r>
+      <w:proofErr w:type="spellStart"/>
+      <w:r>
+        <w:rPr>
+          <w:lang w:val="es-ES"/>
+        </w:rPr>
+        <w:t>como</w:t>
+      </w:r>
+      <w:proofErr w:type="spellEnd"/>
+      <w:r>
+        <w:rPr>
+          <w:lang w:val="es-ES"/>
+        </w:rPr>
+        <w:t xml:space="preserve"> funciona en la parte práctica, nos hemos dado cuenta que es muy difícil entrenar una red neuronal que consiga generalizar y ofrecer técnicas correctas para todos los ejercicios. Por lo que hemos </w:t>
+      </w:r>
+      <w:proofErr w:type="spellStart"/>
+      <w:r>
+        <w:rPr>
+          <w:lang w:val="es-ES"/>
+        </w:rPr>
+        <w:t>obtado</w:t>
+      </w:r>
+      <w:proofErr w:type="spellEnd"/>
+      <w:r>
+        <w:rPr>
+          <w:lang w:val="es-ES"/>
+        </w:rPr>
+        <w:t xml:space="preserve"> por seguir une esquema híbrido en el que nuestra propia red neuronal sacará unos ciertos parámetros para analizar SOLO el movimiento de sentadilla, mientras que para analizar los demás movimientos la idea ahora es subir el archivo con los ángulos y el punto de sustentación (el cual también hemos añadido gracias al experto) y que una IA externa ya entrenada nos analice el ejercicio para poder otorgar una respuesta al usuario sea el ejercicio que sea.</w:t>
+      </w:r>
+    </w:p>
+    <w:p>
+      <w:pPr>
+        <w:pStyle w:val="Heading2"/>
+        <w:rPr>
+          <w:lang w:val="es-ES"/>
+        </w:rPr>
+      </w:pPr>
+      <w:r>
+        <w:rPr>
+          <w:lang w:val="es-ES"/>
+        </w:rPr>
+        <w:t>Quinta Semana</w:t>
+      </w:r>
+    </w:p>
+    <w:p>
+      <w:pPr>
+        <w:rPr>
+          <w:lang w:val="es-ES"/>
+        </w:rPr>
+      </w:pPr>
+      <w:r>
+        <w:rPr>
+          <w:lang w:val="es-ES"/>
+        </w:rPr>
+        <w:t xml:space="preserve">Creación de la red BILSTM y búsqueda de ejemplos para su entrenamiento, una vez recopilada gran cantidad de datos me doy cuenta de la carencia de datos de ejecuciones de sentadilla erróneas, por lo que la siguiente semana me dispondré a </w:t>
+      </w:r>
+      <w:proofErr w:type="spellStart"/>
+      <w:r>
+        <w:rPr>
+          <w:lang w:val="es-ES"/>
+        </w:rPr>
+        <w:t>grabrme</w:t>
+      </w:r>
+      <w:proofErr w:type="spellEnd"/>
+      <w:r>
+        <w:rPr>
+          <w:lang w:val="es-ES"/>
+        </w:rPr>
+        <w:t xml:space="preserve"> a mi y algunos compañeros que se han ofrecido a ayudarme, ya que para el entrenamiento de la red necesito tanto ejecuciones correctas como incorrectas. </w:t>
+      </w:r>
+    </w:p>
+    <w:p>
+      <w:pPr>
+        <w:rPr>
+          <w:lang w:val="es-ES"/>
+        </w:rPr>
+      </w:pPr>
+      <w:r>
+        <w:rPr>
+          <w:lang w:val="es-ES"/>
+        </w:rPr>
+        <w:t>Realización de un primer entrenamiento para conseguir que la red sea capaz de contar repeticiones, el entrenamiento es un éxito y funciona a la perfección casi sin error.</w:t>
+      </w:r>
+    </w:p>
+    <w:p>
+      <w:pPr>
+        <w:rPr>
+          <w:lang w:val="es-ES"/>
+        </w:rPr>
+      </w:pPr>
+      <w:r>
+        <w:rPr>
+          <w:lang w:val="es-ES"/>
+        </w:rPr>
+        <w:lastRenderedPageBreak/>
+        <w:t xml:space="preserve">Gracias a mi tutora Carolina, tengo la oportunidad de ir al centro de IA de la empresa BISITE, en el </w:t>
+      </w:r>
+      <w:proofErr w:type="spellStart"/>
+      <w:r>
+        <w:rPr>
+          <w:lang w:val="es-ES"/>
+        </w:rPr>
+        <w:t>cúal</w:t>
+      </w:r>
+      <w:proofErr w:type="spellEnd"/>
+      <w:r>
+        <w:rPr>
+          <w:lang w:val="es-ES"/>
+        </w:rPr>
+        <w:t xml:space="preserve"> además de enseñarme gran cantidad de proyectos me sirve para preguntar algunas dudas que tenía, contar mi trabajo y recibir recomendaciones las cuales las hemos evaluado y llegado a la siguiente conclusión. Les encanta el </w:t>
+      </w:r>
+      <w:proofErr w:type="gramStart"/>
+      <w:r>
+        <w:rPr>
+          <w:lang w:val="es-ES"/>
+        </w:rPr>
+        <w:t>proyecto</w:t>
+      </w:r>
+      <w:proofErr w:type="gramEnd"/>
+      <w:r>
+        <w:rPr>
+          <w:lang w:val="es-ES"/>
+        </w:rPr>
+        <w:t xml:space="preserve"> pero un integrante del grupo de investigación me sugiere probar con el siguiente tipo de red </w:t>
+      </w:r>
+      <w:proofErr w:type="spellStart"/>
+      <w:r>
+        <w:rPr>
+          <w:lang w:val="es-ES"/>
+        </w:rPr>
+        <w:t>XGboost</w:t>
+      </w:r>
+      <w:proofErr w:type="spellEnd"/>
+      <w:r>
+        <w:rPr>
+          <w:lang w:val="es-ES"/>
+        </w:rPr>
+        <w:t xml:space="preserve">, en caso de algún problema con el tipo de red ya seleccionado </w:t>
+      </w:r>
+      <w:proofErr w:type="spellStart"/>
+      <w:r>
+        <w:rPr>
+          <w:lang w:val="es-ES"/>
+        </w:rPr>
+        <w:t>obtaremos</w:t>
+      </w:r>
+      <w:proofErr w:type="spellEnd"/>
+      <w:r>
+        <w:rPr>
+          <w:lang w:val="es-ES"/>
+        </w:rPr>
+        <w:t xml:space="preserve"> seguramente por hacer una </w:t>
+      </w:r>
+      <w:proofErr w:type="spellStart"/>
+      <w:r>
+        <w:rPr>
+          <w:lang w:val="es-ES"/>
+        </w:rPr>
+        <w:t>comparaciñon</w:t>
+      </w:r>
+      <w:proofErr w:type="spellEnd"/>
+      <w:r>
+        <w:rPr>
+          <w:lang w:val="es-ES"/>
+        </w:rPr>
+        <w:t xml:space="preserve"> con este otro tipo de red para obtener un mejor resultado.</w:t>
+      </w:r>
+    </w:p>
+    <w:p>
+      <w:pPr>
+        <w:rPr>
+          <w:lang w:val="es-ES"/>
+        </w:rPr>
+      </w:pPr>
+      <w:r>
+        <w:rPr>
+          <w:lang w:val="es-ES"/>
+        </w:rPr>
+        <w:t xml:space="preserve">También he decidido realizar una reestructuración del código, de los nombres de los archivos y </w:t>
+      </w:r>
+      <w:r>
+        <w:rPr>
+          <w:lang w:val="es-ES"/>
+        </w:rPr>
+        <w:t xml:space="preserve">dedicar un tiempo a la limpieza del código para mejorar la implementación y que todo quede mejor estructurado, con nombres más sugerentes y profesionales. Además de la realización de una infografía. Es importante mencionar que todos los cambios están siendo registrados en un controlador de versiones, en este caso </w:t>
+      </w:r>
+      <w:proofErr w:type="spellStart"/>
+      <w:r>
+        <w:rPr>
+          <w:lang w:val="es-ES"/>
+        </w:rPr>
+        <w:t>gitlab</w:t>
+      </w:r>
+      <w:proofErr w:type="spellEnd"/>
+      <w:r>
+        <w:rPr>
+          <w:lang w:val="es-ES"/>
+        </w:rPr>
+        <w:t xml:space="preserve">. </w:t>
       </w:r>
     </w:p>
     <w:p>
@@ -690,11 +1255,15 @@
         <w:t>Redes Neuronales Convolucionales (CNN)</w:t>
       </w:r>
       <w:r>
-        <w:t xml:space="preserve"> sobre OpenCV, concluyendo que las técnicas de barrido (ventana deslizante) son demasiado lentas para tiempo real, </w:t>
-      </w:r>
-      <w:r>
-        <w:lastRenderedPageBreak/>
-        <w:t xml:space="preserve">recomendando redes de detección de disparo único (como YOLO o SSD). </w:t>
+        <w:t xml:space="preserve"> sobre </w:t>
+      </w:r>
+      <w:proofErr w:type="spellStart"/>
+      <w:r>
+        <w:t>OpenCV</w:t>
+      </w:r>
+      <w:proofErr w:type="spellEnd"/>
+      <w:r>
+        <w:t xml:space="preserve">, concluyendo que las técnicas de barrido (ventana deslizante) son demasiado lentas para tiempo real, recomendando redes de detección de disparo único (como YOLO o SSD). </w:t>
       </w:r>
       <w:hyperlink r:id="rId10" w:history="1">
         <w:r>
@@ -732,10 +1301,43 @@
           <w:b/>
           <w:bCs/>
         </w:rPr>
-        <w:t>Transfer Learning</w:t>
-      </w:r>
-      <w:r>
-        <w:t xml:space="preserve"> sobre una CNN (ResNet/Inception) para identificar ballenas por su cola; demuestra que el "Data Augmentation" (rotar/deformar imágenes) es vital cuando tienes pocas imágenes para entrenar.</w:t>
+        <w:t xml:space="preserve">Transfer </w:t>
+      </w:r>
+      <w:proofErr w:type="spellStart"/>
+      <w:r>
+        <w:rPr>
+          <w:b/>
+          <w:bCs/>
+        </w:rPr>
+        <w:t>Learning</w:t>
+      </w:r>
+      <w:proofErr w:type="spellEnd"/>
+      <w:r>
+        <w:t xml:space="preserve"> sobre una CNN (</w:t>
+      </w:r>
+      <w:proofErr w:type="spellStart"/>
+      <w:r>
+        <w:t>ResNet</w:t>
+      </w:r>
+      <w:proofErr w:type="spellEnd"/>
+      <w:r>
+        <w:t>/</w:t>
+      </w:r>
+      <w:proofErr w:type="spellStart"/>
+      <w:r>
+        <w:t>Inception</w:t>
+      </w:r>
+      <w:proofErr w:type="spellEnd"/>
+      <w:r>
+        <w:t xml:space="preserve">) para identificar ballenas por su cola; demuestra que el "Data </w:t>
+      </w:r>
+      <w:proofErr w:type="spellStart"/>
+      <w:r>
+        <w:t>Augmentation</w:t>
+      </w:r>
+      <w:proofErr w:type="spellEnd"/>
+      <w:r>
+        <w:t>" (rotar/deformar imágenes) es vital cuando tienes pocas imágenes para entrenar.</w:t>
       </w:r>
       <w:r>
         <w:t xml:space="preserve"> </w:t>
@@ -786,8 +1388,17 @@
           <w:b/>
           <w:bCs/>
         </w:rPr>
-        <w:t>Momentos de Hu</w:t>
-      </w:r>
+        <w:t xml:space="preserve">Momentos de </w:t>
+      </w:r>
+      <w:proofErr w:type="spellStart"/>
+      <w:r>
+        <w:rPr>
+          <w:b/>
+          <w:bCs/>
+        </w:rPr>
+        <w:t>Hu</w:t>
+      </w:r>
+      <w:proofErr w:type="spellEnd"/>
       <w:r>
         <w:t xml:space="preserve"> (geometría de la forma) y una </w:t>
       </w:r>
@@ -827,7 +1438,23 @@
           <w:b/>
           <w:bCs/>
         </w:rPr>
-        <w:t>Santa María et al. (Artículo - Admin a2-15-26):</w:t>
+        <w:t xml:space="preserve">Santa María et al. (Artículo - </w:t>
+      </w:r>
+      <w:proofErr w:type="spellStart"/>
+      <w:r>
+        <w:rPr>
+          <w:b/>
+          <w:bCs/>
+        </w:rPr>
+        <w:t>Admin</w:t>
+      </w:r>
+      <w:proofErr w:type="spellEnd"/>
+      <w:r>
+        <w:rPr>
+          <w:b/>
+          <w:bCs/>
+        </w:rPr>
+        <w:t xml:space="preserve"> a2-15-26):</w:t>
       </w:r>
       <w:r>
         <w:t xml:space="preserve"> Implementa un sistema de </w:t>
@@ -868,20 +1495,104 @@
           <w:b/>
           <w:bCs/>
         </w:rPr>
-        <w:t>Sara Pardo Feijoo (PFC - Bag of Words):</w:t>
-      </w:r>
-      <w:r>
-        <w:t xml:space="preserve"> Aplica el modelo </w:t>
-      </w:r>
+        <w:t xml:space="preserve">Sara Pardo Feijoo (PFC - Bag </w:t>
+      </w:r>
+      <w:proofErr w:type="spellStart"/>
       <w:r>
         <w:rPr>
           <w:b/>
           <w:bCs/>
         </w:rPr>
-        <w:t>"Bag of Words" (BoW)</w:t>
-      </w:r>
-      <w:r>
-        <w:t xml:space="preserve">, que trata la imagen como un "saco" de parches visuales desordenados (sin geometría); útil para buscar objetos en bases de datos, pero inservible para detectar posturas donde la posición de las partes es clave. </w:t>
+        <w:t>of</w:t>
+      </w:r>
+      <w:proofErr w:type="spellEnd"/>
+      <w:r>
+        <w:rPr>
+          <w:b/>
+          <w:bCs/>
+        </w:rPr>
+        <w:t xml:space="preserve"> </w:t>
+      </w:r>
+      <w:proofErr w:type="spellStart"/>
+      <w:r>
+        <w:rPr>
+          <w:b/>
+          <w:bCs/>
+        </w:rPr>
+        <w:t>Words</w:t>
+      </w:r>
+      <w:proofErr w:type="spellEnd"/>
+      <w:r>
+        <w:rPr>
+          <w:b/>
+          <w:bCs/>
+        </w:rPr>
+        <w:t>):</w:t>
+      </w:r>
+      <w:r>
+        <w:t xml:space="preserve"> Aplica el modelo </w:t>
+      </w:r>
+      <w:r>
+        <w:rPr>
+          <w:b/>
+          <w:bCs/>
+        </w:rPr>
+        <w:t xml:space="preserve">"Bag </w:t>
+      </w:r>
+      <w:proofErr w:type="spellStart"/>
+      <w:r>
+        <w:rPr>
+          <w:b/>
+          <w:bCs/>
+        </w:rPr>
+        <w:t>of</w:t>
+      </w:r>
+      <w:proofErr w:type="spellEnd"/>
+      <w:r>
+        <w:rPr>
+          <w:b/>
+          <w:bCs/>
+        </w:rPr>
+        <w:t xml:space="preserve"> </w:t>
+      </w:r>
+      <w:proofErr w:type="spellStart"/>
+      <w:r>
+        <w:rPr>
+          <w:b/>
+          <w:bCs/>
+        </w:rPr>
+        <w:t>Words</w:t>
+      </w:r>
+      <w:proofErr w:type="spellEnd"/>
+      <w:r>
+        <w:rPr>
+          <w:b/>
+          <w:bCs/>
+        </w:rPr>
+        <w:t>" (</w:t>
+      </w:r>
+      <w:proofErr w:type="spellStart"/>
+      <w:r>
+        <w:rPr>
+          <w:b/>
+          <w:bCs/>
+        </w:rPr>
+        <w:t>BoW</w:t>
+      </w:r>
+      <w:proofErr w:type="spellEnd"/>
+      <w:r>
+        <w:rPr>
+          <w:b/>
+          <w:bCs/>
+        </w:rPr>
+        <w:t>)</w:t>
+      </w:r>
+      <w:r>
+        <w:t xml:space="preserve">, que trata la imagen como un "saco" de parches visuales desordenados (sin geometría); útil para buscar objetos en bases de datos, pero inservible para </w:t>
+      </w:r>
+      <w:r>
+        <w:lastRenderedPageBreak/>
+        <w:t xml:space="preserve">detectar posturas donde la posición de las partes es clave. </w:t>
       </w:r>
       <w:hyperlink r:id="rId14" w:history="1">
         <w:r>
@@ -978,7 +1689,25 @@
           <w:szCs w:val="24"/>
           <w:lang w:val="es-ES"/>
         </w:rPr>
-        <w:t>La dificultad de entrenar de cero una red neuronal para conseguir el resultado deseado, es mejor usar una ya entrenada como por ejemplo OpenPose o similar.</w:t>
+        <w:t xml:space="preserve">La dificultad de entrenar de cero una red neuronal para conseguir el resultado deseado, es mejor usar una ya entrenada como por ejemplo </w:t>
+      </w:r>
+      <w:proofErr w:type="spellStart"/>
+      <w:r>
+        <w:rPr>
+          <w:sz w:val="24"/>
+          <w:szCs w:val="24"/>
+          <w:lang w:val="es-ES"/>
+        </w:rPr>
+        <w:t>OpenPose</w:t>
+      </w:r>
+      <w:proofErr w:type="spellEnd"/>
+      <w:r>
+        <w:rPr>
+          <w:sz w:val="24"/>
+          <w:szCs w:val="24"/>
+          <w:lang w:val="es-ES"/>
+        </w:rPr>
+        <w:t xml:space="preserve"> o similar.</w:t>
       </w:r>
     </w:p>
     <w:p>
@@ -1000,15 +1729,51 @@
           <w:szCs w:val="24"/>
           <w:lang w:val="es-ES"/>
         </w:rPr>
-        <w:t>La retropropagación es útil para entrenar una de cero ya que es fácilmente entendible pero lo más usado hoy en día son redes convolucionales</w:t>
-      </w:r>
+        <w:t xml:space="preserve">La </w:t>
+      </w:r>
+      <w:proofErr w:type="spellStart"/>
       <w:r>
         <w:rPr>
           <w:sz w:val="24"/>
           <w:szCs w:val="24"/>
           <w:lang w:val="es-ES"/>
         </w:rPr>
-        <w:t>, es decir, deeplearning.</w:t>
+        <w:t>retropropagación</w:t>
+      </w:r>
+      <w:proofErr w:type="spellEnd"/>
+      <w:r>
+        <w:rPr>
+          <w:sz w:val="24"/>
+          <w:szCs w:val="24"/>
+          <w:lang w:val="es-ES"/>
+        </w:rPr>
+        <w:t xml:space="preserve"> es útil para entrenar una de cero ya que es fácilmente entendible pero lo más usado hoy en día son redes convolucionales</w:t>
+      </w:r>
+      <w:r>
+        <w:rPr>
+          <w:sz w:val="24"/>
+          <w:szCs w:val="24"/>
+          <w:lang w:val="es-ES"/>
+        </w:rPr>
+        <w:t xml:space="preserve">, es decir, </w:t>
+      </w:r>
+      <w:proofErr w:type="spellStart"/>
+      <w:r>
+        <w:rPr>
+          <w:sz w:val="24"/>
+          <w:szCs w:val="24"/>
+          <w:lang w:val="es-ES"/>
+        </w:rPr>
+        <w:t>deeplearning</w:t>
+      </w:r>
+      <w:proofErr w:type="spellEnd"/>
+      <w:r>
+        <w:rPr>
+          <w:sz w:val="24"/>
+          <w:szCs w:val="24"/>
+          <w:lang w:val="es-ES"/>
+        </w:rPr>
+        <w:t>.</w:t>
       </w:r>
     </w:p>
     <w:p>
@@ -1030,7 +1795,25 @@
           <w:szCs w:val="24"/>
           <w:lang w:val="es-ES"/>
         </w:rPr>
-        <w:t>La idea de analizar los datos extraídos de las herramientas como openpose a través de un doble enfoque, ya sea a través de ML con las aplicaciones</w:t>
+        <w:t xml:space="preserve">La idea de analizar los datos extraídos de las herramientas como </w:t>
+      </w:r>
+      <w:proofErr w:type="spellStart"/>
+      <w:r>
+        <w:rPr>
+          <w:sz w:val="24"/>
+          <w:szCs w:val="24"/>
+          <w:lang w:val="es-ES"/>
+        </w:rPr>
+        <w:t>openpose</w:t>
+      </w:r>
+      <w:proofErr w:type="spellEnd"/>
+      <w:r>
+        <w:rPr>
+          <w:sz w:val="24"/>
+          <w:szCs w:val="24"/>
+          <w:lang w:val="es-ES"/>
+        </w:rPr>
+        <w:t xml:space="preserve"> a través de un doble enfoque, ya sea a través de ML con las aplicaciones</w:t>
       </w:r>
       <w:r>
         <w:t xml:space="preserve"> </w:t>
@@ -1071,7 +1854,25 @@
           <w:szCs w:val="24"/>
           <w:lang w:val="es-ES"/>
         </w:rPr>
-        <w:t>La importancia de tratar las imágenes con OpenCV antes de pasar a procesarlas.</w:t>
+        <w:t xml:space="preserve">La importancia de tratar las imágenes con </w:t>
+      </w:r>
+      <w:proofErr w:type="spellStart"/>
+      <w:r>
+        <w:rPr>
+          <w:sz w:val="24"/>
+          <w:szCs w:val="24"/>
+          <w:lang w:val="es-ES"/>
+        </w:rPr>
+        <w:t>OpenCV</w:t>
+      </w:r>
+      <w:proofErr w:type="spellEnd"/>
+      <w:r>
+        <w:rPr>
+          <w:sz w:val="24"/>
+          <w:szCs w:val="24"/>
+          <w:lang w:val="es-ES"/>
+        </w:rPr>
+        <w:t xml:space="preserve"> antes de pasar a procesarlas.</w:t>
       </w:r>
     </w:p>
     <w:p>
@@ -1093,7 +1894,43 @@
           <w:szCs w:val="24"/>
           <w:lang w:val="es-ES"/>
         </w:rPr>
-        <w:t>Si en algún momento necesito usar DataSets, Kaggel es una gran fuente de información que puede llegar a ser útil. (Ballenas)</w:t>
+        <w:t xml:space="preserve">Si en algún momento necesito usar </w:t>
+      </w:r>
+      <w:proofErr w:type="spellStart"/>
+      <w:r>
+        <w:rPr>
+          <w:sz w:val="24"/>
+          <w:szCs w:val="24"/>
+          <w:lang w:val="es-ES"/>
+        </w:rPr>
+        <w:t>DataSets</w:t>
+      </w:r>
+      <w:proofErr w:type="spellEnd"/>
+      <w:r>
+        <w:rPr>
+          <w:sz w:val="24"/>
+          <w:szCs w:val="24"/>
+          <w:lang w:val="es-ES"/>
+        </w:rPr>
+        <w:t xml:space="preserve">, </w:t>
+      </w:r>
+      <w:proofErr w:type="spellStart"/>
+      <w:r>
+        <w:rPr>
+          <w:sz w:val="24"/>
+          <w:szCs w:val="24"/>
+          <w:lang w:val="es-ES"/>
+        </w:rPr>
+        <w:t>Kaggel</w:t>
+      </w:r>
+      <w:proofErr w:type="spellEnd"/>
+      <w:r>
+        <w:rPr>
+          <w:sz w:val="24"/>
+          <w:szCs w:val="24"/>
+          <w:lang w:val="es-ES"/>
+        </w:rPr>
+        <w:t xml:space="preserve"> es una gran fuente de información que puede llegar a ser útil. (Ballenas)</w:t>
       </w:r>
     </w:p>
     <w:p>
@@ -1136,7 +1973,6 @@
           <w:b/>
           <w:bCs/>
         </w:rPr>
-        <w:lastRenderedPageBreak/>
         <w:t>Abandona la "Ingeniería de Características" Manual:</w:t>
       </w:r>
       <w:r>
@@ -1150,7 +1986,23 @@
         <w:t>Pedro Pablo</w:t>
       </w:r>
       <w:r>
-        <w:t xml:space="preserve"> (Hu Moments), </w:t>
+        <w:t xml:space="preserve"> (</w:t>
+      </w:r>
+      <w:proofErr w:type="spellStart"/>
+      <w:r>
+        <w:t>Hu</w:t>
+      </w:r>
+      <w:proofErr w:type="spellEnd"/>
+      <w:r>
+        <w:t xml:space="preserve"> </w:t>
+      </w:r>
+      <w:proofErr w:type="spellStart"/>
+      <w:r>
+        <w:t>Moments</w:t>
+      </w:r>
+      <w:proofErr w:type="spellEnd"/>
+      <w:r>
+        <w:t xml:space="preserve">), </w:t>
       </w:r>
       <w:r>
         <w:rPr>
@@ -1170,7 +2022,23 @@
         <w:t>Sara Pardo</w:t>
       </w:r>
       <w:r>
-        <w:t xml:space="preserve"> (Bag of Words) demuestran enfoques donde el programador debe definir </w:t>
+        <w:t xml:space="preserve"> (Bag </w:t>
+      </w:r>
+      <w:proofErr w:type="spellStart"/>
+      <w:r>
+        <w:t>of</w:t>
+      </w:r>
+      <w:proofErr w:type="spellEnd"/>
+      <w:r>
+        <w:t xml:space="preserve"> </w:t>
+      </w:r>
+      <w:proofErr w:type="spellStart"/>
+      <w:r>
+        <w:t>Words</w:t>
+      </w:r>
+      <w:proofErr w:type="spellEnd"/>
+      <w:r>
+        <w:t xml:space="preserve">) demuestran enfoques donde el programador debe definir </w:t>
       </w:r>
       <w:r>
         <w:rPr>
@@ -1207,7 +2075,39 @@
           <w:b/>
           <w:bCs/>
         </w:rPr>
-        <w:t>Confirma el uso de Deep Learning (CNNs):</w:t>
+        <w:t xml:space="preserve">Confirma el uso de Deep </w:t>
+      </w:r>
+      <w:proofErr w:type="spellStart"/>
+      <w:r>
+        <w:rPr>
+          <w:b/>
+          <w:bCs/>
+        </w:rPr>
+        <w:t>Learning</w:t>
+      </w:r>
+      <w:proofErr w:type="spellEnd"/>
+      <w:r>
+        <w:rPr>
+          <w:b/>
+          <w:bCs/>
+        </w:rPr>
+        <w:t xml:space="preserve"> (</w:t>
+      </w:r>
+      <w:proofErr w:type="spellStart"/>
+      <w:r>
+        <w:rPr>
+          <w:b/>
+          <w:bCs/>
+        </w:rPr>
+        <w:t>CNNs</w:t>
+      </w:r>
+      <w:proofErr w:type="spellEnd"/>
+      <w:r>
+        <w:rPr>
+          <w:b/>
+          <w:bCs/>
+        </w:rPr>
+        <w:t>):</w:t>
       </w:r>
       <w:r>
         <w:t xml:space="preserve"> Los trabajos de </w:t>
@@ -1257,11 +2157,29 @@
           <w:b/>
           <w:bCs/>
         </w:rPr>
-        <w:t>Pose Estimation</w:t>
-      </w:r>
-      <w:r>
-        <w:t xml:space="preserve"> (como la mencionada MoveNet en tu borrador), que detecta </w:t>
-      </w:r>
+        <w:t xml:space="preserve">Pose </w:t>
+      </w:r>
+      <w:proofErr w:type="spellStart"/>
+      <w:r>
+        <w:rPr>
+          <w:b/>
+          <w:bCs/>
+        </w:rPr>
+        <w:t>Estimation</w:t>
+      </w:r>
+      <w:proofErr w:type="spellEnd"/>
+      <w:r>
+        <w:t xml:space="preserve"> (como la mencionada </w:t>
+      </w:r>
+      <w:proofErr w:type="spellStart"/>
+      <w:r>
+        <w:t>MoveNet</w:t>
+      </w:r>
+      <w:proofErr w:type="spellEnd"/>
+      <w:r>
+        <w:t xml:space="preserve"> en tu borrador), que detecta </w:t>
+      </w:r>
+      <w:proofErr w:type="spellStart"/>
       <w:r>
         <w:rPr>
           <w:i/>
@@ -1269,6 +2187,7 @@
         </w:rPr>
         <w:t>keypoints</w:t>
       </w:r>
+      <w:proofErr w:type="spellEnd"/>
       <w:r>
         <w:t xml:space="preserve"> (codos, rodillas) directamente, saltándose la fase de "aprender qué es un brazo" desde cero.</w:t>
       </w:r>
@@ -1287,7 +2206,23 @@
           <w:b/>
           <w:bCs/>
         </w:rPr>
-        <w:t>El Dataset es tu mayor cuello de botella:</w:t>
+        <w:t xml:space="preserve">El </w:t>
+      </w:r>
+      <w:proofErr w:type="spellStart"/>
+      <w:r>
+        <w:rPr>
+          <w:b/>
+          <w:bCs/>
+        </w:rPr>
+        <w:t>Dataset</w:t>
+      </w:r>
+      <w:proofErr w:type="spellEnd"/>
+      <w:r>
+        <w:rPr>
+          <w:b/>
+          <w:bCs/>
+        </w:rPr>
+        <w:t xml:space="preserve"> es tu mayor cuello de botella:</w:t>
       </w:r>
       <w:r>
         <w:t xml:space="preserve"> Todos los autores sufren con la falta de datos.</w:t>
@@ -1327,18 +2262,45 @@
           <w:b/>
           <w:bCs/>
         </w:rPr>
-        <w:t>Transfer Learning</w:t>
-      </w:r>
-      <w:r>
-        <w:t xml:space="preserve">. No entrenes tu red con vídeos tuyos desde cero. Coge un modelo pre-entrenado (en COCO o MPII Human Pose) y úsalo directamente o haz un </w:t>
+        <w:t xml:space="preserve">Transfer </w:t>
+      </w:r>
+      <w:proofErr w:type="spellStart"/>
+      <w:r>
+        <w:rPr>
+          <w:b/>
+          <w:bCs/>
+        </w:rPr>
+        <w:t>Learning</w:t>
+      </w:r>
+      <w:proofErr w:type="spellEnd"/>
+      <w:r>
+        <w:t xml:space="preserve">. No entrenes tu red con vídeos tuyos desde cero. Coge un modelo </w:t>
+      </w:r>
+      <w:proofErr w:type="spellStart"/>
+      <w:r>
+        <w:t>pre-entrenado</w:t>
+      </w:r>
+      <w:proofErr w:type="spellEnd"/>
+      <w:r>
+        <w:t xml:space="preserve"> (en COCO o MPII Human Pose) y úsalo directamente o haz un </w:t>
       </w:r>
       <w:r>
         <w:rPr>
           <w:i/>
           <w:iCs/>
         </w:rPr>
-        <w:t>fine-tuning</w:t>
-      </w:r>
+        <w:lastRenderedPageBreak/>
+        <w:t>fine-</w:t>
+      </w:r>
+      <w:proofErr w:type="spellStart"/>
+      <w:r>
+        <w:rPr>
+          <w:i/>
+          <w:iCs/>
+        </w:rPr>
+        <w:t>tuning</w:t>
+      </w:r>
+      <w:proofErr w:type="spellEnd"/>
       <w:r>
         <w:t xml:space="preserve"> ligero. Esto es lo que diferencia un TFG académico viable de uno imposible.</w:t>
       </w:r>
@@ -1370,7 +2332,23 @@
         <w:t>Oliva</w:t>
       </w:r>
       <w:r>
-        <w:t xml:space="preserve"> demostró que técnicas precisas (ventanas deslizantes) hacen el sistema inútil en tiempo real (segundos por frame). Para tu app móvil, la conclusión es clara: sacrifica resolución de entrada (baja a 256x256 o similar) y procesa 1 de cada 5 frames. La fluidez de la app (UX) es más importante que saber si el ángulo de la rodilla es 45.1º o 45.2º.</w:t>
+        <w:t xml:space="preserve"> demostró que técnicas precisas (ventanas deslizantes) hacen el sistema inútil en tiempo real (segundos por </w:t>
+      </w:r>
+      <w:proofErr w:type="spellStart"/>
+      <w:r>
+        <w:t>frame</w:t>
+      </w:r>
+      <w:proofErr w:type="spellEnd"/>
+      <w:r>
+        <w:t xml:space="preserve">). Para tu app móvil, la conclusión es clara: sacrifica resolución de entrada (baja a 256x256 o similar) y procesa 1 de cada 5 </w:t>
+      </w:r>
+      <w:proofErr w:type="spellStart"/>
+      <w:r>
+        <w:t>frames</w:t>
+      </w:r>
+      <w:proofErr w:type="spellEnd"/>
+      <w:r>
+        <w:t>. La fluidez de la app (UX) es más importante que saber si el ángulo de la rodilla es 45.1º o 45.2º.</w:t>
       </w:r>
     </w:p>
     <w:p>
@@ -1381,11 +2359,19 @@
           <w:rFonts w:ascii="Arial" w:hAnsi="Arial" w:cs="Arial"/>
         </w:rPr>
       </w:pPr>
+      <w:proofErr w:type="spellStart"/>
       <w:r>
         <w:rPr>
           <w:rFonts w:ascii="Arial" w:hAnsi="Arial" w:cs="Arial"/>
         </w:rPr>
-        <w:t>Planning y distintas herramientas</w:t>
+        <w:t>Planning</w:t>
+      </w:r>
+      <w:proofErr w:type="spellEnd"/>
+      <w:r>
+        <w:rPr>
+          <w:rFonts w:ascii="Arial" w:hAnsi="Arial" w:cs="Arial"/>
+        </w:rPr>
+        <w:t xml:space="preserve"> y distintas herramientas</w:t>
       </w:r>
     </w:p>
     <w:p>
@@ -1409,7 +2395,35 @@
         <w:rPr>
           <w:rFonts w:ascii="Arial" w:hAnsi="Arial" w:cs="Arial"/>
         </w:rPr>
-        <w:t>1. Pipeline de Visión Artificial (Computer Vision)</w:t>
+        <w:t>1. Pipeline de Visión Artificial (</w:t>
+      </w:r>
+      <w:proofErr w:type="spellStart"/>
+      <w:r>
+        <w:rPr>
+          <w:rFonts w:ascii="Arial" w:hAnsi="Arial" w:cs="Arial"/>
+        </w:rPr>
+        <w:t>Computer</w:t>
+      </w:r>
+      <w:proofErr w:type="spellEnd"/>
+      <w:r>
+        <w:rPr>
+          <w:rFonts w:ascii="Arial" w:hAnsi="Arial" w:cs="Arial"/>
+        </w:rPr>
+        <w:t xml:space="preserve"> </w:t>
+      </w:r>
+      <w:proofErr w:type="spellStart"/>
+      <w:r>
+        <w:rPr>
+          <w:rFonts w:ascii="Arial" w:hAnsi="Arial" w:cs="Arial"/>
+        </w:rPr>
+        <w:t>Vision</w:t>
+      </w:r>
+      <w:proofErr w:type="spellEnd"/>
+      <w:r>
+        <w:rPr>
+          <w:rFonts w:ascii="Arial" w:hAnsi="Arial" w:cs="Arial"/>
+        </w:rPr>
+        <w:t>)</w:t>
       </w:r>
     </w:p>
     <w:p>
@@ -1454,6 +2468,7 @@
         </w:rPr>
         <w:t xml:space="preserve"> </w:t>
       </w:r>
+      <w:proofErr w:type="spellStart"/>
       <w:r>
         <w:rPr>
           <w:rFonts w:cs="Arial"/>
@@ -1462,11 +2477,26 @@
         </w:rPr>
         <w:t>OpenCV</w:t>
       </w:r>
-      <w:r>
-        <w:rPr>
-          <w:rFonts w:cs="Arial"/>
-        </w:rPr>
-        <w:t>. Se utilizará de forma casi exclusiva para la lectura de los frames de la cámara, redimensionado, cambios de espacio de color, y el dibujado (renderizado) posterior del esqueleto y las métricas sobre el video en la interfaz de usuario.</w:t>
+      <w:proofErr w:type="spellEnd"/>
+      <w:r>
+        <w:rPr>
+          <w:rFonts w:cs="Arial"/>
+        </w:rPr>
+        <w:t xml:space="preserve">. Se utilizará de forma casi exclusiva para la lectura de los </w:t>
+      </w:r>
+      <w:proofErr w:type="spellStart"/>
+      <w:r>
+        <w:rPr>
+          <w:rFonts w:cs="Arial"/>
+        </w:rPr>
+        <w:t>frames</w:t>
+      </w:r>
+      <w:proofErr w:type="spellEnd"/>
+      <w:r>
+        <w:rPr>
+          <w:rFonts w:cs="Arial"/>
+        </w:rPr>
+        <w:t xml:space="preserve"> de la cámara, redimensionado, cambios de espacio de color, y el dibujado (renderizado) posterior del esqueleto y las métricas sobre el video en la interfaz de usuario.</w:t>
       </w:r>
     </w:p>
     <w:p>
@@ -1488,41 +2518,101 @@
           <w:b/>
           <w:bCs/>
         </w:rPr>
-        <w:t>Estimación de Postura (Pose Estimation):</w:t>
-      </w:r>
-      <w:r>
-        <w:rPr>
-          <w:rFonts w:cs="Arial"/>
-        </w:rPr>
-        <w:t xml:space="preserve"> * </w:t>
-      </w:r>
+        <w:t xml:space="preserve">Estimación de Postura (Pose </w:t>
+      </w:r>
+      <w:proofErr w:type="spellStart"/>
       <w:r>
         <w:rPr>
           <w:rFonts w:cs="Arial"/>
           <w:b/>
           <w:bCs/>
         </w:rPr>
-        <w:t>Opción Principal (Recomendada):</w:t>
-      </w:r>
-      <w:r>
-        <w:rPr>
-          <w:rFonts w:cs="Arial"/>
-        </w:rPr>
-        <w:t xml:space="preserve"> </w:t>
-      </w:r>
+        <w:t>Estimation</w:t>
+      </w:r>
+      <w:proofErr w:type="spellEnd"/>
       <w:r>
         <w:rPr>
           <w:rFonts w:cs="Arial"/>
           <w:b/>
           <w:bCs/>
         </w:rPr>
-        <w:t>BlazePose (MediaPipe)</w:t>
-      </w:r>
-      <w:r>
-        <w:rPr>
-          <w:rFonts w:cs="Arial"/>
-        </w:rPr>
-        <w:t xml:space="preserve">. Se elige como la tecnología core por su capacidad de generar coordenadas en </w:t>
+        <w:t>):</w:t>
+      </w:r>
+      <w:r>
+        <w:rPr>
+          <w:rFonts w:cs="Arial"/>
+        </w:rPr>
+        <w:t xml:space="preserve"> * </w:t>
+      </w:r>
+      <w:r>
+        <w:rPr>
+          <w:rFonts w:cs="Arial"/>
+          <w:b/>
+          <w:bCs/>
+        </w:rPr>
+        <w:t>Opción Principal (Recomendada):</w:t>
+      </w:r>
+      <w:r>
+        <w:rPr>
+          <w:rFonts w:cs="Arial"/>
+        </w:rPr>
+        <w:t xml:space="preserve"> </w:t>
+      </w:r>
+      <w:proofErr w:type="spellStart"/>
+      <w:r>
+        <w:rPr>
+          <w:rFonts w:cs="Arial"/>
+          <w:b/>
+          <w:bCs/>
+        </w:rPr>
+        <w:t>BlazePose</w:t>
+      </w:r>
+      <w:proofErr w:type="spellEnd"/>
+      <w:r>
+        <w:rPr>
+          <w:rFonts w:cs="Arial"/>
+          <w:b/>
+          <w:bCs/>
+        </w:rPr>
+        <w:t xml:space="preserve"> (</w:t>
+      </w:r>
+      <w:proofErr w:type="spellStart"/>
+      <w:r>
+        <w:rPr>
+          <w:rFonts w:cs="Arial"/>
+          <w:b/>
+          <w:bCs/>
+        </w:rPr>
+        <w:t>MediaPipe</w:t>
+      </w:r>
+      <w:proofErr w:type="spellEnd"/>
+      <w:r>
+        <w:rPr>
+          <w:rFonts w:cs="Arial"/>
+          <w:b/>
+          <w:bCs/>
+        </w:rPr>
+        <w:t>)</w:t>
+      </w:r>
+      <w:r>
+        <w:rPr>
+          <w:rFonts w:cs="Arial"/>
+        </w:rPr>
+        <w:t xml:space="preserve">. Se elige como la tecnología </w:t>
+      </w:r>
+      <w:proofErr w:type="spellStart"/>
+      <w:r>
+        <w:rPr>
+          <w:rFonts w:cs="Arial"/>
+        </w:rPr>
+        <w:t>core</w:t>
+      </w:r>
+      <w:proofErr w:type="spellEnd"/>
+      <w:r>
+        <w:rPr>
+          <w:rFonts w:cs="Arial"/>
+        </w:rPr>
+        <w:t xml:space="preserve"> por su capacidad de generar coordenadas en </w:t>
       </w:r>
       <w:r>
         <w:rPr>
@@ -1574,20 +2664,135 @@
           <w:rFonts w:cs="Arial"/>
         </w:rPr>
       </w:pPr>
+      <w:proofErr w:type="spellStart"/>
       <w:r>
         <w:rPr>
           <w:rFonts w:cs="Arial"/>
           <w:i/>
           <w:iCs/>
         </w:rPr>
-        <w:lastRenderedPageBreak/>
-        <w:t>OpenPose / MoveNet / AlphaPose:</w:t>
-      </w:r>
-      <w:r>
-        <w:rPr>
-          <w:rFonts w:cs="Arial"/>
-        </w:rPr>
-        <w:t xml:space="preserve"> Descartados para el core móvil por ser pesados (AlphaPose/OpenPose) o limitar la salida a 2D (MoveNet/OpenPose).</w:t>
+        <w:t>OpenPose</w:t>
+      </w:r>
+      <w:proofErr w:type="spellEnd"/>
+      <w:r>
+        <w:rPr>
+          <w:rFonts w:cs="Arial"/>
+          <w:i/>
+          <w:iCs/>
+        </w:rPr>
+        <w:t xml:space="preserve"> / </w:t>
+      </w:r>
+      <w:proofErr w:type="spellStart"/>
+      <w:r>
+        <w:rPr>
+          <w:rFonts w:cs="Arial"/>
+          <w:i/>
+          <w:iCs/>
+        </w:rPr>
+        <w:t>MoveNet</w:t>
+      </w:r>
+      <w:proofErr w:type="spellEnd"/>
+      <w:r>
+        <w:rPr>
+          <w:rFonts w:cs="Arial"/>
+          <w:i/>
+          <w:iCs/>
+        </w:rPr>
+        <w:t xml:space="preserve"> / </w:t>
+      </w:r>
+      <w:proofErr w:type="spellStart"/>
+      <w:r>
+        <w:rPr>
+          <w:rFonts w:cs="Arial"/>
+          <w:i/>
+          <w:iCs/>
+        </w:rPr>
+        <w:t>AlphaPose</w:t>
+      </w:r>
+      <w:proofErr w:type="spellEnd"/>
+      <w:r>
+        <w:rPr>
+          <w:rFonts w:cs="Arial"/>
+          <w:i/>
+          <w:iCs/>
+        </w:rPr>
+        <w:t>:</w:t>
+      </w:r>
+      <w:r>
+        <w:rPr>
+          <w:rFonts w:cs="Arial"/>
+        </w:rPr>
+        <w:t xml:space="preserve"> Descartados para el </w:t>
+      </w:r>
+      <w:proofErr w:type="spellStart"/>
+      <w:r>
+        <w:rPr>
+          <w:rFonts w:cs="Arial"/>
+        </w:rPr>
+        <w:t>core</w:t>
+      </w:r>
+      <w:proofErr w:type="spellEnd"/>
+      <w:r>
+        <w:rPr>
+          <w:rFonts w:cs="Arial"/>
+        </w:rPr>
+        <w:t xml:space="preserve"> móvil por ser pesados (</w:t>
+      </w:r>
+      <w:proofErr w:type="spellStart"/>
+      <w:r>
+        <w:rPr>
+          <w:rFonts w:cs="Arial"/>
+        </w:rPr>
+        <w:t>AlphaPose</w:t>
+      </w:r>
+      <w:proofErr w:type="spellEnd"/>
+      <w:r>
+        <w:rPr>
+          <w:rFonts w:cs="Arial"/>
+        </w:rPr>
+        <w:t>/</w:t>
+      </w:r>
+      <w:proofErr w:type="spellStart"/>
+      <w:r>
+        <w:rPr>
+          <w:rFonts w:cs="Arial"/>
+        </w:rPr>
+        <w:t>OpenPose</w:t>
+      </w:r>
+      <w:proofErr w:type="spellEnd"/>
+      <w:r>
+        <w:rPr>
+          <w:rFonts w:cs="Arial"/>
+        </w:rPr>
+        <w:t>) o limitar la salida a 2D (</w:t>
+      </w:r>
+      <w:proofErr w:type="spellStart"/>
+      <w:r>
+        <w:rPr>
+          <w:rFonts w:cs="Arial"/>
+        </w:rPr>
+        <w:t>MoveNet</w:t>
+      </w:r>
+      <w:proofErr w:type="spellEnd"/>
+      <w:r>
+        <w:rPr>
+          <w:rFonts w:cs="Arial"/>
+        </w:rPr>
+        <w:t>/</w:t>
+      </w:r>
+      <w:proofErr w:type="spellStart"/>
+      <w:r>
+        <w:rPr>
+          <w:rFonts w:cs="Arial"/>
+        </w:rPr>
+        <w:t>OpenPose</w:t>
+      </w:r>
+      <w:proofErr w:type="spellEnd"/>
+      <w:r>
+        <w:rPr>
+          <w:rFonts w:cs="Arial"/>
+        </w:rPr>
+        <w:t>).</w:t>
       </w:r>
     </w:p>
     <w:p>
@@ -1631,13 +2836,41 @@
           <w:rFonts w:cs="Arial"/>
         </w:rPr>
       </w:pPr>
+      <w:proofErr w:type="spellStart"/>
       <w:r>
         <w:rPr>
           <w:rFonts w:cs="Arial"/>
           <w:i/>
           <w:iCs/>
         </w:rPr>
-        <w:t>RTMPose / ViTPose:</w:t>
+        <w:t>RTMPose</w:t>
+      </w:r>
+      <w:proofErr w:type="spellEnd"/>
+      <w:r>
+        <w:rPr>
+          <w:rFonts w:cs="Arial"/>
+          <w:i/>
+          <w:iCs/>
+        </w:rPr>
+        <w:t xml:space="preserve"> / </w:t>
+      </w:r>
+      <w:proofErr w:type="spellStart"/>
+      <w:r>
+        <w:rPr>
+          <w:rFonts w:cs="Arial"/>
+          <w:i/>
+          <w:iCs/>
+        </w:rPr>
+        <w:t>ViTPose</w:t>
+      </w:r>
+      <w:proofErr w:type="spellEnd"/>
+      <w:r>
+        <w:rPr>
+          <w:rFonts w:cs="Arial"/>
+          <w:i/>
+          <w:iCs/>
+        </w:rPr>
+        <w:t>:</w:t>
       </w:r>
       <w:r>
         <w:rPr>
@@ -1673,7 +2906,35 @@
         <w:rPr>
           <w:rFonts w:cs="Arial"/>
         </w:rPr>
-        <w:t>Una vez obtenidos los puntos clave (landmarks) de BlazePose, el sistema transforma estos datos en información física y geométrica con significado clínico/deportivo.</w:t>
+        <w:t>Una vez obtenidos los puntos clave (</w:t>
+      </w:r>
+      <w:proofErr w:type="spellStart"/>
+      <w:r>
+        <w:rPr>
+          <w:rFonts w:cs="Arial"/>
+        </w:rPr>
+        <w:t>landmarks</w:t>
+      </w:r>
+      <w:proofErr w:type="spellEnd"/>
+      <w:r>
+        <w:rPr>
+          <w:rFonts w:cs="Arial"/>
+        </w:rPr>
+        <w:t xml:space="preserve">) de </w:t>
+      </w:r>
+      <w:proofErr w:type="spellStart"/>
+      <w:r>
+        <w:rPr>
+          <w:rFonts w:cs="Arial"/>
+        </w:rPr>
+        <w:t>BlazePose</w:t>
+      </w:r>
+      <w:proofErr w:type="spellEnd"/>
+      <w:r>
+        <w:rPr>
+          <w:rFonts w:cs="Arial"/>
+        </w:rPr>
+        <w:t>, el sistema transforma estos datos en información física y geométrica con significado clínico/deportivo.</w:t>
       </w:r>
     </w:p>
     <w:p>
@@ -1743,7 +3004,21 @@
         <w:rPr>
           <w:rFonts w:cs="Arial"/>
         </w:rPr>
-        <w:t xml:space="preserve"> Derivadas de los cambios de posición y ángulos entre frames consecutivos para evaluar la explosividad y el control del movimiento.</w:t>
+        <w:t xml:space="preserve"> Derivadas de los cambios de posición y ángulos entre </w:t>
+      </w:r>
+      <w:proofErr w:type="spellStart"/>
+      <w:r>
+        <w:rPr>
+          <w:rFonts w:cs="Arial"/>
+        </w:rPr>
+        <w:t>frames</w:t>
+      </w:r>
+      <w:proofErr w:type="spellEnd"/>
+      <w:r>
+        <w:rPr>
+          <w:rFonts w:cs="Arial"/>
+        </w:rPr>
+        <w:t xml:space="preserve"> consecutivos para evaluar la explosividad y el control del movimiento.</w:t>
       </w:r>
     </w:p>
     <w:p>
@@ -1758,7 +3033,21 @@
         <w:rPr>
           <w:rFonts w:ascii="Arial" w:hAnsi="Arial" w:cs="Arial"/>
         </w:rPr>
-        <w:t>3. Clasificación y Modelado Predictivo (Machine Learning)</w:t>
+        <w:t xml:space="preserve">3. Clasificación y Modelado Predictivo (Machine </w:t>
+      </w:r>
+      <w:proofErr w:type="spellStart"/>
+      <w:r>
+        <w:rPr>
+          <w:rFonts w:ascii="Arial" w:hAnsi="Arial" w:cs="Arial"/>
+        </w:rPr>
+        <w:t>Learning</w:t>
+      </w:r>
+      <w:proofErr w:type="spellEnd"/>
+      <w:r>
+        <w:rPr>
+          <w:rFonts w:ascii="Arial" w:hAnsi="Arial" w:cs="Arial"/>
+        </w:rPr>
+        <w:t>)</w:t>
       </w:r>
     </w:p>
     <w:p>
@@ -1784,7 +3073,16 @@
         </w:rPr>
       </w:pPr>
       <w:r>
-        <w:t>Modelos de Machine Learning Evaluados</w:t>
+        <w:lastRenderedPageBreak/>
+        <w:t xml:space="preserve">Modelos de Machine </w:t>
+      </w:r>
+      <w:proofErr w:type="spellStart"/>
+      <w:r>
+        <w:t>Learning</w:t>
+      </w:r>
+      <w:proofErr w:type="spellEnd"/>
+      <w:r>
+        <w:t xml:space="preserve"> Evaluados</w:t>
       </w:r>
     </w:p>
     <w:p>
@@ -1845,15 +3143,40 @@
         </w:numPr>
         <w:jc w:val="left"/>
       </w:pPr>
+      <w:proofErr w:type="spellStart"/>
       <w:r>
         <w:rPr>
           <w:b/>
           <w:bCs/>
         </w:rPr>
-        <w:t>BiLSTM:</w:t>
-      </w:r>
-      <w:r>
-        <w:t xml:space="preserve"> Con complejidad media-alta y requisitos de datos medios, es el modelo ideal para ser ejecutado en el servidor. Destaca en el procesamiento a posteriori (post-entrenamiento), ya que analiza tanto el contexto pasado como el futuro de cada frame de vídeo.</w:t>
+        <w:t>BiLSTM</w:t>
+      </w:r>
+      <w:proofErr w:type="spellEnd"/>
+      <w:r>
+        <w:rPr>
+          <w:b/>
+          <w:bCs/>
+        </w:rPr>
+        <w:t>:</w:t>
+      </w:r>
+      <w:r>
+        <w:t xml:space="preserve"> Con complejidad media-alta y requisitos de datos medios, es el modelo ideal para ser ejecutado en el servidor. Destaca en el procesamiento a posteriori (</w:t>
+      </w:r>
+      <w:proofErr w:type="spellStart"/>
+      <w:r>
+        <w:t>post-entrenamiento</w:t>
+      </w:r>
+      <w:proofErr w:type="spellEnd"/>
+      <w:r>
+        <w:t xml:space="preserve">), ya que analiza tanto el contexto pasado como el futuro de cada </w:t>
+      </w:r>
+      <w:proofErr w:type="spellStart"/>
+      <w:r>
+        <w:t>frame</w:t>
+      </w:r>
+      <w:proofErr w:type="spellEnd"/>
+      <w:r>
+        <w:t xml:space="preserve"> de vídeo.</w:t>
       </w:r>
     </w:p>
     <w:p>
@@ -1865,12 +3188,21 @@
         </w:numPr>
         <w:jc w:val="left"/>
       </w:pPr>
+      <w:proofErr w:type="spellStart"/>
       <w:r>
         <w:rPr>
           <w:b/>
           <w:bCs/>
         </w:rPr>
-        <w:t>Transformer:</w:t>
+        <w:t>Transformer</w:t>
+      </w:r>
+      <w:proofErr w:type="spellEnd"/>
+      <w:r>
+        <w:rPr>
+          <w:b/>
+          <w:bCs/>
+        </w:rPr>
+        <w:t>:</w:t>
       </w:r>
       <w:r>
         <w:t xml:space="preserve"> Ofrece una altísima capacidad de modelado, pero con requerimientos muy altos tanto de datos como de complejidad. Resulta demasiado pesado y complejo para la primera versi</w:t>
@@ -1971,8 +3303,23 @@
         <w:rPr>
           <w:rFonts w:cs="Arial"/>
         </w:rPr>
-        <w:t xml:space="preserve"> por su ligereza. Si la aplicación requiere un informe detallado post-entrenamiento, enviar los datos al servidor para pasarlos por una </w:t>
-      </w:r>
+        <w:t xml:space="preserve"> por su ligereza. Si la aplicación requiere un informe detallado </w:t>
+      </w:r>
+      <w:proofErr w:type="spellStart"/>
+      <w:r>
+        <w:rPr>
+          <w:rFonts w:cs="Arial"/>
+        </w:rPr>
+        <w:t>post-entrenamiento</w:t>
+      </w:r>
+      <w:proofErr w:type="spellEnd"/>
+      <w:r>
+        <w:rPr>
+          <w:rFonts w:cs="Arial"/>
+        </w:rPr>
+        <w:t xml:space="preserve">, enviar los datos al servidor para pasarlos por una </w:t>
+      </w:r>
+      <w:proofErr w:type="spellStart"/>
       <w:r>
         <w:rPr>
           <w:rFonts w:cs="Arial"/>
@@ -1981,6 +3328,7 @@
         </w:rPr>
         <w:t>BiLSTM</w:t>
       </w:r>
+      <w:proofErr w:type="spellEnd"/>
       <w:r>
         <w:rPr>
           <w:rFonts w:cs="Arial"/>
@@ -2000,8 +3348,21 @@
         <w:rPr>
           <w:rFonts w:ascii="Arial" w:hAnsi="Arial" w:cs="Arial"/>
         </w:rPr>
-        <w:lastRenderedPageBreak/>
-        <w:t>4. Sistema de Inferencia y Retroalimentación (Feedback)</w:t>
+        <w:t>4. Sistema de Inferencia y Retroalimentación (</w:t>
+      </w:r>
+      <w:proofErr w:type="spellStart"/>
+      <w:r>
+        <w:rPr>
+          <w:rFonts w:ascii="Arial" w:hAnsi="Arial" w:cs="Arial"/>
+        </w:rPr>
+        <w:t>Feedback</w:t>
+      </w:r>
+      <w:proofErr w:type="spellEnd"/>
+      <w:r>
+        <w:rPr>
+          <w:rFonts w:ascii="Arial" w:hAnsi="Arial" w:cs="Arial"/>
+        </w:rPr>
+        <w:t>)</w:t>
       </w:r>
     </w:p>
     <w:p>
@@ -2044,7 +3405,21 @@
         <w:rPr>
           <w:rFonts w:cs="Arial"/>
         </w:rPr>
-        <w:t xml:space="preserve"> Reglas clínicas de "hard-code" que actúan como salvavidas inmediatos para evitar lesiones.</w:t>
+        <w:t xml:space="preserve"> Reglas clínicas de "</w:t>
+      </w:r>
+      <w:proofErr w:type="spellStart"/>
+      <w:r>
+        <w:rPr>
+          <w:rFonts w:cs="Arial"/>
+        </w:rPr>
+        <w:t>hard-code</w:t>
+      </w:r>
+      <w:proofErr w:type="spellEnd"/>
+      <w:r>
+        <w:rPr>
+          <w:rFonts w:cs="Arial"/>
+        </w:rPr>
+        <w:t>" que actúan como salvavidas inmediatos para evitar lesiones.</w:t>
       </w:r>
     </w:p>
     <w:p>
@@ -2079,7 +3454,23 @@
           <w:rStyle w:val="HTMLCode"/>
           <w:rFonts w:cs="Arial"/>
         </w:rPr>
-        <w:t>SI (Ejercicio == Sentadilla) Y (Ángulo_Rodilla &lt; 90º) -&gt; "Profundidad correcta"</w:t>
+        <w:t>SI (Ejercicio == Sentadilla) Y (</w:t>
+      </w:r>
+      <w:proofErr w:type="spellStart"/>
+      <w:r>
+        <w:rPr>
+          <w:rStyle w:val="HTMLCode"/>
+          <w:rFonts w:cs="Arial"/>
+        </w:rPr>
+        <w:t>Ángulo_Rodilla</w:t>
+      </w:r>
+      <w:proofErr w:type="spellEnd"/>
+      <w:r>
+        <w:rPr>
+          <w:rStyle w:val="HTMLCode"/>
+          <w:rFonts w:cs="Arial"/>
+        </w:rPr>
+        <w:t xml:space="preserve"> &lt; 90º) -&gt; "Profundidad correcta"</w:t>
       </w:r>
     </w:p>
     <w:p>
@@ -2114,7 +3505,39 @@
           <w:rStyle w:val="HTMLCode"/>
           <w:rFonts w:cs="Arial"/>
         </w:rPr>
-        <w:t>SI (Posición_X_Rodilla &gt; Posición_X_Puntera) -&gt; "</w:t>
+        <w:t>SI (</w:t>
+      </w:r>
+      <w:proofErr w:type="spellStart"/>
+      <w:r>
+        <w:rPr>
+          <w:rStyle w:val="HTMLCode"/>
+          <w:rFonts w:cs="Arial"/>
+        </w:rPr>
+        <w:t>Posición_X_Rodilla</w:t>
+      </w:r>
+      <w:proofErr w:type="spellEnd"/>
+      <w:r>
+        <w:rPr>
+          <w:rStyle w:val="HTMLCode"/>
+          <w:rFonts w:cs="Arial"/>
+        </w:rPr>
+        <w:t xml:space="preserve"> &gt; </w:t>
+      </w:r>
+      <w:proofErr w:type="spellStart"/>
+      <w:r>
+        <w:rPr>
+          <w:rStyle w:val="HTMLCode"/>
+          <w:rFonts w:cs="Arial"/>
+        </w:rPr>
+        <w:t>Posición_X_Puntera</w:t>
+      </w:r>
+      <w:proofErr w:type="spellEnd"/>
+      <w:r>
+        <w:rPr>
+          <w:rStyle w:val="HTMLCode"/>
+          <w:rFonts w:cs="Arial"/>
+        </w:rPr>
+        <w:t>) -&gt; "</w:t>
       </w:r>
       <w:r>
         <w:rPr>
@@ -2214,7 +3637,21 @@
         <w:rPr>
           <w:rFonts w:cs="Arial"/>
         </w:rPr>
-        <w:t>Para que la aplicación fluya en teléfonos móviles de gama media sin sobrecalentamiento ni caídas de frames, se aplicará un estricto protocolo de rendimiento:</w:t>
+        <w:t xml:space="preserve">Para que la aplicación fluya en teléfonos móviles de gama media sin sobrecalentamiento ni caídas de </w:t>
+      </w:r>
+      <w:proofErr w:type="spellStart"/>
+      <w:r>
+        <w:rPr>
+          <w:rFonts w:cs="Arial"/>
+        </w:rPr>
+        <w:t>frames</w:t>
+      </w:r>
+      <w:proofErr w:type="spellEnd"/>
+      <w:r>
+        <w:rPr>
+          <w:rFonts w:cs="Arial"/>
+        </w:rPr>
+        <w:t>, se aplicará un estricto protocolo de rendimiento:</w:t>
       </w:r>
     </w:p>
     <w:p>
@@ -2230,27 +3667,74 @@
           <w:rFonts w:cs="Arial"/>
         </w:rPr>
       </w:pPr>
+      <w:proofErr w:type="spellStart"/>
       <w:r>
         <w:rPr>
           <w:rFonts w:cs="Arial"/>
           <w:b/>
           <w:bCs/>
         </w:rPr>
-        <w:t>Frame Skipping (Salto de Fotogramas):</w:t>
-      </w:r>
-      <w:r>
-        <w:rPr>
-          <w:rFonts w:cs="Arial"/>
-        </w:rPr>
-        <w:t xml:space="preserve"> No es necesario analizar video a 30 o 60 FPS. El movimiento de hipertrofia o fuerza es relativamente lento. Se procesará </w:t>
-      </w:r>
+        <w:lastRenderedPageBreak/>
+        <w:t>Frame</w:t>
+      </w:r>
+      <w:proofErr w:type="spellEnd"/>
       <w:r>
         <w:rPr>
           <w:rFonts w:cs="Arial"/>
           <w:b/>
           <w:bCs/>
         </w:rPr>
-        <w:t>1 frame de cada 5</w:t>
+        <w:t xml:space="preserve"> </w:t>
+      </w:r>
+      <w:proofErr w:type="spellStart"/>
+      <w:r>
+        <w:rPr>
+          <w:rFonts w:cs="Arial"/>
+          <w:b/>
+          <w:bCs/>
+        </w:rPr>
+        <w:t>Skipping</w:t>
+      </w:r>
+      <w:proofErr w:type="spellEnd"/>
+      <w:r>
+        <w:rPr>
+          <w:rFonts w:cs="Arial"/>
+          <w:b/>
+          <w:bCs/>
+        </w:rPr>
+        <w:t xml:space="preserve"> (Salto de Fotogramas):</w:t>
+      </w:r>
+      <w:r>
+        <w:rPr>
+          <w:rFonts w:cs="Arial"/>
+        </w:rPr>
+        <w:t xml:space="preserve"> No es necesario analizar video a 30 o 60 FPS. El movimiento de hipertrofia o fuerza es relativamente lento. Se procesará </w:t>
+      </w:r>
+      <w:r>
+        <w:rPr>
+          <w:rFonts w:cs="Arial"/>
+          <w:b/>
+          <w:bCs/>
+        </w:rPr>
+        <w:t xml:space="preserve">1 </w:t>
+      </w:r>
+      <w:proofErr w:type="spellStart"/>
+      <w:r>
+        <w:rPr>
+          <w:rFonts w:cs="Arial"/>
+          <w:b/>
+          <w:bCs/>
+        </w:rPr>
+        <w:t>frame</w:t>
+      </w:r>
+      <w:proofErr w:type="spellEnd"/>
+      <w:r>
+        <w:rPr>
+          <w:rFonts w:cs="Arial"/>
+          <w:b/>
+          <w:bCs/>
+        </w:rPr>
+        <w:t xml:space="preserve"> de cada 5</w:t>
       </w:r>
       <w:r>
         <w:rPr>
@@ -2286,27 +3770,88 @@
           <w:rFonts w:cs="Arial"/>
         </w:rPr>
       </w:pPr>
+      <w:proofErr w:type="spellStart"/>
       <w:r>
         <w:rPr>
           <w:rFonts w:cs="Arial"/>
           <w:b/>
           <w:bCs/>
         </w:rPr>
-        <w:t>Downscaling (Redimensionado):</w:t>
-      </w:r>
-      <w:r>
-        <w:rPr>
-          <w:rFonts w:cs="Arial"/>
-        </w:rPr>
-        <w:t xml:space="preserve"> Antes de pasar por la red neuronal de estimación (OpenCV/MediaPipe), el frame original se reducirá a dimensiones óptimas (ej. </w:t>
+        <w:t>Downscaling</w:t>
+      </w:r>
+      <w:proofErr w:type="spellEnd"/>
+      <w:r>
+        <w:rPr>
+          <w:rFonts w:cs="Arial"/>
+          <w:b/>
+          <w:bCs/>
+        </w:rPr>
+        <w:t xml:space="preserve"> (Redimensionado):</w:t>
+      </w:r>
+      <w:r>
+        <w:rPr>
+          <w:rFonts w:cs="Arial"/>
+        </w:rPr>
+        <w:t xml:space="preserve"> Antes de pasar por la red neuronal de estimación (</w:t>
+      </w:r>
+      <w:proofErr w:type="spellStart"/>
+      <w:r>
+        <w:rPr>
+          <w:rFonts w:cs="Arial"/>
+        </w:rPr>
+        <w:t>OpenCV</w:t>
+      </w:r>
+      <w:proofErr w:type="spellEnd"/>
+      <w:r>
+        <w:rPr>
+          <w:rFonts w:cs="Arial"/>
+        </w:rPr>
+        <w:t>/</w:t>
+      </w:r>
+      <w:proofErr w:type="spellStart"/>
+      <w:r>
+        <w:rPr>
+          <w:rFonts w:cs="Arial"/>
+        </w:rPr>
+        <w:t>MediaPipe</w:t>
+      </w:r>
+      <w:proofErr w:type="spellEnd"/>
+      <w:r>
+        <w:rPr>
+          <w:rFonts w:cs="Arial"/>
+        </w:rPr>
+        <w:t xml:space="preserve">), el </w:t>
+      </w:r>
+      <w:proofErr w:type="spellStart"/>
+      <w:r>
+        <w:rPr>
+          <w:rFonts w:cs="Arial"/>
+        </w:rPr>
+        <w:t>frame</w:t>
+      </w:r>
+      <w:proofErr w:type="spellEnd"/>
+      <w:r>
+        <w:rPr>
+          <w:rFonts w:cs="Arial"/>
+        </w:rPr>
+        <w:t xml:space="preserve"> original se reducirá a dimensiones óptimas (ej. </w:t>
       </w:r>
       <w:r>
         <w:rPr>
           <w:rStyle w:val="HTMLCode"/>
           <w:rFonts w:cs="Arial"/>
         </w:rPr>
-        <w:t>256x256 px</w:t>
-      </w:r>
+        <w:t xml:space="preserve">256x256 </w:t>
+      </w:r>
+      <w:proofErr w:type="spellStart"/>
+      <w:r>
+        <w:rPr>
+          <w:rStyle w:val="HTMLCode"/>
+          <w:rFonts w:cs="Arial"/>
+        </w:rPr>
+        <w:t>px</w:t>
+      </w:r>
+      <w:proofErr w:type="spellEnd"/>
       <w:r>
         <w:rPr>
           <w:rFonts w:cs="Arial"/>
@@ -2318,8 +3863,17 @@
           <w:rStyle w:val="HTMLCode"/>
           <w:rFonts w:cs="Arial"/>
         </w:rPr>
-        <w:t>224x224 px</w:t>
-      </w:r>
+        <w:t xml:space="preserve">224x224 </w:t>
+      </w:r>
+      <w:proofErr w:type="spellStart"/>
+      <w:r>
+        <w:rPr>
+          <w:rStyle w:val="HTMLCode"/>
+          <w:rFonts w:cs="Arial"/>
+        </w:rPr>
+        <w:t>px</w:t>
+      </w:r>
+      <w:proofErr w:type="spellEnd"/>
       <w:r>
         <w:rPr>
           <w:rFonts w:cs="Arial"/>
@@ -2341,7 +3895,6 @@
           <w:rFonts w:cs="Arial"/>
           <w:noProof/>
         </w:rPr>
-        <w:lastRenderedPageBreak/>
         <w:drawing>
           <wp:anchor distT="0" distB="0" distL="114300" distR="114300" simplePos="0" relativeHeight="251659264" behindDoc="1" locked="0" layoutInCell="1" allowOverlap="1" wp14:anchorId="2004F37C" wp14:editId="001F3323">
             <wp:simplePos x="0" y="0"/>
@@ -2605,6 +4158,7 @@
         <w:rPr>
           <w:noProof/>
         </w:rPr>
+        <w:lastRenderedPageBreak/>
         <w:drawing>
           <wp:inline distT="0" distB="0" distL="0" distR="0" wp14:anchorId="55E8FA1D" wp14:editId="5D68251D">
             <wp:extent cx="5943600" cy="3375025"/>
@@ -2710,11 +4264,19 @@
           <w:rFonts w:ascii="Times New Roman" w:hAnsi="Times New Roman"/>
         </w:rPr>
       </w:pPr>
-      <w:r>
-        <w:rPr>
-          <w:rFonts w:cs="Arial"/>
-        </w:rPr>
-        <w:t xml:space="preserve">Codigo pedido a la IA: </w:t>
+      <w:proofErr w:type="spellStart"/>
+      <w:r>
+        <w:rPr>
+          <w:rFonts w:cs="Arial"/>
+        </w:rPr>
+        <w:t>Codigo</w:t>
+      </w:r>
+      <w:proofErr w:type="spellEnd"/>
+      <w:r>
+        <w:rPr>
+          <w:rFonts w:cs="Arial"/>
+        </w:rPr>
+        <w:t xml:space="preserve"> pedido a la IA: </w:t>
       </w:r>
       <w:r>
         <w:t>4️</w:t>
@@ -2739,7 +4301,15 @@
         <w:jc w:val="left"/>
       </w:pPr>
       <w:r>
-        <w:t>Normaliza todos los keypoints por torso/cadera → posición y tamaño</w:t>
+        <w:t xml:space="preserve">Normaliza todos los </w:t>
+      </w:r>
+      <w:proofErr w:type="spellStart"/>
+      <w:r>
+        <w:t>keypoints</w:t>
+      </w:r>
+      <w:proofErr w:type="spellEnd"/>
+      <w:r>
+        <w:t xml:space="preserve"> por torso/cadera → posición y tamaño</w:t>
       </w:r>
     </w:p>
     <w:p>
@@ -2846,11 +4416,19 @@
       <w:r>
         <w:t xml:space="preserve">Extrae </w:t>
       </w:r>
+      <w:proofErr w:type="spellStart"/>
       <w:r>
         <w:rPr>
           <w:rStyle w:val="Strong"/>
         </w:rPr>
-        <w:t>features universales por repetición</w:t>
+        <w:t>features</w:t>
+      </w:r>
+      <w:proofErr w:type="spellEnd"/>
+      <w:r>
+        <w:rPr>
+          <w:rStyle w:val="Strong"/>
+        </w:rPr>
+        <w:t xml:space="preserve"> universales por repetición</w:t>
       </w:r>
       <w:r>
         <w:t>:</w:t>
@@ -2866,8 +4444,13 @@
         <w:jc w:val="left"/>
       </w:pPr>
       <w:r>
-        <w:t>ROM máximo/minimo</w:t>
-      </w:r>
+        <w:t>ROM máximo/</w:t>
+      </w:r>
+      <w:proofErr w:type="spellStart"/>
+      <w:r>
+        <w:t>minimo</w:t>
+      </w:r>
+      <w:proofErr w:type="spellEnd"/>
     </w:p>
     <w:p>
       <w:pPr>
@@ -2905,7 +4488,15 @@
         <w:jc w:val="left"/>
       </w:pPr>
       <w:r>
-        <w:t>Guarda todo en un dataset por repetición → listo para ML o reglas</w:t>
+        <w:t xml:space="preserve">Guarda todo en un </w:t>
+      </w:r>
+      <w:proofErr w:type="spellStart"/>
+      <w:r>
+        <w:t>dataset</w:t>
+      </w:r>
+      <w:proofErr w:type="spellEnd"/>
+      <w:r>
+        <w:t xml:space="preserve"> por repetición → listo para ML o reglas</w:t>
       </w:r>
     </w:p>
     <w:p>
@@ -2950,6 +4541,7 @@
           <w:b/>
           <w:bCs/>
         </w:rPr>
+        <w:lastRenderedPageBreak/>
         <w:t>Activación muscular esperada (El gran problema):</w:t>
       </w:r>
       <w:r>
@@ -2983,7 +4575,15 @@
         <w:t>Balanceos y compensaciones (Estabilidad real):</w:t>
       </w:r>
       <w:r>
-        <w:t xml:space="preserve"> Puedes detectar con MediaPipe si el tronco se inclina hacia adelante, pero ¿cómo sabes si el usuario está perdiendo el equilibrio o simplemente tiene esa anatomía? El equilibrio real se define </w:t>
+        <w:t xml:space="preserve"> Puedes detectar con </w:t>
+      </w:r>
+      <w:proofErr w:type="spellStart"/>
+      <w:r>
+        <w:t>MediaPipe</w:t>
+      </w:r>
+      <w:proofErr w:type="spellEnd"/>
+      <w:r>
+        <w:t xml:space="preserve"> si el tronco se inclina hacia adelante, pero ¿cómo sabes si el usuario está perdiendo el equilibrio o simplemente tiene esa anatomía? El equilibrio real se define </w:t>
       </w:r>
       <w:r>
         <w:rPr>
@@ -3081,16 +4681,303 @@
           <w:color w:val="E3E3E3"/>
           <w:shd w:val="clear" w:color="auto" w:fill="282A2C"/>
         </w:rPr>
-        <w:t> dame el codigo para la red, acuerdate de todos los kpis, extraer repeticiones, y todo lo que hemos hablado.</w:t>
-      </w:r>
-      <w:r>
-        <w:t xml:space="preserve"> Apuntar posteriormente los kpis indicados.</w:t>
-      </w:r>
+        <w:t xml:space="preserve"> dame el </w:t>
+      </w:r>
+      <w:proofErr w:type="spellStart"/>
+      <w:r>
+        <w:rPr>
+          <w:rFonts w:cs="Arial"/>
+          <w:color w:val="E3E3E3"/>
+          <w:shd w:val="clear" w:color="auto" w:fill="282A2C"/>
+        </w:rPr>
+        <w:t>codigo</w:t>
+      </w:r>
+      <w:proofErr w:type="spellEnd"/>
+      <w:r>
+        <w:rPr>
+          <w:rFonts w:cs="Arial"/>
+          <w:color w:val="E3E3E3"/>
+          <w:shd w:val="clear" w:color="auto" w:fill="282A2C"/>
+        </w:rPr>
+        <w:t xml:space="preserve"> para la red, </w:t>
+      </w:r>
+      <w:proofErr w:type="spellStart"/>
+      <w:r>
+        <w:rPr>
+          <w:rFonts w:cs="Arial"/>
+          <w:color w:val="E3E3E3"/>
+          <w:shd w:val="clear" w:color="auto" w:fill="282A2C"/>
+        </w:rPr>
+        <w:t>acuerdate</w:t>
+      </w:r>
+      <w:proofErr w:type="spellEnd"/>
+      <w:r>
+        <w:rPr>
+          <w:rFonts w:cs="Arial"/>
+          <w:color w:val="E3E3E3"/>
+          <w:shd w:val="clear" w:color="auto" w:fill="282A2C"/>
+        </w:rPr>
+        <w:t xml:space="preserve"> de todos los </w:t>
+      </w:r>
+      <w:proofErr w:type="spellStart"/>
+      <w:r>
+        <w:rPr>
+          <w:rFonts w:cs="Arial"/>
+          <w:color w:val="E3E3E3"/>
+          <w:shd w:val="clear" w:color="auto" w:fill="282A2C"/>
+        </w:rPr>
+        <w:t>kpis</w:t>
+      </w:r>
+      <w:proofErr w:type="spellEnd"/>
+      <w:r>
+        <w:rPr>
+          <w:rFonts w:cs="Arial"/>
+          <w:color w:val="E3E3E3"/>
+          <w:shd w:val="clear" w:color="auto" w:fill="282A2C"/>
+        </w:rPr>
+        <w:t>, extraer repeticiones, y todo lo que hemos hablado.</w:t>
+      </w:r>
+      <w:r>
+        <w:t xml:space="preserve"> Apuntar posteriormente los </w:t>
+      </w:r>
+      <w:proofErr w:type="spellStart"/>
+      <w:r>
+        <w:t>kpis</w:t>
+      </w:r>
+      <w:proofErr w:type="spellEnd"/>
+      <w:r>
+        <w:t xml:space="preserve"> indicados.</w:t>
+      </w:r>
+    </w:p>
+    <w:p>
+      <w:pPr>
+        <w:pStyle w:val="NormalWeb"/>
+        <w:jc w:val="left"/>
+      </w:pPr>
+    </w:p>
+    <w:p>
+      <w:pPr>
+        <w:pStyle w:val="NormalWeb"/>
+        <w:jc w:val="left"/>
+      </w:pPr>
+      <w:r>
+        <w:t xml:space="preserve">Videos </w:t>
+      </w:r>
+      <w:r>
+        <w:sym w:font="Wingdings" w:char="F0E0"/>
+      </w:r>
+      <w:r>
+        <w:t xml:space="preserve"> </w:t>
+      </w:r>
+      <w:hyperlink r:id="rId26" w:history="1">
+        <w:r>
+          <w:rPr>
+            <w:rStyle w:val="Hyperlink"/>
+          </w:rPr>
+          <w:t>https://zenodo.org/records/13305826</w:t>
+        </w:r>
+      </w:hyperlink>
+      <w:r>
+        <w:t xml:space="preserve"> </w:t>
+      </w:r>
+      <w:r>
+        <w:t xml:space="preserve">  </w:t>
+      </w:r>
+      <w:hyperlink r:id="rId27" w:history="1">
+        <w:r>
+          <w:rPr>
+            <w:rStyle w:val="Hyperlink"/>
+          </w:rPr>
+          <w:t>https://zenodo.org/records/7672767</w:t>
+        </w:r>
+      </w:hyperlink>
+    </w:p>
+    <w:p>
+      <w:pPr>
+        <w:jc w:val="left"/>
+        <w:rPr>
+          <w:rFonts w:eastAsia="Times New Roman" w:cs="Times New Roman"/>
+          <w:sz w:val="24"/>
+          <w:szCs w:val="24"/>
+          <w:lang w:val="es-ES"/>
+        </w:rPr>
+      </w:pPr>
+      <w:hyperlink r:id="rId28" w:history="1">
+        <w:r>
+          <w:rPr>
+            <w:rStyle w:val="Hyperlink"/>
+            <w:rFonts w:eastAsia="Times New Roman" w:cs="Times New Roman"/>
+            <w:sz w:val="24"/>
+            <w:szCs w:val="24"/>
+            <w:lang w:val="es-ES"/>
+          </w:rPr>
+          <w:t>https://github.com/Ro-ya-cv4Africa/acvdatasets</w:t>
+        </w:r>
+      </w:hyperlink>
+    </w:p>
+    <w:p>
+      <w:pPr>
+        <w:jc w:val="left"/>
+        <w:rPr>
+          <w:rFonts w:eastAsia="Times New Roman" w:cs="Times New Roman"/>
+          <w:sz w:val="24"/>
+          <w:szCs w:val="24"/>
+          <w:lang w:val="es-ES"/>
+        </w:rPr>
+      </w:pPr>
+      <w:hyperlink r:id="rId29" w:history="1">
+        <w:r>
+          <w:rPr>
+            <w:rStyle w:val="Hyperlink"/>
+            <w:rFonts w:eastAsia="Times New Roman" w:cs="Times New Roman"/>
+            <w:sz w:val="24"/>
+            <w:szCs w:val="24"/>
+            <w:lang w:val="es-ES"/>
+          </w:rPr>
+          <w:t>https://mmfit.github.io/</w:t>
+        </w:r>
+      </w:hyperlink>
+      <w:r>
+        <w:rPr>
+          <w:rFonts w:eastAsia="Times New Roman" w:cs="Times New Roman"/>
+          <w:sz w:val="24"/>
+          <w:szCs w:val="24"/>
+          <w:lang w:val="es-ES"/>
+        </w:rPr>
+        <w:t xml:space="preserve"> </w:t>
+      </w:r>
+    </w:p>
+    <w:p>
+      <w:pPr>
+        <w:pStyle w:val="NormalWeb"/>
+        <w:jc w:val="left"/>
+      </w:pPr>
+      <w:r>
+        <w:t>['</w:t>
+      </w:r>
+      <w:proofErr w:type="spellStart"/>
+      <w:r>
+        <w:t>L_elbow</w:t>
+      </w:r>
+      <w:proofErr w:type="spellEnd"/>
+      <w:r>
+        <w:t>', '</w:t>
+      </w:r>
+      <w:proofErr w:type="spellStart"/>
+      <w:r>
+        <w:t>R_elbow</w:t>
+      </w:r>
+      <w:proofErr w:type="spellEnd"/>
+      <w:r>
+        <w:t>', '</w:t>
+      </w:r>
+      <w:proofErr w:type="spellStart"/>
+      <w:r>
+        <w:t>L_shoulder</w:t>
+      </w:r>
+      <w:proofErr w:type="spellEnd"/>
+      <w:r>
+        <w:t>', '</w:t>
+      </w:r>
+      <w:proofErr w:type="spellStart"/>
+      <w:r>
+        <w:t>R_shoulder</w:t>
+      </w:r>
+      <w:proofErr w:type="spellEnd"/>
+      <w:r>
+        <w:t>', '</w:t>
+      </w:r>
+      <w:proofErr w:type="spellStart"/>
+      <w:r>
+        <w:t>L_knee</w:t>
+      </w:r>
+      <w:proofErr w:type="spellEnd"/>
+      <w:r>
+        <w:t>', '</w:t>
+      </w:r>
+      <w:proofErr w:type="spellStart"/>
+      <w:r>
+        <w:t>R_knee</w:t>
+      </w:r>
+      <w:proofErr w:type="spellEnd"/>
+      <w:r>
+        <w:t>', '</w:t>
+      </w:r>
+      <w:proofErr w:type="spellStart"/>
+      <w:r>
+        <w:t>L_hip</w:t>
+      </w:r>
+      <w:proofErr w:type="spellEnd"/>
+      <w:r>
+        <w:t>', '</w:t>
+      </w:r>
+      <w:proofErr w:type="spellStart"/>
+      <w:r>
+        <w:t>R_hip</w:t>
+      </w:r>
+      <w:proofErr w:type="spellEnd"/>
+      <w:r>
+        <w:t>', '</w:t>
+      </w:r>
+      <w:proofErr w:type="spellStart"/>
+      <w:r>
+        <w:t>L_ankle</w:t>
+      </w:r>
+      <w:proofErr w:type="spellEnd"/>
+      <w:r>
+        <w:t>', '</w:t>
+      </w:r>
+      <w:proofErr w:type="spellStart"/>
+      <w:r>
+        <w:t>R_ankle</w:t>
+      </w:r>
+      <w:proofErr w:type="spellEnd"/>
+      <w:r>
+        <w:t>', 'torso', '</w:t>
+      </w:r>
+      <w:proofErr w:type="spellStart"/>
+      <w:r>
+        <w:t>sust_x</w:t>
+      </w:r>
+      <w:proofErr w:type="spellEnd"/>
+      <w:r>
+        <w:t>', '</w:t>
+      </w:r>
+      <w:proofErr w:type="spellStart"/>
+      <w:r>
+        <w:t>sust_y</w:t>
+      </w:r>
+      <w:proofErr w:type="spellEnd"/>
+      <w:r>
+        <w:t>', '</w:t>
+      </w:r>
+      <w:proofErr w:type="spellStart"/>
+      <w:r>
+        <w:t>sust_z</w:t>
+      </w:r>
+      <w:proofErr w:type="spellEnd"/>
+      <w:r>
+        <w:t>', '</w:t>
+      </w:r>
+      <w:proofErr w:type="spellStart"/>
+      <w:r>
+        <w:t>delta_time</w:t>
+      </w:r>
+      <w:proofErr w:type="spellEnd"/>
+      <w:r>
+        <w:t>']</w:t>
+      </w:r>
+    </w:p>
+    <w:p>
+      <w:pPr>
+        <w:pStyle w:val="NormalWeb"/>
+        <w:jc w:val="left"/>
+      </w:pPr>
     </w:p>
     <w:sectPr>
-      <w:headerReference w:type="default" r:id="rId26"/>
-      <w:footerReference w:type="default" r:id="rId27"/>
-      <w:headerReference w:type="first" r:id="rId28"/>
+      <w:headerReference w:type="default" r:id="rId30"/>
+      <w:footerReference w:type="default" r:id="rId31"/>
+      <w:headerReference w:type="first" r:id="rId32"/>
       <w:pgSz w:w="12240" w:h="15840"/>
       <w:pgMar w:top="1080" w:right="1440" w:bottom="1080" w:left="1440" w:header="0" w:footer="720" w:gutter="0"/>
       <w:pgNumType w:start="0"/>

</xml_diff>

<commit_message>
Reestructuración de las carpetas, cambio en como entrenar la red para poder subir las etiquetas de los videos directamente desde un .txt
</commit_message>
<xml_diff>
--- a/docs/Planning.docx
+++ b/docs/Planning.docx
@@ -283,7 +283,6 @@
           <w:lang w:val="es-ES"/>
         </w:rPr>
       </w:pPr>
-      <w:proofErr w:type="spellStart"/>
       <w:r>
         <w:rPr>
           <w:lang w:val="es-ES"/>
@@ -291,7 +290,6 @@
         <w:lastRenderedPageBreak/>
         <w:t>Sprints</w:t>
       </w:r>
-      <w:proofErr w:type="spellEnd"/>
     </w:p>
     <w:p>
       <w:pPr>
@@ -329,89 +327,33 @@
         <w:rPr>
           <w:lang w:val="es-ES"/>
         </w:rPr>
-        <w:t xml:space="preserve">--&gt; Primero de todo he instalado el </w:t>
-      </w:r>
-      <w:proofErr w:type="spellStart"/>
-      <w:r>
-        <w:rPr>
-          <w:lang w:val="es-ES"/>
-        </w:rPr>
-        <w:t>framework</w:t>
-      </w:r>
-      <w:proofErr w:type="spellEnd"/>
-      <w:r>
-        <w:rPr>
-          <w:lang w:val="es-ES"/>
-        </w:rPr>
-        <w:t xml:space="preserve"> de Android </w:t>
-      </w:r>
-      <w:proofErr w:type="spellStart"/>
-      <w:r>
-        <w:rPr>
-          <w:lang w:val="es-ES"/>
-        </w:rPr>
-        <w:t>studio</w:t>
-      </w:r>
-      <w:proofErr w:type="spellEnd"/>
-      <w:r>
-        <w:rPr>
-          <w:lang w:val="es-ES"/>
-        </w:rPr>
-        <w:t>, y he iniciado un proyecto de 0.</w:t>
-      </w:r>
-    </w:p>
-    <w:p>
-      <w:pPr>
-        <w:rPr>
-          <w:lang w:val="es-ES"/>
-        </w:rPr>
-      </w:pPr>
-      <w:r>
-        <w:rPr>
-          <w:lang w:val="es-ES"/>
-        </w:rPr>
-        <w:t xml:space="preserve">--&gt; Posteriormente he creado un repositorio en </w:t>
-      </w:r>
-      <w:proofErr w:type="spellStart"/>
-      <w:r>
-        <w:rPr>
-          <w:lang w:val="es-ES"/>
-        </w:rPr>
-        <w:t>gitlab</w:t>
-      </w:r>
-      <w:proofErr w:type="spellEnd"/>
-      <w:r>
-        <w:rPr>
-          <w:lang w:val="es-ES"/>
-        </w:rPr>
-        <w:t xml:space="preserve"> para tener un control de versiones.</w:t>
-      </w:r>
-    </w:p>
-    <w:p>
-      <w:pPr>
-        <w:rPr>
-          <w:lang w:val="es-ES"/>
-        </w:rPr>
-      </w:pPr>
-      <w:r>
-        <w:rPr>
-          <w:lang w:val="es-ES"/>
-        </w:rPr>
-        <w:t xml:space="preserve">--&gt; He trasteado un poco en el </w:t>
-      </w:r>
-      <w:proofErr w:type="spellStart"/>
-      <w:r>
-        <w:rPr>
-          <w:lang w:val="es-ES"/>
-        </w:rPr>
-        <w:t>framework</w:t>
-      </w:r>
-      <w:proofErr w:type="spellEnd"/>
-      <w:r>
-        <w:rPr>
-          <w:lang w:val="es-ES"/>
-        </w:rPr>
-        <w:t xml:space="preserve"> y he ido programando la aplicación, primero poder hacer fotos y videos y luego poder adjuntar cosas de la galería.</w:t>
+        <w:t>--&gt; Primero de todo he instalado el framework de Android studio, y he iniciado un proyecto de 0.</w:t>
+      </w:r>
+    </w:p>
+    <w:p>
+      <w:pPr>
+        <w:rPr>
+          <w:lang w:val="es-ES"/>
+        </w:rPr>
+      </w:pPr>
+      <w:r>
+        <w:rPr>
+          <w:lang w:val="es-ES"/>
+        </w:rPr>
+        <w:t>--&gt; Posteriormente he creado un repositorio en gitlab para tener un control de versiones.</w:t>
+      </w:r>
+    </w:p>
+    <w:p>
+      <w:pPr>
+        <w:rPr>
+          <w:lang w:val="es-ES"/>
+        </w:rPr>
+      </w:pPr>
+      <w:r>
+        <w:rPr>
+          <w:lang w:val="es-ES"/>
+        </w:rPr>
+        <w:t>--&gt; He trasteado un poco en el framework y he ido programando la aplicación, primero poder hacer fotos y videos y luego poder adjuntar cosas de la galería.</w:t>
       </w:r>
     </w:p>
     <w:p>
@@ -437,21 +379,7 @@
         <w:rPr>
           <w:lang w:val="es-ES"/>
         </w:rPr>
-        <w:t xml:space="preserve">--&gt; la opción de poder cambiar la foto o video subido </w:t>
-      </w:r>
-      <w:proofErr w:type="spellStart"/>
-      <w:r>
-        <w:rPr>
-          <w:lang w:val="es-ES"/>
-        </w:rPr>
-        <w:t>asi</w:t>
-      </w:r>
-      <w:proofErr w:type="spellEnd"/>
-      <w:r>
-        <w:rPr>
-          <w:lang w:val="es-ES"/>
-        </w:rPr>
-        <w:t xml:space="preserve"> de enviarla al servidor.</w:t>
+        <w:t>--&gt; la opción de poder cambiar la foto o video subido asi de enviarla al servidor.</w:t>
       </w:r>
     </w:p>
     <w:p>
@@ -503,21 +431,7 @@
         <w:rPr>
           <w:lang w:val="es-ES"/>
         </w:rPr>
-        <w:t xml:space="preserve">Además, mirar alguna alternativa a </w:t>
-      </w:r>
-      <w:proofErr w:type="spellStart"/>
-      <w:r>
-        <w:rPr>
-          <w:lang w:val="es-ES"/>
-        </w:rPr>
-        <w:t>openpose</w:t>
-      </w:r>
-      <w:proofErr w:type="spellEnd"/>
-      <w:r>
-        <w:rPr>
-          <w:lang w:val="es-ES"/>
-        </w:rPr>
-        <w:t>.</w:t>
+        <w:t>Además, mirar alguna alternativa a openpose.</w:t>
       </w:r>
     </w:p>
     <w:p>
@@ -569,132 +483,20 @@
         <w:rPr>
           <w:lang w:val="es-ES"/>
         </w:rPr>
-        <w:t xml:space="preserve">En primer </w:t>
-      </w:r>
-      <w:proofErr w:type="gramStart"/>
-      <w:r>
-        <w:rPr>
-          <w:lang w:val="es-ES"/>
-        </w:rPr>
-        <w:t>lugar</w:t>
-      </w:r>
-      <w:proofErr w:type="gramEnd"/>
-      <w:r>
-        <w:rPr>
-          <w:lang w:val="es-ES"/>
-        </w:rPr>
-        <w:t xml:space="preserve"> trabajaremos con el análisis de imágenes intentando conseguir los </w:t>
-      </w:r>
-      <w:proofErr w:type="spellStart"/>
-      <w:r>
-        <w:rPr>
-          <w:lang w:val="es-ES"/>
-        </w:rPr>
-        <w:t>keypoints</w:t>
-      </w:r>
-      <w:proofErr w:type="spellEnd"/>
-      <w:r>
-        <w:rPr>
-          <w:lang w:val="es-ES"/>
-        </w:rPr>
-        <w:t xml:space="preserve"> del cuerpo humano a través de </w:t>
-      </w:r>
-      <w:proofErr w:type="spellStart"/>
-      <w:r>
-        <w:rPr>
-          <w:lang w:val="es-ES"/>
-        </w:rPr>
-        <w:t>mediapipe</w:t>
-      </w:r>
-      <w:proofErr w:type="spellEnd"/>
-      <w:r>
-        <w:rPr>
-          <w:lang w:val="es-ES"/>
-        </w:rPr>
-        <w:t xml:space="preserve">. Para ello requiere un análisis </w:t>
-      </w:r>
-      <w:proofErr w:type="spellStart"/>
-      <w:r>
-        <w:rPr>
-          <w:lang w:val="es-ES"/>
-        </w:rPr>
-        <w:t>he</w:t>
-      </w:r>
-      <w:proofErr w:type="spellEnd"/>
-      <w:r>
-        <w:rPr>
-          <w:lang w:val="es-ES"/>
-        </w:rPr>
-        <w:t xml:space="preserve"> investigación propia, tanto de la propia </w:t>
-      </w:r>
-      <w:proofErr w:type="spellStart"/>
-      <w:r>
-        <w:rPr>
-          <w:lang w:val="es-ES"/>
-        </w:rPr>
-        <w:t>docimentacion</w:t>
-      </w:r>
-      <w:proofErr w:type="spellEnd"/>
-      <w:r>
-        <w:rPr>
-          <w:lang w:val="es-ES"/>
-        </w:rPr>
-        <w:t xml:space="preserve"> como de repositorios de </w:t>
-      </w:r>
-      <w:proofErr w:type="spellStart"/>
-      <w:r>
-        <w:rPr>
-          <w:lang w:val="es-ES"/>
-        </w:rPr>
-        <w:t>github</w:t>
-      </w:r>
-      <w:proofErr w:type="spellEnd"/>
-      <w:r>
-        <w:rPr>
-          <w:lang w:val="es-ES"/>
-        </w:rPr>
-        <w:t xml:space="preserve"> los cuales ya han usado esta técnica. </w:t>
-      </w:r>
-    </w:p>
-    <w:p>
-      <w:pPr>
-        <w:rPr>
-          <w:lang w:val="es-ES"/>
-        </w:rPr>
-      </w:pPr>
-      <w:r>
-        <w:rPr>
-          <w:lang w:val="es-ES"/>
-        </w:rPr>
-        <w:t xml:space="preserve">Una vez obtenido los 33 </w:t>
-      </w:r>
-      <w:proofErr w:type="spellStart"/>
-      <w:r>
-        <w:rPr>
-          <w:lang w:val="es-ES"/>
-        </w:rPr>
-        <w:t>keypoints</w:t>
-      </w:r>
-      <w:proofErr w:type="spellEnd"/>
-      <w:r>
-        <w:rPr>
-          <w:lang w:val="es-ES"/>
-        </w:rPr>
-        <w:t xml:space="preserve"> intentamos calcular los ángulos de las articulaciones </w:t>
-      </w:r>
-      <w:proofErr w:type="spellStart"/>
-      <w:r>
-        <w:rPr>
-          <w:lang w:val="es-ES"/>
-        </w:rPr>
-        <w:t>mas</w:t>
-      </w:r>
-      <w:proofErr w:type="spellEnd"/>
-      <w:r>
-        <w:rPr>
-          <w:lang w:val="es-ES"/>
-        </w:rPr>
-        <w:t xml:space="preserve"> importantes del cuerpo como rodilla, codo ,… Una vez obtenidos estos ángulos me doy cuenta de los siguientes problemas:</w:t>
+        <w:t xml:space="preserve">En primer lugar trabajaremos con el análisis de imágenes intentando conseguir los keypoints del cuerpo humano a través de mediapipe. Para ello requiere un análisis he investigación propia, tanto de la propia docimentacion como de repositorios de github los cuales ya han usado esta técnica. </w:t>
+      </w:r>
+    </w:p>
+    <w:p>
+      <w:pPr>
+        <w:rPr>
+          <w:lang w:val="es-ES"/>
+        </w:rPr>
+      </w:pPr>
+      <w:r>
+        <w:rPr>
+          <w:lang w:val="es-ES"/>
+        </w:rPr>
+        <w:t>Una vez obtenido los 33 keypoints intentamos calcular los ángulos de las articulaciones mas importantes del cuerpo como rodilla, codo ,… Una vez obtenidos estos ángulos me doy cuenta de los siguientes problemas:</w:t>
       </w:r>
     </w:p>
     <w:p>
@@ -730,35 +532,7 @@
         <w:rPr>
           <w:lang w:val="es-ES"/>
         </w:rPr>
-        <w:t xml:space="preserve">Hay veces que </w:t>
-      </w:r>
-      <w:proofErr w:type="spellStart"/>
-      <w:r>
-        <w:rPr>
-          <w:lang w:val="es-ES"/>
-        </w:rPr>
-        <w:t>medipipe</w:t>
-      </w:r>
-      <w:proofErr w:type="spellEnd"/>
-      <w:r>
-        <w:rPr>
-          <w:lang w:val="es-ES"/>
-        </w:rPr>
-        <w:t xml:space="preserve">, aporta ciertos valores con poca fiabilidad (la cual el propio </w:t>
-      </w:r>
-      <w:proofErr w:type="spellStart"/>
-      <w:r>
-        <w:rPr>
-          <w:lang w:val="es-ES"/>
-        </w:rPr>
-        <w:t>mediapipe</w:t>
-      </w:r>
-      <w:proofErr w:type="spellEnd"/>
-      <w:r>
-        <w:rPr>
-          <w:lang w:val="es-ES"/>
-        </w:rPr>
-        <w:t xml:space="preserve"> te indica a través de un parámetro de fiabilidad), al calcular los ángulos con parámetros poco fiables hay muchos errores, la solución propuesta, es la técnica del espejo, ya que la mayoría de valores poco fiables es debido al perfil de la cámara y la sola obtención de un perfil del usuario.</w:t>
+        <w:t>Hay veces que medipipe, aporta ciertos valores con poca fiabilidad (la cual el propio mediapipe te indica a través de un parámetro de fiabilidad), al calcular los ángulos con parámetros poco fiables hay muchos errores, la solución propuesta, es la técnica del espejo, ya que la mayoría de valores poco fiables es debido al perfil de la cámara y la sola obtención de un perfil del usuario.</w:t>
       </w:r>
     </w:p>
     <w:p>
@@ -798,214 +572,46 @@
           <w:lang w:val="es-ES"/>
         </w:rPr>
         <w:lastRenderedPageBreak/>
-        <w:t xml:space="preserve">Antes de todo he decidido conversar con un experto en la materia (graduado den CACYFD) para que me aconseje sobre el trabajo que estoy realizando con respecto a </w:t>
-      </w:r>
-      <w:proofErr w:type="spellStart"/>
-      <w:r>
-        <w:rPr>
-          <w:lang w:val="es-ES"/>
-        </w:rPr>
-        <w:t>al</w:t>
-      </w:r>
-      <w:proofErr w:type="spellEnd"/>
-      <w:r>
-        <w:rPr>
-          <w:lang w:val="es-ES"/>
-        </w:rPr>
-        <w:t xml:space="preserve"> </w:t>
-      </w:r>
-      <w:proofErr w:type="spellStart"/>
-      <w:r>
-        <w:rPr>
-          <w:lang w:val="es-ES"/>
-        </w:rPr>
-        <w:t>biomecanica</w:t>
-      </w:r>
-      <w:proofErr w:type="spellEnd"/>
-      <w:r>
-        <w:rPr>
-          <w:lang w:val="es-ES"/>
-        </w:rPr>
-        <w:t xml:space="preserve"> y demás. Me ha sugerido añadir el </w:t>
-      </w:r>
-      <w:proofErr w:type="spellStart"/>
-      <w:r>
-        <w:rPr>
-          <w:lang w:val="es-ES"/>
-        </w:rPr>
-        <w:t>calculo</w:t>
-      </w:r>
-      <w:proofErr w:type="spellEnd"/>
-      <w:r>
-        <w:rPr>
-          <w:lang w:val="es-ES"/>
-        </w:rPr>
-        <w:t xml:space="preserve"> del centro de sustentación, el cual tiene una serie de ventajas y hace que se pueda profesionalizar el análisis del ejercicio.</w:t>
-      </w:r>
-    </w:p>
-    <w:p>
-      <w:pPr>
-        <w:rPr>
-          <w:lang w:val="es-ES"/>
-        </w:rPr>
-      </w:pPr>
-      <w:r>
-        <w:rPr>
-          <w:lang w:val="es-ES"/>
-        </w:rPr>
-        <w:t xml:space="preserve">Una vez que tenemos un archivo con todos los ángulos del cuerpo la idea es entrenar a una red neuronal para conseguir que obtenga ciertas conclusiones de los ángulos. Para ello hay que investigar sobre que red es la más adecuada para nuestro caso, y trazar un plan de entrenamiento o fine </w:t>
-      </w:r>
-      <w:proofErr w:type="spellStart"/>
-      <w:r>
-        <w:rPr>
-          <w:lang w:val="es-ES"/>
-        </w:rPr>
-        <w:t>tunning</w:t>
-      </w:r>
-      <w:proofErr w:type="spellEnd"/>
-      <w:r>
-        <w:rPr>
-          <w:lang w:val="es-ES"/>
-        </w:rPr>
-        <w:t xml:space="preserve"> (a poder ser).</w:t>
-      </w:r>
-    </w:p>
-    <w:p>
-      <w:pPr>
-        <w:rPr>
-          <w:lang w:val="es-ES"/>
-        </w:rPr>
-      </w:pPr>
-      <w:r>
-        <w:rPr>
-          <w:lang w:val="es-ES"/>
-        </w:rPr>
-        <w:t xml:space="preserve">Han surgido ciertos problemas a la hora de revisar el trabajo realizado y analizar el </w:t>
-      </w:r>
-      <w:proofErr w:type="spellStart"/>
-      <w:r>
-        <w:rPr>
-          <w:lang w:val="es-ES"/>
-        </w:rPr>
-        <w:t>csv</w:t>
-      </w:r>
-      <w:proofErr w:type="spellEnd"/>
-      <w:r>
-        <w:rPr>
-          <w:lang w:val="es-ES"/>
-        </w:rPr>
-        <w:t xml:space="preserve">. Además, hablar con el experto en </w:t>
-      </w:r>
-      <w:proofErr w:type="spellStart"/>
-      <w:r>
-        <w:rPr>
-          <w:lang w:val="es-ES"/>
-        </w:rPr>
-        <w:t>biomecanica</w:t>
-      </w:r>
-      <w:proofErr w:type="spellEnd"/>
-      <w:r>
-        <w:rPr>
-          <w:lang w:val="es-ES"/>
-        </w:rPr>
-        <w:t xml:space="preserve"> me ha llevado a hacer algunos cambios en el código y en la forma de entender el proceso. En cuanto a software he decidido actualizar el código y las dependencias a la versión más nueva de </w:t>
-      </w:r>
-      <w:proofErr w:type="spellStart"/>
-      <w:r>
-        <w:rPr>
-          <w:lang w:val="es-ES"/>
-        </w:rPr>
-        <w:t>medipipe</w:t>
-      </w:r>
-      <w:proofErr w:type="spellEnd"/>
-      <w:r>
-        <w:rPr>
-          <w:lang w:val="es-ES"/>
-        </w:rPr>
-        <w:t xml:space="preserve">, ya que ha salido recientemente y he visto que tiene bastantes mejoras, el inconveniente es que me ha tocado cambiar el código. Otro aspecto es en la forma de analizar los datos, </w:t>
-      </w:r>
-      <w:proofErr w:type="spellStart"/>
-      <w:r>
-        <w:rPr>
-          <w:lang w:val="es-ES"/>
-        </w:rPr>
-        <w:t>mediapipe</w:t>
-      </w:r>
-      <w:proofErr w:type="spellEnd"/>
-      <w:r>
-        <w:rPr>
-          <w:lang w:val="es-ES"/>
-        </w:rPr>
-        <w:t xml:space="preserve"> da un valor junto con cada </w:t>
-      </w:r>
-      <w:proofErr w:type="spellStart"/>
-      <w:r>
-        <w:rPr>
-          <w:lang w:val="es-ES"/>
-        </w:rPr>
-        <w:t>keypoint</w:t>
-      </w:r>
-      <w:proofErr w:type="spellEnd"/>
-      <w:r>
-        <w:rPr>
-          <w:lang w:val="es-ES"/>
-        </w:rPr>
-        <w:t xml:space="preserve"> de confianza, he decidido filtrar los </w:t>
-      </w:r>
-      <w:proofErr w:type="spellStart"/>
-      <w:r>
-        <w:rPr>
-          <w:lang w:val="es-ES"/>
-        </w:rPr>
-        <w:t>keypoints</w:t>
-      </w:r>
-      <w:proofErr w:type="spellEnd"/>
-      <w:r>
-        <w:rPr>
-          <w:lang w:val="es-ES"/>
-        </w:rPr>
-        <w:t xml:space="preserve"> por una confianza (variable y en pruebas), para asegurar tener una serie de datos más fiables, dejando espacios vacíos en el conjunto de datos si no se capturan bien en lugar de hacer la técnica del espejo o simplemente valores poco fiables. En cuanto a la técnica del espejo he estado investigando debido al consejo del experto, ya que hemos llegado a la conclusión de que la simetría es un aspecto importante a la hora de analizar un ejercicio y al hacer la técnica del espejo si una parte del cuerpo no se ve estamos asumiendo una simetría inventada que puede dar lugar a errores.</w:t>
-      </w:r>
-    </w:p>
-    <w:p>
-      <w:pPr>
-        <w:rPr>
-          <w:lang w:val="es-ES"/>
-        </w:rPr>
-      </w:pPr>
-      <w:r>
-        <w:rPr>
-          <w:lang w:val="es-ES"/>
-        </w:rPr>
-        <w:t xml:space="preserve">Al hablar con la tutora después de investigar un poco sobre el ML y </w:t>
-      </w:r>
-      <w:proofErr w:type="spellStart"/>
-      <w:r>
-        <w:rPr>
-          <w:lang w:val="es-ES"/>
-        </w:rPr>
-        <w:t>como</w:t>
-      </w:r>
-      <w:proofErr w:type="spellEnd"/>
-      <w:r>
-        <w:rPr>
-          <w:lang w:val="es-ES"/>
-        </w:rPr>
-        <w:t xml:space="preserve"> funciona en la parte práctica, nos hemos dado cuenta que es muy difícil entrenar una red neuronal que consiga generalizar y ofrecer técnicas correctas para todos los ejercicios. Por lo que hemos </w:t>
-      </w:r>
-      <w:proofErr w:type="spellStart"/>
-      <w:r>
-        <w:rPr>
-          <w:lang w:val="es-ES"/>
-        </w:rPr>
-        <w:t>obtado</w:t>
-      </w:r>
-      <w:proofErr w:type="spellEnd"/>
-      <w:r>
-        <w:rPr>
-          <w:lang w:val="es-ES"/>
-        </w:rPr>
-        <w:t xml:space="preserve"> por seguir une esquema híbrido en el que nuestra propia red neuronal sacará unos ciertos parámetros para analizar SOLO el movimiento de sentadilla, mientras que para analizar los demás movimientos la idea ahora es subir el archivo con los ángulos y el punto de sustentación (el cual también hemos añadido gracias al experto) y que una IA externa ya entrenada nos analice el ejercicio para poder otorgar una respuesta al usuario sea el ejercicio que sea.</w:t>
+        <w:t>Antes de todo he decidido conversar con un experto en la materia (graduado den CACYFD) para que me aconseje sobre el trabajo que estoy realizando con respecto a al biomecanica y demás. Me ha sugerido añadir el calculo del centro de sustentación, el cual tiene una serie de ventajas y hace que se pueda profesionalizar el análisis del ejercicio.</w:t>
+      </w:r>
+    </w:p>
+    <w:p>
+      <w:pPr>
+        <w:rPr>
+          <w:lang w:val="es-ES"/>
+        </w:rPr>
+      </w:pPr>
+      <w:r>
+        <w:rPr>
+          <w:lang w:val="es-ES"/>
+        </w:rPr>
+        <w:t>Una vez que tenemos un archivo con todos los ángulos del cuerpo la idea es entrenar a una red neuronal para conseguir que obtenga ciertas conclusiones de los ángulos. Para ello hay que investigar sobre que red es la más adecuada para nuestro caso, y trazar un plan de entrenamiento o fine tunning (a poder ser).</w:t>
+      </w:r>
+    </w:p>
+    <w:p>
+      <w:pPr>
+        <w:rPr>
+          <w:lang w:val="es-ES"/>
+        </w:rPr>
+      </w:pPr>
+      <w:r>
+        <w:rPr>
+          <w:lang w:val="es-ES"/>
+        </w:rPr>
+        <w:t>Han surgido ciertos problemas a la hora de revisar el trabajo realizado y analizar el csv. Además, hablar con el experto en biomecanica me ha llevado a hacer algunos cambios en el código y en la forma de entender el proceso. En cuanto a software he decidido actualizar el código y las dependencias a la versión más nueva de medipipe, ya que ha salido recientemente y he visto que tiene bastantes mejoras, el inconveniente es que me ha tocado cambiar el código. Otro aspecto es en la forma de analizar los datos, mediapipe da un valor junto con cada keypoint de confianza, he decidido filtrar los keypoints por una confianza (variable y en pruebas), para asegurar tener una serie de datos más fiables, dejando espacios vacíos en el conjunto de datos si no se capturan bien en lugar de hacer la técnica del espejo o simplemente valores poco fiables. En cuanto a la técnica del espejo he estado investigando debido al consejo del experto, ya que hemos llegado a la conclusión de que la simetría es un aspecto importante a la hora de analizar un ejercicio y al hacer la técnica del espejo si una parte del cuerpo no se ve estamos asumiendo una simetría inventada que puede dar lugar a errores.</w:t>
+      </w:r>
+    </w:p>
+    <w:p>
+      <w:pPr>
+        <w:rPr>
+          <w:lang w:val="es-ES"/>
+        </w:rPr>
+      </w:pPr>
+      <w:r>
+        <w:rPr>
+          <w:lang w:val="es-ES"/>
+        </w:rPr>
+        <w:t>Al hablar con la tutora después de investigar un poco sobre el ML y como funciona en la parte práctica, nos hemos dado cuenta que es muy difícil entrenar una red neuronal que consiga generalizar y ofrecer técnicas correctas para todos los ejercicios. Por lo que hemos obtado por seguir une esquema híbrido en el que nuestra propia red neuronal sacará unos ciertos parámetros para analizar SOLO el movimiento de sentadilla, mientras que para analizar los demás movimientos la idea ahora es subir el archivo con los ángulos y el punto de sustentación (el cual también hemos añadido gracias al experto) y que una IA externa ya entrenada nos analice el ejercicio para poder otorgar una respuesta al usuario sea el ejercicio que sea.</w:t>
       </w:r>
     </w:p>
     <w:p>
@@ -1032,21 +638,7 @@
         <w:rPr>
           <w:lang w:val="es-ES"/>
         </w:rPr>
-        <w:t xml:space="preserve">Creación de la red BILSTM y búsqueda de ejemplos para su entrenamiento, una vez recopilada gran cantidad de datos me doy cuenta de la carencia de datos de ejecuciones de sentadilla erróneas, por lo que la siguiente semana me dispondré a </w:t>
-      </w:r>
-      <w:proofErr w:type="spellStart"/>
-      <w:r>
-        <w:rPr>
-          <w:lang w:val="es-ES"/>
-        </w:rPr>
-        <w:t>grabrme</w:t>
-      </w:r>
-      <w:proofErr w:type="spellEnd"/>
-      <w:r>
-        <w:rPr>
-          <w:lang w:val="es-ES"/>
-        </w:rPr>
-        <w:t xml:space="preserve"> a mi y algunos compañeros que se han ofrecido a ayudarme, ya que para el entrenamiento de la red necesito tanto ejecuciones correctas como incorrectas. </w:t>
+        <w:t xml:space="preserve">Creación de la red BILSTM y búsqueda de ejemplos para su entrenamiento, una vez recopilada gran cantidad de datos me doy cuenta de la carencia de datos de ejecuciones de sentadilla erróneas, por lo que la siguiente semana me dispondré a grabrme a mi y algunos compañeros que se han ofrecido a ayudarme, ya que para el entrenamiento de la red necesito tanto ejecuciones correctas como incorrectas. </w:t>
       </w:r>
     </w:p>
     <w:p>
@@ -1073,77 +665,7 @@
           <w:lang w:val="es-ES"/>
         </w:rPr>
         <w:lastRenderedPageBreak/>
-        <w:t xml:space="preserve">Gracias a mi tutora Carolina, tengo la oportunidad de ir al centro de IA de la empresa BISITE, en el </w:t>
-      </w:r>
-      <w:proofErr w:type="spellStart"/>
-      <w:r>
-        <w:rPr>
-          <w:lang w:val="es-ES"/>
-        </w:rPr>
-        <w:t>cúal</w:t>
-      </w:r>
-      <w:proofErr w:type="spellEnd"/>
-      <w:r>
-        <w:rPr>
-          <w:lang w:val="es-ES"/>
-        </w:rPr>
-        <w:t xml:space="preserve"> además de enseñarme gran cantidad de proyectos me sirve para preguntar algunas dudas que tenía, contar mi trabajo y recibir recomendaciones las cuales las hemos evaluado y llegado a la siguiente conclusión. Les encanta el </w:t>
-      </w:r>
-      <w:proofErr w:type="gramStart"/>
-      <w:r>
-        <w:rPr>
-          <w:lang w:val="es-ES"/>
-        </w:rPr>
-        <w:t>proyecto</w:t>
-      </w:r>
-      <w:proofErr w:type="gramEnd"/>
-      <w:r>
-        <w:rPr>
-          <w:lang w:val="es-ES"/>
-        </w:rPr>
-        <w:t xml:space="preserve"> pero un integrante del grupo de investigación me sugiere probar con el siguiente tipo de red </w:t>
-      </w:r>
-      <w:proofErr w:type="spellStart"/>
-      <w:r>
-        <w:rPr>
-          <w:lang w:val="es-ES"/>
-        </w:rPr>
-        <w:t>XGboost</w:t>
-      </w:r>
-      <w:proofErr w:type="spellEnd"/>
-      <w:r>
-        <w:rPr>
-          <w:lang w:val="es-ES"/>
-        </w:rPr>
-        <w:t xml:space="preserve">, en caso de algún problema con el tipo de red ya seleccionado </w:t>
-      </w:r>
-      <w:proofErr w:type="spellStart"/>
-      <w:r>
-        <w:rPr>
-          <w:lang w:val="es-ES"/>
-        </w:rPr>
-        <w:t>obtaremos</w:t>
-      </w:r>
-      <w:proofErr w:type="spellEnd"/>
-      <w:r>
-        <w:rPr>
-          <w:lang w:val="es-ES"/>
-        </w:rPr>
-        <w:t xml:space="preserve"> seguramente por hacer una </w:t>
-      </w:r>
-      <w:proofErr w:type="spellStart"/>
-      <w:r>
-        <w:rPr>
-          <w:lang w:val="es-ES"/>
-        </w:rPr>
-        <w:t>comparaciñon</w:t>
-      </w:r>
-      <w:proofErr w:type="spellEnd"/>
-      <w:r>
-        <w:rPr>
-          <w:lang w:val="es-ES"/>
-        </w:rPr>
-        <w:t xml:space="preserve"> con este otro tipo de red para obtener un mejor resultado.</w:t>
+        <w:t>Gracias a mi tutora Carolina, tengo la oportunidad de ir al centro de IA de la empresa BISITE, en el cúal además de enseñarme gran cantidad de proyectos me sirve para preguntar algunas dudas que tenía, contar mi trabajo y recibir recomendaciones las cuales las hemos evaluado y llegado a la siguiente conclusión. Les encanta el proyecto pero un integrante del grupo de investigación me sugiere probar con el siguiente tipo de red XGboost, en caso de algún problema con el tipo de red ya seleccionado obtaremos seguramente por hacer una comparaciñon con este otro tipo de red para obtener un mejor resultado.</w:t>
       </w:r>
     </w:p>
     <w:p>
@@ -1162,21 +684,34 @@
         <w:rPr>
           <w:lang w:val="es-ES"/>
         </w:rPr>
-        <w:t xml:space="preserve">dedicar un tiempo a la limpieza del código para mejorar la implementación y que todo quede mejor estructurado, con nombres más sugerentes y profesionales. Además de la realización de una infografía. Es importante mencionar que todos los cambios están siendo registrados en un controlador de versiones, en este caso </w:t>
-      </w:r>
-      <w:proofErr w:type="spellStart"/>
-      <w:r>
-        <w:rPr>
-          <w:lang w:val="es-ES"/>
-        </w:rPr>
-        <w:t>gitlab</w:t>
-      </w:r>
-      <w:proofErr w:type="spellEnd"/>
-      <w:r>
-        <w:rPr>
-          <w:lang w:val="es-ES"/>
-        </w:rPr>
-        <w:t xml:space="preserve">. </w:t>
+        <w:t xml:space="preserve">dedicar un tiempo a la limpieza del código para mejorar la implementación y que todo quede mejor estructurado, con nombres más sugerentes y profesionales. Además de la realización de una infografía. Es importante mencionar que todos los cambios están siendo registrados en un controlador de versiones, en este caso gitlab. </w:t>
+      </w:r>
+    </w:p>
+    <w:p>
+      <w:pPr>
+        <w:pStyle w:val="Heading3"/>
+        <w:rPr>
+          <w:lang w:val="es-ES"/>
+        </w:rPr>
+      </w:pPr>
+      <w:r>
+        <w:rPr>
+          <w:lang w:val="es-ES"/>
+        </w:rPr>
+        <w:t>Sexta Semana</w:t>
+      </w:r>
+    </w:p>
+    <w:p>
+      <w:pPr>
+        <w:rPr>
+          <w:lang w:val="es-ES"/>
+        </w:rPr>
+      </w:pPr>
+      <w:r>
+        <w:rPr>
+          <w:lang w:val="es-ES"/>
+        </w:rPr>
+        <w:t>Ante la falta de ejemplos de sentadillas realizadas incorrectamente he empezado a grabar a mi mismo haciendo ejemplos concretos como sentadillas que no sean profundas, con inclinación excesiva de espalda etc, además de a otras personas. Una vez armado un dataset de mas de 100 videos viene la parte difícil, la cual es etiquetar cada vídeo y cada frame para entrenar a la red. Para ello he creado una aplicación de Python para ayudarme en este proceso ya que después de una búsqueda no he conseguido encontrar una herramienta similar. Con esta herramienta nos permite ir etiquetando los momentos en la sentadilla (Stand-bajando-abajo-subiendo-stand), además al acabar una repetición nos permite darle valores a los kpis de como ha sido nuestra sentadilla. De esta forma he conseguido agilizar el proceso de etiquetado de los videos.</w:t>
       </w:r>
     </w:p>
     <w:p>
@@ -1255,15 +790,7 @@
         <w:t>Redes Neuronales Convolucionales (CNN)</w:t>
       </w:r>
       <w:r>
-        <w:t xml:space="preserve"> sobre </w:t>
-      </w:r>
-      <w:proofErr w:type="spellStart"/>
-      <w:r>
-        <w:t>OpenCV</w:t>
-      </w:r>
-      <w:proofErr w:type="spellEnd"/>
-      <w:r>
-        <w:t xml:space="preserve">, concluyendo que las técnicas de barrido (ventana deslizante) son demasiado lentas para tiempo real, recomendando redes de detección de disparo único (como YOLO o SSD). </w:t>
+        <w:t xml:space="preserve"> sobre OpenCV, concluyendo que las técnicas de barrido (ventana deslizante) son demasiado lentas para tiempo real, recomendando redes de detección de disparo único (como YOLO o SSD). </w:t>
       </w:r>
       <w:hyperlink r:id="rId10" w:history="1">
         <w:r>
@@ -1301,43 +828,10 @@
           <w:b/>
           <w:bCs/>
         </w:rPr>
-        <w:t xml:space="preserve">Transfer </w:t>
-      </w:r>
-      <w:proofErr w:type="spellStart"/>
-      <w:r>
-        <w:rPr>
-          <w:b/>
-          <w:bCs/>
-        </w:rPr>
-        <w:t>Learning</w:t>
-      </w:r>
-      <w:proofErr w:type="spellEnd"/>
-      <w:r>
-        <w:t xml:space="preserve"> sobre una CNN (</w:t>
-      </w:r>
-      <w:proofErr w:type="spellStart"/>
-      <w:r>
-        <w:t>ResNet</w:t>
-      </w:r>
-      <w:proofErr w:type="spellEnd"/>
-      <w:r>
-        <w:t>/</w:t>
-      </w:r>
-      <w:proofErr w:type="spellStart"/>
-      <w:r>
-        <w:t>Inception</w:t>
-      </w:r>
-      <w:proofErr w:type="spellEnd"/>
-      <w:r>
-        <w:t xml:space="preserve">) para identificar ballenas por su cola; demuestra que el "Data </w:t>
-      </w:r>
-      <w:proofErr w:type="spellStart"/>
-      <w:r>
-        <w:t>Augmentation</w:t>
-      </w:r>
-      <w:proofErr w:type="spellEnd"/>
-      <w:r>
-        <w:t>" (rotar/deformar imágenes) es vital cuando tienes pocas imágenes para entrenar.</w:t>
+        <w:t>Transfer Learning</w:t>
+      </w:r>
+      <w:r>
+        <w:t xml:space="preserve"> sobre una CNN (ResNet/Inception) para identificar ballenas por su cola; demuestra que el "Data Augmentation" (rotar/deformar imágenes) es vital cuando tienes pocas imágenes para entrenar.</w:t>
       </w:r>
       <w:r>
         <w:t xml:space="preserve"> </w:t>
@@ -1378,6 +872,7 @@
           <w:b/>
           <w:bCs/>
         </w:rPr>
+        <w:lastRenderedPageBreak/>
         <w:t>Pedro Pablo García (TFM - Hojas):</w:t>
       </w:r>
       <w:r>
@@ -1388,17 +883,8 @@
           <w:b/>
           <w:bCs/>
         </w:rPr>
-        <w:t xml:space="preserve">Momentos de </w:t>
-      </w:r>
-      <w:proofErr w:type="spellStart"/>
-      <w:r>
-        <w:rPr>
-          <w:b/>
-          <w:bCs/>
-        </w:rPr>
-        <w:t>Hu</w:t>
-      </w:r>
-      <w:proofErr w:type="spellEnd"/>
+        <w:t>Momentos de Hu</w:t>
+      </w:r>
       <w:r>
         <w:t xml:space="preserve"> (geometría de la forma) y una </w:t>
       </w:r>
@@ -1438,23 +924,7 @@
           <w:b/>
           <w:bCs/>
         </w:rPr>
-        <w:t xml:space="preserve">Santa María et al. (Artículo - </w:t>
-      </w:r>
-      <w:proofErr w:type="spellStart"/>
-      <w:r>
-        <w:rPr>
-          <w:b/>
-          <w:bCs/>
-        </w:rPr>
-        <w:t>Admin</w:t>
-      </w:r>
-      <w:proofErr w:type="spellEnd"/>
-      <w:r>
-        <w:rPr>
-          <w:b/>
-          <w:bCs/>
-        </w:rPr>
-        <w:t xml:space="preserve"> a2-15-26):</w:t>
+        <w:t>Santa María et al. (Artículo - Admin a2-15-26):</w:t>
       </w:r>
       <w:r>
         <w:t xml:space="preserve"> Implementa un sistema de </w:t>
@@ -1495,104 +965,20 @@
           <w:b/>
           <w:bCs/>
         </w:rPr>
-        <w:t xml:space="preserve">Sara Pardo Feijoo (PFC - Bag </w:t>
-      </w:r>
-      <w:proofErr w:type="spellStart"/>
+        <w:t>Sara Pardo Feijoo (PFC - Bag of Words):</w:t>
+      </w:r>
+      <w:r>
+        <w:t xml:space="preserve"> Aplica el modelo </w:t>
+      </w:r>
       <w:r>
         <w:rPr>
           <w:b/>
           <w:bCs/>
         </w:rPr>
-        <w:t>of</w:t>
-      </w:r>
-      <w:proofErr w:type="spellEnd"/>
-      <w:r>
-        <w:rPr>
-          <w:b/>
-          <w:bCs/>
-        </w:rPr>
-        <w:t xml:space="preserve"> </w:t>
-      </w:r>
-      <w:proofErr w:type="spellStart"/>
-      <w:r>
-        <w:rPr>
-          <w:b/>
-          <w:bCs/>
-        </w:rPr>
-        <w:t>Words</w:t>
-      </w:r>
-      <w:proofErr w:type="spellEnd"/>
-      <w:r>
-        <w:rPr>
-          <w:b/>
-          <w:bCs/>
-        </w:rPr>
-        <w:t>):</w:t>
-      </w:r>
-      <w:r>
-        <w:t xml:space="preserve"> Aplica el modelo </w:t>
-      </w:r>
-      <w:r>
-        <w:rPr>
-          <w:b/>
-          <w:bCs/>
-        </w:rPr>
-        <w:t xml:space="preserve">"Bag </w:t>
-      </w:r>
-      <w:proofErr w:type="spellStart"/>
-      <w:r>
-        <w:rPr>
-          <w:b/>
-          <w:bCs/>
-        </w:rPr>
-        <w:t>of</w:t>
-      </w:r>
-      <w:proofErr w:type="spellEnd"/>
-      <w:r>
-        <w:rPr>
-          <w:b/>
-          <w:bCs/>
-        </w:rPr>
-        <w:t xml:space="preserve"> </w:t>
-      </w:r>
-      <w:proofErr w:type="spellStart"/>
-      <w:r>
-        <w:rPr>
-          <w:b/>
-          <w:bCs/>
-        </w:rPr>
-        <w:t>Words</w:t>
-      </w:r>
-      <w:proofErr w:type="spellEnd"/>
-      <w:r>
-        <w:rPr>
-          <w:b/>
-          <w:bCs/>
-        </w:rPr>
-        <w:t>" (</w:t>
-      </w:r>
-      <w:proofErr w:type="spellStart"/>
-      <w:r>
-        <w:rPr>
-          <w:b/>
-          <w:bCs/>
-        </w:rPr>
-        <w:t>BoW</w:t>
-      </w:r>
-      <w:proofErr w:type="spellEnd"/>
-      <w:r>
-        <w:rPr>
-          <w:b/>
-          <w:bCs/>
-        </w:rPr>
-        <w:t>)</w:t>
-      </w:r>
-      <w:r>
-        <w:t xml:space="preserve">, que trata la imagen como un "saco" de parches visuales desordenados (sin geometría); útil para buscar objetos en bases de datos, pero inservible para </w:t>
-      </w:r>
-      <w:r>
-        <w:lastRenderedPageBreak/>
-        <w:t xml:space="preserve">detectar posturas donde la posición de las partes es clave. </w:t>
+        <w:t>"Bag of Words" (BoW)</w:t>
+      </w:r>
+      <w:r>
+        <w:t xml:space="preserve">, que trata la imagen como un "saco" de parches visuales desordenados (sin geometría); útil para buscar objetos en bases de datos, pero inservible para detectar posturas donde la posición de las partes es clave. </w:t>
       </w:r>
       <w:hyperlink r:id="rId14" w:history="1">
         <w:r>
@@ -1689,25 +1075,7 @@
           <w:szCs w:val="24"/>
           <w:lang w:val="es-ES"/>
         </w:rPr>
-        <w:t xml:space="preserve">La dificultad de entrenar de cero una red neuronal para conseguir el resultado deseado, es mejor usar una ya entrenada como por ejemplo </w:t>
-      </w:r>
-      <w:proofErr w:type="spellStart"/>
-      <w:r>
-        <w:rPr>
-          <w:sz w:val="24"/>
-          <w:szCs w:val="24"/>
-          <w:lang w:val="es-ES"/>
-        </w:rPr>
-        <w:t>OpenPose</w:t>
-      </w:r>
-      <w:proofErr w:type="spellEnd"/>
-      <w:r>
-        <w:rPr>
-          <w:sz w:val="24"/>
-          <w:szCs w:val="24"/>
-          <w:lang w:val="es-ES"/>
-        </w:rPr>
-        <w:t xml:space="preserve"> o similar.</w:t>
+        <w:t>La dificultad de entrenar de cero una red neuronal para conseguir el resultado deseado, es mejor usar una ya entrenada como por ejemplo OpenPose o similar.</w:t>
       </w:r>
     </w:p>
     <w:p>
@@ -1729,51 +1097,15 @@
           <w:szCs w:val="24"/>
           <w:lang w:val="es-ES"/>
         </w:rPr>
-        <w:t xml:space="preserve">La </w:t>
-      </w:r>
-      <w:proofErr w:type="spellStart"/>
+        <w:t>La retropropagación es útil para entrenar una de cero ya que es fácilmente entendible pero lo más usado hoy en día son redes convolucionales</w:t>
+      </w:r>
       <w:r>
         <w:rPr>
           <w:sz w:val="24"/>
           <w:szCs w:val="24"/>
           <w:lang w:val="es-ES"/>
         </w:rPr>
-        <w:t>retropropagación</w:t>
-      </w:r>
-      <w:proofErr w:type="spellEnd"/>
-      <w:r>
-        <w:rPr>
-          <w:sz w:val="24"/>
-          <w:szCs w:val="24"/>
-          <w:lang w:val="es-ES"/>
-        </w:rPr>
-        <w:t xml:space="preserve"> es útil para entrenar una de cero ya que es fácilmente entendible pero lo más usado hoy en día son redes convolucionales</w:t>
-      </w:r>
-      <w:r>
-        <w:rPr>
-          <w:sz w:val="24"/>
-          <w:szCs w:val="24"/>
-          <w:lang w:val="es-ES"/>
-        </w:rPr>
-        <w:t xml:space="preserve">, es decir, </w:t>
-      </w:r>
-      <w:proofErr w:type="spellStart"/>
-      <w:r>
-        <w:rPr>
-          <w:sz w:val="24"/>
-          <w:szCs w:val="24"/>
-          <w:lang w:val="es-ES"/>
-        </w:rPr>
-        <w:t>deeplearning</w:t>
-      </w:r>
-      <w:proofErr w:type="spellEnd"/>
-      <w:r>
-        <w:rPr>
-          <w:sz w:val="24"/>
-          <w:szCs w:val="24"/>
-          <w:lang w:val="es-ES"/>
-        </w:rPr>
-        <w:t>.</w:t>
+        <w:t>, es decir, deeplearning.</w:t>
       </w:r>
     </w:p>
     <w:p>
@@ -1795,25 +1127,7 @@
           <w:szCs w:val="24"/>
           <w:lang w:val="es-ES"/>
         </w:rPr>
-        <w:t xml:space="preserve">La idea de analizar los datos extraídos de las herramientas como </w:t>
-      </w:r>
-      <w:proofErr w:type="spellStart"/>
-      <w:r>
-        <w:rPr>
-          <w:sz w:val="24"/>
-          <w:szCs w:val="24"/>
-          <w:lang w:val="es-ES"/>
-        </w:rPr>
-        <w:t>openpose</w:t>
-      </w:r>
-      <w:proofErr w:type="spellEnd"/>
-      <w:r>
-        <w:rPr>
-          <w:sz w:val="24"/>
-          <w:szCs w:val="24"/>
-          <w:lang w:val="es-ES"/>
-        </w:rPr>
-        <w:t xml:space="preserve"> a través de un doble enfoque, ya sea a través de ML con las aplicaciones</w:t>
+        <w:t>La idea de analizar los datos extraídos de las herramientas como openpose a través de un doble enfoque, ya sea a través de ML con las aplicaciones</w:t>
       </w:r>
       <w:r>
         <w:t xml:space="preserve"> </w:t>
@@ -1854,25 +1168,7 @@
           <w:szCs w:val="24"/>
           <w:lang w:val="es-ES"/>
         </w:rPr>
-        <w:t xml:space="preserve">La importancia de tratar las imágenes con </w:t>
-      </w:r>
-      <w:proofErr w:type="spellStart"/>
-      <w:r>
-        <w:rPr>
-          <w:sz w:val="24"/>
-          <w:szCs w:val="24"/>
-          <w:lang w:val="es-ES"/>
-        </w:rPr>
-        <w:t>OpenCV</w:t>
-      </w:r>
-      <w:proofErr w:type="spellEnd"/>
-      <w:r>
-        <w:rPr>
-          <w:sz w:val="24"/>
-          <w:szCs w:val="24"/>
-          <w:lang w:val="es-ES"/>
-        </w:rPr>
-        <w:t xml:space="preserve"> antes de pasar a procesarlas.</w:t>
+        <w:t>La importancia de tratar las imágenes con OpenCV antes de pasar a procesarlas.</w:t>
       </w:r>
     </w:p>
     <w:p>
@@ -1894,43 +1190,7 @@
           <w:szCs w:val="24"/>
           <w:lang w:val="es-ES"/>
         </w:rPr>
-        <w:t xml:space="preserve">Si en algún momento necesito usar </w:t>
-      </w:r>
-      <w:proofErr w:type="spellStart"/>
-      <w:r>
-        <w:rPr>
-          <w:sz w:val="24"/>
-          <w:szCs w:val="24"/>
-          <w:lang w:val="es-ES"/>
-        </w:rPr>
-        <w:t>DataSets</w:t>
-      </w:r>
-      <w:proofErr w:type="spellEnd"/>
-      <w:r>
-        <w:rPr>
-          <w:sz w:val="24"/>
-          <w:szCs w:val="24"/>
-          <w:lang w:val="es-ES"/>
-        </w:rPr>
-        <w:t xml:space="preserve">, </w:t>
-      </w:r>
-      <w:proofErr w:type="spellStart"/>
-      <w:r>
-        <w:rPr>
-          <w:sz w:val="24"/>
-          <w:szCs w:val="24"/>
-          <w:lang w:val="es-ES"/>
-        </w:rPr>
-        <w:t>Kaggel</w:t>
-      </w:r>
-      <w:proofErr w:type="spellEnd"/>
-      <w:r>
-        <w:rPr>
-          <w:sz w:val="24"/>
-          <w:szCs w:val="24"/>
-          <w:lang w:val="es-ES"/>
-        </w:rPr>
-        <w:t xml:space="preserve"> es una gran fuente de información que puede llegar a ser útil. (Ballenas)</w:t>
+        <w:t>Si en algún momento necesito usar DataSets, Kaggel es una gran fuente de información que puede llegar a ser útil. (Ballenas)</w:t>
       </w:r>
     </w:p>
     <w:p>
@@ -1986,23 +1246,7 @@
         <w:t>Pedro Pablo</w:t>
       </w:r>
       <w:r>
-        <w:t xml:space="preserve"> (</w:t>
-      </w:r>
-      <w:proofErr w:type="spellStart"/>
-      <w:r>
-        <w:t>Hu</w:t>
-      </w:r>
-      <w:proofErr w:type="spellEnd"/>
-      <w:r>
-        <w:t xml:space="preserve"> </w:t>
-      </w:r>
-      <w:proofErr w:type="spellStart"/>
-      <w:r>
-        <w:t>Moments</w:t>
-      </w:r>
-      <w:proofErr w:type="spellEnd"/>
-      <w:r>
-        <w:t xml:space="preserve">), </w:t>
+        <w:t xml:space="preserve"> (Hu Moments), </w:t>
       </w:r>
       <w:r>
         <w:rPr>
@@ -2022,23 +1266,7 @@
         <w:t>Sara Pardo</w:t>
       </w:r>
       <w:r>
-        <w:t xml:space="preserve"> (Bag </w:t>
-      </w:r>
-      <w:proofErr w:type="spellStart"/>
-      <w:r>
-        <w:t>of</w:t>
-      </w:r>
-      <w:proofErr w:type="spellEnd"/>
-      <w:r>
-        <w:t xml:space="preserve"> </w:t>
-      </w:r>
-      <w:proofErr w:type="spellStart"/>
-      <w:r>
-        <w:t>Words</w:t>
-      </w:r>
-      <w:proofErr w:type="spellEnd"/>
-      <w:r>
-        <w:t xml:space="preserve">) demuestran enfoques donde el programador debe definir </w:t>
+        <w:t xml:space="preserve"> (Bag of Words) demuestran enfoques donde el programador debe definir </w:t>
       </w:r>
       <w:r>
         <w:rPr>
@@ -2075,39 +1303,8 @@
           <w:b/>
           <w:bCs/>
         </w:rPr>
-        <w:t xml:space="preserve">Confirma el uso de Deep </w:t>
-      </w:r>
-      <w:proofErr w:type="spellStart"/>
-      <w:r>
-        <w:rPr>
-          <w:b/>
-          <w:bCs/>
-        </w:rPr>
-        <w:t>Learning</w:t>
-      </w:r>
-      <w:proofErr w:type="spellEnd"/>
-      <w:r>
-        <w:rPr>
-          <w:b/>
-          <w:bCs/>
-        </w:rPr>
-        <w:t xml:space="preserve"> (</w:t>
-      </w:r>
-      <w:proofErr w:type="spellStart"/>
-      <w:r>
-        <w:rPr>
-          <w:b/>
-          <w:bCs/>
-        </w:rPr>
-        <w:t>CNNs</w:t>
-      </w:r>
-      <w:proofErr w:type="spellEnd"/>
-      <w:r>
-        <w:rPr>
-          <w:b/>
-          <w:bCs/>
-        </w:rPr>
-        <w:t>):</w:t>
+        <w:lastRenderedPageBreak/>
+        <w:t>Confirma el uso de Deep Learning (CNNs):</w:t>
       </w:r>
       <w:r>
         <w:t xml:space="preserve"> Los trabajos de </w:t>
@@ -2157,29 +1354,11 @@
           <w:b/>
           <w:bCs/>
         </w:rPr>
-        <w:t xml:space="preserve">Pose </w:t>
-      </w:r>
-      <w:proofErr w:type="spellStart"/>
-      <w:r>
-        <w:rPr>
-          <w:b/>
-          <w:bCs/>
-        </w:rPr>
-        <w:t>Estimation</w:t>
-      </w:r>
-      <w:proofErr w:type="spellEnd"/>
-      <w:r>
-        <w:t xml:space="preserve"> (como la mencionada </w:t>
-      </w:r>
-      <w:proofErr w:type="spellStart"/>
-      <w:r>
-        <w:t>MoveNet</w:t>
-      </w:r>
-      <w:proofErr w:type="spellEnd"/>
-      <w:r>
-        <w:t xml:space="preserve"> en tu borrador), que detecta </w:t>
-      </w:r>
-      <w:proofErr w:type="spellStart"/>
+        <w:t>Pose Estimation</w:t>
+      </w:r>
+      <w:r>
+        <w:t xml:space="preserve"> (como la mencionada MoveNet en tu borrador), que detecta </w:t>
+      </w:r>
       <w:r>
         <w:rPr>
           <w:i/>
@@ -2187,7 +1366,6 @@
         </w:rPr>
         <w:t>keypoints</w:t>
       </w:r>
-      <w:proofErr w:type="spellEnd"/>
       <w:r>
         <w:t xml:space="preserve"> (codos, rodillas) directamente, saltándose la fase de "aprender qué es un brazo" desde cero.</w:t>
       </w:r>
@@ -2206,23 +1384,7 @@
           <w:b/>
           <w:bCs/>
         </w:rPr>
-        <w:t xml:space="preserve">El </w:t>
-      </w:r>
-      <w:proofErr w:type="spellStart"/>
-      <w:r>
-        <w:rPr>
-          <w:b/>
-          <w:bCs/>
-        </w:rPr>
-        <w:t>Dataset</w:t>
-      </w:r>
-      <w:proofErr w:type="spellEnd"/>
-      <w:r>
-        <w:rPr>
-          <w:b/>
-          <w:bCs/>
-        </w:rPr>
-        <w:t xml:space="preserve"> es tu mayor cuello de botella:</w:t>
+        <w:t>El Dataset es tu mayor cuello de botella:</w:t>
       </w:r>
       <w:r>
         <w:t xml:space="preserve"> Todos los autores sufren con la falta de datos.</w:t>
@@ -2262,45 +1424,18 @@
           <w:b/>
           <w:bCs/>
         </w:rPr>
-        <w:t xml:space="preserve">Transfer </w:t>
-      </w:r>
-      <w:proofErr w:type="spellStart"/>
-      <w:r>
-        <w:rPr>
-          <w:b/>
-          <w:bCs/>
-        </w:rPr>
-        <w:t>Learning</w:t>
-      </w:r>
-      <w:proofErr w:type="spellEnd"/>
-      <w:r>
-        <w:t xml:space="preserve">. No entrenes tu red con vídeos tuyos desde cero. Coge un modelo </w:t>
-      </w:r>
-      <w:proofErr w:type="spellStart"/>
-      <w:r>
-        <w:t>pre-entrenado</w:t>
-      </w:r>
-      <w:proofErr w:type="spellEnd"/>
-      <w:r>
-        <w:t xml:space="preserve"> (en COCO o MPII Human Pose) y úsalo directamente o haz un </w:t>
+        <w:t>Transfer Learning</w:t>
+      </w:r>
+      <w:r>
+        <w:t xml:space="preserve">. No entrenes tu red con vídeos tuyos desde cero. Coge un modelo pre-entrenado (en COCO o MPII Human Pose) y úsalo directamente o haz un </w:t>
       </w:r>
       <w:r>
         <w:rPr>
           <w:i/>
           <w:iCs/>
         </w:rPr>
-        <w:lastRenderedPageBreak/>
-        <w:t>fine-</w:t>
-      </w:r>
-      <w:proofErr w:type="spellStart"/>
-      <w:r>
-        <w:rPr>
-          <w:i/>
-          <w:iCs/>
-        </w:rPr>
-        <w:t>tuning</w:t>
-      </w:r>
-      <w:proofErr w:type="spellEnd"/>
+        <w:t>fine-tuning</w:t>
+      </w:r>
       <w:r>
         <w:t xml:space="preserve"> ligero. Esto es lo que diferencia un TFG académico viable de uno imposible.</w:t>
       </w:r>
@@ -2332,23 +1467,7 @@
         <w:t>Oliva</w:t>
       </w:r>
       <w:r>
-        <w:t xml:space="preserve"> demostró que técnicas precisas (ventanas deslizantes) hacen el sistema inútil en tiempo real (segundos por </w:t>
-      </w:r>
-      <w:proofErr w:type="spellStart"/>
-      <w:r>
-        <w:t>frame</w:t>
-      </w:r>
-      <w:proofErr w:type="spellEnd"/>
-      <w:r>
-        <w:t xml:space="preserve">). Para tu app móvil, la conclusión es clara: sacrifica resolución de entrada (baja a 256x256 o similar) y procesa 1 de cada 5 </w:t>
-      </w:r>
-      <w:proofErr w:type="spellStart"/>
-      <w:r>
-        <w:t>frames</w:t>
-      </w:r>
-      <w:proofErr w:type="spellEnd"/>
-      <w:r>
-        <w:t>. La fluidez de la app (UX) es más importante que saber si el ángulo de la rodilla es 45.1º o 45.2º.</w:t>
+        <w:t xml:space="preserve"> demostró que técnicas precisas (ventanas deslizantes) hacen el sistema inútil en tiempo real (segundos por frame). Para tu app móvil, la conclusión es clara: sacrifica resolución de entrada (baja a 256x256 o similar) y procesa 1 de cada 5 frames. La fluidez de la app (UX) es más importante que saber si el ángulo de la rodilla es 45.1º o 45.2º.</w:t>
       </w:r>
     </w:p>
     <w:p>
@@ -2359,19 +1478,11 @@
           <w:rFonts w:ascii="Arial" w:hAnsi="Arial" w:cs="Arial"/>
         </w:rPr>
       </w:pPr>
-      <w:proofErr w:type="spellStart"/>
       <w:r>
         <w:rPr>
           <w:rFonts w:ascii="Arial" w:hAnsi="Arial" w:cs="Arial"/>
         </w:rPr>
-        <w:t>Planning</w:t>
-      </w:r>
-      <w:proofErr w:type="spellEnd"/>
-      <w:r>
-        <w:rPr>
-          <w:rFonts w:ascii="Arial" w:hAnsi="Arial" w:cs="Arial"/>
-        </w:rPr>
-        <w:t xml:space="preserve"> y distintas herramientas</w:t>
+        <w:t>Planning y distintas herramientas</w:t>
       </w:r>
     </w:p>
     <w:p>
@@ -2395,35 +1506,7 @@
         <w:rPr>
           <w:rFonts w:ascii="Arial" w:hAnsi="Arial" w:cs="Arial"/>
         </w:rPr>
-        <w:t>1. Pipeline de Visión Artificial (</w:t>
-      </w:r>
-      <w:proofErr w:type="spellStart"/>
-      <w:r>
-        <w:rPr>
-          <w:rFonts w:ascii="Arial" w:hAnsi="Arial" w:cs="Arial"/>
-        </w:rPr>
-        <w:t>Computer</w:t>
-      </w:r>
-      <w:proofErr w:type="spellEnd"/>
-      <w:r>
-        <w:rPr>
-          <w:rFonts w:ascii="Arial" w:hAnsi="Arial" w:cs="Arial"/>
-        </w:rPr>
-        <w:t xml:space="preserve"> </w:t>
-      </w:r>
-      <w:proofErr w:type="spellStart"/>
-      <w:r>
-        <w:rPr>
-          <w:rFonts w:ascii="Arial" w:hAnsi="Arial" w:cs="Arial"/>
-        </w:rPr>
-        <w:t>Vision</w:t>
-      </w:r>
-      <w:proofErr w:type="spellEnd"/>
-      <w:r>
-        <w:rPr>
-          <w:rFonts w:ascii="Arial" w:hAnsi="Arial" w:cs="Arial"/>
-        </w:rPr>
-        <w:t>)</w:t>
+        <w:t>1. Pipeline de Visión Artificial (Computer Vision)</w:t>
       </w:r>
     </w:p>
     <w:p>
@@ -2468,7 +1551,6 @@
         </w:rPr>
         <w:t xml:space="preserve"> </w:t>
       </w:r>
-      <w:proofErr w:type="spellStart"/>
       <w:r>
         <w:rPr>
           <w:rFonts w:cs="Arial"/>
@@ -2477,26 +1559,11 @@
         </w:rPr>
         <w:t>OpenCV</w:t>
       </w:r>
-      <w:proofErr w:type="spellEnd"/>
-      <w:r>
-        <w:rPr>
-          <w:rFonts w:cs="Arial"/>
-        </w:rPr>
-        <w:t xml:space="preserve">. Se utilizará de forma casi exclusiva para la lectura de los </w:t>
-      </w:r>
-      <w:proofErr w:type="spellStart"/>
-      <w:r>
-        <w:rPr>
-          <w:rFonts w:cs="Arial"/>
-        </w:rPr>
-        <w:t>frames</w:t>
-      </w:r>
-      <w:proofErr w:type="spellEnd"/>
-      <w:r>
-        <w:rPr>
-          <w:rFonts w:cs="Arial"/>
-        </w:rPr>
-        <w:t xml:space="preserve"> de la cámara, redimensionado, cambios de espacio de color, y el dibujado (renderizado) posterior del esqueleto y las métricas sobre el video en la interfaz de usuario.</w:t>
+      <w:r>
+        <w:rPr>
+          <w:rFonts w:cs="Arial"/>
+        </w:rPr>
+        <w:t>. Se utilizará de forma casi exclusiva para la lectura de los frames de la cámara, redimensionado, cambios de espacio de color, y el dibujado (renderizado) posterior del esqueleto y las métricas sobre el video en la interfaz de usuario.</w:t>
       </w:r>
     </w:p>
     <w:p>
@@ -2518,101 +1585,41 @@
           <w:b/>
           <w:bCs/>
         </w:rPr>
-        <w:t xml:space="preserve">Estimación de Postura (Pose </w:t>
-      </w:r>
-      <w:proofErr w:type="spellStart"/>
+        <w:t>Estimación de Postura (Pose Estimation):</w:t>
+      </w:r>
+      <w:r>
+        <w:rPr>
+          <w:rFonts w:cs="Arial"/>
+        </w:rPr>
+        <w:t xml:space="preserve"> * </w:t>
+      </w:r>
       <w:r>
         <w:rPr>
           <w:rFonts w:cs="Arial"/>
           <w:b/>
           <w:bCs/>
         </w:rPr>
-        <w:t>Estimation</w:t>
-      </w:r>
-      <w:proofErr w:type="spellEnd"/>
+        <w:t>Opción Principal (Recomendada):</w:t>
+      </w:r>
+      <w:r>
+        <w:rPr>
+          <w:rFonts w:cs="Arial"/>
+        </w:rPr>
+        <w:t xml:space="preserve"> </w:t>
+      </w:r>
       <w:r>
         <w:rPr>
           <w:rFonts w:cs="Arial"/>
           <w:b/>
           <w:bCs/>
         </w:rPr>
-        <w:t>):</w:t>
-      </w:r>
-      <w:r>
-        <w:rPr>
-          <w:rFonts w:cs="Arial"/>
-        </w:rPr>
-        <w:t xml:space="preserve"> * </w:t>
-      </w:r>
-      <w:r>
-        <w:rPr>
-          <w:rFonts w:cs="Arial"/>
-          <w:b/>
-          <w:bCs/>
-        </w:rPr>
-        <w:t>Opción Principal (Recomendada):</w:t>
-      </w:r>
-      <w:r>
-        <w:rPr>
-          <w:rFonts w:cs="Arial"/>
-        </w:rPr>
-        <w:t xml:space="preserve"> </w:t>
-      </w:r>
-      <w:proofErr w:type="spellStart"/>
-      <w:r>
-        <w:rPr>
-          <w:rFonts w:cs="Arial"/>
-          <w:b/>
-          <w:bCs/>
-        </w:rPr>
-        <w:t>BlazePose</w:t>
-      </w:r>
-      <w:proofErr w:type="spellEnd"/>
-      <w:r>
-        <w:rPr>
-          <w:rFonts w:cs="Arial"/>
-          <w:b/>
-          <w:bCs/>
-        </w:rPr>
-        <w:t xml:space="preserve"> (</w:t>
-      </w:r>
-      <w:proofErr w:type="spellStart"/>
-      <w:r>
-        <w:rPr>
-          <w:rFonts w:cs="Arial"/>
-          <w:b/>
-          <w:bCs/>
-        </w:rPr>
-        <w:t>MediaPipe</w:t>
-      </w:r>
-      <w:proofErr w:type="spellEnd"/>
-      <w:r>
-        <w:rPr>
-          <w:rFonts w:cs="Arial"/>
-          <w:b/>
-          <w:bCs/>
-        </w:rPr>
-        <w:t>)</w:t>
-      </w:r>
-      <w:r>
-        <w:rPr>
-          <w:rFonts w:cs="Arial"/>
-        </w:rPr>
-        <w:t xml:space="preserve">. Se elige como la tecnología </w:t>
-      </w:r>
-      <w:proofErr w:type="spellStart"/>
-      <w:r>
-        <w:rPr>
-          <w:rFonts w:cs="Arial"/>
-        </w:rPr>
-        <w:t>core</w:t>
-      </w:r>
-      <w:proofErr w:type="spellEnd"/>
-      <w:r>
-        <w:rPr>
-          <w:rFonts w:cs="Arial"/>
-        </w:rPr>
-        <w:t xml:space="preserve"> por su capacidad de generar coordenadas en </w:t>
+        <w:t>BlazePose (MediaPipe)</w:t>
+      </w:r>
+      <w:r>
+        <w:rPr>
+          <w:rFonts w:cs="Arial"/>
+        </w:rPr>
+        <w:t xml:space="preserve">. Se elige como la tecnología core por su capacidad de generar coordenadas en </w:t>
       </w:r>
       <w:r>
         <w:rPr>
@@ -2664,135 +1671,19 @@
           <w:rFonts w:cs="Arial"/>
         </w:rPr>
       </w:pPr>
-      <w:proofErr w:type="spellStart"/>
       <w:r>
         <w:rPr>
           <w:rFonts w:cs="Arial"/>
           <w:i/>
           <w:iCs/>
         </w:rPr>
-        <w:t>OpenPose</w:t>
-      </w:r>
-      <w:proofErr w:type="spellEnd"/>
-      <w:r>
-        <w:rPr>
-          <w:rFonts w:cs="Arial"/>
-          <w:i/>
-          <w:iCs/>
-        </w:rPr>
-        <w:t xml:space="preserve"> / </w:t>
-      </w:r>
-      <w:proofErr w:type="spellStart"/>
-      <w:r>
-        <w:rPr>
-          <w:rFonts w:cs="Arial"/>
-          <w:i/>
-          <w:iCs/>
-        </w:rPr>
-        <w:t>MoveNet</w:t>
-      </w:r>
-      <w:proofErr w:type="spellEnd"/>
-      <w:r>
-        <w:rPr>
-          <w:rFonts w:cs="Arial"/>
-          <w:i/>
-          <w:iCs/>
-        </w:rPr>
-        <w:t xml:space="preserve"> / </w:t>
-      </w:r>
-      <w:proofErr w:type="spellStart"/>
-      <w:r>
-        <w:rPr>
-          <w:rFonts w:cs="Arial"/>
-          <w:i/>
-          <w:iCs/>
-        </w:rPr>
-        <w:t>AlphaPose</w:t>
-      </w:r>
-      <w:proofErr w:type="spellEnd"/>
-      <w:r>
-        <w:rPr>
-          <w:rFonts w:cs="Arial"/>
-          <w:i/>
-          <w:iCs/>
-        </w:rPr>
-        <w:t>:</w:t>
-      </w:r>
-      <w:r>
-        <w:rPr>
-          <w:rFonts w:cs="Arial"/>
-        </w:rPr>
-        <w:t xml:space="preserve"> Descartados para el </w:t>
-      </w:r>
-      <w:proofErr w:type="spellStart"/>
-      <w:r>
-        <w:rPr>
-          <w:rFonts w:cs="Arial"/>
-        </w:rPr>
-        <w:t>core</w:t>
-      </w:r>
-      <w:proofErr w:type="spellEnd"/>
-      <w:r>
-        <w:rPr>
-          <w:rFonts w:cs="Arial"/>
-        </w:rPr>
-        <w:t xml:space="preserve"> móvil por ser pesados (</w:t>
-      </w:r>
-      <w:proofErr w:type="spellStart"/>
-      <w:r>
-        <w:rPr>
-          <w:rFonts w:cs="Arial"/>
-        </w:rPr>
-        <w:t>AlphaPose</w:t>
-      </w:r>
-      <w:proofErr w:type="spellEnd"/>
-      <w:r>
-        <w:rPr>
-          <w:rFonts w:cs="Arial"/>
-        </w:rPr>
-        <w:t>/</w:t>
-      </w:r>
-      <w:proofErr w:type="spellStart"/>
-      <w:r>
-        <w:rPr>
-          <w:rFonts w:cs="Arial"/>
-        </w:rPr>
-        <w:t>OpenPose</w:t>
-      </w:r>
-      <w:proofErr w:type="spellEnd"/>
-      <w:r>
-        <w:rPr>
-          <w:rFonts w:cs="Arial"/>
-        </w:rPr>
-        <w:t>) o limitar la salida a 2D (</w:t>
-      </w:r>
-      <w:proofErr w:type="spellStart"/>
-      <w:r>
-        <w:rPr>
-          <w:rFonts w:cs="Arial"/>
-        </w:rPr>
-        <w:t>MoveNet</w:t>
-      </w:r>
-      <w:proofErr w:type="spellEnd"/>
-      <w:r>
-        <w:rPr>
-          <w:rFonts w:cs="Arial"/>
-        </w:rPr>
-        <w:t>/</w:t>
-      </w:r>
-      <w:proofErr w:type="spellStart"/>
-      <w:r>
-        <w:rPr>
-          <w:rFonts w:cs="Arial"/>
-        </w:rPr>
-        <w:t>OpenPose</w:t>
-      </w:r>
-      <w:proofErr w:type="spellEnd"/>
-      <w:r>
-        <w:rPr>
-          <w:rFonts w:cs="Arial"/>
-        </w:rPr>
-        <w:t>).</w:t>
+        <w:t>OpenPose / MoveNet / AlphaPose:</w:t>
+      </w:r>
+      <w:r>
+        <w:rPr>
+          <w:rFonts w:cs="Arial"/>
+        </w:rPr>
+        <w:t xml:space="preserve"> Descartados para el core móvil por ser pesados (AlphaPose/OpenPose) o limitar la salida a 2D (MoveNet/OpenPose).</w:t>
       </w:r>
     </w:p>
     <w:p>
@@ -2836,41 +1727,13 @@
           <w:rFonts w:cs="Arial"/>
         </w:rPr>
       </w:pPr>
-      <w:proofErr w:type="spellStart"/>
       <w:r>
         <w:rPr>
           <w:rFonts w:cs="Arial"/>
           <w:i/>
           <w:iCs/>
         </w:rPr>
-        <w:t>RTMPose</w:t>
-      </w:r>
-      <w:proofErr w:type="spellEnd"/>
-      <w:r>
-        <w:rPr>
-          <w:rFonts w:cs="Arial"/>
-          <w:i/>
-          <w:iCs/>
-        </w:rPr>
-        <w:t xml:space="preserve"> / </w:t>
-      </w:r>
-      <w:proofErr w:type="spellStart"/>
-      <w:r>
-        <w:rPr>
-          <w:rFonts w:cs="Arial"/>
-          <w:i/>
-          <w:iCs/>
-        </w:rPr>
-        <w:t>ViTPose</w:t>
-      </w:r>
-      <w:proofErr w:type="spellEnd"/>
-      <w:r>
-        <w:rPr>
-          <w:rFonts w:cs="Arial"/>
-          <w:i/>
-          <w:iCs/>
-        </w:rPr>
-        <w:t>:</w:t>
+        <w:t>RTMPose / ViTPose:</w:t>
       </w:r>
       <w:r>
         <w:rPr>
@@ -2891,6 +1754,7 @@
         <w:rPr>
           <w:rFonts w:ascii="Arial" w:hAnsi="Arial" w:cs="Arial"/>
         </w:rPr>
+        <w:lastRenderedPageBreak/>
         <w:t>2. Motor de Biomecánica (Extracción de Características)</w:t>
       </w:r>
     </w:p>
@@ -2906,35 +1770,7 @@
         <w:rPr>
           <w:rFonts w:cs="Arial"/>
         </w:rPr>
-        <w:t>Una vez obtenidos los puntos clave (</w:t>
-      </w:r>
-      <w:proofErr w:type="spellStart"/>
-      <w:r>
-        <w:rPr>
-          <w:rFonts w:cs="Arial"/>
-        </w:rPr>
-        <w:t>landmarks</w:t>
-      </w:r>
-      <w:proofErr w:type="spellEnd"/>
-      <w:r>
-        <w:rPr>
-          <w:rFonts w:cs="Arial"/>
-        </w:rPr>
-        <w:t xml:space="preserve">) de </w:t>
-      </w:r>
-      <w:proofErr w:type="spellStart"/>
-      <w:r>
-        <w:rPr>
-          <w:rFonts w:cs="Arial"/>
-        </w:rPr>
-        <w:t>BlazePose</w:t>
-      </w:r>
-      <w:proofErr w:type="spellEnd"/>
-      <w:r>
-        <w:rPr>
-          <w:rFonts w:cs="Arial"/>
-        </w:rPr>
-        <w:t>, el sistema transforma estos datos en información física y geométrica con significado clínico/deportivo.</w:t>
+        <w:t>Una vez obtenidos los puntos clave (landmarks) de BlazePose, el sistema transforma estos datos en información física y geométrica con significado clínico/deportivo.</w:t>
       </w:r>
     </w:p>
     <w:p>
@@ -3004,21 +1840,7 @@
         <w:rPr>
           <w:rFonts w:cs="Arial"/>
         </w:rPr>
-        <w:t xml:space="preserve"> Derivadas de los cambios de posición y ángulos entre </w:t>
-      </w:r>
-      <w:proofErr w:type="spellStart"/>
-      <w:r>
-        <w:rPr>
-          <w:rFonts w:cs="Arial"/>
-        </w:rPr>
-        <w:t>frames</w:t>
-      </w:r>
-      <w:proofErr w:type="spellEnd"/>
-      <w:r>
-        <w:rPr>
-          <w:rFonts w:cs="Arial"/>
-        </w:rPr>
-        <w:t xml:space="preserve"> consecutivos para evaluar la explosividad y el control del movimiento.</w:t>
+        <w:t xml:space="preserve"> Derivadas de los cambios de posición y ángulos entre frames consecutivos para evaluar la explosividad y el control del movimiento.</w:t>
       </w:r>
     </w:p>
     <w:p>
@@ -3033,21 +1855,7 @@
         <w:rPr>
           <w:rFonts w:ascii="Arial" w:hAnsi="Arial" w:cs="Arial"/>
         </w:rPr>
-        <w:t xml:space="preserve">3. Clasificación y Modelado Predictivo (Machine </w:t>
-      </w:r>
-      <w:proofErr w:type="spellStart"/>
-      <w:r>
-        <w:rPr>
-          <w:rFonts w:ascii="Arial" w:hAnsi="Arial" w:cs="Arial"/>
-        </w:rPr>
-        <w:t>Learning</w:t>
-      </w:r>
-      <w:proofErr w:type="spellEnd"/>
-      <w:r>
-        <w:rPr>
-          <w:rFonts w:ascii="Arial" w:hAnsi="Arial" w:cs="Arial"/>
-        </w:rPr>
-        <w:t>)</w:t>
+        <w:t>3. Clasificación y Modelado Predictivo (Machine Learning)</w:t>
       </w:r>
     </w:p>
     <w:p>
@@ -3073,16 +1881,7 @@
         </w:rPr>
       </w:pPr>
       <w:r>
-        <w:lastRenderedPageBreak/>
-        <w:t xml:space="preserve">Modelos de Machine </w:t>
-      </w:r>
-      <w:proofErr w:type="spellStart"/>
-      <w:r>
-        <w:t>Learning</w:t>
-      </w:r>
-      <w:proofErr w:type="spellEnd"/>
-      <w:r>
-        <w:t xml:space="preserve"> Evaluados</w:t>
+        <w:t>Modelos de Machine Learning Evaluados</w:t>
       </w:r>
     </w:p>
     <w:p>
@@ -3143,40 +1942,15 @@
         </w:numPr>
         <w:jc w:val="left"/>
       </w:pPr>
-      <w:proofErr w:type="spellStart"/>
       <w:r>
         <w:rPr>
           <w:b/>
           <w:bCs/>
         </w:rPr>
-        <w:t>BiLSTM</w:t>
-      </w:r>
-      <w:proofErr w:type="spellEnd"/>
-      <w:r>
-        <w:rPr>
-          <w:b/>
-          <w:bCs/>
-        </w:rPr>
-        <w:t>:</w:t>
-      </w:r>
-      <w:r>
-        <w:t xml:space="preserve"> Con complejidad media-alta y requisitos de datos medios, es el modelo ideal para ser ejecutado en el servidor. Destaca en el procesamiento a posteriori (</w:t>
-      </w:r>
-      <w:proofErr w:type="spellStart"/>
-      <w:r>
-        <w:t>post-entrenamiento</w:t>
-      </w:r>
-      <w:proofErr w:type="spellEnd"/>
-      <w:r>
-        <w:t xml:space="preserve">), ya que analiza tanto el contexto pasado como el futuro de cada </w:t>
-      </w:r>
-      <w:proofErr w:type="spellStart"/>
-      <w:r>
-        <w:t>frame</w:t>
-      </w:r>
-      <w:proofErr w:type="spellEnd"/>
-      <w:r>
-        <w:t xml:space="preserve"> de vídeo.</w:t>
+        <w:t>BiLSTM:</w:t>
+      </w:r>
+      <w:r>
+        <w:t xml:space="preserve"> Con complejidad media-alta y requisitos de datos medios, es el modelo ideal para ser ejecutado en el servidor. Destaca en el procesamiento a posteriori (post-entrenamiento), ya que analiza tanto el contexto pasado como el futuro de cada frame de vídeo.</w:t>
       </w:r>
     </w:p>
     <w:p>
@@ -3188,21 +1962,12 @@
         </w:numPr>
         <w:jc w:val="left"/>
       </w:pPr>
-      <w:proofErr w:type="spellStart"/>
       <w:r>
         <w:rPr>
           <w:b/>
           <w:bCs/>
         </w:rPr>
-        <w:t>Transformer</w:t>
-      </w:r>
-      <w:proofErr w:type="spellEnd"/>
-      <w:r>
-        <w:rPr>
-          <w:b/>
-          <w:bCs/>
-        </w:rPr>
-        <w:t>:</w:t>
+        <w:t>Transformer:</w:t>
       </w:r>
       <w:r>
         <w:t xml:space="preserve"> Ofrece una altísima capacidad de modelado, pero con requerimientos muy altos tanto de datos como de complejidad. Resulta demasiado pesado y complejo para la primera versi</w:t>
@@ -3303,23 +2068,8 @@
         <w:rPr>
           <w:rFonts w:cs="Arial"/>
         </w:rPr>
-        <w:t xml:space="preserve"> por su ligereza. Si la aplicación requiere un informe detallado </w:t>
-      </w:r>
-      <w:proofErr w:type="spellStart"/>
-      <w:r>
-        <w:rPr>
-          <w:rFonts w:cs="Arial"/>
-        </w:rPr>
-        <w:t>post-entrenamiento</w:t>
-      </w:r>
-      <w:proofErr w:type="spellEnd"/>
-      <w:r>
-        <w:rPr>
-          <w:rFonts w:cs="Arial"/>
-        </w:rPr>
-        <w:t xml:space="preserve">, enviar los datos al servidor para pasarlos por una </w:t>
-      </w:r>
-      <w:proofErr w:type="spellStart"/>
+        <w:t xml:space="preserve"> por su ligereza. Si la aplicación requiere un informe detallado post-entrenamiento, enviar los datos al servidor para pasarlos por una </w:t>
+      </w:r>
       <w:r>
         <w:rPr>
           <w:rFonts w:cs="Arial"/>
@@ -3328,7 +2078,6 @@
         </w:rPr>
         <w:t>BiLSTM</w:t>
       </w:r>
-      <w:proofErr w:type="spellEnd"/>
       <w:r>
         <w:rPr>
           <w:rFonts w:cs="Arial"/>
@@ -3348,21 +2097,7 @@
         <w:rPr>
           <w:rFonts w:ascii="Arial" w:hAnsi="Arial" w:cs="Arial"/>
         </w:rPr>
-        <w:t>4. Sistema de Inferencia y Retroalimentación (</w:t>
-      </w:r>
-      <w:proofErr w:type="spellStart"/>
-      <w:r>
-        <w:rPr>
-          <w:rFonts w:ascii="Arial" w:hAnsi="Arial" w:cs="Arial"/>
-        </w:rPr>
-        <w:t>Feedback</w:t>
-      </w:r>
-      <w:proofErr w:type="spellEnd"/>
-      <w:r>
-        <w:rPr>
-          <w:rFonts w:ascii="Arial" w:hAnsi="Arial" w:cs="Arial"/>
-        </w:rPr>
-        <w:t>)</w:t>
+        <w:t>4. Sistema de Inferencia y Retroalimentación (Feedback)</w:t>
       </w:r>
     </w:p>
     <w:p>
@@ -3405,21 +2140,7 @@
         <w:rPr>
           <w:rFonts w:cs="Arial"/>
         </w:rPr>
-        <w:t xml:space="preserve"> Reglas clínicas de "</w:t>
-      </w:r>
-      <w:proofErr w:type="spellStart"/>
-      <w:r>
-        <w:rPr>
-          <w:rFonts w:cs="Arial"/>
-        </w:rPr>
-        <w:t>hard-code</w:t>
-      </w:r>
-      <w:proofErr w:type="spellEnd"/>
-      <w:r>
-        <w:rPr>
-          <w:rFonts w:cs="Arial"/>
-        </w:rPr>
-        <w:t>" que actúan como salvavidas inmediatos para evitar lesiones.</w:t>
+        <w:t xml:space="preserve"> Reglas clínicas de "hard-code" que actúan como salvavidas inmediatos para evitar lesiones.</w:t>
       </w:r>
     </w:p>
     <w:p>
@@ -3454,23 +2175,7 @@
           <w:rStyle w:val="HTMLCode"/>
           <w:rFonts w:cs="Arial"/>
         </w:rPr>
-        <w:t>SI (Ejercicio == Sentadilla) Y (</w:t>
-      </w:r>
-      <w:proofErr w:type="spellStart"/>
-      <w:r>
-        <w:rPr>
-          <w:rStyle w:val="HTMLCode"/>
-          <w:rFonts w:cs="Arial"/>
-        </w:rPr>
-        <w:t>Ángulo_Rodilla</w:t>
-      </w:r>
-      <w:proofErr w:type="spellEnd"/>
-      <w:r>
-        <w:rPr>
-          <w:rStyle w:val="HTMLCode"/>
-          <w:rFonts w:cs="Arial"/>
-        </w:rPr>
-        <w:t xml:space="preserve"> &lt; 90º) -&gt; "Profundidad correcta"</w:t>
+        <w:t>SI (Ejercicio == Sentadilla) Y (Ángulo_Rodilla &lt; 90º) -&gt; "Profundidad correcta"</w:t>
       </w:r>
     </w:p>
     <w:p>
@@ -3492,6 +2197,7 @@
           <w:i/>
           <w:iCs/>
         </w:rPr>
+        <w:lastRenderedPageBreak/>
         <w:t>Regla de Seguridad Articular:</w:t>
       </w:r>
       <w:r>
@@ -3505,39 +2211,7 @@
           <w:rStyle w:val="HTMLCode"/>
           <w:rFonts w:cs="Arial"/>
         </w:rPr>
-        <w:t>SI (</w:t>
-      </w:r>
-      <w:proofErr w:type="spellStart"/>
-      <w:r>
-        <w:rPr>
-          <w:rStyle w:val="HTMLCode"/>
-          <w:rFonts w:cs="Arial"/>
-        </w:rPr>
-        <w:t>Posición_X_Rodilla</w:t>
-      </w:r>
-      <w:proofErr w:type="spellEnd"/>
-      <w:r>
-        <w:rPr>
-          <w:rStyle w:val="HTMLCode"/>
-          <w:rFonts w:cs="Arial"/>
-        </w:rPr>
-        <w:t xml:space="preserve"> &gt; </w:t>
-      </w:r>
-      <w:proofErr w:type="spellStart"/>
-      <w:r>
-        <w:rPr>
-          <w:rStyle w:val="HTMLCode"/>
-          <w:rFonts w:cs="Arial"/>
-        </w:rPr>
-        <w:t>Posición_X_Puntera</w:t>
-      </w:r>
-      <w:proofErr w:type="spellEnd"/>
-      <w:r>
-        <w:rPr>
-          <w:rStyle w:val="HTMLCode"/>
-          <w:rFonts w:cs="Arial"/>
-        </w:rPr>
-        <w:t>) -&gt; "</w:t>
+        <w:t>SI (Posición_X_Rodilla &gt; Posición_X_Puntera) -&gt; "</w:t>
       </w:r>
       <w:r>
         <w:rPr>
@@ -3637,21 +2311,7 @@
         <w:rPr>
           <w:rFonts w:cs="Arial"/>
         </w:rPr>
-        <w:t xml:space="preserve">Para que la aplicación fluya en teléfonos móviles de gama media sin sobrecalentamiento ni caídas de </w:t>
-      </w:r>
-      <w:proofErr w:type="spellStart"/>
-      <w:r>
-        <w:rPr>
-          <w:rFonts w:cs="Arial"/>
-        </w:rPr>
-        <w:t>frames</w:t>
-      </w:r>
-      <w:proofErr w:type="spellEnd"/>
-      <w:r>
-        <w:rPr>
-          <w:rFonts w:cs="Arial"/>
-        </w:rPr>
-        <w:t>, se aplicará un estricto protocolo de rendimiento:</w:t>
+        <w:t>Para que la aplicación fluya en teléfonos móviles de gama media sin sobrecalentamiento ni caídas de frames, se aplicará un estricto protocolo de rendimiento:</w:t>
       </w:r>
     </w:p>
     <w:p>
@@ -3667,74 +2327,27 @@
           <w:rFonts w:cs="Arial"/>
         </w:rPr>
       </w:pPr>
-      <w:proofErr w:type="spellStart"/>
       <w:r>
         <w:rPr>
           <w:rFonts w:cs="Arial"/>
           <w:b/>
           <w:bCs/>
         </w:rPr>
-        <w:lastRenderedPageBreak/>
-        <w:t>Frame</w:t>
-      </w:r>
-      <w:proofErr w:type="spellEnd"/>
+        <w:t>Frame Skipping (Salto de Fotogramas):</w:t>
+      </w:r>
+      <w:r>
+        <w:rPr>
+          <w:rFonts w:cs="Arial"/>
+        </w:rPr>
+        <w:t xml:space="preserve"> No es necesario analizar video a 30 o 60 FPS. El movimiento de hipertrofia o fuerza es relativamente lento. Se procesará </w:t>
+      </w:r>
       <w:r>
         <w:rPr>
           <w:rFonts w:cs="Arial"/>
           <w:b/>
           <w:bCs/>
         </w:rPr>
-        <w:t xml:space="preserve"> </w:t>
-      </w:r>
-      <w:proofErr w:type="spellStart"/>
-      <w:r>
-        <w:rPr>
-          <w:rFonts w:cs="Arial"/>
-          <w:b/>
-          <w:bCs/>
-        </w:rPr>
-        <w:t>Skipping</w:t>
-      </w:r>
-      <w:proofErr w:type="spellEnd"/>
-      <w:r>
-        <w:rPr>
-          <w:rFonts w:cs="Arial"/>
-          <w:b/>
-          <w:bCs/>
-        </w:rPr>
-        <w:t xml:space="preserve"> (Salto de Fotogramas):</w:t>
-      </w:r>
-      <w:r>
-        <w:rPr>
-          <w:rFonts w:cs="Arial"/>
-        </w:rPr>
-        <w:t xml:space="preserve"> No es necesario analizar video a 30 o 60 FPS. El movimiento de hipertrofia o fuerza es relativamente lento. Se procesará </w:t>
-      </w:r>
-      <w:r>
-        <w:rPr>
-          <w:rFonts w:cs="Arial"/>
-          <w:b/>
-          <w:bCs/>
-        </w:rPr>
-        <w:t xml:space="preserve">1 </w:t>
-      </w:r>
-      <w:proofErr w:type="spellStart"/>
-      <w:r>
-        <w:rPr>
-          <w:rFonts w:cs="Arial"/>
-          <w:b/>
-          <w:bCs/>
-        </w:rPr>
-        <w:t>frame</w:t>
-      </w:r>
-      <w:proofErr w:type="spellEnd"/>
-      <w:r>
-        <w:rPr>
-          <w:rFonts w:cs="Arial"/>
-          <w:b/>
-          <w:bCs/>
-        </w:rPr>
-        <w:t xml:space="preserve"> de cada 5</w:t>
+        <w:t>1 frame de cada 5</w:t>
       </w:r>
       <w:r>
         <w:rPr>
@@ -3770,110 +2383,40 @@
           <w:rFonts w:cs="Arial"/>
         </w:rPr>
       </w:pPr>
-      <w:proofErr w:type="spellStart"/>
       <w:r>
         <w:rPr>
           <w:rFonts w:cs="Arial"/>
           <w:b/>
           <w:bCs/>
         </w:rPr>
-        <w:t>Downscaling</w:t>
-      </w:r>
-      <w:proofErr w:type="spellEnd"/>
-      <w:r>
-        <w:rPr>
-          <w:rFonts w:cs="Arial"/>
-          <w:b/>
-          <w:bCs/>
-        </w:rPr>
-        <w:t xml:space="preserve"> (Redimensionado):</w:t>
-      </w:r>
-      <w:r>
-        <w:rPr>
-          <w:rFonts w:cs="Arial"/>
-        </w:rPr>
-        <w:t xml:space="preserve"> Antes de pasar por la red neuronal de estimación (</w:t>
-      </w:r>
-      <w:proofErr w:type="spellStart"/>
-      <w:r>
-        <w:rPr>
-          <w:rFonts w:cs="Arial"/>
-        </w:rPr>
-        <w:t>OpenCV</w:t>
-      </w:r>
-      <w:proofErr w:type="spellEnd"/>
-      <w:r>
-        <w:rPr>
-          <w:rFonts w:cs="Arial"/>
-        </w:rPr>
-        <w:t>/</w:t>
-      </w:r>
-      <w:proofErr w:type="spellStart"/>
-      <w:r>
-        <w:rPr>
-          <w:rFonts w:cs="Arial"/>
-        </w:rPr>
-        <w:t>MediaPipe</w:t>
-      </w:r>
-      <w:proofErr w:type="spellEnd"/>
-      <w:r>
-        <w:rPr>
-          <w:rFonts w:cs="Arial"/>
-        </w:rPr>
-        <w:t xml:space="preserve">), el </w:t>
-      </w:r>
-      <w:proofErr w:type="spellStart"/>
-      <w:r>
-        <w:rPr>
-          <w:rFonts w:cs="Arial"/>
-        </w:rPr>
-        <w:t>frame</w:t>
-      </w:r>
-      <w:proofErr w:type="spellEnd"/>
-      <w:r>
-        <w:rPr>
-          <w:rFonts w:cs="Arial"/>
-        </w:rPr>
-        <w:t xml:space="preserve"> original se reducirá a dimensiones óptimas (ej. </w:t>
+        <w:t>Downscaling (Redimensionado):</w:t>
+      </w:r>
+      <w:r>
+        <w:rPr>
+          <w:rFonts w:cs="Arial"/>
+        </w:rPr>
+        <w:t xml:space="preserve"> Antes de pasar por la red neuronal de estimación (OpenCV/MediaPipe), el frame original se reducirá a dimensiones óptimas (ej. </w:t>
       </w:r>
       <w:r>
         <w:rPr>
           <w:rStyle w:val="HTMLCode"/>
           <w:rFonts w:cs="Arial"/>
         </w:rPr>
-        <w:t xml:space="preserve">256x256 </w:t>
-      </w:r>
-      <w:proofErr w:type="spellStart"/>
+        <w:t>256x256 px</w:t>
+      </w:r>
+      <w:r>
+        <w:rPr>
+          <w:rFonts w:cs="Arial"/>
+        </w:rPr>
+        <w:t xml:space="preserve"> o </w:t>
+      </w:r>
       <w:r>
         <w:rPr>
           <w:rStyle w:val="HTMLCode"/>
           <w:rFonts w:cs="Arial"/>
         </w:rPr>
-        <w:t>px</w:t>
-      </w:r>
-      <w:proofErr w:type="spellEnd"/>
-      <w:r>
-        <w:rPr>
-          <w:rFonts w:cs="Arial"/>
-        </w:rPr>
-        <w:t xml:space="preserve"> o </w:t>
-      </w:r>
-      <w:r>
-        <w:rPr>
-          <w:rStyle w:val="HTMLCode"/>
-          <w:rFonts w:cs="Arial"/>
-        </w:rPr>
-        <w:t xml:space="preserve">224x224 </w:t>
-      </w:r>
-      <w:proofErr w:type="spellStart"/>
-      <w:r>
-        <w:rPr>
-          <w:rStyle w:val="HTMLCode"/>
-          <w:rFonts w:cs="Arial"/>
-        </w:rPr>
-        <w:t>px</w:t>
-      </w:r>
-      <w:proofErr w:type="spellEnd"/>
+        <w:t>224x224 px</w:t>
+      </w:r>
       <w:r>
         <w:rPr>
           <w:rFonts w:cs="Arial"/>
@@ -4158,7 +2701,6 @@
         <w:rPr>
           <w:noProof/>
         </w:rPr>
-        <w:lastRenderedPageBreak/>
         <w:drawing>
           <wp:inline distT="0" distB="0" distL="0" distR="0" wp14:anchorId="55E8FA1D" wp14:editId="5D68251D">
             <wp:extent cx="5943600" cy="3375025"/>
@@ -4264,19 +2806,11 @@
           <w:rFonts w:ascii="Times New Roman" w:hAnsi="Times New Roman"/>
         </w:rPr>
       </w:pPr>
-      <w:proofErr w:type="spellStart"/>
-      <w:r>
-        <w:rPr>
-          <w:rFonts w:cs="Arial"/>
-        </w:rPr>
-        <w:t>Codigo</w:t>
-      </w:r>
-      <w:proofErr w:type="spellEnd"/>
-      <w:r>
-        <w:rPr>
-          <w:rFonts w:cs="Arial"/>
-        </w:rPr>
-        <w:t xml:space="preserve"> pedido a la IA: </w:t>
+      <w:r>
+        <w:rPr>
+          <w:rFonts w:cs="Arial"/>
+        </w:rPr>
+        <w:t xml:space="preserve">Codigo pedido a la IA: </w:t>
       </w:r>
       <w:r>
         <w:t>4️</w:t>
@@ -4301,15 +2835,7 @@
         <w:jc w:val="left"/>
       </w:pPr>
       <w:r>
-        <w:t xml:space="preserve">Normaliza todos los </w:t>
-      </w:r>
-      <w:proofErr w:type="spellStart"/>
-      <w:r>
-        <w:t>keypoints</w:t>
-      </w:r>
-      <w:proofErr w:type="spellEnd"/>
-      <w:r>
-        <w:t xml:space="preserve"> por torso/cadera → posición y tamaño</w:t>
+        <w:t>Normaliza todos los keypoints por torso/cadera → posición y tamaño</w:t>
       </w:r>
     </w:p>
     <w:p>
@@ -4416,19 +2942,11 @@
       <w:r>
         <w:t xml:space="preserve">Extrae </w:t>
       </w:r>
-      <w:proofErr w:type="spellStart"/>
       <w:r>
         <w:rPr>
           <w:rStyle w:val="Strong"/>
         </w:rPr>
-        <w:t>features</w:t>
-      </w:r>
-      <w:proofErr w:type="spellEnd"/>
-      <w:r>
-        <w:rPr>
-          <w:rStyle w:val="Strong"/>
-        </w:rPr>
-        <w:t xml:space="preserve"> universales por repetición</w:t>
+        <w:t>features universales por repetición</w:t>
       </w:r>
       <w:r>
         <w:t>:</w:t>
@@ -4444,13 +2962,8 @@
         <w:jc w:val="left"/>
       </w:pPr>
       <w:r>
-        <w:t>ROM máximo/</w:t>
-      </w:r>
-      <w:proofErr w:type="spellStart"/>
-      <w:r>
-        <w:t>minimo</w:t>
-      </w:r>
-      <w:proofErr w:type="spellEnd"/>
+        <w:t>ROM máximo/minimo</w:t>
+      </w:r>
     </w:p>
     <w:p>
       <w:pPr>
@@ -4488,15 +3001,7 @@
         <w:jc w:val="left"/>
       </w:pPr>
       <w:r>
-        <w:t xml:space="preserve">Guarda todo en un </w:t>
-      </w:r>
-      <w:proofErr w:type="spellStart"/>
-      <w:r>
-        <w:t>dataset</w:t>
-      </w:r>
-      <w:proofErr w:type="spellEnd"/>
-      <w:r>
-        <w:t xml:space="preserve"> por repetición → listo para ML o reglas</w:t>
+        <w:t>Guarda todo en un dataset por repetición → listo para ML o reglas</w:t>
       </w:r>
     </w:p>
     <w:p>
@@ -4575,15 +3080,7 @@
         <w:t>Balanceos y compensaciones (Estabilidad real):</w:t>
       </w:r>
       <w:r>
-        <w:t xml:space="preserve"> Puedes detectar con </w:t>
-      </w:r>
-      <w:proofErr w:type="spellStart"/>
-      <w:r>
-        <w:t>MediaPipe</w:t>
-      </w:r>
-      <w:proofErr w:type="spellEnd"/>
-      <w:r>
-        <w:t xml:space="preserve"> si el tronco se inclina hacia adelante, pero ¿cómo sabes si el usuario está perdiendo el equilibrio o simplemente tiene esa anatomía? El equilibrio real se define </w:t>
+        <w:t xml:space="preserve"> Puedes detectar con MediaPipe si el tronco se inclina hacia adelante, pero ¿cómo sabes si el usuario está perdiendo el equilibrio o simplemente tiene esa anatomía? El equilibrio real se define </w:t>
       </w:r>
       <w:r>
         <w:rPr>
@@ -4681,72 +3178,10 @@
           <w:color w:val="E3E3E3"/>
           <w:shd w:val="clear" w:color="auto" w:fill="282A2C"/>
         </w:rPr>
-        <w:t xml:space="preserve"> dame el </w:t>
-      </w:r>
-      <w:proofErr w:type="spellStart"/>
-      <w:r>
-        <w:rPr>
-          <w:rFonts w:cs="Arial"/>
-          <w:color w:val="E3E3E3"/>
-          <w:shd w:val="clear" w:color="auto" w:fill="282A2C"/>
-        </w:rPr>
-        <w:t>codigo</w:t>
-      </w:r>
-      <w:proofErr w:type="spellEnd"/>
-      <w:r>
-        <w:rPr>
-          <w:rFonts w:cs="Arial"/>
-          <w:color w:val="E3E3E3"/>
-          <w:shd w:val="clear" w:color="auto" w:fill="282A2C"/>
-        </w:rPr>
-        <w:t xml:space="preserve"> para la red, </w:t>
-      </w:r>
-      <w:proofErr w:type="spellStart"/>
-      <w:r>
-        <w:rPr>
-          <w:rFonts w:cs="Arial"/>
-          <w:color w:val="E3E3E3"/>
-          <w:shd w:val="clear" w:color="auto" w:fill="282A2C"/>
-        </w:rPr>
-        <w:t>acuerdate</w:t>
-      </w:r>
-      <w:proofErr w:type="spellEnd"/>
-      <w:r>
-        <w:rPr>
-          <w:rFonts w:cs="Arial"/>
-          <w:color w:val="E3E3E3"/>
-          <w:shd w:val="clear" w:color="auto" w:fill="282A2C"/>
-        </w:rPr>
-        <w:t xml:space="preserve"> de todos los </w:t>
-      </w:r>
-      <w:proofErr w:type="spellStart"/>
-      <w:r>
-        <w:rPr>
-          <w:rFonts w:cs="Arial"/>
-          <w:color w:val="E3E3E3"/>
-          <w:shd w:val="clear" w:color="auto" w:fill="282A2C"/>
-        </w:rPr>
-        <w:t>kpis</w:t>
-      </w:r>
-      <w:proofErr w:type="spellEnd"/>
-      <w:r>
-        <w:rPr>
-          <w:rFonts w:cs="Arial"/>
-          <w:color w:val="E3E3E3"/>
-          <w:shd w:val="clear" w:color="auto" w:fill="282A2C"/>
-        </w:rPr>
-        <w:t>, extraer repeticiones, y todo lo que hemos hablado.</w:t>
-      </w:r>
-      <w:r>
-        <w:t xml:space="preserve"> Apuntar posteriormente los </w:t>
-      </w:r>
-      <w:proofErr w:type="spellStart"/>
-      <w:r>
-        <w:t>kpis</w:t>
-      </w:r>
-      <w:proofErr w:type="spellEnd"/>
-      <w:r>
-        <w:t xml:space="preserve"> indicados.</w:t>
+        <w:t> dame el codigo para la red, acuerdate de todos los kpis, extraer repeticiones, y todo lo que hemos hablado.</w:t>
+      </w:r>
+      <w:r>
+        <w:t xml:space="preserve"> Apuntar posteriormente los kpis indicados.</w:t>
       </w:r>
     </w:p>
     <w:p>
@@ -4853,119 +3288,7 @@
         <w:jc w:val="left"/>
       </w:pPr>
       <w:r>
-        <w:t>['</w:t>
-      </w:r>
-      <w:proofErr w:type="spellStart"/>
-      <w:r>
-        <w:t>L_elbow</w:t>
-      </w:r>
-      <w:proofErr w:type="spellEnd"/>
-      <w:r>
-        <w:t>', '</w:t>
-      </w:r>
-      <w:proofErr w:type="spellStart"/>
-      <w:r>
-        <w:t>R_elbow</w:t>
-      </w:r>
-      <w:proofErr w:type="spellEnd"/>
-      <w:r>
-        <w:t>', '</w:t>
-      </w:r>
-      <w:proofErr w:type="spellStart"/>
-      <w:r>
-        <w:t>L_shoulder</w:t>
-      </w:r>
-      <w:proofErr w:type="spellEnd"/>
-      <w:r>
-        <w:t>', '</w:t>
-      </w:r>
-      <w:proofErr w:type="spellStart"/>
-      <w:r>
-        <w:t>R_shoulder</w:t>
-      </w:r>
-      <w:proofErr w:type="spellEnd"/>
-      <w:r>
-        <w:t>', '</w:t>
-      </w:r>
-      <w:proofErr w:type="spellStart"/>
-      <w:r>
-        <w:t>L_knee</w:t>
-      </w:r>
-      <w:proofErr w:type="spellEnd"/>
-      <w:r>
-        <w:t>', '</w:t>
-      </w:r>
-      <w:proofErr w:type="spellStart"/>
-      <w:r>
-        <w:t>R_knee</w:t>
-      </w:r>
-      <w:proofErr w:type="spellEnd"/>
-      <w:r>
-        <w:t>', '</w:t>
-      </w:r>
-      <w:proofErr w:type="spellStart"/>
-      <w:r>
-        <w:t>L_hip</w:t>
-      </w:r>
-      <w:proofErr w:type="spellEnd"/>
-      <w:r>
-        <w:t>', '</w:t>
-      </w:r>
-      <w:proofErr w:type="spellStart"/>
-      <w:r>
-        <w:t>R_hip</w:t>
-      </w:r>
-      <w:proofErr w:type="spellEnd"/>
-      <w:r>
-        <w:t>', '</w:t>
-      </w:r>
-      <w:proofErr w:type="spellStart"/>
-      <w:r>
-        <w:t>L_ankle</w:t>
-      </w:r>
-      <w:proofErr w:type="spellEnd"/>
-      <w:r>
-        <w:t>', '</w:t>
-      </w:r>
-      <w:proofErr w:type="spellStart"/>
-      <w:r>
-        <w:t>R_ankle</w:t>
-      </w:r>
-      <w:proofErr w:type="spellEnd"/>
-      <w:r>
-        <w:t>', 'torso', '</w:t>
-      </w:r>
-      <w:proofErr w:type="spellStart"/>
-      <w:r>
-        <w:t>sust_x</w:t>
-      </w:r>
-      <w:proofErr w:type="spellEnd"/>
-      <w:r>
-        <w:t>', '</w:t>
-      </w:r>
-      <w:proofErr w:type="spellStart"/>
-      <w:r>
-        <w:t>sust_y</w:t>
-      </w:r>
-      <w:proofErr w:type="spellEnd"/>
-      <w:r>
-        <w:t>', '</w:t>
-      </w:r>
-      <w:proofErr w:type="spellStart"/>
-      <w:r>
-        <w:t>sust_z</w:t>
-      </w:r>
-      <w:proofErr w:type="spellEnd"/>
-      <w:r>
-        <w:t>', '</w:t>
-      </w:r>
-      <w:proofErr w:type="spellStart"/>
-      <w:r>
-        <w:t>delta_time</w:t>
-      </w:r>
-      <w:proofErr w:type="spellEnd"/>
-      <w:r>
-        <w:t>']</w:t>
+        <w:t>['L_elbow', 'R_elbow', 'L_shoulder', 'R_shoulder', 'L_knee', 'R_knee', 'L_hip', 'R_hip', 'L_ankle', 'R_ankle', 'torso', 'sust_x', 'sust_y', 'sust_z', 'delta_time']</w:t>
       </w:r>
     </w:p>
     <w:p>

</xml_diff>

<commit_message>
Intento de entrenamiento de forma nueva, rep_report profesional y actualizado
</commit_message>
<xml_diff>
--- a/docs/Planning.docx
+++ b/docs/Planning.docx
@@ -283,6 +283,7 @@
           <w:lang w:val="es-ES"/>
         </w:rPr>
       </w:pPr>
+      <w:proofErr w:type="spellStart"/>
       <w:r>
         <w:rPr>
           <w:lang w:val="es-ES"/>
@@ -290,6 +291,7 @@
         <w:lastRenderedPageBreak/>
         <w:t>Sprints</w:t>
       </w:r>
+      <w:proofErr w:type="spellEnd"/>
     </w:p>
     <w:p>
       <w:pPr>
@@ -327,33 +329,89 @@
         <w:rPr>
           <w:lang w:val="es-ES"/>
         </w:rPr>
-        <w:t>--&gt; Primero de todo he instalado el framework de Android studio, y he iniciado un proyecto de 0.</w:t>
-      </w:r>
-    </w:p>
-    <w:p>
-      <w:pPr>
-        <w:rPr>
-          <w:lang w:val="es-ES"/>
-        </w:rPr>
-      </w:pPr>
-      <w:r>
-        <w:rPr>
-          <w:lang w:val="es-ES"/>
-        </w:rPr>
-        <w:t>--&gt; Posteriormente he creado un repositorio en gitlab para tener un control de versiones.</w:t>
-      </w:r>
-    </w:p>
-    <w:p>
-      <w:pPr>
-        <w:rPr>
-          <w:lang w:val="es-ES"/>
-        </w:rPr>
-      </w:pPr>
-      <w:r>
-        <w:rPr>
-          <w:lang w:val="es-ES"/>
-        </w:rPr>
-        <w:t>--&gt; He trasteado un poco en el framework y he ido programando la aplicación, primero poder hacer fotos y videos y luego poder adjuntar cosas de la galería.</w:t>
+        <w:t xml:space="preserve">--&gt; Primero de todo he instalado el </w:t>
+      </w:r>
+      <w:proofErr w:type="spellStart"/>
+      <w:r>
+        <w:rPr>
+          <w:lang w:val="es-ES"/>
+        </w:rPr>
+        <w:t>framework</w:t>
+      </w:r>
+      <w:proofErr w:type="spellEnd"/>
+      <w:r>
+        <w:rPr>
+          <w:lang w:val="es-ES"/>
+        </w:rPr>
+        <w:t xml:space="preserve"> de Android </w:t>
+      </w:r>
+      <w:proofErr w:type="spellStart"/>
+      <w:r>
+        <w:rPr>
+          <w:lang w:val="es-ES"/>
+        </w:rPr>
+        <w:t>studio</w:t>
+      </w:r>
+      <w:proofErr w:type="spellEnd"/>
+      <w:r>
+        <w:rPr>
+          <w:lang w:val="es-ES"/>
+        </w:rPr>
+        <w:t>, y he iniciado un proyecto de 0.</w:t>
+      </w:r>
+    </w:p>
+    <w:p>
+      <w:pPr>
+        <w:rPr>
+          <w:lang w:val="es-ES"/>
+        </w:rPr>
+      </w:pPr>
+      <w:r>
+        <w:rPr>
+          <w:lang w:val="es-ES"/>
+        </w:rPr>
+        <w:t xml:space="preserve">--&gt; Posteriormente he creado un repositorio en </w:t>
+      </w:r>
+      <w:proofErr w:type="spellStart"/>
+      <w:r>
+        <w:rPr>
+          <w:lang w:val="es-ES"/>
+        </w:rPr>
+        <w:t>gitlab</w:t>
+      </w:r>
+      <w:proofErr w:type="spellEnd"/>
+      <w:r>
+        <w:rPr>
+          <w:lang w:val="es-ES"/>
+        </w:rPr>
+        <w:t xml:space="preserve"> para tener un control de versiones.</w:t>
+      </w:r>
+    </w:p>
+    <w:p>
+      <w:pPr>
+        <w:rPr>
+          <w:lang w:val="es-ES"/>
+        </w:rPr>
+      </w:pPr>
+      <w:r>
+        <w:rPr>
+          <w:lang w:val="es-ES"/>
+        </w:rPr>
+        <w:t xml:space="preserve">--&gt; He trasteado un poco en el </w:t>
+      </w:r>
+      <w:proofErr w:type="spellStart"/>
+      <w:r>
+        <w:rPr>
+          <w:lang w:val="es-ES"/>
+        </w:rPr>
+        <w:t>framework</w:t>
+      </w:r>
+      <w:proofErr w:type="spellEnd"/>
+      <w:r>
+        <w:rPr>
+          <w:lang w:val="es-ES"/>
+        </w:rPr>
+        <w:t xml:space="preserve"> y he ido programando la aplicación, primero poder hacer fotos y videos y luego poder adjuntar cosas de la galería.</w:t>
       </w:r>
     </w:p>
     <w:p>
@@ -379,7 +437,21 @@
         <w:rPr>
           <w:lang w:val="es-ES"/>
         </w:rPr>
-        <w:t>--&gt; la opción de poder cambiar la foto o video subido asi de enviarla al servidor.</w:t>
+        <w:t xml:space="preserve">--&gt; la opción de poder cambiar la foto o video subido </w:t>
+      </w:r>
+      <w:proofErr w:type="spellStart"/>
+      <w:r>
+        <w:rPr>
+          <w:lang w:val="es-ES"/>
+        </w:rPr>
+        <w:t>asi</w:t>
+      </w:r>
+      <w:proofErr w:type="spellEnd"/>
+      <w:r>
+        <w:rPr>
+          <w:lang w:val="es-ES"/>
+        </w:rPr>
+        <w:t xml:space="preserve"> de enviarla al servidor.</w:t>
       </w:r>
     </w:p>
     <w:p>
@@ -431,7 +503,21 @@
         <w:rPr>
           <w:lang w:val="es-ES"/>
         </w:rPr>
-        <w:t>Además, mirar alguna alternativa a openpose.</w:t>
+        <w:t xml:space="preserve">Además, mirar alguna alternativa a </w:t>
+      </w:r>
+      <w:proofErr w:type="spellStart"/>
+      <w:r>
+        <w:rPr>
+          <w:lang w:val="es-ES"/>
+        </w:rPr>
+        <w:t>openpose</w:t>
+      </w:r>
+      <w:proofErr w:type="spellEnd"/>
+      <w:r>
+        <w:rPr>
+          <w:lang w:val="es-ES"/>
+        </w:rPr>
+        <w:t>.</w:t>
       </w:r>
     </w:p>
     <w:p>
@@ -483,20 +569,146 @@
         <w:rPr>
           <w:lang w:val="es-ES"/>
         </w:rPr>
-        <w:t xml:space="preserve">En primer lugar trabajaremos con el análisis de imágenes intentando conseguir los keypoints del cuerpo humano a través de mediapipe. Para ello requiere un análisis he investigación propia, tanto de la propia docimentacion como de repositorios de github los cuales ya han usado esta técnica. </w:t>
-      </w:r>
-    </w:p>
-    <w:p>
-      <w:pPr>
-        <w:rPr>
-          <w:lang w:val="es-ES"/>
-        </w:rPr>
-      </w:pPr>
-      <w:r>
-        <w:rPr>
-          <w:lang w:val="es-ES"/>
-        </w:rPr>
-        <w:t>Una vez obtenido los 33 keypoints intentamos calcular los ángulos de las articulaciones mas importantes del cuerpo como rodilla, codo ,… Una vez obtenidos estos ángulos me doy cuenta de los siguientes problemas:</w:t>
+        <w:t xml:space="preserve">En primer </w:t>
+      </w:r>
+      <w:proofErr w:type="gramStart"/>
+      <w:r>
+        <w:rPr>
+          <w:lang w:val="es-ES"/>
+        </w:rPr>
+        <w:t>lugar</w:t>
+      </w:r>
+      <w:proofErr w:type="gramEnd"/>
+      <w:r>
+        <w:rPr>
+          <w:lang w:val="es-ES"/>
+        </w:rPr>
+        <w:t xml:space="preserve"> trabajaremos con el análisis de imágenes intentando conseguir los </w:t>
+      </w:r>
+      <w:proofErr w:type="spellStart"/>
+      <w:r>
+        <w:rPr>
+          <w:lang w:val="es-ES"/>
+        </w:rPr>
+        <w:t>keypoints</w:t>
+      </w:r>
+      <w:proofErr w:type="spellEnd"/>
+      <w:r>
+        <w:rPr>
+          <w:lang w:val="es-ES"/>
+        </w:rPr>
+        <w:t xml:space="preserve"> del cuerpo humano a través de </w:t>
+      </w:r>
+      <w:proofErr w:type="spellStart"/>
+      <w:r>
+        <w:rPr>
+          <w:lang w:val="es-ES"/>
+        </w:rPr>
+        <w:t>mediapipe</w:t>
+      </w:r>
+      <w:proofErr w:type="spellEnd"/>
+      <w:r>
+        <w:rPr>
+          <w:lang w:val="es-ES"/>
+        </w:rPr>
+        <w:t xml:space="preserve">. Para ello requiere un análisis </w:t>
+      </w:r>
+      <w:proofErr w:type="spellStart"/>
+      <w:r>
+        <w:rPr>
+          <w:lang w:val="es-ES"/>
+        </w:rPr>
+        <w:t>he</w:t>
+      </w:r>
+      <w:proofErr w:type="spellEnd"/>
+      <w:r>
+        <w:rPr>
+          <w:lang w:val="es-ES"/>
+        </w:rPr>
+        <w:t xml:space="preserve"> investigación propia, tanto de la propia </w:t>
+      </w:r>
+      <w:proofErr w:type="spellStart"/>
+      <w:r>
+        <w:rPr>
+          <w:lang w:val="es-ES"/>
+        </w:rPr>
+        <w:t>docimentacion</w:t>
+      </w:r>
+      <w:proofErr w:type="spellEnd"/>
+      <w:r>
+        <w:rPr>
+          <w:lang w:val="es-ES"/>
+        </w:rPr>
+        <w:t xml:space="preserve"> como de repositorios de </w:t>
+      </w:r>
+      <w:proofErr w:type="spellStart"/>
+      <w:r>
+        <w:rPr>
+          <w:lang w:val="es-ES"/>
+        </w:rPr>
+        <w:t>github</w:t>
+      </w:r>
+      <w:proofErr w:type="spellEnd"/>
+      <w:r>
+        <w:rPr>
+          <w:lang w:val="es-ES"/>
+        </w:rPr>
+        <w:t xml:space="preserve"> los cuales ya han usado esta técnica. </w:t>
+      </w:r>
+    </w:p>
+    <w:p>
+      <w:pPr>
+        <w:rPr>
+          <w:lang w:val="es-ES"/>
+        </w:rPr>
+      </w:pPr>
+      <w:r>
+        <w:rPr>
+          <w:lang w:val="es-ES"/>
+        </w:rPr>
+        <w:t xml:space="preserve">Una vez obtenido los 33 </w:t>
+      </w:r>
+      <w:proofErr w:type="spellStart"/>
+      <w:r>
+        <w:rPr>
+          <w:lang w:val="es-ES"/>
+        </w:rPr>
+        <w:t>keypoints</w:t>
+      </w:r>
+      <w:proofErr w:type="spellEnd"/>
+      <w:r>
+        <w:rPr>
+          <w:lang w:val="es-ES"/>
+        </w:rPr>
+        <w:t xml:space="preserve"> intentamos calcular los ángulos de las articulaciones </w:t>
+      </w:r>
+      <w:proofErr w:type="spellStart"/>
+      <w:r>
+        <w:rPr>
+          <w:lang w:val="es-ES"/>
+        </w:rPr>
+        <w:t>mas</w:t>
+      </w:r>
+      <w:proofErr w:type="spellEnd"/>
+      <w:r>
+        <w:rPr>
+          <w:lang w:val="es-ES"/>
+        </w:rPr>
+        <w:t xml:space="preserve"> importantes del cuerpo como rodilla, </w:t>
+      </w:r>
+      <w:proofErr w:type="gramStart"/>
+      <w:r>
+        <w:rPr>
+          <w:lang w:val="es-ES"/>
+        </w:rPr>
+        <w:t>codo ,</w:t>
+      </w:r>
+      <w:proofErr w:type="gramEnd"/>
+      <w:r>
+        <w:rPr>
+          <w:lang w:val="es-ES"/>
+        </w:rPr>
+        <w:t>… Una vez obtenidos estos ángulos me doy cuenta de los siguientes problemas:</w:t>
       </w:r>
     </w:p>
     <w:p>
@@ -532,7 +744,49 @@
         <w:rPr>
           <w:lang w:val="es-ES"/>
         </w:rPr>
-        <w:t>Hay veces que medipipe, aporta ciertos valores con poca fiabilidad (la cual el propio mediapipe te indica a través de un parámetro de fiabilidad), al calcular los ángulos con parámetros poco fiables hay muchos errores, la solución propuesta, es la técnica del espejo, ya que la mayoría de valores poco fiables es debido al perfil de la cámara y la sola obtención de un perfil del usuario.</w:t>
+        <w:t xml:space="preserve">Hay veces que </w:t>
+      </w:r>
+      <w:proofErr w:type="spellStart"/>
+      <w:r>
+        <w:rPr>
+          <w:lang w:val="es-ES"/>
+        </w:rPr>
+        <w:t>medipipe</w:t>
+      </w:r>
+      <w:proofErr w:type="spellEnd"/>
+      <w:r>
+        <w:rPr>
+          <w:lang w:val="es-ES"/>
+        </w:rPr>
+        <w:t xml:space="preserve">, aporta ciertos valores con poca fiabilidad (la cual el propio </w:t>
+      </w:r>
+      <w:proofErr w:type="spellStart"/>
+      <w:r>
+        <w:rPr>
+          <w:lang w:val="es-ES"/>
+        </w:rPr>
+        <w:t>mediapipe</w:t>
+      </w:r>
+      <w:proofErr w:type="spellEnd"/>
+      <w:r>
+        <w:rPr>
+          <w:lang w:val="es-ES"/>
+        </w:rPr>
+        <w:t xml:space="preserve"> te indica a través de un parámetro de fiabilidad), al calcular los ángulos con parámetros poco fiables hay muchos errores, la solución propuesta, es la técnica del espejo, ya que la mayoría de </w:t>
+      </w:r>
+      <w:proofErr w:type="gramStart"/>
+      <w:r>
+        <w:rPr>
+          <w:lang w:val="es-ES"/>
+        </w:rPr>
+        <w:t>valores</w:t>
+      </w:r>
+      <w:proofErr w:type="gramEnd"/>
+      <w:r>
+        <w:rPr>
+          <w:lang w:val="es-ES"/>
+        </w:rPr>
+        <w:t xml:space="preserve"> poco fiables es debido al perfil de la cámara y la sola obtención de un perfil del usuario.</w:t>
       </w:r>
     </w:p>
     <w:p>
@@ -572,46 +826,228 @@
           <w:lang w:val="es-ES"/>
         </w:rPr>
         <w:lastRenderedPageBreak/>
-        <w:t>Antes de todo he decidido conversar con un experto en la materia (graduado den CACYFD) para que me aconseje sobre el trabajo que estoy realizando con respecto a al biomecanica y demás. Me ha sugerido añadir el calculo del centro de sustentación, el cual tiene una serie de ventajas y hace que se pueda profesionalizar el análisis del ejercicio.</w:t>
-      </w:r>
-    </w:p>
-    <w:p>
-      <w:pPr>
-        <w:rPr>
-          <w:lang w:val="es-ES"/>
-        </w:rPr>
-      </w:pPr>
-      <w:r>
-        <w:rPr>
-          <w:lang w:val="es-ES"/>
-        </w:rPr>
-        <w:t>Una vez que tenemos un archivo con todos los ángulos del cuerpo la idea es entrenar a una red neuronal para conseguir que obtenga ciertas conclusiones de los ángulos. Para ello hay que investigar sobre que red es la más adecuada para nuestro caso, y trazar un plan de entrenamiento o fine tunning (a poder ser).</w:t>
-      </w:r>
-    </w:p>
-    <w:p>
-      <w:pPr>
-        <w:rPr>
-          <w:lang w:val="es-ES"/>
-        </w:rPr>
-      </w:pPr>
-      <w:r>
-        <w:rPr>
-          <w:lang w:val="es-ES"/>
-        </w:rPr>
-        <w:t>Han surgido ciertos problemas a la hora de revisar el trabajo realizado y analizar el csv. Además, hablar con el experto en biomecanica me ha llevado a hacer algunos cambios en el código y en la forma de entender el proceso. En cuanto a software he decidido actualizar el código y las dependencias a la versión más nueva de medipipe, ya que ha salido recientemente y he visto que tiene bastantes mejoras, el inconveniente es que me ha tocado cambiar el código. Otro aspecto es en la forma de analizar los datos, mediapipe da un valor junto con cada keypoint de confianza, he decidido filtrar los keypoints por una confianza (variable y en pruebas), para asegurar tener una serie de datos más fiables, dejando espacios vacíos en el conjunto de datos si no se capturan bien en lugar de hacer la técnica del espejo o simplemente valores poco fiables. En cuanto a la técnica del espejo he estado investigando debido al consejo del experto, ya que hemos llegado a la conclusión de que la simetría es un aspecto importante a la hora de analizar un ejercicio y al hacer la técnica del espejo si una parte del cuerpo no se ve estamos asumiendo una simetría inventada que puede dar lugar a errores.</w:t>
-      </w:r>
-    </w:p>
-    <w:p>
-      <w:pPr>
-        <w:rPr>
-          <w:lang w:val="es-ES"/>
-        </w:rPr>
-      </w:pPr>
-      <w:r>
-        <w:rPr>
-          <w:lang w:val="es-ES"/>
-        </w:rPr>
-        <w:t>Al hablar con la tutora después de investigar un poco sobre el ML y como funciona en la parte práctica, nos hemos dado cuenta que es muy difícil entrenar una red neuronal que consiga generalizar y ofrecer técnicas correctas para todos los ejercicios. Por lo que hemos obtado por seguir une esquema híbrido en el que nuestra propia red neuronal sacará unos ciertos parámetros para analizar SOLO el movimiento de sentadilla, mientras que para analizar los demás movimientos la idea ahora es subir el archivo con los ángulos y el punto de sustentación (el cual también hemos añadido gracias al experto) y que una IA externa ya entrenada nos analice el ejercicio para poder otorgar una respuesta al usuario sea el ejercicio que sea.</w:t>
+        <w:t xml:space="preserve">Antes de todo he decidido conversar con un experto en la materia (graduado den CACYFD) para que me aconseje sobre el trabajo que estoy realizando con respecto a </w:t>
+      </w:r>
+      <w:proofErr w:type="spellStart"/>
+      <w:r>
+        <w:rPr>
+          <w:lang w:val="es-ES"/>
+        </w:rPr>
+        <w:t>al</w:t>
+      </w:r>
+      <w:proofErr w:type="spellEnd"/>
+      <w:r>
+        <w:rPr>
+          <w:lang w:val="es-ES"/>
+        </w:rPr>
+        <w:t xml:space="preserve"> </w:t>
+      </w:r>
+      <w:proofErr w:type="spellStart"/>
+      <w:r>
+        <w:rPr>
+          <w:lang w:val="es-ES"/>
+        </w:rPr>
+        <w:t>biomecanica</w:t>
+      </w:r>
+      <w:proofErr w:type="spellEnd"/>
+      <w:r>
+        <w:rPr>
+          <w:lang w:val="es-ES"/>
+        </w:rPr>
+        <w:t xml:space="preserve"> y demás. Me ha sugerido añadir el </w:t>
+      </w:r>
+      <w:proofErr w:type="spellStart"/>
+      <w:r>
+        <w:rPr>
+          <w:lang w:val="es-ES"/>
+        </w:rPr>
+        <w:t>calculo</w:t>
+      </w:r>
+      <w:proofErr w:type="spellEnd"/>
+      <w:r>
+        <w:rPr>
+          <w:lang w:val="es-ES"/>
+        </w:rPr>
+        <w:t xml:space="preserve"> del centro de sustentación, el cual tiene una serie de ventajas y hace que se pueda profesionalizar el análisis del ejercicio.</w:t>
+      </w:r>
+    </w:p>
+    <w:p>
+      <w:pPr>
+        <w:rPr>
+          <w:lang w:val="es-ES"/>
+        </w:rPr>
+      </w:pPr>
+      <w:r>
+        <w:rPr>
+          <w:lang w:val="es-ES"/>
+        </w:rPr>
+        <w:t xml:space="preserve">Una vez que tenemos un archivo con todos los ángulos del cuerpo la idea es entrenar a una red neuronal para conseguir que obtenga ciertas conclusiones de los ángulos. Para ello hay que investigar sobre que red es la más adecuada para nuestro caso, y trazar un plan de entrenamiento o fine </w:t>
+      </w:r>
+      <w:proofErr w:type="spellStart"/>
+      <w:r>
+        <w:rPr>
+          <w:lang w:val="es-ES"/>
+        </w:rPr>
+        <w:t>tunning</w:t>
+      </w:r>
+      <w:proofErr w:type="spellEnd"/>
+      <w:r>
+        <w:rPr>
+          <w:lang w:val="es-ES"/>
+        </w:rPr>
+        <w:t xml:space="preserve"> (a poder ser).</w:t>
+      </w:r>
+    </w:p>
+    <w:p>
+      <w:pPr>
+        <w:rPr>
+          <w:lang w:val="es-ES"/>
+        </w:rPr>
+      </w:pPr>
+      <w:r>
+        <w:rPr>
+          <w:lang w:val="es-ES"/>
+        </w:rPr>
+        <w:t xml:space="preserve">Han surgido ciertos problemas a la hora de revisar el trabajo realizado y analizar el </w:t>
+      </w:r>
+      <w:proofErr w:type="spellStart"/>
+      <w:r>
+        <w:rPr>
+          <w:lang w:val="es-ES"/>
+        </w:rPr>
+        <w:t>csv</w:t>
+      </w:r>
+      <w:proofErr w:type="spellEnd"/>
+      <w:r>
+        <w:rPr>
+          <w:lang w:val="es-ES"/>
+        </w:rPr>
+        <w:t xml:space="preserve">. Además, hablar con el experto en </w:t>
+      </w:r>
+      <w:proofErr w:type="spellStart"/>
+      <w:r>
+        <w:rPr>
+          <w:lang w:val="es-ES"/>
+        </w:rPr>
+        <w:t>biomecanica</w:t>
+      </w:r>
+      <w:proofErr w:type="spellEnd"/>
+      <w:r>
+        <w:rPr>
+          <w:lang w:val="es-ES"/>
+        </w:rPr>
+        <w:t xml:space="preserve"> me ha llevado a hacer algunos cambios en el código y en la forma de entender el proceso. En cuanto a software he decidido actualizar el código y las dependencias a la versión más nueva de </w:t>
+      </w:r>
+      <w:proofErr w:type="spellStart"/>
+      <w:r>
+        <w:rPr>
+          <w:lang w:val="es-ES"/>
+        </w:rPr>
+        <w:t>medipipe</w:t>
+      </w:r>
+      <w:proofErr w:type="spellEnd"/>
+      <w:r>
+        <w:rPr>
+          <w:lang w:val="es-ES"/>
+        </w:rPr>
+        <w:t xml:space="preserve">, ya que ha salido recientemente y he visto que tiene bastantes mejoras, el inconveniente es que me ha tocado cambiar el código. Otro aspecto es en la forma de analizar los datos, </w:t>
+      </w:r>
+      <w:proofErr w:type="spellStart"/>
+      <w:r>
+        <w:rPr>
+          <w:lang w:val="es-ES"/>
+        </w:rPr>
+        <w:t>mediapipe</w:t>
+      </w:r>
+      <w:proofErr w:type="spellEnd"/>
+      <w:r>
+        <w:rPr>
+          <w:lang w:val="es-ES"/>
+        </w:rPr>
+        <w:t xml:space="preserve"> da un valor junto con cada </w:t>
+      </w:r>
+      <w:proofErr w:type="spellStart"/>
+      <w:r>
+        <w:rPr>
+          <w:lang w:val="es-ES"/>
+        </w:rPr>
+        <w:t>keypoint</w:t>
+      </w:r>
+      <w:proofErr w:type="spellEnd"/>
+      <w:r>
+        <w:rPr>
+          <w:lang w:val="es-ES"/>
+        </w:rPr>
+        <w:t xml:space="preserve"> de confianza, he decidido filtrar los </w:t>
+      </w:r>
+      <w:proofErr w:type="spellStart"/>
+      <w:r>
+        <w:rPr>
+          <w:lang w:val="es-ES"/>
+        </w:rPr>
+        <w:t>keypoints</w:t>
+      </w:r>
+      <w:proofErr w:type="spellEnd"/>
+      <w:r>
+        <w:rPr>
+          <w:lang w:val="es-ES"/>
+        </w:rPr>
+        <w:t xml:space="preserve"> por una confianza (variable y en pruebas), para asegurar tener una serie de datos más fiables, dejando espacios vacíos en el conjunto de datos si no se capturan bien en lugar de hacer la técnica del espejo o simplemente valores poco fiables. En cuanto a la técnica del espejo he estado investigando debido al consejo del experto, ya que hemos llegado a la conclusión de que la simetría es un aspecto importante a la hora de analizar un ejercicio y al hacer la técnica del espejo si una parte del cuerpo no se ve estamos asumiendo una simetría inventada que puede dar lugar a errores.</w:t>
+      </w:r>
+    </w:p>
+    <w:p>
+      <w:pPr>
+        <w:rPr>
+          <w:lang w:val="es-ES"/>
+        </w:rPr>
+      </w:pPr>
+      <w:r>
+        <w:rPr>
+          <w:lang w:val="es-ES"/>
+        </w:rPr>
+        <w:t xml:space="preserve">Al hablar con la tutora después de investigar un poco sobre el ML y </w:t>
+      </w:r>
+      <w:proofErr w:type="spellStart"/>
+      <w:r>
+        <w:rPr>
+          <w:lang w:val="es-ES"/>
+        </w:rPr>
+        <w:t>como</w:t>
+      </w:r>
+      <w:proofErr w:type="spellEnd"/>
+      <w:r>
+        <w:rPr>
+          <w:lang w:val="es-ES"/>
+        </w:rPr>
+        <w:t xml:space="preserve"> funciona en la parte práctica, nos hemos dado cuenta </w:t>
+      </w:r>
+      <w:proofErr w:type="gramStart"/>
+      <w:r>
+        <w:rPr>
+          <w:lang w:val="es-ES"/>
+        </w:rPr>
+        <w:t>que</w:t>
+      </w:r>
+      <w:proofErr w:type="gramEnd"/>
+      <w:r>
+        <w:rPr>
+          <w:lang w:val="es-ES"/>
+        </w:rPr>
+        <w:t xml:space="preserve"> es muy difícil entrenar una red neuronal que consiga generalizar y ofrecer técnicas correctas para todos los ejercicios. Por lo que hemos </w:t>
+      </w:r>
+      <w:proofErr w:type="spellStart"/>
+      <w:r>
+        <w:rPr>
+          <w:lang w:val="es-ES"/>
+        </w:rPr>
+        <w:t>obtado</w:t>
+      </w:r>
+      <w:proofErr w:type="spellEnd"/>
+      <w:r>
+        <w:rPr>
+          <w:lang w:val="es-ES"/>
+        </w:rPr>
+        <w:t xml:space="preserve"> por seguir une esquema híbrido en el que nuestra propia red neuronal sacará unos ciertos parámetros para analizar SOLO el movimiento de sentadilla, mientras que para analizar los demás movimientos la idea ahora es subir el archivo con los ángulos y el punto de sustentación (el cual también hemos añadido gracias al experto) y que una IA externa ya entrenada nos analice el ejercicio para poder otorgar una respuesta al usuario sea el ejercicio que sea.</w:t>
       </w:r>
     </w:p>
     <w:p>
@@ -638,7 +1074,35 @@
         <w:rPr>
           <w:lang w:val="es-ES"/>
         </w:rPr>
-        <w:t xml:space="preserve">Creación de la red BILSTM y búsqueda de ejemplos para su entrenamiento, una vez recopilada gran cantidad de datos me doy cuenta de la carencia de datos de ejecuciones de sentadilla erróneas, por lo que la siguiente semana me dispondré a grabrme a mi y algunos compañeros que se han ofrecido a ayudarme, ya que para el entrenamiento de la red necesito tanto ejecuciones correctas como incorrectas. </w:t>
+        <w:t xml:space="preserve">Creación de la red BILSTM y búsqueda de ejemplos para su entrenamiento, una vez recopilada gran cantidad de datos me doy cuenta de la carencia de datos de ejecuciones de sentadilla erróneas, por lo que la siguiente semana me dispondré a </w:t>
+      </w:r>
+      <w:proofErr w:type="spellStart"/>
+      <w:r>
+        <w:rPr>
+          <w:lang w:val="es-ES"/>
+        </w:rPr>
+        <w:t>grabrme</w:t>
+      </w:r>
+      <w:proofErr w:type="spellEnd"/>
+      <w:r>
+        <w:rPr>
+          <w:lang w:val="es-ES"/>
+        </w:rPr>
+        <w:t xml:space="preserve"> a </w:t>
+      </w:r>
+      <w:proofErr w:type="spellStart"/>
+      <w:r>
+        <w:rPr>
+          <w:lang w:val="es-ES"/>
+        </w:rPr>
+        <w:t>mi</w:t>
+      </w:r>
+      <w:proofErr w:type="spellEnd"/>
+      <w:r>
+        <w:rPr>
+          <w:lang w:val="es-ES"/>
+        </w:rPr>
+        <w:t xml:space="preserve"> y algunos compañeros que se han ofrecido a ayudarme, ya que para el entrenamiento de la red necesito tanto ejecuciones correctas como incorrectas. </w:t>
       </w:r>
     </w:p>
     <w:p>
@@ -665,7 +1129,77 @@
           <w:lang w:val="es-ES"/>
         </w:rPr>
         <w:lastRenderedPageBreak/>
-        <w:t>Gracias a mi tutora Carolina, tengo la oportunidad de ir al centro de IA de la empresa BISITE, en el cúal además de enseñarme gran cantidad de proyectos me sirve para preguntar algunas dudas que tenía, contar mi trabajo y recibir recomendaciones las cuales las hemos evaluado y llegado a la siguiente conclusión. Les encanta el proyecto pero un integrante del grupo de investigación me sugiere probar con el siguiente tipo de red XGboost, en caso de algún problema con el tipo de red ya seleccionado obtaremos seguramente por hacer una comparaciñon con este otro tipo de red para obtener un mejor resultado.</w:t>
+        <w:t xml:space="preserve">Gracias a mi tutora Carolina, tengo la oportunidad de ir al centro de IA de la empresa BISITE, en el </w:t>
+      </w:r>
+      <w:proofErr w:type="spellStart"/>
+      <w:r>
+        <w:rPr>
+          <w:lang w:val="es-ES"/>
+        </w:rPr>
+        <w:t>cúal</w:t>
+      </w:r>
+      <w:proofErr w:type="spellEnd"/>
+      <w:r>
+        <w:rPr>
+          <w:lang w:val="es-ES"/>
+        </w:rPr>
+        <w:t xml:space="preserve"> además de enseñarme gran cantidad de proyectos me sirve para preguntar algunas dudas que tenía, contar mi trabajo y recibir recomendaciones las cuales las hemos evaluado y llegado a la siguiente conclusión. Les encanta el </w:t>
+      </w:r>
+      <w:proofErr w:type="gramStart"/>
+      <w:r>
+        <w:rPr>
+          <w:lang w:val="es-ES"/>
+        </w:rPr>
+        <w:t>proyecto</w:t>
+      </w:r>
+      <w:proofErr w:type="gramEnd"/>
+      <w:r>
+        <w:rPr>
+          <w:lang w:val="es-ES"/>
+        </w:rPr>
+        <w:t xml:space="preserve"> pero un integrante del grupo de investigación me sugiere probar con el siguiente tipo de red </w:t>
+      </w:r>
+      <w:proofErr w:type="spellStart"/>
+      <w:r>
+        <w:rPr>
+          <w:lang w:val="es-ES"/>
+        </w:rPr>
+        <w:t>XGboost</w:t>
+      </w:r>
+      <w:proofErr w:type="spellEnd"/>
+      <w:r>
+        <w:rPr>
+          <w:lang w:val="es-ES"/>
+        </w:rPr>
+        <w:t xml:space="preserve">, en caso de algún problema con el tipo de red ya seleccionado </w:t>
+      </w:r>
+      <w:proofErr w:type="spellStart"/>
+      <w:r>
+        <w:rPr>
+          <w:lang w:val="es-ES"/>
+        </w:rPr>
+        <w:t>obtaremos</w:t>
+      </w:r>
+      <w:proofErr w:type="spellEnd"/>
+      <w:r>
+        <w:rPr>
+          <w:lang w:val="es-ES"/>
+        </w:rPr>
+        <w:t xml:space="preserve"> seguramente por hacer una </w:t>
+      </w:r>
+      <w:proofErr w:type="spellStart"/>
+      <w:r>
+        <w:rPr>
+          <w:lang w:val="es-ES"/>
+        </w:rPr>
+        <w:t>comparaciñon</w:t>
+      </w:r>
+      <w:proofErr w:type="spellEnd"/>
+      <w:r>
+        <w:rPr>
+          <w:lang w:val="es-ES"/>
+        </w:rPr>
+        <w:t xml:space="preserve"> con este otro tipo de red para obtener un mejor resultado.</w:t>
       </w:r>
     </w:p>
     <w:p>
@@ -684,7 +1218,21 @@
         <w:rPr>
           <w:lang w:val="es-ES"/>
         </w:rPr>
-        <w:t xml:space="preserve">dedicar un tiempo a la limpieza del código para mejorar la implementación y que todo quede mejor estructurado, con nombres más sugerentes y profesionales. Además de la realización de una infografía. Es importante mencionar que todos los cambios están siendo registrados en un controlador de versiones, en este caso gitlab. </w:t>
+        <w:t xml:space="preserve">dedicar un tiempo a la limpieza del código para mejorar la implementación y que todo quede mejor estructurado, con nombres más sugerentes y profesionales. Además de la realización de una infografía. Es importante mencionar que todos los cambios están siendo registrados en un controlador de versiones, en este caso </w:t>
+      </w:r>
+      <w:proofErr w:type="spellStart"/>
+      <w:r>
+        <w:rPr>
+          <w:lang w:val="es-ES"/>
+        </w:rPr>
+        <w:t>gitlab</w:t>
+      </w:r>
+      <w:proofErr w:type="spellEnd"/>
+      <w:r>
+        <w:rPr>
+          <w:lang w:val="es-ES"/>
+        </w:rPr>
+        <w:t xml:space="preserve">. </w:t>
       </w:r>
     </w:p>
     <w:p>
@@ -711,8 +1259,156 @@
         <w:rPr>
           <w:lang w:val="es-ES"/>
         </w:rPr>
-        <w:t>Ante la falta de ejemplos de sentadillas realizadas incorrectamente he empezado a grabar a mi mismo haciendo ejemplos concretos como sentadillas que no sean profundas, con inclinación excesiva de espalda etc, además de a otras personas. Una vez armado un dataset de mas de 100 videos viene la parte difícil, la cual es etiquetar cada vídeo y cada frame para entrenar a la red. Para ello he creado una aplicación de Python para ayudarme en este proceso ya que después de una búsqueda no he conseguido encontrar una herramienta similar. Con esta herramienta nos permite ir etiquetando los momentos en la sentadilla (Stand-bajando-abajo-subiendo-stand), además al acabar una repetición nos permite darle valores a los kpis de como ha sido nuestra sentadilla. De esta forma he conseguido agilizar el proceso de etiquetado de los videos.</w:t>
-      </w:r>
+        <w:t xml:space="preserve">Ante la falta de ejemplos de sentadillas realizadas incorrectamente he empezado a grabar a </w:t>
+      </w:r>
+      <w:proofErr w:type="spellStart"/>
+      <w:r>
+        <w:rPr>
+          <w:lang w:val="es-ES"/>
+        </w:rPr>
+        <w:t>mi</w:t>
+      </w:r>
+      <w:proofErr w:type="spellEnd"/>
+      <w:r>
+        <w:rPr>
+          <w:lang w:val="es-ES"/>
+        </w:rPr>
+        <w:t xml:space="preserve"> mismo haciendo ejemplos concretos como sentadillas que no sean profundas, con inclinación excesiva de espalda </w:t>
+      </w:r>
+      <w:proofErr w:type="spellStart"/>
+      <w:r>
+        <w:rPr>
+          <w:lang w:val="es-ES"/>
+        </w:rPr>
+        <w:t>etc</w:t>
+      </w:r>
+      <w:proofErr w:type="spellEnd"/>
+      <w:r>
+        <w:rPr>
+          <w:lang w:val="es-ES"/>
+        </w:rPr>
+        <w:t xml:space="preserve">, además de a otras personas. Una vez armado un </w:t>
+      </w:r>
+      <w:proofErr w:type="spellStart"/>
+      <w:r>
+        <w:rPr>
+          <w:lang w:val="es-ES"/>
+        </w:rPr>
+        <w:t>dataset</w:t>
+      </w:r>
+      <w:proofErr w:type="spellEnd"/>
+      <w:r>
+        <w:rPr>
+          <w:lang w:val="es-ES"/>
+        </w:rPr>
+        <w:t xml:space="preserve"> de </w:t>
+      </w:r>
+      <w:proofErr w:type="spellStart"/>
+      <w:r>
+        <w:rPr>
+          <w:lang w:val="es-ES"/>
+        </w:rPr>
+        <w:t>mas</w:t>
+      </w:r>
+      <w:proofErr w:type="spellEnd"/>
+      <w:r>
+        <w:rPr>
+          <w:lang w:val="es-ES"/>
+        </w:rPr>
+        <w:t xml:space="preserve"> de 100 videos viene la parte difícil, la cual es etiquetar cada vídeo y cada </w:t>
+      </w:r>
+      <w:proofErr w:type="spellStart"/>
+      <w:proofErr w:type="gramStart"/>
+      <w:r>
+        <w:rPr>
+          <w:lang w:val="es-ES"/>
+        </w:rPr>
+        <w:t>frame</w:t>
+      </w:r>
+      <w:proofErr w:type="spellEnd"/>
+      <w:proofErr w:type="gramEnd"/>
+      <w:r>
+        <w:rPr>
+          <w:lang w:val="es-ES"/>
+        </w:rPr>
+        <w:t xml:space="preserve"> para entrenar a la red. Para ello he creado una aplicación de Python para ayudarme en este proceso ya que después de una búsqueda no he conseguido encontrar una herramienta similar. Con esta herramienta nos permite ir etiquetando los momentos en la sentadilla (Stand-bajando-abajo-subiendo-stand), además al acabar una repetición nos permite darle valores a los </w:t>
+      </w:r>
+      <w:proofErr w:type="spellStart"/>
+      <w:r>
+        <w:rPr>
+          <w:lang w:val="es-ES"/>
+        </w:rPr>
+        <w:t>kpis</w:t>
+      </w:r>
+      <w:proofErr w:type="spellEnd"/>
+      <w:r>
+        <w:rPr>
+          <w:lang w:val="es-ES"/>
+        </w:rPr>
+        <w:t xml:space="preserve"> de </w:t>
+      </w:r>
+      <w:proofErr w:type="spellStart"/>
+      <w:r>
+        <w:rPr>
+          <w:lang w:val="es-ES"/>
+        </w:rPr>
+        <w:t>como</w:t>
+      </w:r>
+      <w:proofErr w:type="spellEnd"/>
+      <w:r>
+        <w:rPr>
+          <w:lang w:val="es-ES"/>
+        </w:rPr>
+        <w:t xml:space="preserve"> ha sido nuestra sentadilla. De esta forma he conseguido agilizar el proceso de etiquetado de los videos.</w:t>
+      </w:r>
+    </w:p>
+    <w:p>
+      <w:pPr>
+        <w:pStyle w:val="Heading3"/>
+        <w:rPr>
+          <w:lang w:val="es-ES"/>
+        </w:rPr>
+      </w:pPr>
+      <w:r>
+        <w:rPr>
+          <w:lang w:val="es-ES"/>
+        </w:rPr>
+        <w:t>Séptima Semana</w:t>
+      </w:r>
+    </w:p>
+    <w:p>
+      <w:pPr>
+        <w:rPr>
+          <w:lang w:val="es-ES"/>
+        </w:rPr>
+      </w:pPr>
+      <w:r>
+        <w:rPr>
+          <w:lang w:val="es-ES"/>
+        </w:rPr>
+        <w:t xml:space="preserve">Después del etiquetado de los videos hemos empezado con el entreno de la red neuronal, el primer entreno ha sido con unos 40 vídeos, todos etiquetados y pasados por nuestro archivo de visión para extraer los </w:t>
+      </w:r>
+      <w:proofErr w:type="spellStart"/>
+      <w:r>
+        <w:rPr>
+          <w:lang w:val="es-ES"/>
+        </w:rPr>
+        <w:t>keypoints</w:t>
+      </w:r>
+      <w:proofErr w:type="spellEnd"/>
+      <w:r>
+        <w:rPr>
+          <w:lang w:val="es-ES"/>
+        </w:rPr>
+        <w:t xml:space="preserve">, ángulos y demás. Las pruebas sobre este entrenamiento no han sido las esperadas ya que no he conseguido un resultado decente. </w:t>
+      </w:r>
+    </w:p>
+    <w:p>
+      <w:pPr>
+        <w:rPr>
+          <w:lang w:val="es-ES"/>
+        </w:rPr>
+      </w:pPr>
     </w:p>
     <w:p>
       <w:pPr>
@@ -777,6 +1473,7 @@
           <w:b/>
           <w:bCs/>
         </w:rPr>
+        <w:lastRenderedPageBreak/>
         <w:t>Oliva Rodríguez (TFG - Detección de Objetos):</w:t>
       </w:r>
       <w:r>
@@ -790,7 +1487,15 @@
         <w:t>Redes Neuronales Convolucionales (CNN)</w:t>
       </w:r>
       <w:r>
-        <w:t xml:space="preserve"> sobre OpenCV, concluyendo que las técnicas de barrido (ventana deslizante) son demasiado lentas para tiempo real, recomendando redes de detección de disparo único (como YOLO o SSD). </w:t>
+        <w:t xml:space="preserve"> sobre </w:t>
+      </w:r>
+      <w:proofErr w:type="spellStart"/>
+      <w:r>
+        <w:t>OpenCV</w:t>
+      </w:r>
+      <w:proofErr w:type="spellEnd"/>
+      <w:r>
+        <w:t xml:space="preserve">, concluyendo que las técnicas de barrido (ventana deslizante) son demasiado lentas para tiempo real, recomendando redes de detección de disparo único (como YOLO o SSD). </w:t>
       </w:r>
       <w:hyperlink r:id="rId10" w:history="1">
         <w:r>
@@ -828,10 +1533,43 @@
           <w:b/>
           <w:bCs/>
         </w:rPr>
-        <w:t>Transfer Learning</w:t>
-      </w:r>
-      <w:r>
-        <w:t xml:space="preserve"> sobre una CNN (ResNet/Inception) para identificar ballenas por su cola; demuestra que el "Data Augmentation" (rotar/deformar imágenes) es vital cuando tienes pocas imágenes para entrenar.</w:t>
+        <w:t xml:space="preserve">Transfer </w:t>
+      </w:r>
+      <w:proofErr w:type="spellStart"/>
+      <w:r>
+        <w:rPr>
+          <w:b/>
+          <w:bCs/>
+        </w:rPr>
+        <w:t>Learning</w:t>
+      </w:r>
+      <w:proofErr w:type="spellEnd"/>
+      <w:r>
+        <w:t xml:space="preserve"> sobre una CNN (</w:t>
+      </w:r>
+      <w:proofErr w:type="spellStart"/>
+      <w:r>
+        <w:t>ResNet</w:t>
+      </w:r>
+      <w:proofErr w:type="spellEnd"/>
+      <w:r>
+        <w:t>/</w:t>
+      </w:r>
+      <w:proofErr w:type="spellStart"/>
+      <w:r>
+        <w:t>Inception</w:t>
+      </w:r>
+      <w:proofErr w:type="spellEnd"/>
+      <w:r>
+        <w:t xml:space="preserve">) para identificar ballenas por su cola; demuestra que el "Data </w:t>
+      </w:r>
+      <w:proofErr w:type="spellStart"/>
+      <w:r>
+        <w:t>Augmentation</w:t>
+      </w:r>
+      <w:proofErr w:type="spellEnd"/>
+      <w:r>
+        <w:t>" (rotar/deformar imágenes) es vital cuando tienes pocas imágenes para entrenar.</w:t>
       </w:r>
       <w:r>
         <w:t xml:space="preserve"> </w:t>
@@ -872,7 +1610,6 @@
           <w:b/>
           <w:bCs/>
         </w:rPr>
-        <w:lastRenderedPageBreak/>
         <w:t>Pedro Pablo García (TFM - Hojas):</w:t>
       </w:r>
       <w:r>
@@ -883,8 +1620,17 @@
           <w:b/>
           <w:bCs/>
         </w:rPr>
-        <w:t>Momentos de Hu</w:t>
-      </w:r>
+        <w:t xml:space="preserve">Momentos de </w:t>
+      </w:r>
+      <w:proofErr w:type="spellStart"/>
+      <w:r>
+        <w:rPr>
+          <w:b/>
+          <w:bCs/>
+        </w:rPr>
+        <w:t>Hu</w:t>
+      </w:r>
+      <w:proofErr w:type="spellEnd"/>
       <w:r>
         <w:t xml:space="preserve"> (geometría de la forma) y una </w:t>
       </w:r>
@@ -924,7 +1670,23 @@
           <w:b/>
           <w:bCs/>
         </w:rPr>
-        <w:t>Santa María et al. (Artículo - Admin a2-15-26):</w:t>
+        <w:t xml:space="preserve">Santa María et al. (Artículo - </w:t>
+      </w:r>
+      <w:proofErr w:type="spellStart"/>
+      <w:r>
+        <w:rPr>
+          <w:b/>
+          <w:bCs/>
+        </w:rPr>
+        <w:t>Admin</w:t>
+      </w:r>
+      <w:proofErr w:type="spellEnd"/>
+      <w:r>
+        <w:rPr>
+          <w:b/>
+          <w:bCs/>
+        </w:rPr>
+        <w:t xml:space="preserve"> a2-15-26):</w:t>
       </w:r>
       <w:r>
         <w:t xml:space="preserve"> Implementa un sistema de </w:t>
@@ -965,17 +1727,97 @@
           <w:b/>
           <w:bCs/>
         </w:rPr>
-        <w:t>Sara Pardo Feijoo (PFC - Bag of Words):</w:t>
-      </w:r>
-      <w:r>
-        <w:t xml:space="preserve"> Aplica el modelo </w:t>
-      </w:r>
+        <w:t xml:space="preserve">Sara Pardo Feijoo (PFC - Bag </w:t>
+      </w:r>
+      <w:proofErr w:type="spellStart"/>
       <w:r>
         <w:rPr>
           <w:b/>
           <w:bCs/>
         </w:rPr>
-        <w:t>"Bag of Words" (BoW)</w:t>
+        <w:t>of</w:t>
+      </w:r>
+      <w:proofErr w:type="spellEnd"/>
+      <w:r>
+        <w:rPr>
+          <w:b/>
+          <w:bCs/>
+        </w:rPr>
+        <w:t xml:space="preserve"> </w:t>
+      </w:r>
+      <w:proofErr w:type="spellStart"/>
+      <w:r>
+        <w:rPr>
+          <w:b/>
+          <w:bCs/>
+        </w:rPr>
+        <w:t>Words</w:t>
+      </w:r>
+      <w:proofErr w:type="spellEnd"/>
+      <w:r>
+        <w:rPr>
+          <w:b/>
+          <w:bCs/>
+        </w:rPr>
+        <w:t>):</w:t>
+      </w:r>
+      <w:r>
+        <w:t xml:space="preserve"> Aplica el modelo </w:t>
+      </w:r>
+      <w:r>
+        <w:rPr>
+          <w:b/>
+          <w:bCs/>
+        </w:rPr>
+        <w:t xml:space="preserve">"Bag </w:t>
+      </w:r>
+      <w:proofErr w:type="spellStart"/>
+      <w:r>
+        <w:rPr>
+          <w:b/>
+          <w:bCs/>
+        </w:rPr>
+        <w:t>of</w:t>
+      </w:r>
+      <w:proofErr w:type="spellEnd"/>
+      <w:r>
+        <w:rPr>
+          <w:b/>
+          <w:bCs/>
+        </w:rPr>
+        <w:t xml:space="preserve"> </w:t>
+      </w:r>
+      <w:proofErr w:type="spellStart"/>
+      <w:r>
+        <w:rPr>
+          <w:b/>
+          <w:bCs/>
+        </w:rPr>
+        <w:t>Words</w:t>
+      </w:r>
+      <w:proofErr w:type="spellEnd"/>
+      <w:r>
+        <w:rPr>
+          <w:b/>
+          <w:bCs/>
+        </w:rPr>
+        <w:t>" (</w:t>
+      </w:r>
+      <w:proofErr w:type="spellStart"/>
+      <w:r>
+        <w:rPr>
+          <w:b/>
+          <w:bCs/>
+        </w:rPr>
+        <w:t>BoW</w:t>
+      </w:r>
+      <w:proofErr w:type="spellEnd"/>
+      <w:r>
+        <w:rPr>
+          <w:b/>
+          <w:bCs/>
+        </w:rPr>
+        <w:t>)</w:t>
       </w:r>
       <w:r>
         <w:t xml:space="preserve">, que trata la imagen como un "saco" de parches visuales desordenados (sin geometría); útil para buscar objetos en bases de datos, pero inservible para detectar posturas donde la posición de las partes es clave. </w:t>
@@ -1053,7 +1895,25 @@
           <w:szCs w:val="24"/>
           <w:lang w:val="es-ES"/>
         </w:rPr>
-        <w:t>De los otros puntos he podido sacar la siguientes conclusiones:</w:t>
+        <w:t xml:space="preserve">De los otros puntos he podido sacar </w:t>
+      </w:r>
+      <w:proofErr w:type="gramStart"/>
+      <w:r>
+        <w:rPr>
+          <w:sz w:val="24"/>
+          <w:szCs w:val="24"/>
+          <w:lang w:val="es-ES"/>
+        </w:rPr>
+        <w:t>la siguientes conclusiones</w:t>
+      </w:r>
+      <w:proofErr w:type="gramEnd"/>
+      <w:r>
+        <w:rPr>
+          <w:sz w:val="24"/>
+          <w:szCs w:val="24"/>
+          <w:lang w:val="es-ES"/>
+        </w:rPr>
+        <w:t>:</w:t>
       </w:r>
     </w:p>
     <w:p>
@@ -1075,7 +1935,25 @@
           <w:szCs w:val="24"/>
           <w:lang w:val="es-ES"/>
         </w:rPr>
-        <w:t>La dificultad de entrenar de cero una red neuronal para conseguir el resultado deseado, es mejor usar una ya entrenada como por ejemplo OpenPose o similar.</w:t>
+        <w:t xml:space="preserve">La dificultad de entrenar de cero una red neuronal para conseguir el resultado deseado, es mejor usar una ya entrenada como por ejemplo </w:t>
+      </w:r>
+      <w:proofErr w:type="spellStart"/>
+      <w:r>
+        <w:rPr>
+          <w:sz w:val="24"/>
+          <w:szCs w:val="24"/>
+          <w:lang w:val="es-ES"/>
+        </w:rPr>
+        <w:t>OpenPose</w:t>
+      </w:r>
+      <w:proofErr w:type="spellEnd"/>
+      <w:r>
+        <w:rPr>
+          <w:sz w:val="24"/>
+          <w:szCs w:val="24"/>
+          <w:lang w:val="es-ES"/>
+        </w:rPr>
+        <w:t xml:space="preserve"> o similar.</w:t>
       </w:r>
     </w:p>
     <w:p>
@@ -1097,15 +1975,51 @@
           <w:szCs w:val="24"/>
           <w:lang w:val="es-ES"/>
         </w:rPr>
-        <w:t>La retropropagación es útil para entrenar una de cero ya que es fácilmente entendible pero lo más usado hoy en día son redes convolucionales</w:t>
-      </w:r>
+        <w:t xml:space="preserve">La </w:t>
+      </w:r>
+      <w:proofErr w:type="spellStart"/>
       <w:r>
         <w:rPr>
           <w:sz w:val="24"/>
           <w:szCs w:val="24"/>
           <w:lang w:val="es-ES"/>
         </w:rPr>
-        <w:t>, es decir, deeplearning.</w:t>
+        <w:t>retropropagación</w:t>
+      </w:r>
+      <w:proofErr w:type="spellEnd"/>
+      <w:r>
+        <w:rPr>
+          <w:sz w:val="24"/>
+          <w:szCs w:val="24"/>
+          <w:lang w:val="es-ES"/>
+        </w:rPr>
+        <w:t xml:space="preserve"> es útil para entrenar una de cero ya que es fácilmente entendible pero lo más usado hoy en día son redes convolucionales</w:t>
+      </w:r>
+      <w:r>
+        <w:rPr>
+          <w:sz w:val="24"/>
+          <w:szCs w:val="24"/>
+          <w:lang w:val="es-ES"/>
+        </w:rPr>
+        <w:t xml:space="preserve">, es decir, </w:t>
+      </w:r>
+      <w:proofErr w:type="spellStart"/>
+      <w:r>
+        <w:rPr>
+          <w:sz w:val="24"/>
+          <w:szCs w:val="24"/>
+          <w:lang w:val="es-ES"/>
+        </w:rPr>
+        <w:t>deeplearning</w:t>
+      </w:r>
+      <w:proofErr w:type="spellEnd"/>
+      <w:r>
+        <w:rPr>
+          <w:sz w:val="24"/>
+          <w:szCs w:val="24"/>
+          <w:lang w:val="es-ES"/>
+        </w:rPr>
+        <w:t>.</w:t>
       </w:r>
     </w:p>
     <w:p>
@@ -1127,7 +2041,25 @@
           <w:szCs w:val="24"/>
           <w:lang w:val="es-ES"/>
         </w:rPr>
-        <w:t>La idea de analizar los datos extraídos de las herramientas como openpose a través de un doble enfoque, ya sea a través de ML con las aplicaciones</w:t>
+        <w:t xml:space="preserve">La idea de analizar los datos extraídos de las herramientas como </w:t>
+      </w:r>
+      <w:proofErr w:type="spellStart"/>
+      <w:r>
+        <w:rPr>
+          <w:sz w:val="24"/>
+          <w:szCs w:val="24"/>
+          <w:lang w:val="es-ES"/>
+        </w:rPr>
+        <w:t>openpose</w:t>
+      </w:r>
+      <w:proofErr w:type="spellEnd"/>
+      <w:r>
+        <w:rPr>
+          <w:sz w:val="24"/>
+          <w:szCs w:val="24"/>
+          <w:lang w:val="es-ES"/>
+        </w:rPr>
+        <w:t xml:space="preserve"> a través de un doble enfoque, ya sea a través de ML con las aplicaciones</w:t>
       </w:r>
       <w:r>
         <w:t xml:space="preserve"> </w:t>
@@ -1168,7 +2100,25 @@
           <w:szCs w:val="24"/>
           <w:lang w:val="es-ES"/>
         </w:rPr>
-        <w:t>La importancia de tratar las imágenes con OpenCV antes de pasar a procesarlas.</w:t>
+        <w:t xml:space="preserve">La importancia de tratar las imágenes con </w:t>
+      </w:r>
+      <w:proofErr w:type="spellStart"/>
+      <w:r>
+        <w:rPr>
+          <w:sz w:val="24"/>
+          <w:szCs w:val="24"/>
+          <w:lang w:val="es-ES"/>
+        </w:rPr>
+        <w:t>OpenCV</w:t>
+      </w:r>
+      <w:proofErr w:type="spellEnd"/>
+      <w:r>
+        <w:rPr>
+          <w:sz w:val="24"/>
+          <w:szCs w:val="24"/>
+          <w:lang w:val="es-ES"/>
+        </w:rPr>
+        <w:t xml:space="preserve"> antes de pasar a procesarlas.</w:t>
       </w:r>
     </w:p>
     <w:p>
@@ -1190,24 +2140,61 @@
           <w:szCs w:val="24"/>
           <w:lang w:val="es-ES"/>
         </w:rPr>
-        <w:t>Si en algún momento necesito usar DataSets, Kaggel es una gran fuente de información que puede llegar a ser útil. (Ballenas)</w:t>
-      </w:r>
-    </w:p>
-    <w:p>
-      <w:pPr>
-        <w:ind w:left="360"/>
+        <w:t xml:space="preserve">Si en algún momento necesito usar </w:t>
+      </w:r>
+      <w:proofErr w:type="spellStart"/>
+      <w:r>
         <w:rPr>
           <w:sz w:val="24"/>
           <w:szCs w:val="24"/>
           <w:lang w:val="es-ES"/>
         </w:rPr>
-      </w:pPr>
+        <w:t>DataSets</w:t>
+      </w:r>
+      <w:proofErr w:type="spellEnd"/>
       <w:r>
         <w:rPr>
           <w:sz w:val="24"/>
           <w:szCs w:val="24"/>
           <w:lang w:val="es-ES"/>
         </w:rPr>
+        <w:t xml:space="preserve">, </w:t>
+      </w:r>
+      <w:proofErr w:type="spellStart"/>
+      <w:r>
+        <w:rPr>
+          <w:sz w:val="24"/>
+          <w:szCs w:val="24"/>
+          <w:lang w:val="es-ES"/>
+        </w:rPr>
+        <w:t>Kaggel</w:t>
+      </w:r>
+      <w:proofErr w:type="spellEnd"/>
+      <w:r>
+        <w:rPr>
+          <w:sz w:val="24"/>
+          <w:szCs w:val="24"/>
+          <w:lang w:val="es-ES"/>
+        </w:rPr>
+        <w:t xml:space="preserve"> es una gran fuente de información que puede llegar a ser útil. (Ballenas)</w:t>
+      </w:r>
+    </w:p>
+    <w:p>
+      <w:pPr>
+        <w:ind w:left="360"/>
+        <w:rPr>
+          <w:sz w:val="24"/>
+          <w:szCs w:val="24"/>
+          <w:lang w:val="es-ES"/>
+        </w:rPr>
+      </w:pPr>
+      <w:r>
+        <w:rPr>
+          <w:sz w:val="24"/>
+          <w:szCs w:val="24"/>
+          <w:lang w:val="es-ES"/>
+        </w:rPr>
+        <w:lastRenderedPageBreak/>
         <w:t>Conclusiones obtenidas gracias a la IA</w:t>
       </w:r>
       <w:r>
@@ -1246,7 +2233,23 @@
         <w:t>Pedro Pablo</w:t>
       </w:r>
       <w:r>
-        <w:t xml:space="preserve"> (Hu Moments), </w:t>
+        <w:t xml:space="preserve"> (</w:t>
+      </w:r>
+      <w:proofErr w:type="spellStart"/>
+      <w:r>
+        <w:t>Hu</w:t>
+      </w:r>
+      <w:proofErr w:type="spellEnd"/>
+      <w:r>
+        <w:t xml:space="preserve"> </w:t>
+      </w:r>
+      <w:proofErr w:type="spellStart"/>
+      <w:r>
+        <w:t>Moments</w:t>
+      </w:r>
+      <w:proofErr w:type="spellEnd"/>
+      <w:r>
+        <w:t xml:space="preserve">), </w:t>
       </w:r>
       <w:r>
         <w:rPr>
@@ -1266,7 +2269,23 @@
         <w:t>Sara Pardo</w:t>
       </w:r>
       <w:r>
-        <w:t xml:space="preserve"> (Bag of Words) demuestran enfoques donde el programador debe definir </w:t>
+        <w:t xml:space="preserve"> (Bag </w:t>
+      </w:r>
+      <w:proofErr w:type="spellStart"/>
+      <w:r>
+        <w:t>of</w:t>
+      </w:r>
+      <w:proofErr w:type="spellEnd"/>
+      <w:r>
+        <w:t xml:space="preserve"> </w:t>
+      </w:r>
+      <w:proofErr w:type="spellStart"/>
+      <w:r>
+        <w:t>Words</w:t>
+      </w:r>
+      <w:proofErr w:type="spellEnd"/>
+      <w:r>
+        <w:t xml:space="preserve">) demuestran enfoques donde el programador debe definir </w:t>
       </w:r>
       <w:r>
         <w:rPr>
@@ -1303,8 +2322,39 @@
           <w:b/>
           <w:bCs/>
         </w:rPr>
-        <w:lastRenderedPageBreak/>
-        <w:t>Confirma el uso de Deep Learning (CNNs):</w:t>
+        <w:t xml:space="preserve">Confirma el uso de Deep </w:t>
+      </w:r>
+      <w:proofErr w:type="spellStart"/>
+      <w:r>
+        <w:rPr>
+          <w:b/>
+          <w:bCs/>
+        </w:rPr>
+        <w:t>Learning</w:t>
+      </w:r>
+      <w:proofErr w:type="spellEnd"/>
+      <w:r>
+        <w:rPr>
+          <w:b/>
+          <w:bCs/>
+        </w:rPr>
+        <w:t xml:space="preserve"> (</w:t>
+      </w:r>
+      <w:proofErr w:type="spellStart"/>
+      <w:r>
+        <w:rPr>
+          <w:b/>
+          <w:bCs/>
+        </w:rPr>
+        <w:t>CNNs</w:t>
+      </w:r>
+      <w:proofErr w:type="spellEnd"/>
+      <w:r>
+        <w:rPr>
+          <w:b/>
+          <w:bCs/>
+        </w:rPr>
+        <w:t>):</w:t>
       </w:r>
       <w:r>
         <w:t xml:space="preserve"> Los trabajos de </w:t>
@@ -1354,11 +2404,29 @@
           <w:b/>
           <w:bCs/>
         </w:rPr>
-        <w:t>Pose Estimation</w:t>
-      </w:r>
-      <w:r>
-        <w:t xml:space="preserve"> (como la mencionada MoveNet en tu borrador), que detecta </w:t>
-      </w:r>
+        <w:t xml:space="preserve">Pose </w:t>
+      </w:r>
+      <w:proofErr w:type="spellStart"/>
+      <w:r>
+        <w:rPr>
+          <w:b/>
+          <w:bCs/>
+        </w:rPr>
+        <w:t>Estimation</w:t>
+      </w:r>
+      <w:proofErr w:type="spellEnd"/>
+      <w:r>
+        <w:t xml:space="preserve"> (como la mencionada </w:t>
+      </w:r>
+      <w:proofErr w:type="spellStart"/>
+      <w:r>
+        <w:t>MoveNet</w:t>
+      </w:r>
+      <w:proofErr w:type="spellEnd"/>
+      <w:r>
+        <w:t xml:space="preserve"> en tu borrador), que detecta </w:t>
+      </w:r>
+      <w:proofErr w:type="spellStart"/>
       <w:r>
         <w:rPr>
           <w:i/>
@@ -1366,6 +2434,7 @@
         </w:rPr>
         <w:t>keypoints</w:t>
       </w:r>
+      <w:proofErr w:type="spellEnd"/>
       <w:r>
         <w:t xml:space="preserve"> (codos, rodillas) directamente, saltándose la fase de "aprender qué es un brazo" desde cero.</w:t>
       </w:r>
@@ -1384,7 +2453,23 @@
           <w:b/>
           <w:bCs/>
         </w:rPr>
-        <w:t>El Dataset es tu mayor cuello de botella:</w:t>
+        <w:t xml:space="preserve">El </w:t>
+      </w:r>
+      <w:proofErr w:type="spellStart"/>
+      <w:r>
+        <w:rPr>
+          <w:b/>
+          <w:bCs/>
+        </w:rPr>
+        <w:t>Dataset</w:t>
+      </w:r>
+      <w:proofErr w:type="spellEnd"/>
+      <w:r>
+        <w:rPr>
+          <w:b/>
+          <w:bCs/>
+        </w:rPr>
+        <w:t xml:space="preserve"> es tu mayor cuello de botella:</w:t>
       </w:r>
       <w:r>
         <w:t xml:space="preserve"> Todos los autores sufren con la falta de datos.</w:t>
@@ -1424,18 +2509,44 @@
           <w:b/>
           <w:bCs/>
         </w:rPr>
-        <w:t>Transfer Learning</w:t>
-      </w:r>
-      <w:r>
-        <w:t xml:space="preserve">. No entrenes tu red con vídeos tuyos desde cero. Coge un modelo pre-entrenado (en COCO o MPII Human Pose) y úsalo directamente o haz un </w:t>
+        <w:t xml:space="preserve">Transfer </w:t>
+      </w:r>
+      <w:proofErr w:type="spellStart"/>
+      <w:r>
+        <w:rPr>
+          <w:b/>
+          <w:bCs/>
+        </w:rPr>
+        <w:t>Learning</w:t>
+      </w:r>
+      <w:proofErr w:type="spellEnd"/>
+      <w:r>
+        <w:t xml:space="preserve">. No entrenes tu red con vídeos tuyos desde cero. Coge un modelo </w:t>
+      </w:r>
+      <w:proofErr w:type="spellStart"/>
+      <w:r>
+        <w:t>pre-entrenado</w:t>
+      </w:r>
+      <w:proofErr w:type="spellEnd"/>
+      <w:r>
+        <w:t xml:space="preserve"> (en COCO o MPII Human Pose) y úsalo directamente o haz un </w:t>
       </w:r>
       <w:r>
         <w:rPr>
           <w:i/>
           <w:iCs/>
         </w:rPr>
-        <w:t>fine-tuning</w:t>
-      </w:r>
+        <w:t>fine-</w:t>
+      </w:r>
+      <w:proofErr w:type="spellStart"/>
+      <w:r>
+        <w:rPr>
+          <w:i/>
+          <w:iCs/>
+        </w:rPr>
+        <w:t>tuning</w:t>
+      </w:r>
+      <w:proofErr w:type="spellEnd"/>
       <w:r>
         <w:t xml:space="preserve"> ligero. Esto es lo que diferencia un TFG académico viable de uno imposible.</w:t>
       </w:r>
@@ -1467,7 +2578,41 @@
         <w:t>Oliva</w:t>
       </w:r>
       <w:r>
-        <w:t xml:space="preserve"> demostró que técnicas precisas (ventanas deslizantes) hacen el sistema inútil en tiempo real (segundos por frame). Para tu app móvil, la conclusión es clara: sacrifica resolución de entrada (baja a 256x256 o similar) y procesa 1 de cada 5 frames. La fluidez de la app (UX) es más importante que saber si el ángulo de la rodilla es 45.1º o 45.2º.</w:t>
+        <w:t xml:space="preserve"> demostró que técnicas precisas (ventanas deslizantes) hacen el sistema inútil en tiempo real (segundos por </w:t>
+      </w:r>
+      <w:proofErr w:type="spellStart"/>
+      <w:proofErr w:type="gramStart"/>
+      <w:r>
+        <w:t>frame</w:t>
+      </w:r>
+      <w:proofErr w:type="spellEnd"/>
+      <w:proofErr w:type="gramEnd"/>
+      <w:r>
+        <w:t xml:space="preserve">). Para tu </w:t>
+      </w:r>
+      <w:proofErr w:type="gramStart"/>
+      <w:r>
+        <w:t>app</w:t>
+      </w:r>
+      <w:proofErr w:type="gramEnd"/>
+      <w:r>
+        <w:t xml:space="preserve"> móvil, la conclusión es clara: sacrifica resolución de entrada (baja a 256x256 o similar) y procesa 1 de cada 5 </w:t>
+      </w:r>
+      <w:proofErr w:type="spellStart"/>
+      <w:r>
+        <w:t>frames</w:t>
+      </w:r>
+      <w:proofErr w:type="spellEnd"/>
+      <w:r>
+        <w:t xml:space="preserve">. La fluidez de la app (UX) es más importante que saber si el ángulo de la rodilla es </w:t>
+      </w:r>
+      <w:proofErr w:type="gramStart"/>
+      <w:r>
+        <w:t>45.1º</w:t>
+      </w:r>
+      <w:proofErr w:type="gramEnd"/>
+      <w:r>
+        <w:t xml:space="preserve"> o 45.2º.</w:t>
       </w:r>
     </w:p>
     <w:p>
@@ -1478,11 +2623,19 @@
           <w:rFonts w:ascii="Arial" w:hAnsi="Arial" w:cs="Arial"/>
         </w:rPr>
       </w:pPr>
+      <w:proofErr w:type="spellStart"/>
       <w:r>
         <w:rPr>
           <w:rFonts w:ascii="Arial" w:hAnsi="Arial" w:cs="Arial"/>
         </w:rPr>
-        <w:t>Planning y distintas herramientas</w:t>
+        <w:t>Planning</w:t>
+      </w:r>
+      <w:proofErr w:type="spellEnd"/>
+      <w:r>
+        <w:rPr>
+          <w:rFonts w:ascii="Arial" w:hAnsi="Arial" w:cs="Arial"/>
+        </w:rPr>
+        <w:t xml:space="preserve"> y distintas herramientas</w:t>
       </w:r>
     </w:p>
     <w:p>
@@ -1506,7 +2659,35 @@
         <w:rPr>
           <w:rFonts w:ascii="Arial" w:hAnsi="Arial" w:cs="Arial"/>
         </w:rPr>
-        <w:t>1. Pipeline de Visión Artificial (Computer Vision)</w:t>
+        <w:t>1. Pipeline de Visión Artificial (</w:t>
+      </w:r>
+      <w:proofErr w:type="spellStart"/>
+      <w:r>
+        <w:rPr>
+          <w:rFonts w:ascii="Arial" w:hAnsi="Arial" w:cs="Arial"/>
+        </w:rPr>
+        <w:t>Computer</w:t>
+      </w:r>
+      <w:proofErr w:type="spellEnd"/>
+      <w:r>
+        <w:rPr>
+          <w:rFonts w:ascii="Arial" w:hAnsi="Arial" w:cs="Arial"/>
+        </w:rPr>
+        <w:t xml:space="preserve"> </w:t>
+      </w:r>
+      <w:proofErr w:type="spellStart"/>
+      <w:r>
+        <w:rPr>
+          <w:rFonts w:ascii="Arial" w:hAnsi="Arial" w:cs="Arial"/>
+        </w:rPr>
+        <w:t>Vision</w:t>
+      </w:r>
+      <w:proofErr w:type="spellEnd"/>
+      <w:r>
+        <w:rPr>
+          <w:rFonts w:ascii="Arial" w:hAnsi="Arial" w:cs="Arial"/>
+        </w:rPr>
+        <w:t>)</w:t>
       </w:r>
     </w:p>
     <w:p>
@@ -1551,6 +2732,7 @@
         </w:rPr>
         <w:t xml:space="preserve"> </w:t>
       </w:r>
+      <w:proofErr w:type="spellStart"/>
       <w:r>
         <w:rPr>
           <w:rFonts w:cs="Arial"/>
@@ -1559,11 +2741,26 @@
         </w:rPr>
         <w:t>OpenCV</w:t>
       </w:r>
-      <w:r>
-        <w:rPr>
-          <w:rFonts w:cs="Arial"/>
-        </w:rPr>
-        <w:t>. Se utilizará de forma casi exclusiva para la lectura de los frames de la cámara, redimensionado, cambios de espacio de color, y el dibujado (renderizado) posterior del esqueleto y las métricas sobre el video en la interfaz de usuario.</w:t>
+      <w:proofErr w:type="spellEnd"/>
+      <w:r>
+        <w:rPr>
+          <w:rFonts w:cs="Arial"/>
+        </w:rPr>
+        <w:t xml:space="preserve">. Se utilizará de forma casi exclusiva para la lectura de los </w:t>
+      </w:r>
+      <w:proofErr w:type="spellStart"/>
+      <w:r>
+        <w:rPr>
+          <w:rFonts w:cs="Arial"/>
+        </w:rPr>
+        <w:t>frames</w:t>
+      </w:r>
+      <w:proofErr w:type="spellEnd"/>
+      <w:r>
+        <w:rPr>
+          <w:rFonts w:cs="Arial"/>
+        </w:rPr>
+        <w:t xml:space="preserve"> de la cámara, redimensionado, cambios de espacio de color, y el dibujado (renderizado) posterior del esqueleto y las métricas sobre el video en la interfaz de usuario.</w:t>
       </w:r>
     </w:p>
     <w:p>
@@ -1585,41 +2782,115 @@
           <w:b/>
           <w:bCs/>
         </w:rPr>
-        <w:t>Estimación de Postura (Pose Estimation):</w:t>
-      </w:r>
-      <w:r>
-        <w:rPr>
-          <w:rFonts w:cs="Arial"/>
-        </w:rPr>
-        <w:t xml:space="preserve"> * </w:t>
-      </w:r>
+        <w:t xml:space="preserve">Estimación de Postura (Pose </w:t>
+      </w:r>
+      <w:proofErr w:type="spellStart"/>
       <w:r>
         <w:rPr>
           <w:rFonts w:cs="Arial"/>
           <w:b/>
           <w:bCs/>
         </w:rPr>
-        <w:t>Opción Principal (Recomendada):</w:t>
-      </w:r>
-      <w:r>
-        <w:rPr>
-          <w:rFonts w:cs="Arial"/>
-        </w:rPr>
-        <w:t xml:space="preserve"> </w:t>
-      </w:r>
+        <w:t>Estimation</w:t>
+      </w:r>
+      <w:proofErr w:type="spellEnd"/>
       <w:r>
         <w:rPr>
           <w:rFonts w:cs="Arial"/>
           <w:b/>
           <w:bCs/>
         </w:rPr>
-        <w:t>BlazePose (MediaPipe)</w:t>
-      </w:r>
-      <w:r>
-        <w:rPr>
-          <w:rFonts w:cs="Arial"/>
-        </w:rPr>
-        <w:t xml:space="preserve">. Se elige como la tecnología core por su capacidad de generar coordenadas en </w:t>
+        <w:t>):</w:t>
+      </w:r>
+      <w:r>
+        <w:rPr>
+          <w:rFonts w:cs="Arial"/>
+        </w:rPr>
+        <w:t xml:space="preserve"> * </w:t>
+      </w:r>
+      <w:r>
+        <w:rPr>
+          <w:rFonts w:cs="Arial"/>
+          <w:b/>
+          <w:bCs/>
+        </w:rPr>
+        <w:t>Opción Principal (Recomendada):</w:t>
+      </w:r>
+      <w:r>
+        <w:rPr>
+          <w:rFonts w:cs="Arial"/>
+        </w:rPr>
+        <w:t xml:space="preserve"> </w:t>
+      </w:r>
+      <w:proofErr w:type="spellStart"/>
+      <w:r>
+        <w:rPr>
+          <w:rFonts w:cs="Arial"/>
+          <w:b/>
+          <w:bCs/>
+        </w:rPr>
+        <w:t>BlazePose</w:t>
+      </w:r>
+      <w:proofErr w:type="spellEnd"/>
+      <w:r>
+        <w:rPr>
+          <w:rFonts w:cs="Arial"/>
+          <w:b/>
+          <w:bCs/>
+        </w:rPr>
+        <w:t xml:space="preserve"> (</w:t>
+      </w:r>
+      <w:proofErr w:type="spellStart"/>
+      <w:r>
+        <w:rPr>
+          <w:rFonts w:cs="Arial"/>
+          <w:b/>
+          <w:bCs/>
+        </w:rPr>
+        <w:t>MediaPipe</w:t>
+      </w:r>
+      <w:proofErr w:type="spellEnd"/>
+      <w:r>
+        <w:rPr>
+          <w:rFonts w:cs="Arial"/>
+          <w:b/>
+          <w:bCs/>
+        </w:rPr>
+        <w:t>)</w:t>
+      </w:r>
+      <w:r>
+        <w:rPr>
+          <w:rFonts w:cs="Arial"/>
+        </w:rPr>
+        <w:t xml:space="preserve">. Se </w:t>
+      </w:r>
+      <w:proofErr w:type="gramStart"/>
+      <w:r>
+        <w:rPr>
+          <w:rFonts w:cs="Arial"/>
+        </w:rPr>
+        <w:t>elige como</w:t>
+      </w:r>
+      <w:proofErr w:type="gramEnd"/>
+      <w:r>
+        <w:rPr>
+          <w:rFonts w:cs="Arial"/>
+        </w:rPr>
+        <w:t xml:space="preserve"> la tecnología </w:t>
+      </w:r>
+      <w:proofErr w:type="spellStart"/>
+      <w:r>
+        <w:rPr>
+          <w:rFonts w:cs="Arial"/>
+        </w:rPr>
+        <w:t>core</w:t>
+      </w:r>
+      <w:proofErr w:type="spellEnd"/>
+      <w:r>
+        <w:rPr>
+          <w:rFonts w:cs="Arial"/>
+        </w:rPr>
+        <w:t xml:space="preserve"> por su capacidad de generar coordenadas en </w:t>
       </w:r>
       <w:r>
         <w:rPr>
@@ -1671,19 +2942,136 @@
           <w:rFonts w:cs="Arial"/>
         </w:rPr>
       </w:pPr>
+      <w:proofErr w:type="spellStart"/>
       <w:r>
         <w:rPr>
           <w:rFonts w:cs="Arial"/>
           <w:i/>
           <w:iCs/>
         </w:rPr>
-        <w:t>OpenPose / MoveNet / AlphaPose:</w:t>
-      </w:r>
-      <w:r>
-        <w:rPr>
-          <w:rFonts w:cs="Arial"/>
-        </w:rPr>
-        <w:t xml:space="preserve"> Descartados para el core móvil por ser pesados (AlphaPose/OpenPose) o limitar la salida a 2D (MoveNet/OpenPose).</w:t>
+        <w:lastRenderedPageBreak/>
+        <w:t>OpenPose</w:t>
+      </w:r>
+      <w:proofErr w:type="spellEnd"/>
+      <w:r>
+        <w:rPr>
+          <w:rFonts w:cs="Arial"/>
+          <w:i/>
+          <w:iCs/>
+        </w:rPr>
+        <w:t xml:space="preserve"> / </w:t>
+      </w:r>
+      <w:proofErr w:type="spellStart"/>
+      <w:r>
+        <w:rPr>
+          <w:rFonts w:cs="Arial"/>
+          <w:i/>
+          <w:iCs/>
+        </w:rPr>
+        <w:t>MoveNet</w:t>
+      </w:r>
+      <w:proofErr w:type="spellEnd"/>
+      <w:r>
+        <w:rPr>
+          <w:rFonts w:cs="Arial"/>
+          <w:i/>
+          <w:iCs/>
+        </w:rPr>
+        <w:t xml:space="preserve"> / </w:t>
+      </w:r>
+      <w:proofErr w:type="spellStart"/>
+      <w:r>
+        <w:rPr>
+          <w:rFonts w:cs="Arial"/>
+          <w:i/>
+          <w:iCs/>
+        </w:rPr>
+        <w:t>AlphaPose</w:t>
+      </w:r>
+      <w:proofErr w:type="spellEnd"/>
+      <w:r>
+        <w:rPr>
+          <w:rFonts w:cs="Arial"/>
+          <w:i/>
+          <w:iCs/>
+        </w:rPr>
+        <w:t>:</w:t>
+      </w:r>
+      <w:r>
+        <w:rPr>
+          <w:rFonts w:cs="Arial"/>
+        </w:rPr>
+        <w:t xml:space="preserve"> Descartados para el </w:t>
+      </w:r>
+      <w:proofErr w:type="spellStart"/>
+      <w:r>
+        <w:rPr>
+          <w:rFonts w:cs="Arial"/>
+        </w:rPr>
+        <w:t>core</w:t>
+      </w:r>
+      <w:proofErr w:type="spellEnd"/>
+      <w:r>
+        <w:rPr>
+          <w:rFonts w:cs="Arial"/>
+        </w:rPr>
+        <w:t xml:space="preserve"> móvil por ser pesados (</w:t>
+      </w:r>
+      <w:proofErr w:type="spellStart"/>
+      <w:r>
+        <w:rPr>
+          <w:rFonts w:cs="Arial"/>
+        </w:rPr>
+        <w:t>AlphaPose</w:t>
+      </w:r>
+      <w:proofErr w:type="spellEnd"/>
+      <w:r>
+        <w:rPr>
+          <w:rFonts w:cs="Arial"/>
+        </w:rPr>
+        <w:t>/</w:t>
+      </w:r>
+      <w:proofErr w:type="spellStart"/>
+      <w:r>
+        <w:rPr>
+          <w:rFonts w:cs="Arial"/>
+        </w:rPr>
+        <w:t>OpenPose</w:t>
+      </w:r>
+      <w:proofErr w:type="spellEnd"/>
+      <w:r>
+        <w:rPr>
+          <w:rFonts w:cs="Arial"/>
+        </w:rPr>
+        <w:t>) o limitar la salida a 2D (</w:t>
+      </w:r>
+      <w:proofErr w:type="spellStart"/>
+      <w:r>
+        <w:rPr>
+          <w:rFonts w:cs="Arial"/>
+        </w:rPr>
+        <w:t>MoveNet</w:t>
+      </w:r>
+      <w:proofErr w:type="spellEnd"/>
+      <w:r>
+        <w:rPr>
+          <w:rFonts w:cs="Arial"/>
+        </w:rPr>
+        <w:t>/</w:t>
+      </w:r>
+      <w:proofErr w:type="spellStart"/>
+      <w:r>
+        <w:rPr>
+          <w:rFonts w:cs="Arial"/>
+        </w:rPr>
+        <w:t>OpenPose</w:t>
+      </w:r>
+      <w:proofErr w:type="spellEnd"/>
+      <w:r>
+        <w:rPr>
+          <w:rFonts w:cs="Arial"/>
+        </w:rPr>
+        <w:t>).</w:t>
       </w:r>
     </w:p>
     <w:p>
@@ -1727,13 +3115,41 @@
           <w:rFonts w:cs="Arial"/>
         </w:rPr>
       </w:pPr>
+      <w:proofErr w:type="spellStart"/>
       <w:r>
         <w:rPr>
           <w:rFonts w:cs="Arial"/>
           <w:i/>
           <w:iCs/>
         </w:rPr>
-        <w:t>RTMPose / ViTPose:</w:t>
+        <w:t>RTMPose</w:t>
+      </w:r>
+      <w:proofErr w:type="spellEnd"/>
+      <w:r>
+        <w:rPr>
+          <w:rFonts w:cs="Arial"/>
+          <w:i/>
+          <w:iCs/>
+        </w:rPr>
+        <w:t xml:space="preserve"> / </w:t>
+      </w:r>
+      <w:proofErr w:type="spellStart"/>
+      <w:r>
+        <w:rPr>
+          <w:rFonts w:cs="Arial"/>
+          <w:i/>
+          <w:iCs/>
+        </w:rPr>
+        <w:t>ViTPose</w:t>
+      </w:r>
+      <w:proofErr w:type="spellEnd"/>
+      <w:r>
+        <w:rPr>
+          <w:rFonts w:cs="Arial"/>
+          <w:i/>
+          <w:iCs/>
+        </w:rPr>
+        <w:t>:</w:t>
       </w:r>
       <w:r>
         <w:rPr>
@@ -1754,7 +3170,6 @@
         <w:rPr>
           <w:rFonts w:ascii="Arial" w:hAnsi="Arial" w:cs="Arial"/>
         </w:rPr>
-        <w:lastRenderedPageBreak/>
         <w:t>2. Motor de Biomecánica (Extracción de Características)</w:t>
       </w:r>
     </w:p>
@@ -1770,7 +3185,35 @@
         <w:rPr>
           <w:rFonts w:cs="Arial"/>
         </w:rPr>
-        <w:t>Una vez obtenidos los puntos clave (landmarks) de BlazePose, el sistema transforma estos datos en información física y geométrica con significado clínico/deportivo.</w:t>
+        <w:t>Una vez obtenidos los puntos clave (</w:t>
+      </w:r>
+      <w:proofErr w:type="spellStart"/>
+      <w:r>
+        <w:rPr>
+          <w:rFonts w:cs="Arial"/>
+        </w:rPr>
+        <w:t>landmarks</w:t>
+      </w:r>
+      <w:proofErr w:type="spellEnd"/>
+      <w:r>
+        <w:rPr>
+          <w:rFonts w:cs="Arial"/>
+        </w:rPr>
+        <w:t xml:space="preserve">) de </w:t>
+      </w:r>
+      <w:proofErr w:type="spellStart"/>
+      <w:r>
+        <w:rPr>
+          <w:rFonts w:cs="Arial"/>
+        </w:rPr>
+        <w:t>BlazePose</w:t>
+      </w:r>
+      <w:proofErr w:type="spellEnd"/>
+      <w:r>
+        <w:rPr>
+          <w:rFonts w:cs="Arial"/>
+        </w:rPr>
+        <w:t>, el sistema transforma estos datos en información física y geométrica con significado clínico/deportivo.</w:t>
       </w:r>
     </w:p>
     <w:p>
@@ -1840,7 +3283,21 @@
         <w:rPr>
           <w:rFonts w:cs="Arial"/>
         </w:rPr>
-        <w:t xml:space="preserve"> Derivadas de los cambios de posición y ángulos entre frames consecutivos para evaluar la explosividad y el control del movimiento.</w:t>
+        <w:t xml:space="preserve"> Derivadas de los cambios de posición y ángulos entre </w:t>
+      </w:r>
+      <w:proofErr w:type="spellStart"/>
+      <w:r>
+        <w:rPr>
+          <w:rFonts w:cs="Arial"/>
+        </w:rPr>
+        <w:t>frames</w:t>
+      </w:r>
+      <w:proofErr w:type="spellEnd"/>
+      <w:r>
+        <w:rPr>
+          <w:rFonts w:cs="Arial"/>
+        </w:rPr>
+        <w:t xml:space="preserve"> consecutivos para evaluar la explosividad y el control del movimiento.</w:t>
       </w:r>
     </w:p>
     <w:p>
@@ -1855,7 +3312,21 @@
         <w:rPr>
           <w:rFonts w:ascii="Arial" w:hAnsi="Arial" w:cs="Arial"/>
         </w:rPr>
-        <w:t>3. Clasificación y Modelado Predictivo (Machine Learning)</w:t>
+        <w:t xml:space="preserve">3. Clasificación y Modelado Predictivo (Machine </w:t>
+      </w:r>
+      <w:proofErr w:type="spellStart"/>
+      <w:r>
+        <w:rPr>
+          <w:rFonts w:ascii="Arial" w:hAnsi="Arial" w:cs="Arial"/>
+        </w:rPr>
+        <w:t>Learning</w:t>
+      </w:r>
+      <w:proofErr w:type="spellEnd"/>
+      <w:r>
+        <w:rPr>
+          <w:rFonts w:ascii="Arial" w:hAnsi="Arial" w:cs="Arial"/>
+        </w:rPr>
+        <w:t>)</w:t>
       </w:r>
     </w:p>
     <w:p>
@@ -1881,7 +3352,15 @@
         </w:rPr>
       </w:pPr>
       <w:r>
-        <w:t>Modelos de Machine Learning Evaluados</w:t>
+        <w:t xml:space="preserve">Modelos de Machine </w:t>
+      </w:r>
+      <w:proofErr w:type="spellStart"/>
+      <w:r>
+        <w:t>Learning</w:t>
+      </w:r>
+      <w:proofErr w:type="spellEnd"/>
+      <w:r>
+        <w:t xml:space="preserve"> Evaluados</w:t>
       </w:r>
     </w:p>
     <w:p>
@@ -1942,15 +3421,42 @@
         </w:numPr>
         <w:jc w:val="left"/>
       </w:pPr>
+      <w:proofErr w:type="spellStart"/>
       <w:r>
         <w:rPr>
           <w:b/>
           <w:bCs/>
         </w:rPr>
-        <w:t>BiLSTM:</w:t>
-      </w:r>
-      <w:r>
-        <w:t xml:space="preserve"> Con complejidad media-alta y requisitos de datos medios, es el modelo ideal para ser ejecutado en el servidor. Destaca en el procesamiento a posteriori (post-entrenamiento), ya que analiza tanto el contexto pasado como el futuro de cada frame de vídeo.</w:t>
+        <w:t>BiLSTM</w:t>
+      </w:r>
+      <w:proofErr w:type="spellEnd"/>
+      <w:r>
+        <w:rPr>
+          <w:b/>
+          <w:bCs/>
+        </w:rPr>
+        <w:t>:</w:t>
+      </w:r>
+      <w:r>
+        <w:t xml:space="preserve"> Con complejidad media-alta y requisitos de datos medios, es el modelo ideal para ser ejecutado en el servidor. Destaca en el procesamiento a posteriori (</w:t>
+      </w:r>
+      <w:proofErr w:type="spellStart"/>
+      <w:r>
+        <w:t>post-entrenamiento</w:t>
+      </w:r>
+      <w:proofErr w:type="spellEnd"/>
+      <w:r>
+        <w:t xml:space="preserve">), ya que analiza tanto el contexto pasado como el futuro de cada </w:t>
+      </w:r>
+      <w:proofErr w:type="spellStart"/>
+      <w:proofErr w:type="gramStart"/>
+      <w:r>
+        <w:t>frame</w:t>
+      </w:r>
+      <w:proofErr w:type="spellEnd"/>
+      <w:proofErr w:type="gramEnd"/>
+      <w:r>
+        <w:t xml:space="preserve"> de vídeo.</w:t>
       </w:r>
     </w:p>
     <w:p>
@@ -1962,12 +3468,21 @@
         </w:numPr>
         <w:jc w:val="left"/>
       </w:pPr>
+      <w:proofErr w:type="spellStart"/>
       <w:r>
         <w:rPr>
           <w:b/>
           <w:bCs/>
         </w:rPr>
-        <w:t>Transformer:</w:t>
+        <w:t>Transformer</w:t>
+      </w:r>
+      <w:proofErr w:type="spellEnd"/>
+      <w:r>
+        <w:rPr>
+          <w:b/>
+          <w:bCs/>
+        </w:rPr>
+        <w:t>:</w:t>
       </w:r>
       <w:r>
         <w:t xml:space="preserve"> Ofrece una altísima capacidad de modelado, pero con requerimientos muy altos tanto de datos como de complejidad. Resulta demasiado pesado y complejo para la primera versi</w:t>
@@ -2008,7 +3523,15 @@
         <w:t>ST-GCN:</w:t>
       </w:r>
       <w:r>
-        <w:t xml:space="preserve"> Este modelo analiza grafos espacio-temporales. Al tener la máxima complejidad y altos requisitos de datos, resulta completamente excesivo para un Producto M</w:t>
+        <w:t xml:space="preserve"> Este modelo analiza grafos </w:t>
+      </w:r>
+      <w:proofErr w:type="gramStart"/>
+      <w:r>
+        <w:t>espacio-temporales</w:t>
+      </w:r>
+      <w:proofErr w:type="gramEnd"/>
+      <w:r>
+        <w:t>. Al tener la máxima complejidad y altos requisitos de datos, resulta completamente excesivo para un Producto M</w:t>
       </w:r>
       <w:r>
         <w:rPr>
@@ -2068,8 +3591,23 @@
         <w:rPr>
           <w:rFonts w:cs="Arial"/>
         </w:rPr>
-        <w:t xml:space="preserve"> por su ligereza. Si la aplicación requiere un informe detallado post-entrenamiento, enviar los datos al servidor para pasarlos por una </w:t>
-      </w:r>
+        <w:t xml:space="preserve"> por su ligereza. Si la aplicación requiere un informe detallado </w:t>
+      </w:r>
+      <w:proofErr w:type="spellStart"/>
+      <w:r>
+        <w:rPr>
+          <w:rFonts w:cs="Arial"/>
+        </w:rPr>
+        <w:t>post-entrenamiento</w:t>
+      </w:r>
+      <w:proofErr w:type="spellEnd"/>
+      <w:r>
+        <w:rPr>
+          <w:rFonts w:cs="Arial"/>
+        </w:rPr>
+        <w:t xml:space="preserve">, enviar los datos al servidor para pasarlos por una </w:t>
+      </w:r>
+      <w:proofErr w:type="spellStart"/>
       <w:r>
         <w:rPr>
           <w:rFonts w:cs="Arial"/>
@@ -2078,6 +3616,7 @@
         </w:rPr>
         <w:t>BiLSTM</w:t>
       </w:r>
+      <w:proofErr w:type="spellEnd"/>
       <w:r>
         <w:rPr>
           <w:rFonts w:cs="Arial"/>
@@ -2097,7 +3636,22 @@
         <w:rPr>
           <w:rFonts w:ascii="Arial" w:hAnsi="Arial" w:cs="Arial"/>
         </w:rPr>
-        <w:t>4. Sistema de Inferencia y Retroalimentación (Feedback)</w:t>
+        <w:lastRenderedPageBreak/>
+        <w:t>4. Sistema de Inferencia y Retroalimentación (</w:t>
+      </w:r>
+      <w:proofErr w:type="spellStart"/>
+      <w:r>
+        <w:rPr>
+          <w:rFonts w:ascii="Arial" w:hAnsi="Arial" w:cs="Arial"/>
+        </w:rPr>
+        <w:t>Feedback</w:t>
+      </w:r>
+      <w:proofErr w:type="spellEnd"/>
+      <w:r>
+        <w:rPr>
+          <w:rFonts w:ascii="Arial" w:hAnsi="Arial" w:cs="Arial"/>
+        </w:rPr>
+        <w:t>)</w:t>
       </w:r>
     </w:p>
     <w:p>
@@ -2140,7 +3694,21 @@
         <w:rPr>
           <w:rFonts w:cs="Arial"/>
         </w:rPr>
-        <w:t xml:space="preserve"> Reglas clínicas de "hard-code" que actúan como salvavidas inmediatos para evitar lesiones.</w:t>
+        <w:t xml:space="preserve"> Reglas clínicas de "</w:t>
+      </w:r>
+      <w:proofErr w:type="spellStart"/>
+      <w:r>
+        <w:rPr>
+          <w:rFonts w:cs="Arial"/>
+        </w:rPr>
+        <w:t>hard-code</w:t>
+      </w:r>
+      <w:proofErr w:type="spellEnd"/>
+      <w:r>
+        <w:rPr>
+          <w:rFonts w:cs="Arial"/>
+        </w:rPr>
+        <w:t>" que actúan como salvavidas inmediatos para evitar lesiones.</w:t>
       </w:r>
     </w:p>
     <w:p>
@@ -2175,7 +3743,23 @@
           <w:rStyle w:val="HTMLCode"/>
           <w:rFonts w:cs="Arial"/>
         </w:rPr>
-        <w:t>SI (Ejercicio == Sentadilla) Y (Ángulo_Rodilla &lt; 90º) -&gt; "Profundidad correcta"</w:t>
+        <w:t>SI (Ejercicio == Sentadilla) Y (</w:t>
+      </w:r>
+      <w:proofErr w:type="spellStart"/>
+      <w:r>
+        <w:rPr>
+          <w:rStyle w:val="HTMLCode"/>
+          <w:rFonts w:cs="Arial"/>
+        </w:rPr>
+        <w:t>Ángulo_Rodilla</w:t>
+      </w:r>
+      <w:proofErr w:type="spellEnd"/>
+      <w:r>
+        <w:rPr>
+          <w:rStyle w:val="HTMLCode"/>
+          <w:rFonts w:cs="Arial"/>
+        </w:rPr>
+        <w:t xml:space="preserve"> &lt; 90º) -&gt; "Profundidad correcta"</w:t>
       </w:r>
     </w:p>
     <w:p>
@@ -2197,7 +3781,6 @@
           <w:i/>
           <w:iCs/>
         </w:rPr>
-        <w:lastRenderedPageBreak/>
         <w:t>Regla de Seguridad Articular:</w:t>
       </w:r>
       <w:r>
@@ -2211,7 +3794,39 @@
           <w:rStyle w:val="HTMLCode"/>
           <w:rFonts w:cs="Arial"/>
         </w:rPr>
-        <w:t>SI (Posición_X_Rodilla &gt; Posición_X_Puntera) -&gt; "</w:t>
+        <w:t>SI (</w:t>
+      </w:r>
+      <w:proofErr w:type="spellStart"/>
+      <w:r>
+        <w:rPr>
+          <w:rStyle w:val="HTMLCode"/>
+          <w:rFonts w:cs="Arial"/>
+        </w:rPr>
+        <w:t>Posición_X_Rodilla</w:t>
+      </w:r>
+      <w:proofErr w:type="spellEnd"/>
+      <w:r>
+        <w:rPr>
+          <w:rStyle w:val="HTMLCode"/>
+          <w:rFonts w:cs="Arial"/>
+        </w:rPr>
+        <w:t xml:space="preserve"> &gt; </w:t>
+      </w:r>
+      <w:proofErr w:type="spellStart"/>
+      <w:r>
+        <w:rPr>
+          <w:rStyle w:val="HTMLCode"/>
+          <w:rFonts w:cs="Arial"/>
+        </w:rPr>
+        <w:t>Posición_X_Puntera</w:t>
+      </w:r>
+      <w:proofErr w:type="spellEnd"/>
+      <w:r>
+        <w:rPr>
+          <w:rStyle w:val="HTMLCode"/>
+          <w:rFonts w:cs="Arial"/>
+        </w:rPr>
+        <w:t>) -&gt; "</w:t>
       </w:r>
       <w:r>
         <w:rPr>
@@ -2311,7 +3926,21 @@
         <w:rPr>
           <w:rFonts w:cs="Arial"/>
         </w:rPr>
-        <w:t>Para que la aplicación fluya en teléfonos móviles de gama media sin sobrecalentamiento ni caídas de frames, se aplicará un estricto protocolo de rendimiento:</w:t>
+        <w:t xml:space="preserve">Para que la aplicación fluya en teléfonos móviles de gama media sin sobrecalentamiento ni caídas de </w:t>
+      </w:r>
+      <w:proofErr w:type="spellStart"/>
+      <w:r>
+        <w:rPr>
+          <w:rFonts w:cs="Arial"/>
+        </w:rPr>
+        <w:t>frames</w:t>
+      </w:r>
+      <w:proofErr w:type="spellEnd"/>
+      <w:r>
+        <w:rPr>
+          <w:rFonts w:cs="Arial"/>
+        </w:rPr>
+        <w:t>, se aplicará un estricto protocolo de rendimiento:</w:t>
       </w:r>
     </w:p>
     <w:p>
@@ -2327,27 +3956,77 @@
           <w:rFonts w:cs="Arial"/>
         </w:rPr>
       </w:pPr>
+      <w:proofErr w:type="spellStart"/>
+      <w:proofErr w:type="gramStart"/>
       <w:r>
         <w:rPr>
           <w:rFonts w:cs="Arial"/>
           <w:b/>
           <w:bCs/>
         </w:rPr>
-        <w:t>Frame Skipping (Salto de Fotogramas):</w:t>
-      </w:r>
-      <w:r>
-        <w:rPr>
-          <w:rFonts w:cs="Arial"/>
-        </w:rPr>
-        <w:t xml:space="preserve"> No es necesario analizar video a 30 o 60 FPS. El movimiento de hipertrofia o fuerza es relativamente lento. Se procesará </w:t>
-      </w:r>
+        <w:t>Frame</w:t>
+      </w:r>
+      <w:proofErr w:type="spellEnd"/>
+      <w:proofErr w:type="gramEnd"/>
       <w:r>
         <w:rPr>
           <w:rFonts w:cs="Arial"/>
           <w:b/>
           <w:bCs/>
         </w:rPr>
-        <w:t>1 frame de cada 5</w:t>
+        <w:t xml:space="preserve"> </w:t>
+      </w:r>
+      <w:proofErr w:type="spellStart"/>
+      <w:r>
+        <w:rPr>
+          <w:rFonts w:cs="Arial"/>
+          <w:b/>
+          <w:bCs/>
+        </w:rPr>
+        <w:t>Skipping</w:t>
+      </w:r>
+      <w:proofErr w:type="spellEnd"/>
+      <w:r>
+        <w:rPr>
+          <w:rFonts w:cs="Arial"/>
+          <w:b/>
+          <w:bCs/>
+        </w:rPr>
+        <w:t xml:space="preserve"> (Salto de Fotogramas):</w:t>
+      </w:r>
+      <w:r>
+        <w:rPr>
+          <w:rFonts w:cs="Arial"/>
+        </w:rPr>
+        <w:t xml:space="preserve"> No es necesario analizar video a 30 o 60 FPS. El movimiento de hipertrofia o fuerza es relativamente lento. Se procesará </w:t>
+      </w:r>
+      <w:r>
+        <w:rPr>
+          <w:rFonts w:cs="Arial"/>
+          <w:b/>
+          <w:bCs/>
+        </w:rPr>
+        <w:t xml:space="preserve">1 </w:t>
+      </w:r>
+      <w:proofErr w:type="spellStart"/>
+      <w:proofErr w:type="gramStart"/>
+      <w:r>
+        <w:rPr>
+          <w:rFonts w:cs="Arial"/>
+          <w:b/>
+          <w:bCs/>
+        </w:rPr>
+        <w:t>frame</w:t>
+      </w:r>
+      <w:proofErr w:type="spellEnd"/>
+      <w:proofErr w:type="gramEnd"/>
+      <w:r>
+        <w:rPr>
+          <w:rFonts w:cs="Arial"/>
+          <w:b/>
+          <w:bCs/>
+        </w:rPr>
+        <w:t xml:space="preserve"> de cada 5</w:t>
       </w:r>
       <w:r>
         <w:rPr>
@@ -2383,27 +4062,90 @@
           <w:rFonts w:cs="Arial"/>
         </w:rPr>
       </w:pPr>
+      <w:proofErr w:type="spellStart"/>
       <w:r>
         <w:rPr>
           <w:rFonts w:cs="Arial"/>
           <w:b/>
           <w:bCs/>
         </w:rPr>
-        <w:t>Downscaling (Redimensionado):</w:t>
-      </w:r>
-      <w:r>
-        <w:rPr>
-          <w:rFonts w:cs="Arial"/>
-        </w:rPr>
-        <w:t xml:space="preserve"> Antes de pasar por la red neuronal de estimación (OpenCV/MediaPipe), el frame original se reducirá a dimensiones óptimas (ej. </w:t>
+        <w:t>Downscaling</w:t>
+      </w:r>
+      <w:proofErr w:type="spellEnd"/>
+      <w:r>
+        <w:rPr>
+          <w:rFonts w:cs="Arial"/>
+          <w:b/>
+          <w:bCs/>
+        </w:rPr>
+        <w:t xml:space="preserve"> (Redimensionado):</w:t>
+      </w:r>
+      <w:r>
+        <w:rPr>
+          <w:rFonts w:cs="Arial"/>
+        </w:rPr>
+        <w:t xml:space="preserve"> Antes de pasar por la red neuronal de estimación (</w:t>
+      </w:r>
+      <w:proofErr w:type="spellStart"/>
+      <w:r>
+        <w:rPr>
+          <w:rFonts w:cs="Arial"/>
+        </w:rPr>
+        <w:t>OpenCV</w:t>
+      </w:r>
+      <w:proofErr w:type="spellEnd"/>
+      <w:r>
+        <w:rPr>
+          <w:rFonts w:cs="Arial"/>
+        </w:rPr>
+        <w:t>/</w:t>
+      </w:r>
+      <w:proofErr w:type="spellStart"/>
+      <w:r>
+        <w:rPr>
+          <w:rFonts w:cs="Arial"/>
+        </w:rPr>
+        <w:t>MediaPipe</w:t>
+      </w:r>
+      <w:proofErr w:type="spellEnd"/>
+      <w:r>
+        <w:rPr>
+          <w:rFonts w:cs="Arial"/>
+        </w:rPr>
+        <w:t xml:space="preserve">), el </w:t>
+      </w:r>
+      <w:proofErr w:type="spellStart"/>
+      <w:proofErr w:type="gramStart"/>
+      <w:r>
+        <w:rPr>
+          <w:rFonts w:cs="Arial"/>
+        </w:rPr>
+        <w:t>frame</w:t>
+      </w:r>
+      <w:proofErr w:type="spellEnd"/>
+      <w:proofErr w:type="gramEnd"/>
+      <w:r>
+        <w:rPr>
+          <w:rFonts w:cs="Arial"/>
+        </w:rPr>
+        <w:t xml:space="preserve"> original se reducirá a dimensiones óptimas (ej. </w:t>
       </w:r>
       <w:r>
         <w:rPr>
           <w:rStyle w:val="HTMLCode"/>
           <w:rFonts w:cs="Arial"/>
         </w:rPr>
-        <w:t>256x256 px</w:t>
-      </w:r>
+        <w:t xml:space="preserve">256x256 </w:t>
+      </w:r>
+      <w:proofErr w:type="spellStart"/>
+      <w:r>
+        <w:rPr>
+          <w:rStyle w:val="HTMLCode"/>
+          <w:rFonts w:cs="Arial"/>
+        </w:rPr>
+        <w:t>px</w:t>
+      </w:r>
+      <w:proofErr w:type="spellEnd"/>
       <w:r>
         <w:rPr>
           <w:rFonts w:cs="Arial"/>
@@ -2415,8 +4157,17 @@
           <w:rStyle w:val="HTMLCode"/>
           <w:rFonts w:cs="Arial"/>
         </w:rPr>
-        <w:t>224x224 px</w:t>
-      </w:r>
+        <w:t xml:space="preserve">224x224 </w:t>
+      </w:r>
+      <w:proofErr w:type="spellStart"/>
+      <w:r>
+        <w:rPr>
+          <w:rStyle w:val="HTMLCode"/>
+          <w:rFonts w:cs="Arial"/>
+        </w:rPr>
+        <w:t>px</w:t>
+      </w:r>
+      <w:proofErr w:type="spellEnd"/>
       <w:r>
         <w:rPr>
           <w:rFonts w:cs="Arial"/>
@@ -2438,6 +4189,7 @@
           <w:rFonts w:cs="Arial"/>
           <w:noProof/>
         </w:rPr>
+        <w:lastRenderedPageBreak/>
         <w:drawing>
           <wp:anchor distT="0" distB="0" distL="114300" distR="114300" simplePos="0" relativeHeight="251659264" behindDoc="1" locked="0" layoutInCell="1" allowOverlap="1" wp14:anchorId="2004F37C" wp14:editId="001F3323">
             <wp:simplePos x="0" y="0"/>
@@ -2806,11 +4558,19 @@
           <w:rFonts w:ascii="Times New Roman" w:hAnsi="Times New Roman"/>
         </w:rPr>
       </w:pPr>
-      <w:r>
-        <w:rPr>
-          <w:rFonts w:cs="Arial"/>
-        </w:rPr>
-        <w:t xml:space="preserve">Codigo pedido a la IA: </w:t>
+      <w:proofErr w:type="spellStart"/>
+      <w:r>
+        <w:rPr>
+          <w:rFonts w:cs="Arial"/>
+        </w:rPr>
+        <w:t>Codigo</w:t>
+      </w:r>
+      <w:proofErr w:type="spellEnd"/>
+      <w:r>
+        <w:rPr>
+          <w:rFonts w:cs="Arial"/>
+        </w:rPr>
+        <w:t xml:space="preserve"> pedido a la IA: </w:t>
       </w:r>
       <w:r>
         <w:t>4️</w:t>
@@ -2835,7 +4595,15 @@
         <w:jc w:val="left"/>
       </w:pPr>
       <w:r>
-        <w:t>Normaliza todos los keypoints por torso/cadera → posición y tamaño</w:t>
+        <w:t xml:space="preserve">Normaliza todos los </w:t>
+      </w:r>
+      <w:proofErr w:type="spellStart"/>
+      <w:r>
+        <w:t>keypoints</w:t>
+      </w:r>
+      <w:proofErr w:type="spellEnd"/>
+      <w:r>
+        <w:t xml:space="preserve"> por torso/cadera → posición y tamaño</w:t>
       </w:r>
     </w:p>
     <w:p>
@@ -2942,11 +4710,19 @@
       <w:r>
         <w:t xml:space="preserve">Extrae </w:t>
       </w:r>
+      <w:proofErr w:type="spellStart"/>
       <w:r>
         <w:rPr>
           <w:rStyle w:val="Strong"/>
         </w:rPr>
-        <w:t>features universales por repetición</w:t>
+        <w:t>features</w:t>
+      </w:r>
+      <w:proofErr w:type="spellEnd"/>
+      <w:r>
+        <w:rPr>
+          <w:rStyle w:val="Strong"/>
+        </w:rPr>
+        <w:t xml:space="preserve"> universales por repetición</w:t>
       </w:r>
       <w:r>
         <w:t>:</w:t>
@@ -2962,8 +4738,13 @@
         <w:jc w:val="left"/>
       </w:pPr>
       <w:r>
-        <w:t>ROM máximo/minimo</w:t>
-      </w:r>
+        <w:t>ROM máximo/</w:t>
+      </w:r>
+      <w:proofErr w:type="spellStart"/>
+      <w:r>
+        <w:t>minimo</w:t>
+      </w:r>
+      <w:proofErr w:type="spellEnd"/>
     </w:p>
     <w:p>
       <w:pPr>
@@ -3001,7 +4782,15 @@
         <w:jc w:val="left"/>
       </w:pPr>
       <w:r>
-        <w:t>Guarda todo en un dataset por repetición → listo para ML o reglas</w:t>
+        <w:t xml:space="preserve">Guarda todo en un </w:t>
+      </w:r>
+      <w:proofErr w:type="spellStart"/>
+      <w:r>
+        <w:t>dataset</w:t>
+      </w:r>
+      <w:proofErr w:type="spellEnd"/>
+      <w:r>
+        <w:t xml:space="preserve"> por repetición → listo para ML o reglas</w:t>
       </w:r>
     </w:p>
     <w:p>
@@ -3046,7 +4835,6 @@
           <w:b/>
           <w:bCs/>
         </w:rPr>
-        <w:lastRenderedPageBreak/>
         <w:t>Activación muscular esperada (El gran problema):</w:t>
       </w:r>
       <w:r>
@@ -3080,7 +4868,15 @@
         <w:t>Balanceos y compensaciones (Estabilidad real):</w:t>
       </w:r>
       <w:r>
-        <w:t xml:space="preserve"> Puedes detectar con MediaPipe si el tronco se inclina hacia adelante, pero ¿cómo sabes si el usuario está perdiendo el equilibrio o simplemente tiene esa anatomía? El equilibrio real se define </w:t>
+        <w:t xml:space="preserve"> Puedes detectar con </w:t>
+      </w:r>
+      <w:proofErr w:type="spellStart"/>
+      <w:r>
+        <w:t>MediaPipe</w:t>
+      </w:r>
+      <w:proofErr w:type="spellEnd"/>
+      <w:r>
+        <w:t xml:space="preserve"> si el tronco se inclina hacia adelante, pero ¿cómo sabes si el usuario está perdiendo el equilibrio o simplemente tiene esa anatomía? El equilibrio real se define </w:t>
       </w:r>
       <w:r>
         <w:rPr>
@@ -3178,10 +4974,72 @@
           <w:color w:val="E3E3E3"/>
           <w:shd w:val="clear" w:color="auto" w:fill="282A2C"/>
         </w:rPr>
-        <w:t> dame el codigo para la red, acuerdate de todos los kpis, extraer repeticiones, y todo lo que hemos hablado.</w:t>
-      </w:r>
-      <w:r>
-        <w:t xml:space="preserve"> Apuntar posteriormente los kpis indicados.</w:t>
+        <w:t xml:space="preserve"> dame el </w:t>
+      </w:r>
+      <w:proofErr w:type="spellStart"/>
+      <w:r>
+        <w:rPr>
+          <w:rFonts w:cs="Arial"/>
+          <w:color w:val="E3E3E3"/>
+          <w:shd w:val="clear" w:color="auto" w:fill="282A2C"/>
+        </w:rPr>
+        <w:t>codigo</w:t>
+      </w:r>
+      <w:proofErr w:type="spellEnd"/>
+      <w:r>
+        <w:rPr>
+          <w:rFonts w:cs="Arial"/>
+          <w:color w:val="E3E3E3"/>
+          <w:shd w:val="clear" w:color="auto" w:fill="282A2C"/>
+        </w:rPr>
+        <w:t xml:space="preserve"> para la red, </w:t>
+      </w:r>
+      <w:proofErr w:type="spellStart"/>
+      <w:r>
+        <w:rPr>
+          <w:rFonts w:cs="Arial"/>
+          <w:color w:val="E3E3E3"/>
+          <w:shd w:val="clear" w:color="auto" w:fill="282A2C"/>
+        </w:rPr>
+        <w:t>acuerdate</w:t>
+      </w:r>
+      <w:proofErr w:type="spellEnd"/>
+      <w:r>
+        <w:rPr>
+          <w:rFonts w:cs="Arial"/>
+          <w:color w:val="E3E3E3"/>
+          <w:shd w:val="clear" w:color="auto" w:fill="282A2C"/>
+        </w:rPr>
+        <w:t xml:space="preserve"> de todos los </w:t>
+      </w:r>
+      <w:proofErr w:type="spellStart"/>
+      <w:r>
+        <w:rPr>
+          <w:rFonts w:cs="Arial"/>
+          <w:color w:val="E3E3E3"/>
+          <w:shd w:val="clear" w:color="auto" w:fill="282A2C"/>
+        </w:rPr>
+        <w:t>kpis</w:t>
+      </w:r>
+      <w:proofErr w:type="spellEnd"/>
+      <w:r>
+        <w:rPr>
+          <w:rFonts w:cs="Arial"/>
+          <w:color w:val="E3E3E3"/>
+          <w:shd w:val="clear" w:color="auto" w:fill="282A2C"/>
+        </w:rPr>
+        <w:t>, extraer repeticiones, y todo lo que hemos hablado.</w:t>
+      </w:r>
+      <w:r>
+        <w:t xml:space="preserve"> Apuntar posteriormente los </w:t>
+      </w:r>
+      <w:proofErr w:type="spellStart"/>
+      <w:r>
+        <w:t>kpis</w:t>
+      </w:r>
+      <w:proofErr w:type="spellEnd"/>
+      <w:r>
+        <w:t xml:space="preserve"> indicados.</w:t>
       </w:r>
     </w:p>
     <w:p>
@@ -3288,7 +5146,119 @@
         <w:jc w:val="left"/>
       </w:pPr>
       <w:r>
-        <w:t>['L_elbow', 'R_elbow', 'L_shoulder', 'R_shoulder', 'L_knee', 'R_knee', 'L_hip', 'R_hip', 'L_ankle', 'R_ankle', 'torso', 'sust_x', 'sust_y', 'sust_z', 'delta_time']</w:t>
+        <w:t>['</w:t>
+      </w:r>
+      <w:proofErr w:type="spellStart"/>
+      <w:r>
+        <w:t>L_elbow</w:t>
+      </w:r>
+      <w:proofErr w:type="spellEnd"/>
+      <w:r>
+        <w:t>', '</w:t>
+      </w:r>
+      <w:proofErr w:type="spellStart"/>
+      <w:r>
+        <w:t>R_elbow</w:t>
+      </w:r>
+      <w:proofErr w:type="spellEnd"/>
+      <w:r>
+        <w:t>', '</w:t>
+      </w:r>
+      <w:proofErr w:type="spellStart"/>
+      <w:r>
+        <w:t>L_shoulder</w:t>
+      </w:r>
+      <w:proofErr w:type="spellEnd"/>
+      <w:r>
+        <w:t>', '</w:t>
+      </w:r>
+      <w:proofErr w:type="spellStart"/>
+      <w:r>
+        <w:t>R_shoulder</w:t>
+      </w:r>
+      <w:proofErr w:type="spellEnd"/>
+      <w:r>
+        <w:t>', '</w:t>
+      </w:r>
+      <w:proofErr w:type="spellStart"/>
+      <w:r>
+        <w:t>L_knee</w:t>
+      </w:r>
+      <w:proofErr w:type="spellEnd"/>
+      <w:r>
+        <w:t>', '</w:t>
+      </w:r>
+      <w:proofErr w:type="spellStart"/>
+      <w:r>
+        <w:t>R_knee</w:t>
+      </w:r>
+      <w:proofErr w:type="spellEnd"/>
+      <w:r>
+        <w:t>', '</w:t>
+      </w:r>
+      <w:proofErr w:type="spellStart"/>
+      <w:r>
+        <w:t>L_hip</w:t>
+      </w:r>
+      <w:proofErr w:type="spellEnd"/>
+      <w:r>
+        <w:t>', '</w:t>
+      </w:r>
+      <w:proofErr w:type="spellStart"/>
+      <w:r>
+        <w:t>R_hip</w:t>
+      </w:r>
+      <w:proofErr w:type="spellEnd"/>
+      <w:r>
+        <w:t>', '</w:t>
+      </w:r>
+      <w:proofErr w:type="spellStart"/>
+      <w:r>
+        <w:t>L_ankle</w:t>
+      </w:r>
+      <w:proofErr w:type="spellEnd"/>
+      <w:r>
+        <w:t>', '</w:t>
+      </w:r>
+      <w:proofErr w:type="spellStart"/>
+      <w:r>
+        <w:t>R_ankle</w:t>
+      </w:r>
+      <w:proofErr w:type="spellEnd"/>
+      <w:r>
+        <w:t>', 'torso', '</w:t>
+      </w:r>
+      <w:proofErr w:type="spellStart"/>
+      <w:r>
+        <w:t>sust_x</w:t>
+      </w:r>
+      <w:proofErr w:type="spellEnd"/>
+      <w:r>
+        <w:t>', '</w:t>
+      </w:r>
+      <w:proofErr w:type="spellStart"/>
+      <w:r>
+        <w:t>sust_y</w:t>
+      </w:r>
+      <w:proofErr w:type="spellEnd"/>
+      <w:r>
+        <w:t>', '</w:t>
+      </w:r>
+      <w:proofErr w:type="spellStart"/>
+      <w:r>
+        <w:t>sust_z</w:t>
+      </w:r>
+      <w:proofErr w:type="spellEnd"/>
+      <w:r>
+        <w:t>', '</w:t>
+      </w:r>
+      <w:proofErr w:type="spellStart"/>
+      <w:r>
+        <w:t>delta_time</w:t>
+      </w:r>
+      <w:proofErr w:type="spellEnd"/>
+      <w:r>
+        <w:t>']</w:t>
       </w:r>
     </w:p>
     <w:p>
@@ -7613,6 +9583,7 @@
     <w:name w:val="heading 3"/>
     <w:basedOn w:val="Normal"/>
     <w:next w:val="Normal"/>
+    <w:link w:val="Heading3Char"/>
     <w:uiPriority w:val="9"/>
     <w:unhideWhenUsed/>
     <w:qFormat/>
@@ -8152,6 +10123,19 @@
     <w:basedOn w:val="DefaultParagraphFont"/>
     <w:rsid w:val="009806C1"/>
   </w:style>
+  <w:style w:type="character" w:customStyle="1" w:styleId="Heading3Char">
+    <w:name w:val="Heading 3 Char"/>
+    <w:basedOn w:val="DefaultParagraphFont"/>
+    <w:link w:val="Heading3"/>
+    <w:uiPriority w:val="9"/>
+    <w:rsid w:val="00482657"/>
+    <w:rPr>
+      <w:b/>
+      <w:color w:val="auto"/>
+      <w:sz w:val="24"/>
+      <w:szCs w:val="26"/>
+    </w:rPr>
+  </w:style>
 </w:styles>
 </file>
 

</xml_diff>

<commit_message>
Entrenamiento con modelo entrenado con más ejemplos, modelo v9. Primeras pruebas bastante satisfactorias
</commit_message>
<xml_diff>
--- a/docs/Planning.docx
+++ b/docs/Planning.docx
@@ -283,7 +283,6 @@
           <w:lang w:val="es-ES"/>
         </w:rPr>
       </w:pPr>
-      <w:proofErr w:type="spellStart"/>
       <w:r>
         <w:rPr>
           <w:lang w:val="es-ES"/>
@@ -291,7 +290,6 @@
         <w:lastRenderedPageBreak/>
         <w:t>Sprints</w:t>
       </w:r>
-      <w:proofErr w:type="spellEnd"/>
     </w:p>
     <w:p>
       <w:pPr>
@@ -329,89 +327,33 @@
         <w:rPr>
           <w:lang w:val="es-ES"/>
         </w:rPr>
-        <w:t xml:space="preserve">--&gt; Primero de todo he instalado el </w:t>
-      </w:r>
-      <w:proofErr w:type="spellStart"/>
-      <w:r>
-        <w:rPr>
-          <w:lang w:val="es-ES"/>
-        </w:rPr>
-        <w:t>framework</w:t>
-      </w:r>
-      <w:proofErr w:type="spellEnd"/>
-      <w:r>
-        <w:rPr>
-          <w:lang w:val="es-ES"/>
-        </w:rPr>
-        <w:t xml:space="preserve"> de Android </w:t>
-      </w:r>
-      <w:proofErr w:type="spellStart"/>
-      <w:r>
-        <w:rPr>
-          <w:lang w:val="es-ES"/>
-        </w:rPr>
-        <w:t>studio</w:t>
-      </w:r>
-      <w:proofErr w:type="spellEnd"/>
-      <w:r>
-        <w:rPr>
-          <w:lang w:val="es-ES"/>
-        </w:rPr>
-        <w:t>, y he iniciado un proyecto de 0.</w:t>
-      </w:r>
-    </w:p>
-    <w:p>
-      <w:pPr>
-        <w:rPr>
-          <w:lang w:val="es-ES"/>
-        </w:rPr>
-      </w:pPr>
-      <w:r>
-        <w:rPr>
-          <w:lang w:val="es-ES"/>
-        </w:rPr>
-        <w:t xml:space="preserve">--&gt; Posteriormente he creado un repositorio en </w:t>
-      </w:r>
-      <w:proofErr w:type="spellStart"/>
-      <w:r>
-        <w:rPr>
-          <w:lang w:val="es-ES"/>
-        </w:rPr>
-        <w:t>gitlab</w:t>
-      </w:r>
-      <w:proofErr w:type="spellEnd"/>
-      <w:r>
-        <w:rPr>
-          <w:lang w:val="es-ES"/>
-        </w:rPr>
-        <w:t xml:space="preserve"> para tener un control de versiones.</w:t>
-      </w:r>
-    </w:p>
-    <w:p>
-      <w:pPr>
-        <w:rPr>
-          <w:lang w:val="es-ES"/>
-        </w:rPr>
-      </w:pPr>
-      <w:r>
-        <w:rPr>
-          <w:lang w:val="es-ES"/>
-        </w:rPr>
-        <w:t xml:space="preserve">--&gt; He trasteado un poco en el </w:t>
-      </w:r>
-      <w:proofErr w:type="spellStart"/>
-      <w:r>
-        <w:rPr>
-          <w:lang w:val="es-ES"/>
-        </w:rPr>
-        <w:t>framework</w:t>
-      </w:r>
-      <w:proofErr w:type="spellEnd"/>
-      <w:r>
-        <w:rPr>
-          <w:lang w:val="es-ES"/>
-        </w:rPr>
-        <w:t xml:space="preserve"> y he ido programando la aplicación, primero poder hacer fotos y videos y luego poder adjuntar cosas de la galería.</w:t>
+        <w:t>--&gt; Primero de todo he instalado el framework de Android studio, y he iniciado un proyecto de 0.</w:t>
+      </w:r>
+    </w:p>
+    <w:p>
+      <w:pPr>
+        <w:rPr>
+          <w:lang w:val="es-ES"/>
+        </w:rPr>
+      </w:pPr>
+      <w:r>
+        <w:rPr>
+          <w:lang w:val="es-ES"/>
+        </w:rPr>
+        <w:t>--&gt; Posteriormente he creado un repositorio en gitlab para tener un control de versiones.</w:t>
+      </w:r>
+    </w:p>
+    <w:p>
+      <w:pPr>
+        <w:rPr>
+          <w:lang w:val="es-ES"/>
+        </w:rPr>
+      </w:pPr>
+      <w:r>
+        <w:rPr>
+          <w:lang w:val="es-ES"/>
+        </w:rPr>
+        <w:t>--&gt; He trasteado un poco en el framework y he ido programando la aplicación, primero poder hacer fotos y videos y luego poder adjuntar cosas de la galería.</w:t>
       </w:r>
     </w:p>
     <w:p>
@@ -437,21 +379,7 @@
         <w:rPr>
           <w:lang w:val="es-ES"/>
         </w:rPr>
-        <w:t xml:space="preserve">--&gt; la opción de poder cambiar la foto o video subido </w:t>
-      </w:r>
-      <w:proofErr w:type="spellStart"/>
-      <w:r>
-        <w:rPr>
-          <w:lang w:val="es-ES"/>
-        </w:rPr>
-        <w:t>asi</w:t>
-      </w:r>
-      <w:proofErr w:type="spellEnd"/>
-      <w:r>
-        <w:rPr>
-          <w:lang w:val="es-ES"/>
-        </w:rPr>
-        <w:t xml:space="preserve"> de enviarla al servidor.</w:t>
+        <w:t>--&gt; la opción de poder cambiar la foto o video subido asi de enviarla al servidor.</w:t>
       </w:r>
     </w:p>
     <w:p>
@@ -503,21 +431,7 @@
         <w:rPr>
           <w:lang w:val="es-ES"/>
         </w:rPr>
-        <w:t xml:space="preserve">Además, mirar alguna alternativa a </w:t>
-      </w:r>
-      <w:proofErr w:type="spellStart"/>
-      <w:r>
-        <w:rPr>
-          <w:lang w:val="es-ES"/>
-        </w:rPr>
-        <w:t>openpose</w:t>
-      </w:r>
-      <w:proofErr w:type="spellEnd"/>
-      <w:r>
-        <w:rPr>
-          <w:lang w:val="es-ES"/>
-        </w:rPr>
-        <w:t>.</w:t>
+        <w:t>Además, mirar alguna alternativa a openpose.</w:t>
       </w:r>
     </w:p>
     <w:p>
@@ -569,146 +483,20 @@
         <w:rPr>
           <w:lang w:val="es-ES"/>
         </w:rPr>
-        <w:t xml:space="preserve">En primer </w:t>
-      </w:r>
-      <w:proofErr w:type="gramStart"/>
-      <w:r>
-        <w:rPr>
-          <w:lang w:val="es-ES"/>
-        </w:rPr>
-        <w:t>lugar</w:t>
-      </w:r>
-      <w:proofErr w:type="gramEnd"/>
-      <w:r>
-        <w:rPr>
-          <w:lang w:val="es-ES"/>
-        </w:rPr>
-        <w:t xml:space="preserve"> trabajaremos con el análisis de imágenes intentando conseguir los </w:t>
-      </w:r>
-      <w:proofErr w:type="spellStart"/>
-      <w:r>
-        <w:rPr>
-          <w:lang w:val="es-ES"/>
-        </w:rPr>
-        <w:t>keypoints</w:t>
-      </w:r>
-      <w:proofErr w:type="spellEnd"/>
-      <w:r>
-        <w:rPr>
-          <w:lang w:val="es-ES"/>
-        </w:rPr>
-        <w:t xml:space="preserve"> del cuerpo humano a través de </w:t>
-      </w:r>
-      <w:proofErr w:type="spellStart"/>
-      <w:r>
-        <w:rPr>
-          <w:lang w:val="es-ES"/>
-        </w:rPr>
-        <w:t>mediapipe</w:t>
-      </w:r>
-      <w:proofErr w:type="spellEnd"/>
-      <w:r>
-        <w:rPr>
-          <w:lang w:val="es-ES"/>
-        </w:rPr>
-        <w:t xml:space="preserve">. Para ello requiere un análisis </w:t>
-      </w:r>
-      <w:proofErr w:type="spellStart"/>
-      <w:r>
-        <w:rPr>
-          <w:lang w:val="es-ES"/>
-        </w:rPr>
-        <w:t>he</w:t>
-      </w:r>
-      <w:proofErr w:type="spellEnd"/>
-      <w:r>
-        <w:rPr>
-          <w:lang w:val="es-ES"/>
-        </w:rPr>
-        <w:t xml:space="preserve"> investigación propia, tanto de la propia </w:t>
-      </w:r>
-      <w:proofErr w:type="spellStart"/>
-      <w:r>
-        <w:rPr>
-          <w:lang w:val="es-ES"/>
-        </w:rPr>
-        <w:t>docimentacion</w:t>
-      </w:r>
-      <w:proofErr w:type="spellEnd"/>
-      <w:r>
-        <w:rPr>
-          <w:lang w:val="es-ES"/>
-        </w:rPr>
-        <w:t xml:space="preserve"> como de repositorios de </w:t>
-      </w:r>
-      <w:proofErr w:type="spellStart"/>
-      <w:r>
-        <w:rPr>
-          <w:lang w:val="es-ES"/>
-        </w:rPr>
-        <w:t>github</w:t>
-      </w:r>
-      <w:proofErr w:type="spellEnd"/>
-      <w:r>
-        <w:rPr>
-          <w:lang w:val="es-ES"/>
-        </w:rPr>
-        <w:t xml:space="preserve"> los cuales ya han usado esta técnica. </w:t>
-      </w:r>
-    </w:p>
-    <w:p>
-      <w:pPr>
-        <w:rPr>
-          <w:lang w:val="es-ES"/>
-        </w:rPr>
-      </w:pPr>
-      <w:r>
-        <w:rPr>
-          <w:lang w:val="es-ES"/>
-        </w:rPr>
-        <w:t xml:space="preserve">Una vez obtenido los 33 </w:t>
-      </w:r>
-      <w:proofErr w:type="spellStart"/>
-      <w:r>
-        <w:rPr>
-          <w:lang w:val="es-ES"/>
-        </w:rPr>
-        <w:t>keypoints</w:t>
-      </w:r>
-      <w:proofErr w:type="spellEnd"/>
-      <w:r>
-        <w:rPr>
-          <w:lang w:val="es-ES"/>
-        </w:rPr>
-        <w:t xml:space="preserve"> intentamos calcular los ángulos de las articulaciones </w:t>
-      </w:r>
-      <w:proofErr w:type="spellStart"/>
-      <w:r>
-        <w:rPr>
-          <w:lang w:val="es-ES"/>
-        </w:rPr>
-        <w:t>mas</w:t>
-      </w:r>
-      <w:proofErr w:type="spellEnd"/>
-      <w:r>
-        <w:rPr>
-          <w:lang w:val="es-ES"/>
-        </w:rPr>
-        <w:t xml:space="preserve"> importantes del cuerpo como rodilla, </w:t>
-      </w:r>
-      <w:proofErr w:type="gramStart"/>
-      <w:r>
-        <w:rPr>
-          <w:lang w:val="es-ES"/>
-        </w:rPr>
-        <w:t>codo ,</w:t>
-      </w:r>
-      <w:proofErr w:type="gramEnd"/>
-      <w:r>
-        <w:rPr>
-          <w:lang w:val="es-ES"/>
-        </w:rPr>
-        <w:t>… Una vez obtenidos estos ángulos me doy cuenta de los siguientes problemas:</w:t>
+        <w:t xml:space="preserve">En primer lugar trabajaremos con el análisis de imágenes intentando conseguir los keypoints del cuerpo humano a través de mediapipe. Para ello requiere un análisis he investigación propia, tanto de la propia docimentacion como de repositorios de github los cuales ya han usado esta técnica. </w:t>
+      </w:r>
+    </w:p>
+    <w:p>
+      <w:pPr>
+        <w:rPr>
+          <w:lang w:val="es-ES"/>
+        </w:rPr>
+      </w:pPr>
+      <w:r>
+        <w:rPr>
+          <w:lang w:val="es-ES"/>
+        </w:rPr>
+        <w:t>Una vez obtenido los 33 keypoints intentamos calcular los ángulos de las articulaciones mas importantes del cuerpo como rodilla, codo ,… Una vez obtenidos estos ángulos me doy cuenta de los siguientes problemas:</w:t>
       </w:r>
     </w:p>
     <w:p>
@@ -744,49 +532,7 @@
         <w:rPr>
           <w:lang w:val="es-ES"/>
         </w:rPr>
-        <w:t xml:space="preserve">Hay veces que </w:t>
-      </w:r>
-      <w:proofErr w:type="spellStart"/>
-      <w:r>
-        <w:rPr>
-          <w:lang w:val="es-ES"/>
-        </w:rPr>
-        <w:t>medipipe</w:t>
-      </w:r>
-      <w:proofErr w:type="spellEnd"/>
-      <w:r>
-        <w:rPr>
-          <w:lang w:val="es-ES"/>
-        </w:rPr>
-        <w:t xml:space="preserve">, aporta ciertos valores con poca fiabilidad (la cual el propio </w:t>
-      </w:r>
-      <w:proofErr w:type="spellStart"/>
-      <w:r>
-        <w:rPr>
-          <w:lang w:val="es-ES"/>
-        </w:rPr>
-        <w:t>mediapipe</w:t>
-      </w:r>
-      <w:proofErr w:type="spellEnd"/>
-      <w:r>
-        <w:rPr>
-          <w:lang w:val="es-ES"/>
-        </w:rPr>
-        <w:t xml:space="preserve"> te indica a través de un parámetro de fiabilidad), al calcular los ángulos con parámetros poco fiables hay muchos errores, la solución propuesta, es la técnica del espejo, ya que la mayoría de </w:t>
-      </w:r>
-      <w:proofErr w:type="gramStart"/>
-      <w:r>
-        <w:rPr>
-          <w:lang w:val="es-ES"/>
-        </w:rPr>
-        <w:t>valores</w:t>
-      </w:r>
-      <w:proofErr w:type="gramEnd"/>
-      <w:r>
-        <w:rPr>
-          <w:lang w:val="es-ES"/>
-        </w:rPr>
-        <w:t xml:space="preserve"> poco fiables es debido al perfil de la cámara y la sola obtención de un perfil del usuario.</w:t>
+        <w:t>Hay veces que medipipe, aporta ciertos valores con poca fiabilidad (la cual el propio mediapipe te indica a través de un parámetro de fiabilidad), al calcular los ángulos con parámetros poco fiables hay muchos errores, la solución propuesta, es la técnica del espejo, ya que la mayoría de valores poco fiables es debido al perfil de la cámara y la sola obtención de un perfil del usuario.</w:t>
       </w:r>
     </w:p>
     <w:p>
@@ -826,228 +572,46 @@
           <w:lang w:val="es-ES"/>
         </w:rPr>
         <w:lastRenderedPageBreak/>
-        <w:t xml:space="preserve">Antes de todo he decidido conversar con un experto en la materia (graduado den CACYFD) para que me aconseje sobre el trabajo que estoy realizando con respecto a </w:t>
-      </w:r>
-      <w:proofErr w:type="spellStart"/>
-      <w:r>
-        <w:rPr>
-          <w:lang w:val="es-ES"/>
-        </w:rPr>
-        <w:t>al</w:t>
-      </w:r>
-      <w:proofErr w:type="spellEnd"/>
-      <w:r>
-        <w:rPr>
-          <w:lang w:val="es-ES"/>
-        </w:rPr>
-        <w:t xml:space="preserve"> </w:t>
-      </w:r>
-      <w:proofErr w:type="spellStart"/>
-      <w:r>
-        <w:rPr>
-          <w:lang w:val="es-ES"/>
-        </w:rPr>
-        <w:t>biomecanica</w:t>
-      </w:r>
-      <w:proofErr w:type="spellEnd"/>
-      <w:r>
-        <w:rPr>
-          <w:lang w:val="es-ES"/>
-        </w:rPr>
-        <w:t xml:space="preserve"> y demás. Me ha sugerido añadir el </w:t>
-      </w:r>
-      <w:proofErr w:type="spellStart"/>
-      <w:r>
-        <w:rPr>
-          <w:lang w:val="es-ES"/>
-        </w:rPr>
-        <w:t>calculo</w:t>
-      </w:r>
-      <w:proofErr w:type="spellEnd"/>
-      <w:r>
-        <w:rPr>
-          <w:lang w:val="es-ES"/>
-        </w:rPr>
-        <w:t xml:space="preserve"> del centro de sustentación, el cual tiene una serie de ventajas y hace que se pueda profesionalizar el análisis del ejercicio.</w:t>
-      </w:r>
-    </w:p>
-    <w:p>
-      <w:pPr>
-        <w:rPr>
-          <w:lang w:val="es-ES"/>
-        </w:rPr>
-      </w:pPr>
-      <w:r>
-        <w:rPr>
-          <w:lang w:val="es-ES"/>
-        </w:rPr>
-        <w:t xml:space="preserve">Una vez que tenemos un archivo con todos los ángulos del cuerpo la idea es entrenar a una red neuronal para conseguir que obtenga ciertas conclusiones de los ángulos. Para ello hay que investigar sobre que red es la más adecuada para nuestro caso, y trazar un plan de entrenamiento o fine </w:t>
-      </w:r>
-      <w:proofErr w:type="spellStart"/>
-      <w:r>
-        <w:rPr>
-          <w:lang w:val="es-ES"/>
-        </w:rPr>
-        <w:t>tunning</w:t>
-      </w:r>
-      <w:proofErr w:type="spellEnd"/>
-      <w:r>
-        <w:rPr>
-          <w:lang w:val="es-ES"/>
-        </w:rPr>
-        <w:t xml:space="preserve"> (a poder ser).</w:t>
-      </w:r>
-    </w:p>
-    <w:p>
-      <w:pPr>
-        <w:rPr>
-          <w:lang w:val="es-ES"/>
-        </w:rPr>
-      </w:pPr>
-      <w:r>
-        <w:rPr>
-          <w:lang w:val="es-ES"/>
-        </w:rPr>
-        <w:t xml:space="preserve">Han surgido ciertos problemas a la hora de revisar el trabajo realizado y analizar el </w:t>
-      </w:r>
-      <w:proofErr w:type="spellStart"/>
-      <w:r>
-        <w:rPr>
-          <w:lang w:val="es-ES"/>
-        </w:rPr>
-        <w:t>csv</w:t>
-      </w:r>
-      <w:proofErr w:type="spellEnd"/>
-      <w:r>
-        <w:rPr>
-          <w:lang w:val="es-ES"/>
-        </w:rPr>
-        <w:t xml:space="preserve">. Además, hablar con el experto en </w:t>
-      </w:r>
-      <w:proofErr w:type="spellStart"/>
-      <w:r>
-        <w:rPr>
-          <w:lang w:val="es-ES"/>
-        </w:rPr>
-        <w:t>biomecanica</w:t>
-      </w:r>
-      <w:proofErr w:type="spellEnd"/>
-      <w:r>
-        <w:rPr>
-          <w:lang w:val="es-ES"/>
-        </w:rPr>
-        <w:t xml:space="preserve"> me ha llevado a hacer algunos cambios en el código y en la forma de entender el proceso. En cuanto a software he decidido actualizar el código y las dependencias a la versión más nueva de </w:t>
-      </w:r>
-      <w:proofErr w:type="spellStart"/>
-      <w:r>
-        <w:rPr>
-          <w:lang w:val="es-ES"/>
-        </w:rPr>
-        <w:t>medipipe</w:t>
-      </w:r>
-      <w:proofErr w:type="spellEnd"/>
-      <w:r>
-        <w:rPr>
-          <w:lang w:val="es-ES"/>
-        </w:rPr>
-        <w:t xml:space="preserve">, ya que ha salido recientemente y he visto que tiene bastantes mejoras, el inconveniente es que me ha tocado cambiar el código. Otro aspecto es en la forma de analizar los datos, </w:t>
-      </w:r>
-      <w:proofErr w:type="spellStart"/>
-      <w:r>
-        <w:rPr>
-          <w:lang w:val="es-ES"/>
-        </w:rPr>
-        <w:t>mediapipe</w:t>
-      </w:r>
-      <w:proofErr w:type="spellEnd"/>
-      <w:r>
-        <w:rPr>
-          <w:lang w:val="es-ES"/>
-        </w:rPr>
-        <w:t xml:space="preserve"> da un valor junto con cada </w:t>
-      </w:r>
-      <w:proofErr w:type="spellStart"/>
-      <w:r>
-        <w:rPr>
-          <w:lang w:val="es-ES"/>
-        </w:rPr>
-        <w:t>keypoint</w:t>
-      </w:r>
-      <w:proofErr w:type="spellEnd"/>
-      <w:r>
-        <w:rPr>
-          <w:lang w:val="es-ES"/>
-        </w:rPr>
-        <w:t xml:space="preserve"> de confianza, he decidido filtrar los </w:t>
-      </w:r>
-      <w:proofErr w:type="spellStart"/>
-      <w:r>
-        <w:rPr>
-          <w:lang w:val="es-ES"/>
-        </w:rPr>
-        <w:t>keypoints</w:t>
-      </w:r>
-      <w:proofErr w:type="spellEnd"/>
-      <w:r>
-        <w:rPr>
-          <w:lang w:val="es-ES"/>
-        </w:rPr>
-        <w:t xml:space="preserve"> por una confianza (variable y en pruebas), para asegurar tener una serie de datos más fiables, dejando espacios vacíos en el conjunto de datos si no se capturan bien en lugar de hacer la técnica del espejo o simplemente valores poco fiables. En cuanto a la técnica del espejo he estado investigando debido al consejo del experto, ya que hemos llegado a la conclusión de que la simetría es un aspecto importante a la hora de analizar un ejercicio y al hacer la técnica del espejo si una parte del cuerpo no se ve estamos asumiendo una simetría inventada que puede dar lugar a errores.</w:t>
-      </w:r>
-    </w:p>
-    <w:p>
-      <w:pPr>
-        <w:rPr>
-          <w:lang w:val="es-ES"/>
-        </w:rPr>
-      </w:pPr>
-      <w:r>
-        <w:rPr>
-          <w:lang w:val="es-ES"/>
-        </w:rPr>
-        <w:t xml:space="preserve">Al hablar con la tutora después de investigar un poco sobre el ML y </w:t>
-      </w:r>
-      <w:proofErr w:type="spellStart"/>
-      <w:r>
-        <w:rPr>
-          <w:lang w:val="es-ES"/>
-        </w:rPr>
-        <w:t>como</w:t>
-      </w:r>
-      <w:proofErr w:type="spellEnd"/>
-      <w:r>
-        <w:rPr>
-          <w:lang w:val="es-ES"/>
-        </w:rPr>
-        <w:t xml:space="preserve"> funciona en la parte práctica, nos hemos dado cuenta </w:t>
-      </w:r>
-      <w:proofErr w:type="gramStart"/>
-      <w:r>
-        <w:rPr>
-          <w:lang w:val="es-ES"/>
-        </w:rPr>
-        <w:t>que</w:t>
-      </w:r>
-      <w:proofErr w:type="gramEnd"/>
-      <w:r>
-        <w:rPr>
-          <w:lang w:val="es-ES"/>
-        </w:rPr>
-        <w:t xml:space="preserve"> es muy difícil entrenar una red neuronal que consiga generalizar y ofrecer técnicas correctas para todos los ejercicios. Por lo que hemos </w:t>
-      </w:r>
-      <w:proofErr w:type="spellStart"/>
-      <w:r>
-        <w:rPr>
-          <w:lang w:val="es-ES"/>
-        </w:rPr>
-        <w:t>obtado</w:t>
-      </w:r>
-      <w:proofErr w:type="spellEnd"/>
-      <w:r>
-        <w:rPr>
-          <w:lang w:val="es-ES"/>
-        </w:rPr>
-        <w:t xml:space="preserve"> por seguir une esquema híbrido en el que nuestra propia red neuronal sacará unos ciertos parámetros para analizar SOLO el movimiento de sentadilla, mientras que para analizar los demás movimientos la idea ahora es subir el archivo con los ángulos y el punto de sustentación (el cual también hemos añadido gracias al experto) y que una IA externa ya entrenada nos analice el ejercicio para poder otorgar una respuesta al usuario sea el ejercicio que sea.</w:t>
+        <w:t>Antes de todo he decidido conversar con un experto en la materia (graduado den CACYFD) para que me aconseje sobre el trabajo que estoy realizando con respecto a al biomecanica y demás. Me ha sugerido añadir el calculo del centro de sustentación, el cual tiene una serie de ventajas y hace que se pueda profesionalizar el análisis del ejercicio.</w:t>
+      </w:r>
+    </w:p>
+    <w:p>
+      <w:pPr>
+        <w:rPr>
+          <w:lang w:val="es-ES"/>
+        </w:rPr>
+      </w:pPr>
+      <w:r>
+        <w:rPr>
+          <w:lang w:val="es-ES"/>
+        </w:rPr>
+        <w:t>Una vez que tenemos un archivo con todos los ángulos del cuerpo la idea es entrenar a una red neuronal para conseguir que obtenga ciertas conclusiones de los ángulos. Para ello hay que investigar sobre que red es la más adecuada para nuestro caso, y trazar un plan de entrenamiento o fine tunning (a poder ser).</w:t>
+      </w:r>
+    </w:p>
+    <w:p>
+      <w:pPr>
+        <w:rPr>
+          <w:lang w:val="es-ES"/>
+        </w:rPr>
+      </w:pPr>
+      <w:r>
+        <w:rPr>
+          <w:lang w:val="es-ES"/>
+        </w:rPr>
+        <w:t>Han surgido ciertos problemas a la hora de revisar el trabajo realizado y analizar el csv. Además, hablar con el experto en biomecanica me ha llevado a hacer algunos cambios en el código y en la forma de entender el proceso. En cuanto a software he decidido actualizar el código y las dependencias a la versión más nueva de medipipe, ya que ha salido recientemente y he visto que tiene bastantes mejoras, el inconveniente es que me ha tocado cambiar el código. Otro aspecto es en la forma de analizar los datos, mediapipe da un valor junto con cada keypoint de confianza, he decidido filtrar los keypoints por una confianza (variable y en pruebas), para asegurar tener una serie de datos más fiables, dejando espacios vacíos en el conjunto de datos si no se capturan bien en lugar de hacer la técnica del espejo o simplemente valores poco fiables. En cuanto a la técnica del espejo he estado investigando debido al consejo del experto, ya que hemos llegado a la conclusión de que la simetría es un aspecto importante a la hora de analizar un ejercicio y al hacer la técnica del espejo si una parte del cuerpo no se ve estamos asumiendo una simetría inventada que puede dar lugar a errores.</w:t>
+      </w:r>
+    </w:p>
+    <w:p>
+      <w:pPr>
+        <w:rPr>
+          <w:lang w:val="es-ES"/>
+        </w:rPr>
+      </w:pPr>
+      <w:r>
+        <w:rPr>
+          <w:lang w:val="es-ES"/>
+        </w:rPr>
+        <w:t>Al hablar con la tutora después de investigar un poco sobre el ML y como funciona en la parte práctica, nos hemos dado cuenta que es muy difícil entrenar una red neuronal que consiga generalizar y ofrecer técnicas correctas para todos los ejercicios. Por lo que hemos obtado por seguir une esquema híbrido en el que nuestra propia red neuronal sacará unos ciertos parámetros para analizar SOLO el movimiento de sentadilla, mientras que para analizar los demás movimientos la idea ahora es subir el archivo con los ángulos y el punto de sustentación (el cual también hemos añadido gracias al experto) y que una IA externa ya entrenada nos analice el ejercicio para poder otorgar una respuesta al usuario sea el ejercicio que sea.</w:t>
       </w:r>
     </w:p>
     <w:p>
@@ -1074,35 +638,7 @@
         <w:rPr>
           <w:lang w:val="es-ES"/>
         </w:rPr>
-        <w:t xml:space="preserve">Creación de la red BILSTM y búsqueda de ejemplos para su entrenamiento, una vez recopilada gran cantidad de datos me doy cuenta de la carencia de datos de ejecuciones de sentadilla erróneas, por lo que la siguiente semana me dispondré a </w:t>
-      </w:r>
-      <w:proofErr w:type="spellStart"/>
-      <w:r>
-        <w:rPr>
-          <w:lang w:val="es-ES"/>
-        </w:rPr>
-        <w:t>grabrme</w:t>
-      </w:r>
-      <w:proofErr w:type="spellEnd"/>
-      <w:r>
-        <w:rPr>
-          <w:lang w:val="es-ES"/>
-        </w:rPr>
-        <w:t xml:space="preserve"> a </w:t>
-      </w:r>
-      <w:proofErr w:type="spellStart"/>
-      <w:r>
-        <w:rPr>
-          <w:lang w:val="es-ES"/>
-        </w:rPr>
-        <w:t>mi</w:t>
-      </w:r>
-      <w:proofErr w:type="spellEnd"/>
-      <w:r>
-        <w:rPr>
-          <w:lang w:val="es-ES"/>
-        </w:rPr>
-        <w:t xml:space="preserve"> y algunos compañeros que se han ofrecido a ayudarme, ya que para el entrenamiento de la red necesito tanto ejecuciones correctas como incorrectas. </w:t>
+        <w:t xml:space="preserve">Creación de la red BILSTM y búsqueda de ejemplos para su entrenamiento, una vez recopilada gran cantidad de datos me doy cuenta de la carencia de datos de ejecuciones de sentadilla erróneas, por lo que la siguiente semana me dispondré a grabrme a mi y algunos compañeros que se han ofrecido a ayudarme, ya que para el entrenamiento de la red necesito tanto ejecuciones correctas como incorrectas. </w:t>
       </w:r>
     </w:p>
     <w:p>
@@ -1129,77 +665,7 @@
           <w:lang w:val="es-ES"/>
         </w:rPr>
         <w:lastRenderedPageBreak/>
-        <w:t xml:space="preserve">Gracias a mi tutora Carolina, tengo la oportunidad de ir al centro de IA de la empresa BISITE, en el </w:t>
-      </w:r>
-      <w:proofErr w:type="spellStart"/>
-      <w:r>
-        <w:rPr>
-          <w:lang w:val="es-ES"/>
-        </w:rPr>
-        <w:t>cúal</w:t>
-      </w:r>
-      <w:proofErr w:type="spellEnd"/>
-      <w:r>
-        <w:rPr>
-          <w:lang w:val="es-ES"/>
-        </w:rPr>
-        <w:t xml:space="preserve"> además de enseñarme gran cantidad de proyectos me sirve para preguntar algunas dudas que tenía, contar mi trabajo y recibir recomendaciones las cuales las hemos evaluado y llegado a la siguiente conclusión. Les encanta el </w:t>
-      </w:r>
-      <w:proofErr w:type="gramStart"/>
-      <w:r>
-        <w:rPr>
-          <w:lang w:val="es-ES"/>
-        </w:rPr>
-        <w:t>proyecto</w:t>
-      </w:r>
-      <w:proofErr w:type="gramEnd"/>
-      <w:r>
-        <w:rPr>
-          <w:lang w:val="es-ES"/>
-        </w:rPr>
-        <w:t xml:space="preserve"> pero un integrante del grupo de investigación me sugiere probar con el siguiente tipo de red </w:t>
-      </w:r>
-      <w:proofErr w:type="spellStart"/>
-      <w:r>
-        <w:rPr>
-          <w:lang w:val="es-ES"/>
-        </w:rPr>
-        <w:t>XGboost</w:t>
-      </w:r>
-      <w:proofErr w:type="spellEnd"/>
-      <w:r>
-        <w:rPr>
-          <w:lang w:val="es-ES"/>
-        </w:rPr>
-        <w:t xml:space="preserve">, en caso de algún problema con el tipo de red ya seleccionado </w:t>
-      </w:r>
-      <w:proofErr w:type="spellStart"/>
-      <w:r>
-        <w:rPr>
-          <w:lang w:val="es-ES"/>
-        </w:rPr>
-        <w:t>obtaremos</w:t>
-      </w:r>
-      <w:proofErr w:type="spellEnd"/>
-      <w:r>
-        <w:rPr>
-          <w:lang w:val="es-ES"/>
-        </w:rPr>
-        <w:t xml:space="preserve"> seguramente por hacer una </w:t>
-      </w:r>
-      <w:proofErr w:type="spellStart"/>
-      <w:r>
-        <w:rPr>
-          <w:lang w:val="es-ES"/>
-        </w:rPr>
-        <w:t>comparaciñon</w:t>
-      </w:r>
-      <w:proofErr w:type="spellEnd"/>
-      <w:r>
-        <w:rPr>
-          <w:lang w:val="es-ES"/>
-        </w:rPr>
-        <w:t xml:space="preserve"> con este otro tipo de red para obtener un mejor resultado.</w:t>
+        <w:t>Gracias a mi tutora Carolina, tengo la oportunidad de ir al centro de IA de la empresa BISITE, en el cúal además de enseñarme gran cantidad de proyectos me sirve para preguntar algunas dudas que tenía, contar mi trabajo y recibir recomendaciones las cuales las hemos evaluado y llegado a la siguiente conclusión. Les encanta el proyecto pero un integrante del grupo de investigación me sugiere probar con el siguiente tipo de red XGboost, en caso de algún problema con el tipo de red ya seleccionado obtaremos seguramente por hacer una comparaciñon con este otro tipo de red para obtener un mejor resultado.</w:t>
       </w:r>
     </w:p>
     <w:p>
@@ -1218,21 +684,7 @@
         <w:rPr>
           <w:lang w:val="es-ES"/>
         </w:rPr>
-        <w:t xml:space="preserve">dedicar un tiempo a la limpieza del código para mejorar la implementación y que todo quede mejor estructurado, con nombres más sugerentes y profesionales. Además de la realización de una infografía. Es importante mencionar que todos los cambios están siendo registrados en un controlador de versiones, en este caso </w:t>
-      </w:r>
-      <w:proofErr w:type="spellStart"/>
-      <w:r>
-        <w:rPr>
-          <w:lang w:val="es-ES"/>
-        </w:rPr>
-        <w:t>gitlab</w:t>
-      </w:r>
-      <w:proofErr w:type="spellEnd"/>
-      <w:r>
-        <w:rPr>
-          <w:lang w:val="es-ES"/>
-        </w:rPr>
-        <w:t xml:space="preserve">. </w:t>
+        <w:t xml:space="preserve">dedicar un tiempo a la limpieza del código para mejorar la implementación y que todo quede mejor estructurado, con nombres más sugerentes y profesionales. Además de la realización de una infografía. Es importante mencionar que todos los cambios están siendo registrados en un controlador de versiones, en este caso gitlab. </w:t>
       </w:r>
     </w:p>
     <w:p>
@@ -1259,107 +711,7 @@
         <w:rPr>
           <w:lang w:val="es-ES"/>
         </w:rPr>
-        <w:t xml:space="preserve">Ante la falta de ejemplos de sentadillas realizadas incorrectamente he empezado a grabar a </w:t>
-      </w:r>
-      <w:proofErr w:type="spellStart"/>
-      <w:r>
-        <w:rPr>
-          <w:lang w:val="es-ES"/>
-        </w:rPr>
-        <w:t>mi</w:t>
-      </w:r>
-      <w:proofErr w:type="spellEnd"/>
-      <w:r>
-        <w:rPr>
-          <w:lang w:val="es-ES"/>
-        </w:rPr>
-        <w:t xml:space="preserve"> mismo haciendo ejemplos concretos como sentadillas que no sean profundas, con inclinación excesiva de espalda </w:t>
-      </w:r>
-      <w:proofErr w:type="spellStart"/>
-      <w:r>
-        <w:rPr>
-          <w:lang w:val="es-ES"/>
-        </w:rPr>
-        <w:t>etc</w:t>
-      </w:r>
-      <w:proofErr w:type="spellEnd"/>
-      <w:r>
-        <w:rPr>
-          <w:lang w:val="es-ES"/>
-        </w:rPr>
-        <w:t xml:space="preserve">, además de a otras personas. Una vez armado un </w:t>
-      </w:r>
-      <w:proofErr w:type="spellStart"/>
-      <w:r>
-        <w:rPr>
-          <w:lang w:val="es-ES"/>
-        </w:rPr>
-        <w:t>dataset</w:t>
-      </w:r>
-      <w:proofErr w:type="spellEnd"/>
-      <w:r>
-        <w:rPr>
-          <w:lang w:val="es-ES"/>
-        </w:rPr>
-        <w:t xml:space="preserve"> de </w:t>
-      </w:r>
-      <w:proofErr w:type="spellStart"/>
-      <w:r>
-        <w:rPr>
-          <w:lang w:val="es-ES"/>
-        </w:rPr>
-        <w:t>mas</w:t>
-      </w:r>
-      <w:proofErr w:type="spellEnd"/>
-      <w:r>
-        <w:rPr>
-          <w:lang w:val="es-ES"/>
-        </w:rPr>
-        <w:t xml:space="preserve"> de 100 videos viene la parte difícil, la cual es etiquetar cada vídeo y cada </w:t>
-      </w:r>
-      <w:proofErr w:type="spellStart"/>
-      <w:proofErr w:type="gramStart"/>
-      <w:r>
-        <w:rPr>
-          <w:lang w:val="es-ES"/>
-        </w:rPr>
-        <w:t>frame</w:t>
-      </w:r>
-      <w:proofErr w:type="spellEnd"/>
-      <w:proofErr w:type="gramEnd"/>
-      <w:r>
-        <w:rPr>
-          <w:lang w:val="es-ES"/>
-        </w:rPr>
-        <w:t xml:space="preserve"> para entrenar a la red. Para ello he creado una aplicación de Python para ayudarme en este proceso ya que después de una búsqueda no he conseguido encontrar una herramienta similar. Con esta herramienta nos permite ir etiquetando los momentos en la sentadilla (Stand-bajando-abajo-subiendo-stand), además al acabar una repetición nos permite darle valores a los </w:t>
-      </w:r>
-      <w:proofErr w:type="spellStart"/>
-      <w:r>
-        <w:rPr>
-          <w:lang w:val="es-ES"/>
-        </w:rPr>
-        <w:t>kpis</w:t>
-      </w:r>
-      <w:proofErr w:type="spellEnd"/>
-      <w:r>
-        <w:rPr>
-          <w:lang w:val="es-ES"/>
-        </w:rPr>
-        <w:t xml:space="preserve"> de </w:t>
-      </w:r>
-      <w:proofErr w:type="spellStart"/>
-      <w:r>
-        <w:rPr>
-          <w:lang w:val="es-ES"/>
-        </w:rPr>
-        <w:t>como</w:t>
-      </w:r>
-      <w:proofErr w:type="spellEnd"/>
-      <w:r>
-        <w:rPr>
-          <w:lang w:val="es-ES"/>
-        </w:rPr>
-        <w:t xml:space="preserve"> ha sido nuestra sentadilla. De esta forma he conseguido agilizar el proceso de etiquetado de los videos.</w:t>
+        <w:t>Ante la falta de ejemplos de sentadillas realizadas incorrectamente he empezado a grabar a mi mismo haciendo ejemplos concretos como sentadillas que no sean profundas, con inclinación excesiva de espalda etc, además de a otras personas. Una vez armado un dataset de mas de 100 videos viene la parte difícil, la cual es etiquetar cada vídeo y cada frame para entrenar a la red. Para ello he creado una aplicación de Python para ayudarme en este proceso ya que después de una búsqueda no he conseguido encontrar una herramienta similar. Con esta herramienta nos permite ir etiquetando los momentos en la sentadilla (Stand-bajando-abajo-subiendo-stand), además al acabar una repetición nos permite darle valores a los kpis de como ha sido nuestra sentadilla. De esta forma he conseguido agilizar el proceso de etiquetado de los videos.</w:t>
       </w:r>
     </w:p>
     <w:p>
@@ -1386,21 +738,86 @@
         <w:rPr>
           <w:lang w:val="es-ES"/>
         </w:rPr>
-        <w:t xml:space="preserve">Después del etiquetado de los videos hemos empezado con el entreno de la red neuronal, el primer entreno ha sido con unos 40 vídeos, todos etiquetados y pasados por nuestro archivo de visión para extraer los </w:t>
-      </w:r>
-      <w:proofErr w:type="spellStart"/>
-      <w:r>
-        <w:rPr>
-          <w:lang w:val="es-ES"/>
-        </w:rPr>
-        <w:t>keypoints</w:t>
-      </w:r>
-      <w:proofErr w:type="spellEnd"/>
-      <w:r>
-        <w:rPr>
-          <w:lang w:val="es-ES"/>
-        </w:rPr>
-        <w:t xml:space="preserve">, ángulos y demás. Las pruebas sobre este entrenamiento no han sido las esperadas ya que no he conseguido un resultado decente. </w:t>
+        <w:t>Después del etiquetado de los videos hemos empezado con el entreno de la red neuronal, el primer entreno ha sido con unos 40 vídeos, todos etiquetados y pasados por nuestro archivo de visión para extraer los keypoints, ángulos y demás. Las pruebas sobre este entrenamiento no han sido las esperadas ya que no he conseguido un resultado decente.</w:t>
+      </w:r>
+    </w:p>
+    <w:p>
+      <w:pPr>
+        <w:rPr>
+          <w:lang w:val="es-ES"/>
+        </w:rPr>
+      </w:pPr>
+      <w:r>
+        <w:rPr>
+          <w:lang w:val="es-ES"/>
+        </w:rPr>
+        <w:t xml:space="preserve">Al probar con otro método de entrenamiento más complejo hemos conseguido unos resultados bastante coherentes. </w:t>
+      </w:r>
+    </w:p>
+    <w:p>
+      <w:pPr>
+        <w:rPr>
+          <w:lang w:val="es-ES"/>
+        </w:rPr>
+      </w:pPr>
+      <w:r>
+        <w:rPr>
+          <w:lang w:val="es-ES"/>
+        </w:rPr>
+        <w:t>El siguiente paso antes de seguir etiquetando videos para mejorar el entrenamiento vamos a probar una serie de alternativas, que tengo en mente.</w:t>
+      </w:r>
+    </w:p>
+    <w:p>
+      <w:pPr>
+        <w:rPr>
+          <w:lang w:val="es-ES"/>
+        </w:rPr>
+      </w:pPr>
+      <w:r>
+        <w:rPr>
+          <w:lang w:val="es-ES"/>
+        </w:rPr>
+        <w:t>En primer lugar el centro de sustentación pasaremos a normalizarlo, ya que no estábamos teniendo en cuenta eso.</w:t>
+      </w:r>
+    </w:p>
+    <w:p>
+      <w:pPr>
+        <w:rPr>
+          <w:lang w:val="es-ES"/>
+        </w:rPr>
+      </w:pPr>
+      <w:r>
+        <w:rPr>
+          <w:lang w:val="es-ES"/>
+        </w:rPr>
+        <w:t>En segundo lugar, eliminaremos información que es irrelevante para patrones de sentadillas como los ángulos de codos y hombros.</w:t>
+      </w:r>
+    </w:p>
+    <w:p>
+      <w:pPr>
+        <w:rPr>
+          <w:lang w:val="es-ES"/>
+        </w:rPr>
+      </w:pPr>
+      <w:r>
+        <w:rPr>
+          <w:lang w:val="es-ES"/>
+        </w:rPr>
+        <w:lastRenderedPageBreak/>
+        <w:t>En tercer lugar tenemos que manejar los 0s, ya que cuando no es fiable la información obtenida por mediapipe lo que hacemos es poner la celda correspondiente a NaN, el problema que a la hora de entrenarla esos NaN los convertimos en 0s, lo cual puede dar lugar a que la red se confunda ya que un angulo perfectamente puede ser 0.</w:t>
+      </w:r>
+    </w:p>
+    <w:p>
+      <w:pPr>
+        <w:rPr>
+          <w:lang w:val="es-ES"/>
+        </w:rPr>
+      </w:pPr>
+      <w:r>
+        <w:rPr>
+          <w:lang w:val="es-ES"/>
+        </w:rPr>
+        <w:t>Como última opción si no conseguimos una salida exitosa podemos probar con otro modelo de red neuronal, en este caso como recomendación expresa de uno de los integrantes del departamento de ia de Bisite, usaremos una red de tipo XGBoost.</w:t>
       </w:r>
     </w:p>
     <w:p>
@@ -1473,7 +890,6 @@
           <w:b/>
           <w:bCs/>
         </w:rPr>
-        <w:lastRenderedPageBreak/>
         <w:t>Oliva Rodríguez (TFG - Detección de Objetos):</w:t>
       </w:r>
       <w:r>
@@ -1487,15 +903,7 @@
         <w:t>Redes Neuronales Convolucionales (CNN)</w:t>
       </w:r>
       <w:r>
-        <w:t xml:space="preserve"> sobre </w:t>
-      </w:r>
-      <w:proofErr w:type="spellStart"/>
-      <w:r>
-        <w:t>OpenCV</w:t>
-      </w:r>
-      <w:proofErr w:type="spellEnd"/>
-      <w:r>
-        <w:t xml:space="preserve">, concluyendo que las técnicas de barrido (ventana deslizante) son demasiado lentas para tiempo real, recomendando redes de detección de disparo único (como YOLO o SSD). </w:t>
+        <w:t xml:space="preserve"> sobre OpenCV, concluyendo que las técnicas de barrido (ventana deslizante) son demasiado lentas para tiempo real, recomendando redes de detección de disparo único (como YOLO o SSD). </w:t>
       </w:r>
       <w:hyperlink r:id="rId10" w:history="1">
         <w:r>
@@ -1533,43 +941,10 @@
           <w:b/>
           <w:bCs/>
         </w:rPr>
-        <w:t xml:space="preserve">Transfer </w:t>
-      </w:r>
-      <w:proofErr w:type="spellStart"/>
-      <w:r>
-        <w:rPr>
-          <w:b/>
-          <w:bCs/>
-        </w:rPr>
-        <w:t>Learning</w:t>
-      </w:r>
-      <w:proofErr w:type="spellEnd"/>
-      <w:r>
-        <w:t xml:space="preserve"> sobre una CNN (</w:t>
-      </w:r>
-      <w:proofErr w:type="spellStart"/>
-      <w:r>
-        <w:t>ResNet</w:t>
-      </w:r>
-      <w:proofErr w:type="spellEnd"/>
-      <w:r>
-        <w:t>/</w:t>
-      </w:r>
-      <w:proofErr w:type="spellStart"/>
-      <w:r>
-        <w:t>Inception</w:t>
-      </w:r>
-      <w:proofErr w:type="spellEnd"/>
-      <w:r>
-        <w:t xml:space="preserve">) para identificar ballenas por su cola; demuestra que el "Data </w:t>
-      </w:r>
-      <w:proofErr w:type="spellStart"/>
-      <w:r>
-        <w:t>Augmentation</w:t>
-      </w:r>
-      <w:proofErr w:type="spellEnd"/>
-      <w:r>
-        <w:t>" (rotar/deformar imágenes) es vital cuando tienes pocas imágenes para entrenar.</w:t>
+        <w:t>Transfer Learning</w:t>
+      </w:r>
+      <w:r>
+        <w:t xml:space="preserve"> sobre una CNN (ResNet/Inception) para identificar ballenas por su cola; demuestra que el "Data Augmentation" (rotar/deformar imágenes) es vital cuando tienes pocas imágenes para entrenar.</w:t>
       </w:r>
       <w:r>
         <w:t xml:space="preserve"> </w:t>
@@ -1620,17 +995,8 @@
           <w:b/>
           <w:bCs/>
         </w:rPr>
-        <w:t xml:space="preserve">Momentos de </w:t>
-      </w:r>
-      <w:proofErr w:type="spellStart"/>
-      <w:r>
-        <w:rPr>
-          <w:b/>
-          <w:bCs/>
-        </w:rPr>
-        <w:t>Hu</w:t>
-      </w:r>
-      <w:proofErr w:type="spellEnd"/>
+        <w:t>Momentos de Hu</w:t>
+      </w:r>
       <w:r>
         <w:t xml:space="preserve"> (geometría de la forma) y una </w:t>
       </w:r>
@@ -1670,23 +1036,7 @@
           <w:b/>
           <w:bCs/>
         </w:rPr>
-        <w:t xml:space="preserve">Santa María et al. (Artículo - </w:t>
-      </w:r>
-      <w:proofErr w:type="spellStart"/>
-      <w:r>
-        <w:rPr>
-          <w:b/>
-          <w:bCs/>
-        </w:rPr>
-        <w:t>Admin</w:t>
-      </w:r>
-      <w:proofErr w:type="spellEnd"/>
-      <w:r>
-        <w:rPr>
-          <w:b/>
-          <w:bCs/>
-        </w:rPr>
-        <w:t xml:space="preserve"> a2-15-26):</w:t>
+        <w:t>Santa María et al. (Artículo - Admin a2-15-26):</w:t>
       </w:r>
       <w:r>
         <w:t xml:space="preserve"> Implementa un sistema de </w:t>
@@ -1727,97 +1077,17 @@
           <w:b/>
           <w:bCs/>
         </w:rPr>
-        <w:t xml:space="preserve">Sara Pardo Feijoo (PFC - Bag </w:t>
-      </w:r>
-      <w:proofErr w:type="spellStart"/>
+        <w:t>Sara Pardo Feijoo (PFC - Bag of Words):</w:t>
+      </w:r>
+      <w:r>
+        <w:t xml:space="preserve"> Aplica el modelo </w:t>
+      </w:r>
       <w:r>
         <w:rPr>
           <w:b/>
           <w:bCs/>
         </w:rPr>
-        <w:t>of</w:t>
-      </w:r>
-      <w:proofErr w:type="spellEnd"/>
-      <w:r>
-        <w:rPr>
-          <w:b/>
-          <w:bCs/>
-        </w:rPr>
-        <w:t xml:space="preserve"> </w:t>
-      </w:r>
-      <w:proofErr w:type="spellStart"/>
-      <w:r>
-        <w:rPr>
-          <w:b/>
-          <w:bCs/>
-        </w:rPr>
-        <w:t>Words</w:t>
-      </w:r>
-      <w:proofErr w:type="spellEnd"/>
-      <w:r>
-        <w:rPr>
-          <w:b/>
-          <w:bCs/>
-        </w:rPr>
-        <w:t>):</w:t>
-      </w:r>
-      <w:r>
-        <w:t xml:space="preserve"> Aplica el modelo </w:t>
-      </w:r>
-      <w:r>
-        <w:rPr>
-          <w:b/>
-          <w:bCs/>
-        </w:rPr>
-        <w:t xml:space="preserve">"Bag </w:t>
-      </w:r>
-      <w:proofErr w:type="spellStart"/>
-      <w:r>
-        <w:rPr>
-          <w:b/>
-          <w:bCs/>
-        </w:rPr>
-        <w:t>of</w:t>
-      </w:r>
-      <w:proofErr w:type="spellEnd"/>
-      <w:r>
-        <w:rPr>
-          <w:b/>
-          <w:bCs/>
-        </w:rPr>
-        <w:t xml:space="preserve"> </w:t>
-      </w:r>
-      <w:proofErr w:type="spellStart"/>
-      <w:r>
-        <w:rPr>
-          <w:b/>
-          <w:bCs/>
-        </w:rPr>
-        <w:t>Words</w:t>
-      </w:r>
-      <w:proofErr w:type="spellEnd"/>
-      <w:r>
-        <w:rPr>
-          <w:b/>
-          <w:bCs/>
-        </w:rPr>
-        <w:t>" (</w:t>
-      </w:r>
-      <w:proofErr w:type="spellStart"/>
-      <w:r>
-        <w:rPr>
-          <w:b/>
-          <w:bCs/>
-        </w:rPr>
-        <w:t>BoW</w:t>
-      </w:r>
-      <w:proofErr w:type="spellEnd"/>
-      <w:r>
-        <w:rPr>
-          <w:b/>
-          <w:bCs/>
-        </w:rPr>
-        <w:t>)</w:t>
+        <w:t>"Bag of Words" (BoW)</w:t>
       </w:r>
       <w:r>
         <w:t xml:space="preserve">, que trata la imagen como un "saco" de parches visuales desordenados (sin geometría); útil para buscar objetos en bases de datos, pero inservible para detectar posturas donde la posición de las partes es clave. </w:t>
@@ -1895,25 +1165,7 @@
           <w:szCs w:val="24"/>
           <w:lang w:val="es-ES"/>
         </w:rPr>
-        <w:t xml:space="preserve">De los otros puntos he podido sacar </w:t>
-      </w:r>
-      <w:proofErr w:type="gramStart"/>
-      <w:r>
-        <w:rPr>
-          <w:sz w:val="24"/>
-          <w:szCs w:val="24"/>
-          <w:lang w:val="es-ES"/>
-        </w:rPr>
-        <w:t>la siguientes conclusiones</w:t>
-      </w:r>
-      <w:proofErr w:type="gramEnd"/>
-      <w:r>
-        <w:rPr>
-          <w:sz w:val="24"/>
-          <w:szCs w:val="24"/>
-          <w:lang w:val="es-ES"/>
-        </w:rPr>
-        <w:t>:</w:t>
+        <w:t>De los otros puntos he podido sacar la siguientes conclusiones:</w:t>
       </w:r>
     </w:p>
     <w:p>
@@ -1935,25 +1187,7 @@
           <w:szCs w:val="24"/>
           <w:lang w:val="es-ES"/>
         </w:rPr>
-        <w:t xml:space="preserve">La dificultad de entrenar de cero una red neuronal para conseguir el resultado deseado, es mejor usar una ya entrenada como por ejemplo </w:t>
-      </w:r>
-      <w:proofErr w:type="spellStart"/>
-      <w:r>
-        <w:rPr>
-          <w:sz w:val="24"/>
-          <w:szCs w:val="24"/>
-          <w:lang w:val="es-ES"/>
-        </w:rPr>
-        <w:t>OpenPose</w:t>
-      </w:r>
-      <w:proofErr w:type="spellEnd"/>
-      <w:r>
-        <w:rPr>
-          <w:sz w:val="24"/>
-          <w:szCs w:val="24"/>
-          <w:lang w:val="es-ES"/>
-        </w:rPr>
-        <w:t xml:space="preserve"> o similar.</w:t>
+        <w:t>La dificultad de entrenar de cero una red neuronal para conseguir el resultado deseado, es mejor usar una ya entrenada como por ejemplo OpenPose o similar.</w:t>
       </w:r>
     </w:p>
     <w:p>
@@ -1975,51 +1209,15 @@
           <w:szCs w:val="24"/>
           <w:lang w:val="es-ES"/>
         </w:rPr>
-        <w:t xml:space="preserve">La </w:t>
-      </w:r>
-      <w:proofErr w:type="spellStart"/>
+        <w:t>La retropropagación es útil para entrenar una de cero ya que es fácilmente entendible pero lo más usado hoy en día son redes convolucionales</w:t>
+      </w:r>
       <w:r>
         <w:rPr>
           <w:sz w:val="24"/>
           <w:szCs w:val="24"/>
           <w:lang w:val="es-ES"/>
         </w:rPr>
-        <w:t>retropropagación</w:t>
-      </w:r>
-      <w:proofErr w:type="spellEnd"/>
-      <w:r>
-        <w:rPr>
-          <w:sz w:val="24"/>
-          <w:szCs w:val="24"/>
-          <w:lang w:val="es-ES"/>
-        </w:rPr>
-        <w:t xml:space="preserve"> es útil para entrenar una de cero ya que es fácilmente entendible pero lo más usado hoy en día son redes convolucionales</w:t>
-      </w:r>
-      <w:r>
-        <w:rPr>
-          <w:sz w:val="24"/>
-          <w:szCs w:val="24"/>
-          <w:lang w:val="es-ES"/>
-        </w:rPr>
-        <w:t xml:space="preserve">, es decir, </w:t>
-      </w:r>
-      <w:proofErr w:type="spellStart"/>
-      <w:r>
-        <w:rPr>
-          <w:sz w:val="24"/>
-          <w:szCs w:val="24"/>
-          <w:lang w:val="es-ES"/>
-        </w:rPr>
-        <w:t>deeplearning</w:t>
-      </w:r>
-      <w:proofErr w:type="spellEnd"/>
-      <w:r>
-        <w:rPr>
-          <w:sz w:val="24"/>
-          <w:szCs w:val="24"/>
-          <w:lang w:val="es-ES"/>
-        </w:rPr>
-        <w:t>.</w:t>
+        <w:t>, es decir, deeplearning.</w:t>
       </w:r>
     </w:p>
     <w:p>
@@ -2041,25 +1239,7 @@
           <w:szCs w:val="24"/>
           <w:lang w:val="es-ES"/>
         </w:rPr>
-        <w:t xml:space="preserve">La idea de analizar los datos extraídos de las herramientas como </w:t>
-      </w:r>
-      <w:proofErr w:type="spellStart"/>
-      <w:r>
-        <w:rPr>
-          <w:sz w:val="24"/>
-          <w:szCs w:val="24"/>
-          <w:lang w:val="es-ES"/>
-        </w:rPr>
-        <w:t>openpose</w:t>
-      </w:r>
-      <w:proofErr w:type="spellEnd"/>
-      <w:r>
-        <w:rPr>
-          <w:sz w:val="24"/>
-          <w:szCs w:val="24"/>
-          <w:lang w:val="es-ES"/>
-        </w:rPr>
-        <w:t xml:space="preserve"> a través de un doble enfoque, ya sea a través de ML con las aplicaciones</w:t>
+        <w:t>La idea de analizar los datos extraídos de las herramientas como openpose a través de un doble enfoque, ya sea a través de ML con las aplicaciones</w:t>
       </w:r>
       <w:r>
         <w:t xml:space="preserve"> </w:t>
@@ -2100,25 +1280,7 @@
           <w:szCs w:val="24"/>
           <w:lang w:val="es-ES"/>
         </w:rPr>
-        <w:t xml:space="preserve">La importancia de tratar las imágenes con </w:t>
-      </w:r>
-      <w:proofErr w:type="spellStart"/>
-      <w:r>
-        <w:rPr>
-          <w:sz w:val="24"/>
-          <w:szCs w:val="24"/>
-          <w:lang w:val="es-ES"/>
-        </w:rPr>
-        <w:t>OpenCV</w:t>
-      </w:r>
-      <w:proofErr w:type="spellEnd"/>
-      <w:r>
-        <w:rPr>
-          <w:sz w:val="24"/>
-          <w:szCs w:val="24"/>
-          <w:lang w:val="es-ES"/>
-        </w:rPr>
-        <w:t xml:space="preserve"> antes de pasar a procesarlas.</w:t>
+        <w:t>La importancia de tratar las imágenes con OpenCV antes de pasar a procesarlas.</w:t>
       </w:r>
     </w:p>
     <w:p>
@@ -2140,61 +1302,24 @@
           <w:szCs w:val="24"/>
           <w:lang w:val="es-ES"/>
         </w:rPr>
-        <w:t xml:space="preserve">Si en algún momento necesito usar </w:t>
-      </w:r>
-      <w:proofErr w:type="spellStart"/>
-      <w:r>
+        <w:t>Si en algún momento necesito usar DataSets, Kaggel es una gran fuente de información que puede llegar a ser útil. (Ballenas)</w:t>
+      </w:r>
+    </w:p>
+    <w:p>
+      <w:pPr>
+        <w:ind w:left="360"/>
         <w:rPr>
           <w:sz w:val="24"/>
           <w:szCs w:val="24"/>
           <w:lang w:val="es-ES"/>
         </w:rPr>
-        <w:t>DataSets</w:t>
-      </w:r>
-      <w:proofErr w:type="spellEnd"/>
+      </w:pPr>
       <w:r>
         <w:rPr>
           <w:sz w:val="24"/>
           <w:szCs w:val="24"/>
           <w:lang w:val="es-ES"/>
         </w:rPr>
-        <w:t xml:space="preserve">, </w:t>
-      </w:r>
-      <w:proofErr w:type="spellStart"/>
-      <w:r>
-        <w:rPr>
-          <w:sz w:val="24"/>
-          <w:szCs w:val="24"/>
-          <w:lang w:val="es-ES"/>
-        </w:rPr>
-        <w:t>Kaggel</w:t>
-      </w:r>
-      <w:proofErr w:type="spellEnd"/>
-      <w:r>
-        <w:rPr>
-          <w:sz w:val="24"/>
-          <w:szCs w:val="24"/>
-          <w:lang w:val="es-ES"/>
-        </w:rPr>
-        <w:t xml:space="preserve"> es una gran fuente de información que puede llegar a ser útil. (Ballenas)</w:t>
-      </w:r>
-    </w:p>
-    <w:p>
-      <w:pPr>
-        <w:ind w:left="360"/>
-        <w:rPr>
-          <w:sz w:val="24"/>
-          <w:szCs w:val="24"/>
-          <w:lang w:val="es-ES"/>
-        </w:rPr>
-      </w:pPr>
-      <w:r>
-        <w:rPr>
-          <w:sz w:val="24"/>
-          <w:szCs w:val="24"/>
-          <w:lang w:val="es-ES"/>
-        </w:rPr>
-        <w:lastRenderedPageBreak/>
         <w:t>Conclusiones obtenidas gracias a la IA</w:t>
       </w:r>
       <w:r>
@@ -2233,23 +1358,7 @@
         <w:t>Pedro Pablo</w:t>
       </w:r>
       <w:r>
-        <w:t xml:space="preserve"> (</w:t>
-      </w:r>
-      <w:proofErr w:type="spellStart"/>
-      <w:r>
-        <w:t>Hu</w:t>
-      </w:r>
-      <w:proofErr w:type="spellEnd"/>
-      <w:r>
-        <w:t xml:space="preserve"> </w:t>
-      </w:r>
-      <w:proofErr w:type="spellStart"/>
-      <w:r>
-        <w:t>Moments</w:t>
-      </w:r>
-      <w:proofErr w:type="spellEnd"/>
-      <w:r>
-        <w:t xml:space="preserve">), </w:t>
+        <w:t xml:space="preserve"> (Hu Moments), </w:t>
       </w:r>
       <w:r>
         <w:rPr>
@@ -2269,23 +1378,7 @@
         <w:t>Sara Pardo</w:t>
       </w:r>
       <w:r>
-        <w:t xml:space="preserve"> (Bag </w:t>
-      </w:r>
-      <w:proofErr w:type="spellStart"/>
-      <w:r>
-        <w:t>of</w:t>
-      </w:r>
-      <w:proofErr w:type="spellEnd"/>
-      <w:r>
-        <w:t xml:space="preserve"> </w:t>
-      </w:r>
-      <w:proofErr w:type="spellStart"/>
-      <w:r>
-        <w:t>Words</w:t>
-      </w:r>
-      <w:proofErr w:type="spellEnd"/>
-      <w:r>
-        <w:t xml:space="preserve">) demuestran enfoques donde el programador debe definir </w:t>
+        <w:t xml:space="preserve"> (Bag of Words) demuestran enfoques donde el programador debe definir </w:t>
       </w:r>
       <w:r>
         <w:rPr>
@@ -2322,39 +1415,7 @@
           <w:b/>
           <w:bCs/>
         </w:rPr>
-        <w:t xml:space="preserve">Confirma el uso de Deep </w:t>
-      </w:r>
-      <w:proofErr w:type="spellStart"/>
-      <w:r>
-        <w:rPr>
-          <w:b/>
-          <w:bCs/>
-        </w:rPr>
-        <w:t>Learning</w:t>
-      </w:r>
-      <w:proofErr w:type="spellEnd"/>
-      <w:r>
-        <w:rPr>
-          <w:b/>
-          <w:bCs/>
-        </w:rPr>
-        <w:t xml:space="preserve"> (</w:t>
-      </w:r>
-      <w:proofErr w:type="spellStart"/>
-      <w:r>
-        <w:rPr>
-          <w:b/>
-          <w:bCs/>
-        </w:rPr>
-        <w:t>CNNs</w:t>
-      </w:r>
-      <w:proofErr w:type="spellEnd"/>
-      <w:r>
-        <w:rPr>
-          <w:b/>
-          <w:bCs/>
-        </w:rPr>
-        <w:t>):</w:t>
+        <w:t>Confirma el uso de Deep Learning (CNNs):</w:t>
       </w:r>
       <w:r>
         <w:t xml:space="preserve"> Los trabajos de </w:t>
@@ -2404,29 +1465,11 @@
           <w:b/>
           <w:bCs/>
         </w:rPr>
-        <w:t xml:space="preserve">Pose </w:t>
-      </w:r>
-      <w:proofErr w:type="spellStart"/>
-      <w:r>
-        <w:rPr>
-          <w:b/>
-          <w:bCs/>
-        </w:rPr>
-        <w:t>Estimation</w:t>
-      </w:r>
-      <w:proofErr w:type="spellEnd"/>
-      <w:r>
-        <w:t xml:space="preserve"> (como la mencionada </w:t>
-      </w:r>
-      <w:proofErr w:type="spellStart"/>
-      <w:r>
-        <w:t>MoveNet</w:t>
-      </w:r>
-      <w:proofErr w:type="spellEnd"/>
-      <w:r>
-        <w:t xml:space="preserve"> en tu borrador), que detecta </w:t>
-      </w:r>
-      <w:proofErr w:type="spellStart"/>
+        <w:t>Pose Estimation</w:t>
+      </w:r>
+      <w:r>
+        <w:t xml:space="preserve"> (como la mencionada MoveNet en tu borrador), que detecta </w:t>
+      </w:r>
       <w:r>
         <w:rPr>
           <w:i/>
@@ -2434,7 +1477,6 @@
         </w:rPr>
         <w:t>keypoints</w:t>
       </w:r>
-      <w:proofErr w:type="spellEnd"/>
       <w:r>
         <w:t xml:space="preserve"> (codos, rodillas) directamente, saltándose la fase de "aprender qué es un brazo" desde cero.</w:t>
       </w:r>
@@ -2453,23 +1495,7 @@
           <w:b/>
           <w:bCs/>
         </w:rPr>
-        <w:t xml:space="preserve">El </w:t>
-      </w:r>
-      <w:proofErr w:type="spellStart"/>
-      <w:r>
-        <w:rPr>
-          <w:b/>
-          <w:bCs/>
-        </w:rPr>
-        <w:t>Dataset</w:t>
-      </w:r>
-      <w:proofErr w:type="spellEnd"/>
-      <w:r>
-        <w:rPr>
-          <w:b/>
-          <w:bCs/>
-        </w:rPr>
-        <w:t xml:space="preserve"> es tu mayor cuello de botella:</w:t>
+        <w:t>El Dataset es tu mayor cuello de botella:</w:t>
       </w:r>
       <w:r>
         <w:t xml:space="preserve"> Todos los autores sufren con la falta de datos.</w:t>
@@ -2509,44 +1535,18 @@
           <w:b/>
           <w:bCs/>
         </w:rPr>
-        <w:t xml:space="preserve">Transfer </w:t>
-      </w:r>
-      <w:proofErr w:type="spellStart"/>
-      <w:r>
-        <w:rPr>
-          <w:b/>
-          <w:bCs/>
-        </w:rPr>
-        <w:t>Learning</w:t>
-      </w:r>
-      <w:proofErr w:type="spellEnd"/>
-      <w:r>
-        <w:t xml:space="preserve">. No entrenes tu red con vídeos tuyos desde cero. Coge un modelo </w:t>
-      </w:r>
-      <w:proofErr w:type="spellStart"/>
-      <w:r>
-        <w:t>pre-entrenado</w:t>
-      </w:r>
-      <w:proofErr w:type="spellEnd"/>
-      <w:r>
-        <w:t xml:space="preserve"> (en COCO o MPII Human Pose) y úsalo directamente o haz un </w:t>
+        <w:t>Transfer Learning</w:t>
+      </w:r>
+      <w:r>
+        <w:t xml:space="preserve">. No entrenes tu red con vídeos tuyos desde cero. Coge un modelo pre-entrenado (en COCO o MPII Human Pose) y úsalo directamente o haz un </w:t>
       </w:r>
       <w:r>
         <w:rPr>
           <w:i/>
           <w:iCs/>
         </w:rPr>
-        <w:t>fine-</w:t>
-      </w:r>
-      <w:proofErr w:type="spellStart"/>
-      <w:r>
-        <w:rPr>
-          <w:i/>
-          <w:iCs/>
-        </w:rPr>
-        <w:t>tuning</w:t>
-      </w:r>
-      <w:proofErr w:type="spellEnd"/>
+        <w:t>fine-tuning</w:t>
+      </w:r>
       <w:r>
         <w:t xml:space="preserve"> ligero. Esto es lo que diferencia un TFG académico viable de uno imposible.</w:t>
       </w:r>
@@ -2578,41 +1578,11 @@
         <w:t>Oliva</w:t>
       </w:r>
       <w:r>
-        <w:t xml:space="preserve"> demostró que técnicas precisas (ventanas deslizantes) hacen el sistema inútil en tiempo real (segundos por </w:t>
-      </w:r>
-      <w:proofErr w:type="spellStart"/>
-      <w:proofErr w:type="gramStart"/>
-      <w:r>
-        <w:t>frame</w:t>
-      </w:r>
-      <w:proofErr w:type="spellEnd"/>
-      <w:proofErr w:type="gramEnd"/>
-      <w:r>
-        <w:t xml:space="preserve">). Para tu </w:t>
-      </w:r>
-      <w:proofErr w:type="gramStart"/>
-      <w:r>
-        <w:t>app</w:t>
-      </w:r>
-      <w:proofErr w:type="gramEnd"/>
-      <w:r>
-        <w:t xml:space="preserve"> móvil, la conclusión es clara: sacrifica resolución de entrada (baja a 256x256 o similar) y procesa 1 de cada 5 </w:t>
-      </w:r>
-      <w:proofErr w:type="spellStart"/>
-      <w:r>
-        <w:t>frames</w:t>
-      </w:r>
-      <w:proofErr w:type="spellEnd"/>
-      <w:r>
-        <w:t xml:space="preserve">. La fluidez de la app (UX) es más importante que saber si el ángulo de la rodilla es </w:t>
-      </w:r>
-      <w:proofErr w:type="gramStart"/>
-      <w:r>
-        <w:t>45.1º</w:t>
-      </w:r>
-      <w:proofErr w:type="gramEnd"/>
-      <w:r>
-        <w:t xml:space="preserve"> o 45.2º.</w:t>
+        <w:t xml:space="preserve"> demostró que técnicas precisas (ventanas deslizantes) hacen el sistema inútil en tiempo real (segundos por frame). Para tu app móvil, la conclusión es clara: sacrifica </w:t>
+      </w:r>
+      <w:r>
+        <w:lastRenderedPageBreak/>
+        <w:t>resolución de entrada (baja a 256x256 o similar) y procesa 1 de cada 5 frames. La fluidez de la app (UX) es más importante que saber si el ángulo de la rodilla es 45.1º o 45.2º.</w:t>
       </w:r>
     </w:p>
     <w:p>
@@ -2623,19 +1593,11 @@
           <w:rFonts w:ascii="Arial" w:hAnsi="Arial" w:cs="Arial"/>
         </w:rPr>
       </w:pPr>
-      <w:proofErr w:type="spellStart"/>
       <w:r>
         <w:rPr>
           <w:rFonts w:ascii="Arial" w:hAnsi="Arial" w:cs="Arial"/>
         </w:rPr>
-        <w:t>Planning</w:t>
-      </w:r>
-      <w:proofErr w:type="spellEnd"/>
-      <w:r>
-        <w:rPr>
-          <w:rFonts w:ascii="Arial" w:hAnsi="Arial" w:cs="Arial"/>
-        </w:rPr>
-        <w:t xml:space="preserve"> y distintas herramientas</w:t>
+        <w:t>Planning y distintas herramientas</w:t>
       </w:r>
     </w:p>
     <w:p>
@@ -2659,35 +1621,7 @@
         <w:rPr>
           <w:rFonts w:ascii="Arial" w:hAnsi="Arial" w:cs="Arial"/>
         </w:rPr>
-        <w:t>1. Pipeline de Visión Artificial (</w:t>
-      </w:r>
-      <w:proofErr w:type="spellStart"/>
-      <w:r>
-        <w:rPr>
-          <w:rFonts w:ascii="Arial" w:hAnsi="Arial" w:cs="Arial"/>
-        </w:rPr>
-        <w:t>Computer</w:t>
-      </w:r>
-      <w:proofErr w:type="spellEnd"/>
-      <w:r>
-        <w:rPr>
-          <w:rFonts w:ascii="Arial" w:hAnsi="Arial" w:cs="Arial"/>
-        </w:rPr>
-        <w:t xml:space="preserve"> </w:t>
-      </w:r>
-      <w:proofErr w:type="spellStart"/>
-      <w:r>
-        <w:rPr>
-          <w:rFonts w:ascii="Arial" w:hAnsi="Arial" w:cs="Arial"/>
-        </w:rPr>
-        <w:t>Vision</w:t>
-      </w:r>
-      <w:proofErr w:type="spellEnd"/>
-      <w:r>
-        <w:rPr>
-          <w:rFonts w:ascii="Arial" w:hAnsi="Arial" w:cs="Arial"/>
-        </w:rPr>
-        <w:t>)</w:t>
+        <w:t>1. Pipeline de Visión Artificial (Computer Vision)</w:t>
       </w:r>
     </w:p>
     <w:p>
@@ -2732,7 +1666,6 @@
         </w:rPr>
         <w:t xml:space="preserve"> </w:t>
       </w:r>
-      <w:proofErr w:type="spellStart"/>
       <w:r>
         <w:rPr>
           <w:rFonts w:cs="Arial"/>
@@ -2741,26 +1674,11 @@
         </w:rPr>
         <w:t>OpenCV</w:t>
       </w:r>
-      <w:proofErr w:type="spellEnd"/>
-      <w:r>
-        <w:rPr>
-          <w:rFonts w:cs="Arial"/>
-        </w:rPr>
-        <w:t xml:space="preserve">. Se utilizará de forma casi exclusiva para la lectura de los </w:t>
-      </w:r>
-      <w:proofErr w:type="spellStart"/>
-      <w:r>
-        <w:rPr>
-          <w:rFonts w:cs="Arial"/>
-        </w:rPr>
-        <w:t>frames</w:t>
-      </w:r>
-      <w:proofErr w:type="spellEnd"/>
-      <w:r>
-        <w:rPr>
-          <w:rFonts w:cs="Arial"/>
-        </w:rPr>
-        <w:t xml:space="preserve"> de la cámara, redimensionado, cambios de espacio de color, y el dibujado (renderizado) posterior del esqueleto y las métricas sobre el video en la interfaz de usuario.</w:t>
+      <w:r>
+        <w:rPr>
+          <w:rFonts w:cs="Arial"/>
+        </w:rPr>
+        <w:t>. Se utilizará de forma casi exclusiva para la lectura de los frames de la cámara, redimensionado, cambios de espacio de color, y el dibujado (renderizado) posterior del esqueleto y las métricas sobre el video en la interfaz de usuario.</w:t>
       </w:r>
     </w:p>
     <w:p>
@@ -2782,115 +1700,41 @@
           <w:b/>
           <w:bCs/>
         </w:rPr>
-        <w:t xml:space="preserve">Estimación de Postura (Pose </w:t>
-      </w:r>
-      <w:proofErr w:type="spellStart"/>
+        <w:t>Estimación de Postura (Pose Estimation):</w:t>
+      </w:r>
+      <w:r>
+        <w:rPr>
+          <w:rFonts w:cs="Arial"/>
+        </w:rPr>
+        <w:t xml:space="preserve"> * </w:t>
+      </w:r>
       <w:r>
         <w:rPr>
           <w:rFonts w:cs="Arial"/>
           <w:b/>
           <w:bCs/>
         </w:rPr>
-        <w:t>Estimation</w:t>
-      </w:r>
-      <w:proofErr w:type="spellEnd"/>
+        <w:t>Opción Principal (Recomendada):</w:t>
+      </w:r>
+      <w:r>
+        <w:rPr>
+          <w:rFonts w:cs="Arial"/>
+        </w:rPr>
+        <w:t xml:space="preserve"> </w:t>
+      </w:r>
       <w:r>
         <w:rPr>
           <w:rFonts w:cs="Arial"/>
           <w:b/>
           <w:bCs/>
         </w:rPr>
-        <w:t>):</w:t>
-      </w:r>
-      <w:r>
-        <w:rPr>
-          <w:rFonts w:cs="Arial"/>
-        </w:rPr>
-        <w:t xml:space="preserve"> * </w:t>
-      </w:r>
-      <w:r>
-        <w:rPr>
-          <w:rFonts w:cs="Arial"/>
-          <w:b/>
-          <w:bCs/>
-        </w:rPr>
-        <w:t>Opción Principal (Recomendada):</w:t>
-      </w:r>
-      <w:r>
-        <w:rPr>
-          <w:rFonts w:cs="Arial"/>
-        </w:rPr>
-        <w:t xml:space="preserve"> </w:t>
-      </w:r>
-      <w:proofErr w:type="spellStart"/>
-      <w:r>
-        <w:rPr>
-          <w:rFonts w:cs="Arial"/>
-          <w:b/>
-          <w:bCs/>
-        </w:rPr>
-        <w:t>BlazePose</w:t>
-      </w:r>
-      <w:proofErr w:type="spellEnd"/>
-      <w:r>
-        <w:rPr>
-          <w:rFonts w:cs="Arial"/>
-          <w:b/>
-          <w:bCs/>
-        </w:rPr>
-        <w:t xml:space="preserve"> (</w:t>
-      </w:r>
-      <w:proofErr w:type="spellStart"/>
-      <w:r>
-        <w:rPr>
-          <w:rFonts w:cs="Arial"/>
-          <w:b/>
-          <w:bCs/>
-        </w:rPr>
-        <w:t>MediaPipe</w:t>
-      </w:r>
-      <w:proofErr w:type="spellEnd"/>
-      <w:r>
-        <w:rPr>
-          <w:rFonts w:cs="Arial"/>
-          <w:b/>
-          <w:bCs/>
-        </w:rPr>
-        <w:t>)</w:t>
-      </w:r>
-      <w:r>
-        <w:rPr>
-          <w:rFonts w:cs="Arial"/>
-        </w:rPr>
-        <w:t xml:space="preserve">. Se </w:t>
-      </w:r>
-      <w:proofErr w:type="gramStart"/>
-      <w:r>
-        <w:rPr>
-          <w:rFonts w:cs="Arial"/>
-        </w:rPr>
-        <w:t>elige como</w:t>
-      </w:r>
-      <w:proofErr w:type="gramEnd"/>
-      <w:r>
-        <w:rPr>
-          <w:rFonts w:cs="Arial"/>
-        </w:rPr>
-        <w:t xml:space="preserve"> la tecnología </w:t>
-      </w:r>
-      <w:proofErr w:type="spellStart"/>
-      <w:r>
-        <w:rPr>
-          <w:rFonts w:cs="Arial"/>
-        </w:rPr>
-        <w:t>core</w:t>
-      </w:r>
-      <w:proofErr w:type="spellEnd"/>
-      <w:r>
-        <w:rPr>
-          <w:rFonts w:cs="Arial"/>
-        </w:rPr>
-        <w:t xml:space="preserve"> por su capacidad de generar coordenadas en </w:t>
+        <w:t>BlazePose (MediaPipe)</w:t>
+      </w:r>
+      <w:r>
+        <w:rPr>
+          <w:rFonts w:cs="Arial"/>
+        </w:rPr>
+        <w:t xml:space="preserve">. Se elige como la tecnología core por su capacidad de generar coordenadas en </w:t>
       </w:r>
       <w:r>
         <w:rPr>
@@ -2942,136 +1786,19 @@
           <w:rFonts w:cs="Arial"/>
         </w:rPr>
       </w:pPr>
-      <w:proofErr w:type="spellStart"/>
       <w:r>
         <w:rPr>
           <w:rFonts w:cs="Arial"/>
           <w:i/>
           <w:iCs/>
         </w:rPr>
-        <w:lastRenderedPageBreak/>
-        <w:t>OpenPose</w:t>
-      </w:r>
-      <w:proofErr w:type="spellEnd"/>
-      <w:r>
-        <w:rPr>
-          <w:rFonts w:cs="Arial"/>
-          <w:i/>
-          <w:iCs/>
-        </w:rPr>
-        <w:t xml:space="preserve"> / </w:t>
-      </w:r>
-      <w:proofErr w:type="spellStart"/>
-      <w:r>
-        <w:rPr>
-          <w:rFonts w:cs="Arial"/>
-          <w:i/>
-          <w:iCs/>
-        </w:rPr>
-        <w:t>MoveNet</w:t>
-      </w:r>
-      <w:proofErr w:type="spellEnd"/>
-      <w:r>
-        <w:rPr>
-          <w:rFonts w:cs="Arial"/>
-          <w:i/>
-          <w:iCs/>
-        </w:rPr>
-        <w:t xml:space="preserve"> / </w:t>
-      </w:r>
-      <w:proofErr w:type="spellStart"/>
-      <w:r>
-        <w:rPr>
-          <w:rFonts w:cs="Arial"/>
-          <w:i/>
-          <w:iCs/>
-        </w:rPr>
-        <w:t>AlphaPose</w:t>
-      </w:r>
-      <w:proofErr w:type="spellEnd"/>
-      <w:r>
-        <w:rPr>
-          <w:rFonts w:cs="Arial"/>
-          <w:i/>
-          <w:iCs/>
-        </w:rPr>
-        <w:t>:</w:t>
-      </w:r>
-      <w:r>
-        <w:rPr>
-          <w:rFonts w:cs="Arial"/>
-        </w:rPr>
-        <w:t xml:space="preserve"> Descartados para el </w:t>
-      </w:r>
-      <w:proofErr w:type="spellStart"/>
-      <w:r>
-        <w:rPr>
-          <w:rFonts w:cs="Arial"/>
-        </w:rPr>
-        <w:t>core</w:t>
-      </w:r>
-      <w:proofErr w:type="spellEnd"/>
-      <w:r>
-        <w:rPr>
-          <w:rFonts w:cs="Arial"/>
-        </w:rPr>
-        <w:t xml:space="preserve"> móvil por ser pesados (</w:t>
-      </w:r>
-      <w:proofErr w:type="spellStart"/>
-      <w:r>
-        <w:rPr>
-          <w:rFonts w:cs="Arial"/>
-        </w:rPr>
-        <w:t>AlphaPose</w:t>
-      </w:r>
-      <w:proofErr w:type="spellEnd"/>
-      <w:r>
-        <w:rPr>
-          <w:rFonts w:cs="Arial"/>
-        </w:rPr>
-        <w:t>/</w:t>
-      </w:r>
-      <w:proofErr w:type="spellStart"/>
-      <w:r>
-        <w:rPr>
-          <w:rFonts w:cs="Arial"/>
-        </w:rPr>
-        <w:t>OpenPose</w:t>
-      </w:r>
-      <w:proofErr w:type="spellEnd"/>
-      <w:r>
-        <w:rPr>
-          <w:rFonts w:cs="Arial"/>
-        </w:rPr>
-        <w:t>) o limitar la salida a 2D (</w:t>
-      </w:r>
-      <w:proofErr w:type="spellStart"/>
-      <w:r>
-        <w:rPr>
-          <w:rFonts w:cs="Arial"/>
-        </w:rPr>
-        <w:t>MoveNet</w:t>
-      </w:r>
-      <w:proofErr w:type="spellEnd"/>
-      <w:r>
-        <w:rPr>
-          <w:rFonts w:cs="Arial"/>
-        </w:rPr>
-        <w:t>/</w:t>
-      </w:r>
-      <w:proofErr w:type="spellStart"/>
-      <w:r>
-        <w:rPr>
-          <w:rFonts w:cs="Arial"/>
-        </w:rPr>
-        <w:t>OpenPose</w:t>
-      </w:r>
-      <w:proofErr w:type="spellEnd"/>
-      <w:r>
-        <w:rPr>
-          <w:rFonts w:cs="Arial"/>
-        </w:rPr>
-        <w:t>).</w:t>
+        <w:t>OpenPose / MoveNet / AlphaPose:</w:t>
+      </w:r>
+      <w:r>
+        <w:rPr>
+          <w:rFonts w:cs="Arial"/>
+        </w:rPr>
+        <w:t xml:space="preserve"> Descartados para el core móvil por ser pesados (AlphaPose/OpenPose) o limitar la salida a 2D (MoveNet/OpenPose).</w:t>
       </w:r>
     </w:p>
     <w:p>
@@ -3115,41 +1842,13 @@
           <w:rFonts w:cs="Arial"/>
         </w:rPr>
       </w:pPr>
-      <w:proofErr w:type="spellStart"/>
       <w:r>
         <w:rPr>
           <w:rFonts w:cs="Arial"/>
           <w:i/>
           <w:iCs/>
         </w:rPr>
-        <w:t>RTMPose</w:t>
-      </w:r>
-      <w:proofErr w:type="spellEnd"/>
-      <w:r>
-        <w:rPr>
-          <w:rFonts w:cs="Arial"/>
-          <w:i/>
-          <w:iCs/>
-        </w:rPr>
-        <w:t xml:space="preserve"> / </w:t>
-      </w:r>
-      <w:proofErr w:type="spellStart"/>
-      <w:r>
-        <w:rPr>
-          <w:rFonts w:cs="Arial"/>
-          <w:i/>
-          <w:iCs/>
-        </w:rPr>
-        <w:t>ViTPose</w:t>
-      </w:r>
-      <w:proofErr w:type="spellEnd"/>
-      <w:r>
-        <w:rPr>
-          <w:rFonts w:cs="Arial"/>
-          <w:i/>
-          <w:iCs/>
-        </w:rPr>
-        <w:t>:</w:t>
+        <w:t>RTMPose / ViTPose:</w:t>
       </w:r>
       <w:r>
         <w:rPr>
@@ -3185,35 +1884,7 @@
         <w:rPr>
           <w:rFonts w:cs="Arial"/>
         </w:rPr>
-        <w:t>Una vez obtenidos los puntos clave (</w:t>
-      </w:r>
-      <w:proofErr w:type="spellStart"/>
-      <w:r>
-        <w:rPr>
-          <w:rFonts w:cs="Arial"/>
-        </w:rPr>
-        <w:t>landmarks</w:t>
-      </w:r>
-      <w:proofErr w:type="spellEnd"/>
-      <w:r>
-        <w:rPr>
-          <w:rFonts w:cs="Arial"/>
-        </w:rPr>
-        <w:t xml:space="preserve">) de </w:t>
-      </w:r>
-      <w:proofErr w:type="spellStart"/>
-      <w:r>
-        <w:rPr>
-          <w:rFonts w:cs="Arial"/>
-        </w:rPr>
-        <w:t>BlazePose</w:t>
-      </w:r>
-      <w:proofErr w:type="spellEnd"/>
-      <w:r>
-        <w:rPr>
-          <w:rFonts w:cs="Arial"/>
-        </w:rPr>
-        <w:t>, el sistema transforma estos datos en información física y geométrica con significado clínico/deportivo.</w:t>
+        <w:t>Una vez obtenidos los puntos clave (landmarks) de BlazePose, el sistema transforma estos datos en información física y geométrica con significado clínico/deportivo.</w:t>
       </w:r>
     </w:p>
     <w:p>
@@ -3283,21 +1954,7 @@
         <w:rPr>
           <w:rFonts w:cs="Arial"/>
         </w:rPr>
-        <w:t xml:space="preserve"> Derivadas de los cambios de posición y ángulos entre </w:t>
-      </w:r>
-      <w:proofErr w:type="spellStart"/>
-      <w:r>
-        <w:rPr>
-          <w:rFonts w:cs="Arial"/>
-        </w:rPr>
-        <w:t>frames</w:t>
-      </w:r>
-      <w:proofErr w:type="spellEnd"/>
-      <w:r>
-        <w:rPr>
-          <w:rFonts w:cs="Arial"/>
-        </w:rPr>
-        <w:t xml:space="preserve"> consecutivos para evaluar la explosividad y el control del movimiento.</w:t>
+        <w:t xml:space="preserve"> Derivadas de los cambios de posición y ángulos entre frames consecutivos para evaluar la explosividad y el control del movimiento.</w:t>
       </w:r>
     </w:p>
     <w:p>
@@ -3312,21 +1969,7 @@
         <w:rPr>
           <w:rFonts w:ascii="Arial" w:hAnsi="Arial" w:cs="Arial"/>
         </w:rPr>
-        <w:t xml:space="preserve">3. Clasificación y Modelado Predictivo (Machine </w:t>
-      </w:r>
-      <w:proofErr w:type="spellStart"/>
-      <w:r>
-        <w:rPr>
-          <w:rFonts w:ascii="Arial" w:hAnsi="Arial" w:cs="Arial"/>
-        </w:rPr>
-        <w:t>Learning</w:t>
-      </w:r>
-      <w:proofErr w:type="spellEnd"/>
-      <w:r>
-        <w:rPr>
-          <w:rFonts w:ascii="Arial" w:hAnsi="Arial" w:cs="Arial"/>
-        </w:rPr>
-        <w:t>)</w:t>
+        <w:t>3. Clasificación y Modelado Predictivo (Machine Learning)</w:t>
       </w:r>
     </w:p>
     <w:p>
@@ -3352,15 +1995,7 @@
         </w:rPr>
       </w:pPr>
       <w:r>
-        <w:t xml:space="preserve">Modelos de Machine </w:t>
-      </w:r>
-      <w:proofErr w:type="spellStart"/>
-      <w:r>
-        <w:t>Learning</w:t>
-      </w:r>
-      <w:proofErr w:type="spellEnd"/>
-      <w:r>
-        <w:t xml:space="preserve"> Evaluados</w:t>
+        <w:t>Modelos de Machine Learning Evaluados</w:t>
       </w:r>
     </w:p>
     <w:p>
@@ -3380,7 +2015,11 @@
         <w:t>GRU y 1D CNN:</w:t>
       </w:r>
       <w:r>
-        <w:t xml:space="preserve"> Con una complejidad baja y requerimientos de datos bajos/medios, son las opciones perfectas para ejecutar directamente en el dispositivo m</w:t>
+        <w:t xml:space="preserve"> Con una complejidad baja y requerimientos de datos bajos/medios, son las opciones perfectas para ejecutar directamente en el </w:t>
+      </w:r>
+      <w:r>
+        <w:lastRenderedPageBreak/>
+        <w:t>dispositivo m</w:t>
       </w:r>
       <w:r>
         <w:rPr>
@@ -3421,42 +2060,15 @@
         </w:numPr>
         <w:jc w:val="left"/>
       </w:pPr>
-      <w:proofErr w:type="spellStart"/>
       <w:r>
         <w:rPr>
           <w:b/>
           <w:bCs/>
         </w:rPr>
-        <w:t>BiLSTM</w:t>
-      </w:r>
-      <w:proofErr w:type="spellEnd"/>
-      <w:r>
-        <w:rPr>
-          <w:b/>
-          <w:bCs/>
-        </w:rPr>
-        <w:t>:</w:t>
-      </w:r>
-      <w:r>
-        <w:t xml:space="preserve"> Con complejidad media-alta y requisitos de datos medios, es el modelo ideal para ser ejecutado en el servidor. Destaca en el procesamiento a posteriori (</w:t>
-      </w:r>
-      <w:proofErr w:type="spellStart"/>
-      <w:r>
-        <w:t>post-entrenamiento</w:t>
-      </w:r>
-      <w:proofErr w:type="spellEnd"/>
-      <w:r>
-        <w:t xml:space="preserve">), ya que analiza tanto el contexto pasado como el futuro de cada </w:t>
-      </w:r>
-      <w:proofErr w:type="spellStart"/>
-      <w:proofErr w:type="gramStart"/>
-      <w:r>
-        <w:t>frame</w:t>
-      </w:r>
-      <w:proofErr w:type="spellEnd"/>
-      <w:proofErr w:type="gramEnd"/>
-      <w:r>
-        <w:t xml:space="preserve"> de vídeo.</w:t>
+        <w:t>BiLSTM:</w:t>
+      </w:r>
+      <w:r>
+        <w:t xml:space="preserve"> Con complejidad media-alta y requisitos de datos medios, es el modelo ideal para ser ejecutado en el servidor. Destaca en el procesamiento a posteriori (post-entrenamiento), ya que analiza tanto el contexto pasado como el futuro de cada frame de vídeo.</w:t>
       </w:r>
     </w:p>
     <w:p>
@@ -3468,21 +2080,12 @@
         </w:numPr>
         <w:jc w:val="left"/>
       </w:pPr>
-      <w:proofErr w:type="spellStart"/>
       <w:r>
         <w:rPr>
           <w:b/>
           <w:bCs/>
         </w:rPr>
-        <w:t>Transformer</w:t>
-      </w:r>
-      <w:proofErr w:type="spellEnd"/>
-      <w:r>
-        <w:rPr>
-          <w:b/>
-          <w:bCs/>
-        </w:rPr>
-        <w:t>:</w:t>
+        <w:t>Transformer:</w:t>
       </w:r>
       <w:r>
         <w:t xml:space="preserve"> Ofrece una altísima capacidad de modelado, pero con requerimientos muy altos tanto de datos como de complejidad. Resulta demasiado pesado y complejo para la primera versi</w:t>
@@ -3523,15 +2126,7 @@
         <w:t>ST-GCN:</w:t>
       </w:r>
       <w:r>
-        <w:t xml:space="preserve"> Este modelo analiza grafos </w:t>
-      </w:r>
-      <w:proofErr w:type="gramStart"/>
-      <w:r>
-        <w:t>espacio-temporales</w:t>
-      </w:r>
-      <w:proofErr w:type="gramEnd"/>
-      <w:r>
-        <w:t>. Al tener la máxima complejidad y altos requisitos de datos, resulta completamente excesivo para un Producto M</w:t>
+        <w:t xml:space="preserve"> Este modelo analiza grafos espacio-temporales. Al tener la máxima complejidad y altos requisitos de datos, resulta completamente excesivo para un Producto M</w:t>
       </w:r>
       <w:r>
         <w:rPr>
@@ -3591,23 +2186,8 @@
         <w:rPr>
           <w:rFonts w:cs="Arial"/>
         </w:rPr>
-        <w:t xml:space="preserve"> por su ligereza. Si la aplicación requiere un informe detallado </w:t>
-      </w:r>
-      <w:proofErr w:type="spellStart"/>
-      <w:r>
-        <w:rPr>
-          <w:rFonts w:cs="Arial"/>
-        </w:rPr>
-        <w:t>post-entrenamiento</w:t>
-      </w:r>
-      <w:proofErr w:type="spellEnd"/>
-      <w:r>
-        <w:rPr>
-          <w:rFonts w:cs="Arial"/>
-        </w:rPr>
-        <w:t xml:space="preserve">, enviar los datos al servidor para pasarlos por una </w:t>
-      </w:r>
-      <w:proofErr w:type="spellStart"/>
+        <w:t xml:space="preserve"> por su ligereza. Si la aplicación requiere un informe detallado post-entrenamiento, enviar los datos al servidor para pasarlos por una </w:t>
+      </w:r>
       <w:r>
         <w:rPr>
           <w:rFonts w:cs="Arial"/>
@@ -3616,7 +2196,6 @@
         </w:rPr>
         <w:t>BiLSTM</w:t>
       </w:r>
-      <w:proofErr w:type="spellEnd"/>
       <w:r>
         <w:rPr>
           <w:rFonts w:cs="Arial"/>
@@ -3636,22 +2215,7 @@
         <w:rPr>
           <w:rFonts w:ascii="Arial" w:hAnsi="Arial" w:cs="Arial"/>
         </w:rPr>
-        <w:lastRenderedPageBreak/>
-        <w:t>4. Sistema de Inferencia y Retroalimentación (</w:t>
-      </w:r>
-      <w:proofErr w:type="spellStart"/>
-      <w:r>
-        <w:rPr>
-          <w:rFonts w:ascii="Arial" w:hAnsi="Arial" w:cs="Arial"/>
-        </w:rPr>
-        <w:t>Feedback</w:t>
-      </w:r>
-      <w:proofErr w:type="spellEnd"/>
-      <w:r>
-        <w:rPr>
-          <w:rFonts w:ascii="Arial" w:hAnsi="Arial" w:cs="Arial"/>
-        </w:rPr>
-        <w:t>)</w:t>
+        <w:t>4. Sistema de Inferencia y Retroalimentación (Feedback)</w:t>
       </w:r>
     </w:p>
     <w:p>
@@ -3694,21 +2258,7 @@
         <w:rPr>
           <w:rFonts w:cs="Arial"/>
         </w:rPr>
-        <w:t xml:space="preserve"> Reglas clínicas de "</w:t>
-      </w:r>
-      <w:proofErr w:type="spellStart"/>
-      <w:r>
-        <w:rPr>
-          <w:rFonts w:cs="Arial"/>
-        </w:rPr>
-        <w:t>hard-code</w:t>
-      </w:r>
-      <w:proofErr w:type="spellEnd"/>
-      <w:r>
-        <w:rPr>
-          <w:rFonts w:cs="Arial"/>
-        </w:rPr>
-        <w:t>" que actúan como salvavidas inmediatos para evitar lesiones.</w:t>
+        <w:t xml:space="preserve"> Reglas clínicas de "hard-code" que actúan como salvavidas inmediatos para evitar lesiones.</w:t>
       </w:r>
     </w:p>
     <w:p>
@@ -3743,23 +2293,7 @@
           <w:rStyle w:val="HTMLCode"/>
           <w:rFonts w:cs="Arial"/>
         </w:rPr>
-        <w:t>SI (Ejercicio == Sentadilla) Y (</w:t>
-      </w:r>
-      <w:proofErr w:type="spellStart"/>
-      <w:r>
-        <w:rPr>
-          <w:rStyle w:val="HTMLCode"/>
-          <w:rFonts w:cs="Arial"/>
-        </w:rPr>
-        <w:t>Ángulo_Rodilla</w:t>
-      </w:r>
-      <w:proofErr w:type="spellEnd"/>
-      <w:r>
-        <w:rPr>
-          <w:rStyle w:val="HTMLCode"/>
-          <w:rFonts w:cs="Arial"/>
-        </w:rPr>
-        <w:t xml:space="preserve"> &lt; 90º) -&gt; "Profundidad correcta"</w:t>
+        <w:t>SI (Ejercicio == Sentadilla) Y (Ángulo_Rodilla &lt; 90º) -&gt; "Profundidad correcta"</w:t>
       </w:r>
     </w:p>
     <w:p>
@@ -3794,39 +2328,7 @@
           <w:rStyle w:val="HTMLCode"/>
           <w:rFonts w:cs="Arial"/>
         </w:rPr>
-        <w:t>SI (</w:t>
-      </w:r>
-      <w:proofErr w:type="spellStart"/>
-      <w:r>
-        <w:rPr>
-          <w:rStyle w:val="HTMLCode"/>
-          <w:rFonts w:cs="Arial"/>
-        </w:rPr>
-        <w:t>Posición_X_Rodilla</w:t>
-      </w:r>
-      <w:proofErr w:type="spellEnd"/>
-      <w:r>
-        <w:rPr>
-          <w:rStyle w:val="HTMLCode"/>
-          <w:rFonts w:cs="Arial"/>
-        </w:rPr>
-        <w:t xml:space="preserve"> &gt; </w:t>
-      </w:r>
-      <w:proofErr w:type="spellStart"/>
-      <w:r>
-        <w:rPr>
-          <w:rStyle w:val="HTMLCode"/>
-          <w:rFonts w:cs="Arial"/>
-        </w:rPr>
-        <w:t>Posición_X_Puntera</w:t>
-      </w:r>
-      <w:proofErr w:type="spellEnd"/>
-      <w:r>
-        <w:rPr>
-          <w:rStyle w:val="HTMLCode"/>
-          <w:rFonts w:cs="Arial"/>
-        </w:rPr>
-        <w:t>) -&gt; "</w:t>
+        <w:t>SI (Posición_X_Rodilla &gt; Posición_X_Puntera) -&gt; "</w:t>
       </w:r>
       <w:r>
         <w:rPr>
@@ -3926,21 +2428,7 @@
         <w:rPr>
           <w:rFonts w:cs="Arial"/>
         </w:rPr>
-        <w:t xml:space="preserve">Para que la aplicación fluya en teléfonos móviles de gama media sin sobrecalentamiento ni caídas de </w:t>
-      </w:r>
-      <w:proofErr w:type="spellStart"/>
-      <w:r>
-        <w:rPr>
-          <w:rFonts w:cs="Arial"/>
-        </w:rPr>
-        <w:t>frames</w:t>
-      </w:r>
-      <w:proofErr w:type="spellEnd"/>
-      <w:r>
-        <w:rPr>
-          <w:rFonts w:cs="Arial"/>
-        </w:rPr>
-        <w:t>, se aplicará un estricto protocolo de rendimiento:</w:t>
+        <w:t>Para que la aplicación fluya en teléfonos móviles de gama media sin sobrecalentamiento ni caídas de frames, se aplicará un estricto protocolo de rendimiento:</w:t>
       </w:r>
     </w:p>
     <w:p>
@@ -3956,77 +2444,27 @@
           <w:rFonts w:cs="Arial"/>
         </w:rPr>
       </w:pPr>
-      <w:proofErr w:type="spellStart"/>
-      <w:proofErr w:type="gramStart"/>
       <w:r>
         <w:rPr>
           <w:rFonts w:cs="Arial"/>
           <w:b/>
           <w:bCs/>
         </w:rPr>
-        <w:t>Frame</w:t>
-      </w:r>
-      <w:proofErr w:type="spellEnd"/>
-      <w:proofErr w:type="gramEnd"/>
+        <w:t>Frame Skipping (Salto de Fotogramas):</w:t>
+      </w:r>
+      <w:r>
+        <w:rPr>
+          <w:rFonts w:cs="Arial"/>
+        </w:rPr>
+        <w:t xml:space="preserve"> No es necesario analizar video a 30 o 60 FPS. El movimiento de hipertrofia o fuerza es relativamente lento. Se procesará </w:t>
+      </w:r>
       <w:r>
         <w:rPr>
           <w:rFonts w:cs="Arial"/>
           <w:b/>
           <w:bCs/>
         </w:rPr>
-        <w:t xml:space="preserve"> </w:t>
-      </w:r>
-      <w:proofErr w:type="spellStart"/>
-      <w:r>
-        <w:rPr>
-          <w:rFonts w:cs="Arial"/>
-          <w:b/>
-          <w:bCs/>
-        </w:rPr>
-        <w:t>Skipping</w:t>
-      </w:r>
-      <w:proofErr w:type="spellEnd"/>
-      <w:r>
-        <w:rPr>
-          <w:rFonts w:cs="Arial"/>
-          <w:b/>
-          <w:bCs/>
-        </w:rPr>
-        <w:t xml:space="preserve"> (Salto de Fotogramas):</w:t>
-      </w:r>
-      <w:r>
-        <w:rPr>
-          <w:rFonts w:cs="Arial"/>
-        </w:rPr>
-        <w:t xml:space="preserve"> No es necesario analizar video a 30 o 60 FPS. El movimiento de hipertrofia o fuerza es relativamente lento. Se procesará </w:t>
-      </w:r>
-      <w:r>
-        <w:rPr>
-          <w:rFonts w:cs="Arial"/>
-          <w:b/>
-          <w:bCs/>
-        </w:rPr>
-        <w:t xml:space="preserve">1 </w:t>
-      </w:r>
-      <w:proofErr w:type="spellStart"/>
-      <w:proofErr w:type="gramStart"/>
-      <w:r>
-        <w:rPr>
-          <w:rFonts w:cs="Arial"/>
-          <w:b/>
-          <w:bCs/>
-        </w:rPr>
-        <w:t>frame</w:t>
-      </w:r>
-      <w:proofErr w:type="spellEnd"/>
-      <w:proofErr w:type="gramEnd"/>
-      <w:r>
-        <w:rPr>
-          <w:rFonts w:cs="Arial"/>
-          <w:b/>
-          <w:bCs/>
-        </w:rPr>
-        <w:t xml:space="preserve"> de cada 5</w:t>
+        <w:t>1 frame de cada 5</w:t>
       </w:r>
       <w:r>
         <w:rPr>
@@ -4062,112 +2500,41 @@
           <w:rFonts w:cs="Arial"/>
         </w:rPr>
       </w:pPr>
-      <w:proofErr w:type="spellStart"/>
       <w:r>
         <w:rPr>
           <w:rFonts w:cs="Arial"/>
           <w:b/>
           <w:bCs/>
         </w:rPr>
-        <w:t>Downscaling</w:t>
-      </w:r>
-      <w:proofErr w:type="spellEnd"/>
-      <w:r>
-        <w:rPr>
-          <w:rFonts w:cs="Arial"/>
-          <w:b/>
-          <w:bCs/>
-        </w:rPr>
-        <w:t xml:space="preserve"> (Redimensionado):</w:t>
-      </w:r>
-      <w:r>
-        <w:rPr>
-          <w:rFonts w:cs="Arial"/>
-        </w:rPr>
-        <w:t xml:space="preserve"> Antes de pasar por la red neuronal de estimación (</w:t>
-      </w:r>
-      <w:proofErr w:type="spellStart"/>
-      <w:r>
-        <w:rPr>
-          <w:rFonts w:cs="Arial"/>
-        </w:rPr>
-        <w:t>OpenCV</w:t>
-      </w:r>
-      <w:proofErr w:type="spellEnd"/>
-      <w:r>
-        <w:rPr>
-          <w:rFonts w:cs="Arial"/>
-        </w:rPr>
-        <w:t>/</w:t>
-      </w:r>
-      <w:proofErr w:type="spellStart"/>
-      <w:r>
-        <w:rPr>
-          <w:rFonts w:cs="Arial"/>
-        </w:rPr>
-        <w:t>MediaPipe</w:t>
-      </w:r>
-      <w:proofErr w:type="spellEnd"/>
-      <w:r>
-        <w:rPr>
-          <w:rFonts w:cs="Arial"/>
-        </w:rPr>
-        <w:t xml:space="preserve">), el </w:t>
-      </w:r>
-      <w:proofErr w:type="spellStart"/>
-      <w:proofErr w:type="gramStart"/>
-      <w:r>
-        <w:rPr>
-          <w:rFonts w:cs="Arial"/>
-        </w:rPr>
-        <w:t>frame</w:t>
-      </w:r>
-      <w:proofErr w:type="spellEnd"/>
-      <w:proofErr w:type="gramEnd"/>
-      <w:r>
-        <w:rPr>
-          <w:rFonts w:cs="Arial"/>
-        </w:rPr>
-        <w:t xml:space="preserve"> original se reducirá a dimensiones óptimas (ej. </w:t>
+        <w:lastRenderedPageBreak/>
+        <w:t>Downscaling (Redimensionado):</w:t>
+      </w:r>
+      <w:r>
+        <w:rPr>
+          <w:rFonts w:cs="Arial"/>
+        </w:rPr>
+        <w:t xml:space="preserve"> Antes de pasar por la red neuronal de estimación (OpenCV/MediaPipe), el frame original se reducirá a dimensiones óptimas (ej. </w:t>
       </w:r>
       <w:r>
         <w:rPr>
           <w:rStyle w:val="HTMLCode"/>
           <w:rFonts w:cs="Arial"/>
         </w:rPr>
-        <w:t xml:space="preserve">256x256 </w:t>
-      </w:r>
-      <w:proofErr w:type="spellStart"/>
+        <w:t>256x256 px</w:t>
+      </w:r>
+      <w:r>
+        <w:rPr>
+          <w:rFonts w:cs="Arial"/>
+        </w:rPr>
+        <w:t xml:space="preserve"> o </w:t>
+      </w:r>
       <w:r>
         <w:rPr>
           <w:rStyle w:val="HTMLCode"/>
           <w:rFonts w:cs="Arial"/>
         </w:rPr>
-        <w:t>px</w:t>
-      </w:r>
-      <w:proofErr w:type="spellEnd"/>
-      <w:r>
-        <w:rPr>
-          <w:rFonts w:cs="Arial"/>
-        </w:rPr>
-        <w:t xml:space="preserve"> o </w:t>
-      </w:r>
-      <w:r>
-        <w:rPr>
-          <w:rStyle w:val="HTMLCode"/>
-          <w:rFonts w:cs="Arial"/>
-        </w:rPr>
-        <w:t xml:space="preserve">224x224 </w:t>
-      </w:r>
-      <w:proofErr w:type="spellStart"/>
-      <w:r>
-        <w:rPr>
-          <w:rStyle w:val="HTMLCode"/>
-          <w:rFonts w:cs="Arial"/>
-        </w:rPr>
-        <w:t>px</w:t>
-      </w:r>
-      <w:proofErr w:type="spellEnd"/>
+        <w:t>224x224 px</w:t>
+      </w:r>
       <w:r>
         <w:rPr>
           <w:rFonts w:cs="Arial"/>
@@ -4189,7 +2556,6 @@
           <w:rFonts w:cs="Arial"/>
           <w:noProof/>
         </w:rPr>
-        <w:lastRenderedPageBreak/>
         <w:drawing>
           <wp:anchor distT="0" distB="0" distL="114300" distR="114300" simplePos="0" relativeHeight="251659264" behindDoc="1" locked="0" layoutInCell="1" allowOverlap="1" wp14:anchorId="2004F37C" wp14:editId="001F3323">
             <wp:simplePos x="0" y="0"/>
@@ -4418,6 +2784,7 @@
         <w:spacing w:before="0" w:beforeAutospacing="0"/>
         <w:jc w:val="center"/>
         <w:rPr>
+          <w:rStyle w:val="Hyperlink"/>
           <w:rFonts w:cs="Arial"/>
         </w:rPr>
       </w:pPr>
@@ -4432,6 +2799,102 @@
       </w:hyperlink>
     </w:p>
     <w:p>
+      <w:r>
+        <w:t>V1,</w:t>
+      </w:r>
+      <w:r>
+        <w:rPr>
+          <w:b/>
+          <w:bCs/>
+        </w:rPr>
+        <w:t>V2</w:t>
+      </w:r>
+      <w:r>
+        <w:t xml:space="preserve"> </w:t>
+      </w:r>
+      <w:r>
+        <w:sym w:font="Wingdings" w:char="F0E0"/>
+      </w:r>
+      <w:r>
+        <w:t xml:space="preserve"> Primeros entrenamientos con pocos cambios</w:t>
+      </w:r>
+    </w:p>
+    <w:p>
+      <w:r>
+        <w:t xml:space="preserve">V3 </w:t>
+      </w:r>
+      <w:r>
+        <w:sym w:font="Wingdings" w:char="F0E0"/>
+      </w:r>
+      <w:r>
+        <w:t xml:space="preserve"> Centro de sustentación, y datos relevantes solamente </w:t>
+      </w:r>
+      <w:r>
+        <w:sym w:font="Wingdings" w:char="F0E0"/>
+      </w:r>
+      <w:r>
+        <w:t xml:space="preserve"> </w:t>
+      </w:r>
+      <w:r>
+        <w:t>git checkout e70954ff1b6983d96228f5b94317b127d854486d</w:t>
+      </w:r>
+    </w:p>
+    <w:p>
+      <w:r>
+        <w:t>V4</w:t>
+      </w:r>
+      <w:r>
+        <w:t xml:space="preserve">, </w:t>
+      </w:r>
+      <w:r>
+        <w:rPr>
+          <w:b/>
+          <w:bCs/>
+        </w:rPr>
+        <w:t>V5</w:t>
+      </w:r>
+      <w:r>
+        <w:t>, V6, V7</w:t>
+      </w:r>
+      <w:r>
+        <w:sym w:font="Wingdings" w:char="F0E0"/>
+      </w:r>
+      <w:r>
+        <w:t xml:space="preserve"> Tratado de 0s</w:t>
+      </w:r>
+      <w:r>
+        <w:t>, no cuenta ni una repe bien</w:t>
+      </w:r>
+      <w:r>
+        <w:t xml:space="preserve"> </w:t>
+      </w:r>
+      <w:r>
+        <w:t xml:space="preserve"> </w:t>
+      </w:r>
+      <w:r>
+        <w:sym w:font="Wingdings" w:char="F0E0"/>
+      </w:r>
+      <w:r>
+        <w:t xml:space="preserve"> el commit de 0s</w:t>
+      </w:r>
+    </w:p>
+    <w:p>
+      <w:r>
+        <w:t xml:space="preserve">V8 </w:t>
+      </w:r>
+      <w:r>
+        <w:sym w:font="Wingdings" w:char="F0E0"/>
+      </w:r>
+      <w:r>
+        <w:t xml:space="preserve"> ni compula</w:t>
+      </w:r>
+    </w:p>
+    <w:p>
+      <w:r>
+        <w:t>El mejor hasta v8 es v3, el cual tiene las columnas justas y saca conclusiones bastante buenas.</w:t>
+      </w:r>
+    </w:p>
+    <w:p>
       <w:pPr>
         <w:pStyle w:val="NormalWeb"/>
         <w:spacing w:before="0" w:beforeAutospacing="0"/>
@@ -4453,6 +2916,7 @@
         <w:rPr>
           <w:noProof/>
         </w:rPr>
+        <w:lastRenderedPageBreak/>
         <w:drawing>
           <wp:inline distT="0" distB="0" distL="0" distR="0" wp14:anchorId="55E8FA1D" wp14:editId="5D68251D">
             <wp:extent cx="5943600" cy="3375025"/>
@@ -4558,19 +3022,11 @@
           <w:rFonts w:ascii="Times New Roman" w:hAnsi="Times New Roman"/>
         </w:rPr>
       </w:pPr>
-      <w:proofErr w:type="spellStart"/>
-      <w:r>
-        <w:rPr>
-          <w:rFonts w:cs="Arial"/>
-        </w:rPr>
-        <w:t>Codigo</w:t>
-      </w:r>
-      <w:proofErr w:type="spellEnd"/>
-      <w:r>
-        <w:rPr>
-          <w:rFonts w:cs="Arial"/>
-        </w:rPr>
-        <w:t xml:space="preserve"> pedido a la IA: </w:t>
+      <w:r>
+        <w:rPr>
+          <w:rFonts w:cs="Arial"/>
+        </w:rPr>
+        <w:t xml:space="preserve">Codigo pedido a la IA: </w:t>
       </w:r>
       <w:r>
         <w:t>4️</w:t>
@@ -4595,15 +3051,7 @@
         <w:jc w:val="left"/>
       </w:pPr>
       <w:r>
-        <w:t xml:space="preserve">Normaliza todos los </w:t>
-      </w:r>
-      <w:proofErr w:type="spellStart"/>
-      <w:r>
-        <w:t>keypoints</w:t>
-      </w:r>
-      <w:proofErr w:type="spellEnd"/>
-      <w:r>
-        <w:t xml:space="preserve"> por torso/cadera → posición y tamaño</w:t>
+        <w:t>Normaliza todos los keypoints por torso/cadera → posición y tamaño</w:t>
       </w:r>
     </w:p>
     <w:p>
@@ -4710,19 +3158,11 @@
       <w:r>
         <w:t xml:space="preserve">Extrae </w:t>
       </w:r>
-      <w:proofErr w:type="spellStart"/>
       <w:r>
         <w:rPr>
           <w:rStyle w:val="Strong"/>
         </w:rPr>
-        <w:t>features</w:t>
-      </w:r>
-      <w:proofErr w:type="spellEnd"/>
-      <w:r>
-        <w:rPr>
-          <w:rStyle w:val="Strong"/>
-        </w:rPr>
-        <w:t xml:space="preserve"> universales por repetición</w:t>
+        <w:t>features universales por repetición</w:t>
       </w:r>
       <w:r>
         <w:t>:</w:t>
@@ -4738,13 +3178,8 @@
         <w:jc w:val="left"/>
       </w:pPr>
       <w:r>
-        <w:t>ROM máximo/</w:t>
-      </w:r>
-      <w:proofErr w:type="spellStart"/>
-      <w:r>
-        <w:t>minimo</w:t>
-      </w:r>
-      <w:proofErr w:type="spellEnd"/>
+        <w:t>ROM máximo/minimo</w:t>
+      </w:r>
     </w:p>
     <w:p>
       <w:pPr>
@@ -4782,15 +3217,7 @@
         <w:jc w:val="left"/>
       </w:pPr>
       <w:r>
-        <w:t xml:space="preserve">Guarda todo en un </w:t>
-      </w:r>
-      <w:proofErr w:type="spellStart"/>
-      <w:r>
-        <w:t>dataset</w:t>
-      </w:r>
-      <w:proofErr w:type="spellEnd"/>
-      <w:r>
-        <w:t xml:space="preserve"> por repetición → listo para ML o reglas</w:t>
+        <w:t>Guarda todo en un dataset por repetición → listo para ML o reglas</w:t>
       </w:r>
     </w:p>
     <w:p>
@@ -4835,6 +3262,7 @@
           <w:b/>
           <w:bCs/>
         </w:rPr>
+        <w:lastRenderedPageBreak/>
         <w:t>Activación muscular esperada (El gran problema):</w:t>
       </w:r>
       <w:r>
@@ -4868,15 +3296,7 @@
         <w:t>Balanceos y compensaciones (Estabilidad real):</w:t>
       </w:r>
       <w:r>
-        <w:t xml:space="preserve"> Puedes detectar con </w:t>
-      </w:r>
-      <w:proofErr w:type="spellStart"/>
-      <w:r>
-        <w:t>MediaPipe</w:t>
-      </w:r>
-      <w:proofErr w:type="spellEnd"/>
-      <w:r>
-        <w:t xml:space="preserve"> si el tronco se inclina hacia adelante, pero ¿cómo sabes si el usuario está perdiendo el equilibrio o simplemente tiene esa anatomía? El equilibrio real se define </w:t>
+        <w:t xml:space="preserve"> Puedes detectar con MediaPipe si el tronco se inclina hacia adelante, pero ¿cómo sabes si el usuario está perdiendo el equilibrio o simplemente tiene esa anatomía? El equilibrio real se define </w:t>
       </w:r>
       <w:r>
         <w:rPr>
@@ -4974,72 +3394,10 @@
           <w:color w:val="E3E3E3"/>
           <w:shd w:val="clear" w:color="auto" w:fill="282A2C"/>
         </w:rPr>
-        <w:t xml:space="preserve"> dame el </w:t>
-      </w:r>
-      <w:proofErr w:type="spellStart"/>
-      <w:r>
-        <w:rPr>
-          <w:rFonts w:cs="Arial"/>
-          <w:color w:val="E3E3E3"/>
-          <w:shd w:val="clear" w:color="auto" w:fill="282A2C"/>
-        </w:rPr>
-        <w:t>codigo</w:t>
-      </w:r>
-      <w:proofErr w:type="spellEnd"/>
-      <w:r>
-        <w:rPr>
-          <w:rFonts w:cs="Arial"/>
-          <w:color w:val="E3E3E3"/>
-          <w:shd w:val="clear" w:color="auto" w:fill="282A2C"/>
-        </w:rPr>
-        <w:t xml:space="preserve"> para la red, </w:t>
-      </w:r>
-      <w:proofErr w:type="spellStart"/>
-      <w:r>
-        <w:rPr>
-          <w:rFonts w:cs="Arial"/>
-          <w:color w:val="E3E3E3"/>
-          <w:shd w:val="clear" w:color="auto" w:fill="282A2C"/>
-        </w:rPr>
-        <w:t>acuerdate</w:t>
-      </w:r>
-      <w:proofErr w:type="spellEnd"/>
-      <w:r>
-        <w:rPr>
-          <w:rFonts w:cs="Arial"/>
-          <w:color w:val="E3E3E3"/>
-          <w:shd w:val="clear" w:color="auto" w:fill="282A2C"/>
-        </w:rPr>
-        <w:t xml:space="preserve"> de todos los </w:t>
-      </w:r>
-      <w:proofErr w:type="spellStart"/>
-      <w:r>
-        <w:rPr>
-          <w:rFonts w:cs="Arial"/>
-          <w:color w:val="E3E3E3"/>
-          <w:shd w:val="clear" w:color="auto" w:fill="282A2C"/>
-        </w:rPr>
-        <w:t>kpis</w:t>
-      </w:r>
-      <w:proofErr w:type="spellEnd"/>
-      <w:r>
-        <w:rPr>
-          <w:rFonts w:cs="Arial"/>
-          <w:color w:val="E3E3E3"/>
-          <w:shd w:val="clear" w:color="auto" w:fill="282A2C"/>
-        </w:rPr>
-        <w:t>, extraer repeticiones, y todo lo que hemos hablado.</w:t>
-      </w:r>
-      <w:r>
-        <w:t xml:space="preserve"> Apuntar posteriormente los </w:t>
-      </w:r>
-      <w:proofErr w:type="spellStart"/>
-      <w:r>
-        <w:t>kpis</w:t>
-      </w:r>
-      <w:proofErr w:type="spellEnd"/>
-      <w:r>
-        <w:t xml:space="preserve"> indicados.</w:t>
+        <w:t> dame el codigo para la red, acuerdate de todos los kpis, extraer repeticiones, y todo lo que hemos hablado.</w:t>
+      </w:r>
+      <w:r>
+        <w:t xml:space="preserve"> Apuntar posteriormente los kpis indicados.</w:t>
       </w:r>
     </w:p>
     <w:p>
@@ -5146,119 +3504,7 @@
         <w:jc w:val="left"/>
       </w:pPr>
       <w:r>
-        <w:t>['</w:t>
-      </w:r>
-      <w:proofErr w:type="spellStart"/>
-      <w:r>
-        <w:t>L_elbow</w:t>
-      </w:r>
-      <w:proofErr w:type="spellEnd"/>
-      <w:r>
-        <w:t>', '</w:t>
-      </w:r>
-      <w:proofErr w:type="spellStart"/>
-      <w:r>
-        <w:t>R_elbow</w:t>
-      </w:r>
-      <w:proofErr w:type="spellEnd"/>
-      <w:r>
-        <w:t>', '</w:t>
-      </w:r>
-      <w:proofErr w:type="spellStart"/>
-      <w:r>
-        <w:t>L_shoulder</w:t>
-      </w:r>
-      <w:proofErr w:type="spellEnd"/>
-      <w:r>
-        <w:t>', '</w:t>
-      </w:r>
-      <w:proofErr w:type="spellStart"/>
-      <w:r>
-        <w:t>R_shoulder</w:t>
-      </w:r>
-      <w:proofErr w:type="spellEnd"/>
-      <w:r>
-        <w:t>', '</w:t>
-      </w:r>
-      <w:proofErr w:type="spellStart"/>
-      <w:r>
-        <w:t>L_knee</w:t>
-      </w:r>
-      <w:proofErr w:type="spellEnd"/>
-      <w:r>
-        <w:t>', '</w:t>
-      </w:r>
-      <w:proofErr w:type="spellStart"/>
-      <w:r>
-        <w:t>R_knee</w:t>
-      </w:r>
-      <w:proofErr w:type="spellEnd"/>
-      <w:r>
-        <w:t>', '</w:t>
-      </w:r>
-      <w:proofErr w:type="spellStart"/>
-      <w:r>
-        <w:t>L_hip</w:t>
-      </w:r>
-      <w:proofErr w:type="spellEnd"/>
-      <w:r>
-        <w:t>', '</w:t>
-      </w:r>
-      <w:proofErr w:type="spellStart"/>
-      <w:r>
-        <w:t>R_hip</w:t>
-      </w:r>
-      <w:proofErr w:type="spellEnd"/>
-      <w:r>
-        <w:t>', '</w:t>
-      </w:r>
-      <w:proofErr w:type="spellStart"/>
-      <w:r>
-        <w:t>L_ankle</w:t>
-      </w:r>
-      <w:proofErr w:type="spellEnd"/>
-      <w:r>
-        <w:t>', '</w:t>
-      </w:r>
-      <w:proofErr w:type="spellStart"/>
-      <w:r>
-        <w:t>R_ankle</w:t>
-      </w:r>
-      <w:proofErr w:type="spellEnd"/>
-      <w:r>
-        <w:t>', 'torso', '</w:t>
-      </w:r>
-      <w:proofErr w:type="spellStart"/>
-      <w:r>
-        <w:t>sust_x</w:t>
-      </w:r>
-      <w:proofErr w:type="spellEnd"/>
-      <w:r>
-        <w:t>', '</w:t>
-      </w:r>
-      <w:proofErr w:type="spellStart"/>
-      <w:r>
-        <w:t>sust_y</w:t>
-      </w:r>
-      <w:proofErr w:type="spellEnd"/>
-      <w:r>
-        <w:t>', '</w:t>
-      </w:r>
-      <w:proofErr w:type="spellStart"/>
-      <w:r>
-        <w:t>sust_z</w:t>
-      </w:r>
-      <w:proofErr w:type="spellEnd"/>
-      <w:r>
-        <w:t>', '</w:t>
-      </w:r>
-      <w:proofErr w:type="spellStart"/>
-      <w:r>
-        <w:t>delta_time</w:t>
-      </w:r>
-      <w:proofErr w:type="spellEnd"/>
-      <w:r>
-        <w:t>']</w:t>
+        <w:t>['L_elbow', 'R_elbow', 'L_shoulder', 'R_shoulder', 'L_knee', 'R_knee', 'L_hip', 'R_hip', 'L_ankle', 'R_ankle', 'torso', 'sust_x', 'sust_y', 'sust_z', 'delta_time']</w:t>
       </w:r>
     </w:p>
     <w:p>

</xml_diff>

<commit_message>
V10 --> Implementación de velocidades, cambio en la forma de entender la profundidad (no funciona)
</commit_message>
<xml_diff>
--- a/docs/Planning.docx
+++ b/docs/Planning.docx
@@ -822,6 +822,104 @@
     </w:p>
     <w:p>
       <w:pPr>
+        <w:pStyle w:val="Heading3"/>
+        <w:rPr>
+          <w:lang w:val="es-ES"/>
+        </w:rPr>
+      </w:pPr>
+      <w:r>
+        <w:rPr>
+          <w:lang w:val="es-ES"/>
+        </w:rPr>
+        <w:t xml:space="preserve">Octava Semana </w:t>
+      </w:r>
+      <w:r>
+        <w:rPr>
+          <w:lang w:val="es-ES"/>
+        </w:rPr>
+        <w:sym w:font="Wingdings" w:char="F0E0"/>
+      </w:r>
+    </w:p>
+    <w:p>
+      <w:pPr>
+        <w:rPr>
+          <w:lang w:val="es-ES"/>
+        </w:rPr>
+      </w:pPr>
+      <w:r>
+        <w:rPr>
+          <w:lang w:val="es-ES"/>
+        </w:rPr>
+        <w:t>Hemos ido probando distintas técnicas como el tratamiento de 0s, pero al final el mejor resultado ha sido dejar los valores a 0 para que la red interprete, ya que si poníamos un valor pico como -99 la red se volvía loca y no sacaba buenos resultados.</w:t>
+      </w:r>
+    </w:p>
+    <w:p>
+      <w:pPr>
+        <w:rPr>
+          <w:lang w:val="es-ES"/>
+        </w:rPr>
+      </w:pPr>
+      <w:r>
+        <w:rPr>
+          <w:lang w:val="es-ES"/>
+        </w:rPr>
+        <w:t>Hemos hecho una pequeña prueba con una red de tipo XGBoost pero el resultado ha sido pésimo por lo que de momento hemos descartado esa opción.</w:t>
+      </w:r>
+    </w:p>
+    <w:p>
+      <w:pPr>
+        <w:rPr>
+          <w:lang w:val="es-ES"/>
+        </w:rPr>
+      </w:pPr>
+      <w:r>
+        <w:rPr>
+          <w:lang w:val="es-ES"/>
+        </w:rPr>
+        <w:t>Hemos realizado unos pequeños cambios pasandole a la red solo lo necesario para la sentadilla, es decir, descartando articulaciones de codo y hombro, además de normalizar el centro de sustentación.</w:t>
+      </w:r>
+    </w:p>
+    <w:p>
+      <w:pPr>
+        <w:pStyle w:val="Heading3"/>
+        <w:rPr>
+          <w:lang w:val="es-ES"/>
+        </w:rPr>
+      </w:pPr>
+      <w:r>
+        <w:rPr>
+          <w:lang w:val="es-ES"/>
+        </w:rPr>
+        <w:t xml:space="preserve">Novena Semana </w:t>
+      </w:r>
+      <w:r>
+        <w:rPr>
+          <w:lang w:val="es-ES"/>
+        </w:rPr>
+        <w:sym w:font="Wingdings" w:char="F0E0"/>
+      </w:r>
+      <w:r>
+        <w:rPr>
+          <w:lang w:val="es-ES"/>
+        </w:rPr>
+        <w:t xml:space="preserve"> </w:t>
+      </w:r>
+    </w:p>
+    <w:p>
+      <w:pPr>
+        <w:rPr>
+          <w:lang w:val="es-ES"/>
+        </w:rPr>
+      </w:pPr>
+      <w:r>
+        <w:rPr>
+          <w:lang w:val="es-ES"/>
+        </w:rPr>
+        <w:t>Hemos eitiquetado más videos para hacer un entrenamiento más profundo, hemos conseguido sacar el modelo v9 el cual es el que mejores resultados nos ha dado hasta la fecha. Hay un pequeño análisis de como ha sido este modelo, ahora vamos a buscar mejorarlo.</w:t>
+      </w:r>
+    </w:p>
+    <w:p>
+      <w:pPr>
         <w:rPr>
           <w:lang w:val="es-ES"/>
         </w:rPr>
@@ -944,7 +1042,11 @@
         <w:t>Transfer Learning</w:t>
       </w:r>
       <w:r>
-        <w:t xml:space="preserve"> sobre una CNN (ResNet/Inception) para identificar ballenas por su cola; demuestra que el "Data Augmentation" (rotar/deformar imágenes) es vital cuando tienes pocas imágenes para entrenar.</w:t>
+        <w:t xml:space="preserve"> sobre una CNN (ResNet/Inception) para identificar ballenas por su cola; demuestra que el "Data Augmentation" (rotar/deformar imágenes) es vital cuando tienes pocas </w:t>
+      </w:r>
+      <w:r>
+        <w:lastRenderedPageBreak/>
+        <w:t>imágenes para entrenar.</w:t>
       </w:r>
       <w:r>
         <w:t xml:space="preserve"> </w:t>
@@ -1398,7 +1500,11 @@
         <w:t>inviable para el cuerpo humano</w:t>
       </w:r>
       <w:r>
-        <w:t>, que es articulado y deformable. Para tu TFG, justifica que estos métodos "clásicos" no tienen la robustez necesaria para capturar la biomecánica en movimiento.</w:t>
+        <w:t xml:space="preserve">, que es articulado </w:t>
+      </w:r>
+      <w:r>
+        <w:lastRenderedPageBreak/>
+        <w:t>y deformable. Para tu TFG, justifica que estos métodos "clásicos" no tienen la robustez necesaria para capturar la biomecánica en movimiento.</w:t>
       </w:r>
     </w:p>
     <w:p>
@@ -1578,11 +1684,7 @@
         <w:t>Oliva</w:t>
       </w:r>
       <w:r>
-        <w:t xml:space="preserve"> demostró que técnicas precisas (ventanas deslizantes) hacen el sistema inútil en tiempo real (segundos por frame). Para tu app móvil, la conclusión es clara: sacrifica </w:t>
-      </w:r>
-      <w:r>
-        <w:lastRenderedPageBreak/>
-        <w:t>resolución de entrada (baja a 256x256 o similar) y procesa 1 de cada 5 frames. La fluidez de la app (UX) es más importante que saber si el ángulo de la rodilla es 45.1º o 45.2º.</w:t>
+        <w:t xml:space="preserve"> demostró que técnicas precisas (ventanas deslizantes) hacen el sistema inútil en tiempo real (segundos por frame). Para tu app móvil, la conclusión es clara: sacrifica resolución de entrada (baja a 256x256 o similar) y procesa 1 de cada 5 frames. La fluidez de la app (UX) es más importante que saber si el ángulo de la rodilla es 45.1º o 45.2º.</w:t>
       </w:r>
     </w:p>
     <w:p>
@@ -1848,6 +1950,7 @@
           <w:i/>
           <w:iCs/>
         </w:rPr>
+        <w:lastRenderedPageBreak/>
         <w:t>RTMPose / ViTPose:</w:t>
       </w:r>
       <w:r>
@@ -2015,11 +2118,7 @@
         <w:t>GRU y 1D CNN:</w:t>
       </w:r>
       <w:r>
-        <w:t xml:space="preserve"> Con una complejidad baja y requerimientos de datos bajos/medios, son las opciones perfectas para ejecutar directamente en el </w:t>
-      </w:r>
-      <w:r>
-        <w:lastRenderedPageBreak/>
-        <w:t>dispositivo m</w:t>
+        <w:t xml:space="preserve"> Con una complejidad baja y requerimientos de datos bajos/medios, son las opciones perfectas para ejecutar directamente en el dispositivo m</w:t>
       </w:r>
       <w:r>
         <w:rPr>
@@ -2252,6 +2351,7 @@
           <w:b/>
           <w:bCs/>
         </w:rPr>
+        <w:lastRenderedPageBreak/>
         <w:t>Reglas Deterministas (Árbol de Decisión):</w:t>
       </w:r>
       <w:r>
@@ -2506,7 +2606,6 @@
           <w:b/>
           <w:bCs/>
         </w:rPr>
-        <w:lastRenderedPageBreak/>
         <w:t>Downscaling (Redimensionado):</w:t>
       </w:r>
       <w:r>
@@ -2894,6 +2993,212 @@
         <w:t>El mejor hasta v8 es v3, el cual tiene las columnas justas y saca conclusiones bastante buenas.</w:t>
       </w:r>
     </w:p>
+    <w:p/>
+    <w:p>
+      <w:pPr>
+        <w:pStyle w:val="NormalWeb"/>
+        <w:spacing w:before="0" w:beforeAutospacing="0" w:after="0" w:afterAutospacing="0"/>
+      </w:pPr>
+      <w:r>
+        <w:t xml:space="preserve">V9 </w:t>
+      </w:r>
+      <w:r>
+        <w:sym w:font="Wingdings" w:char="F0E0"/>
+      </w:r>
+      <w:r>
+        <w:t xml:space="preserve"> Nuevo entrenamiento con mayor número de vídeos, se ha conseguido un resultado aceptable, hemos hecho una pequeña prueba con un conjunto de 17 videos de distintos tipos de sentadillas, en el cual podemos obtener las siguientes conclusiones: </w:t>
+      </w:r>
+    </w:p>
+    <w:p>
+      <w:pPr>
+        <w:pStyle w:val="NormalWeb"/>
+        <w:spacing w:before="0" w:beforeAutospacing="0" w:after="0" w:afterAutospacing="0"/>
+        <w:rPr>
+          <w:rFonts w:cs="Arial"/>
+          <w:color w:val="1F1F1F"/>
+        </w:rPr>
+      </w:pPr>
+      <w:r>
+        <w:rPr>
+          <w:rFonts w:cs="Arial"/>
+          <w:color w:val="1F1F1F"/>
+        </w:rPr>
+        <w:t xml:space="preserve">Actualmente, tu red neuronal es excepcionalmente sólida en la </w:t>
+      </w:r>
+      <w:r>
+        <w:rPr>
+          <w:rFonts w:cs="Arial"/>
+          <w:b/>
+          <w:bCs/>
+          <w:color w:val="1F1F1F"/>
+          <w:bdr w:val="none" w:sz="0" w:space="0" w:color="auto" w:frame="1"/>
+        </w:rPr>
+        <w:t>detección estructural</w:t>
+      </w:r>
+      <w:r>
+        <w:rPr>
+          <w:rFonts w:cs="Arial"/>
+          <w:color w:val="1F1F1F"/>
+        </w:rPr>
+        <w:t xml:space="preserve">, logrando una precisión casi perfecta en el conteo de repeticiones y la identificación de fases. Es, esencialmente, un juez que sabe contar sin fallar pero que tiene "miopía" para los detalles técnicos: mientras que la </w:t>
+      </w:r>
+      <w:r>
+        <w:rPr>
+          <w:rFonts w:cs="Arial"/>
+          <w:b/>
+          <w:bCs/>
+          <w:color w:val="1F1F1F"/>
+          <w:bdr w:val="none" w:sz="0" w:space="0" w:color="auto" w:frame="1"/>
+        </w:rPr>
+        <w:t>Profundidad</w:t>
+      </w:r>
+      <w:r>
+        <w:rPr>
+          <w:rFonts w:cs="Arial"/>
+          <w:color w:val="1F1F1F"/>
+        </w:rPr>
+        <w:t xml:space="preserve"> es tu KPI más fiable, el modelo tropieza significativamente en métricas dinámicas como el </w:t>
+      </w:r>
+      <w:r>
+        <w:rPr>
+          <w:rFonts w:cs="Arial"/>
+          <w:b/>
+          <w:bCs/>
+          <w:color w:val="1F1F1F"/>
+          <w:bdr w:val="none" w:sz="0" w:space="0" w:color="auto" w:frame="1"/>
+        </w:rPr>
+        <w:t>Ritmo</w:t>
+      </w:r>
+      <w:r>
+        <w:rPr>
+          <w:rFonts w:cs="Arial"/>
+          <w:color w:val="1F1F1F"/>
+        </w:rPr>
+        <w:t xml:space="preserve"> y la </w:t>
+      </w:r>
+      <w:r>
+        <w:rPr>
+          <w:rFonts w:cs="Arial"/>
+          <w:b/>
+          <w:bCs/>
+          <w:color w:val="1F1F1F"/>
+          <w:bdr w:val="none" w:sz="0" w:space="0" w:color="auto" w:frame="1"/>
+        </w:rPr>
+        <w:t>Estabilidad</w:t>
+      </w:r>
+      <w:r>
+        <w:rPr>
+          <w:rFonts w:cs="Arial"/>
+          <w:color w:val="1F1F1F"/>
+        </w:rPr>
+        <w:t xml:space="preserve">. Con un Error Absoluto Medio (MAE) de 1.8 puntos y correlaciones bajas, el estado actual es el de un modelo que entiende </w:t>
+      </w:r>
+      <w:r>
+        <w:rPr>
+          <w:rFonts w:cs="Arial"/>
+          <w:i/>
+          <w:iCs/>
+          <w:color w:val="1F1F1F"/>
+          <w:bdr w:val="none" w:sz="0" w:space="0" w:color="auto" w:frame="1"/>
+        </w:rPr>
+        <w:t>cuándo</w:t>
+      </w:r>
+      <w:r>
+        <w:rPr>
+          <w:rFonts w:cs="Arial"/>
+          <w:color w:val="1F1F1F"/>
+        </w:rPr>
+        <w:t xml:space="preserve"> ocurre el ejercicio, pero que aún no procesa correctamente el </w:t>
+      </w:r>
+      <w:r>
+        <w:rPr>
+          <w:rFonts w:cs="Arial"/>
+          <w:i/>
+          <w:iCs/>
+          <w:color w:val="1F1F1F"/>
+          <w:bdr w:val="none" w:sz="0" w:space="0" w:color="auto" w:frame="1"/>
+        </w:rPr>
+        <w:t>cómo</w:t>
+      </w:r>
+      <w:r>
+        <w:rPr>
+          <w:rFonts w:cs="Arial"/>
+          <w:color w:val="1F1F1F"/>
+        </w:rPr>
+        <w:t>, interpretando a menudo el ruido visual o pequeños temblores de los landmarks como fallos técnicos graves.</w:t>
+      </w:r>
+    </w:p>
+    <w:p>
+      <w:pPr>
+        <w:spacing w:before="0" w:line="240" w:lineRule="auto"/>
+        <w:jc w:val="left"/>
+        <w:rPr>
+          <w:rFonts w:eastAsia="Times New Roman" w:cs="Arial"/>
+          <w:color w:val="1F1F1F"/>
+          <w:sz w:val="24"/>
+          <w:szCs w:val="24"/>
+          <w:lang w:val="es-ES"/>
+        </w:rPr>
+      </w:pPr>
+      <w:r>
+        <w:rPr>
+          <w:rFonts w:eastAsia="Times New Roman" w:cs="Arial"/>
+          <w:color w:val="1F1F1F"/>
+          <w:sz w:val="24"/>
+          <w:szCs w:val="24"/>
+          <w:lang w:val="es-ES"/>
+        </w:rPr>
+        <w:t xml:space="preserve">El rendimiento actual se define como </w:t>
+      </w:r>
+      <w:r>
+        <w:rPr>
+          <w:rFonts w:eastAsia="Times New Roman" w:cs="Arial"/>
+          <w:b/>
+          <w:bCs/>
+          <w:color w:val="1F1F1F"/>
+          <w:sz w:val="24"/>
+          <w:szCs w:val="24"/>
+          <w:bdr w:val="none" w:sz="0" w:space="0" w:color="auto" w:frame="1"/>
+          <w:lang w:val="es-ES"/>
+        </w:rPr>
+        <w:t>funcional pero descalibrado</w:t>
+      </w:r>
+      <w:r>
+        <w:rPr>
+          <w:rFonts w:eastAsia="Times New Roman" w:cs="Arial"/>
+          <w:color w:val="1F1F1F"/>
+          <w:sz w:val="24"/>
+          <w:szCs w:val="24"/>
+          <w:lang w:val="es-ES"/>
+        </w:rPr>
+        <w:t xml:space="preserve">, donde el cuello de botella no es la arquitectura BiLSTM, sino la "monotonía" del entrenamiento. Al usar etiquetas planas (el mismo valor para toda la repetición), la red no sabe distinguir qué frames son los que realmente definen la calidad del movimiento. Para que el modelo alcance un nivel de precisión profesional, necesita dejar de ver "fotos de ángulos" y empezar a entender la </w:t>
+      </w:r>
+      <w:r>
+        <w:rPr>
+          <w:rFonts w:eastAsia="Times New Roman" w:cs="Arial"/>
+          <w:b/>
+          <w:bCs/>
+          <w:color w:val="1F1F1F"/>
+          <w:sz w:val="24"/>
+          <w:szCs w:val="24"/>
+          <w:bdr w:val="none" w:sz="0" w:space="0" w:color="auto" w:frame="1"/>
+          <w:lang w:val="es-ES"/>
+        </w:rPr>
+        <w:t>física del movimiento</w:t>
+      </w:r>
+      <w:r>
+        <w:rPr>
+          <w:rFonts w:eastAsia="Times New Roman" w:cs="Arial"/>
+          <w:color w:val="1F1F1F"/>
+          <w:sz w:val="24"/>
+          <w:szCs w:val="24"/>
+          <w:lang w:val="es-ES"/>
+        </w:rPr>
+        <w:t xml:space="preserve"> (velocidad y aceleración), permitiendo que los KPIs dejen de ser una respuesta plana y se conviertan en un juicio dinámico basado en los momentos críticos de la sentadilla.</w:t>
+      </w:r>
+    </w:p>
+    <w:p/>
+    <w:p/>
     <w:p>
       <w:pPr>
         <w:pStyle w:val="NormalWeb"/>

</xml_diff>

<commit_message>
V13 --> Mejor prueba hasta ahora, volvemos a calcular la profundidad de manera continua, juntando las mejoras de los otros modelos para conseguir el mejor resultado posible
</commit_message>
<xml_diff>
--- a/docs/Planning.docx
+++ b/docs/Planning.docx
@@ -283,6 +283,7 @@
           <w:lang w:val="es-ES"/>
         </w:rPr>
       </w:pPr>
+      <w:proofErr w:type="spellStart"/>
       <w:r>
         <w:rPr>
           <w:lang w:val="es-ES"/>
@@ -290,6 +291,7 @@
         <w:lastRenderedPageBreak/>
         <w:t>Sprints</w:t>
       </w:r>
+      <w:proofErr w:type="spellEnd"/>
     </w:p>
     <w:p>
       <w:pPr>
@@ -327,33 +329,89 @@
         <w:rPr>
           <w:lang w:val="es-ES"/>
         </w:rPr>
-        <w:t>--&gt; Primero de todo he instalado el framework de Android studio, y he iniciado un proyecto de 0.</w:t>
-      </w:r>
-    </w:p>
-    <w:p>
-      <w:pPr>
-        <w:rPr>
-          <w:lang w:val="es-ES"/>
-        </w:rPr>
-      </w:pPr>
-      <w:r>
-        <w:rPr>
-          <w:lang w:val="es-ES"/>
-        </w:rPr>
-        <w:t>--&gt; Posteriormente he creado un repositorio en gitlab para tener un control de versiones.</w:t>
-      </w:r>
-    </w:p>
-    <w:p>
-      <w:pPr>
-        <w:rPr>
-          <w:lang w:val="es-ES"/>
-        </w:rPr>
-      </w:pPr>
-      <w:r>
-        <w:rPr>
-          <w:lang w:val="es-ES"/>
-        </w:rPr>
-        <w:t>--&gt; He trasteado un poco en el framework y he ido programando la aplicación, primero poder hacer fotos y videos y luego poder adjuntar cosas de la galería.</w:t>
+        <w:t xml:space="preserve">--&gt; Primero de todo he instalado el </w:t>
+      </w:r>
+      <w:proofErr w:type="spellStart"/>
+      <w:r>
+        <w:rPr>
+          <w:lang w:val="es-ES"/>
+        </w:rPr>
+        <w:t>framework</w:t>
+      </w:r>
+      <w:proofErr w:type="spellEnd"/>
+      <w:r>
+        <w:rPr>
+          <w:lang w:val="es-ES"/>
+        </w:rPr>
+        <w:t xml:space="preserve"> de Android </w:t>
+      </w:r>
+      <w:proofErr w:type="spellStart"/>
+      <w:r>
+        <w:rPr>
+          <w:lang w:val="es-ES"/>
+        </w:rPr>
+        <w:t>studio</w:t>
+      </w:r>
+      <w:proofErr w:type="spellEnd"/>
+      <w:r>
+        <w:rPr>
+          <w:lang w:val="es-ES"/>
+        </w:rPr>
+        <w:t>, y he iniciado un proyecto de 0.</w:t>
+      </w:r>
+    </w:p>
+    <w:p>
+      <w:pPr>
+        <w:rPr>
+          <w:lang w:val="es-ES"/>
+        </w:rPr>
+      </w:pPr>
+      <w:r>
+        <w:rPr>
+          <w:lang w:val="es-ES"/>
+        </w:rPr>
+        <w:t xml:space="preserve">--&gt; Posteriormente he creado un repositorio en </w:t>
+      </w:r>
+      <w:proofErr w:type="spellStart"/>
+      <w:r>
+        <w:rPr>
+          <w:lang w:val="es-ES"/>
+        </w:rPr>
+        <w:t>gitlab</w:t>
+      </w:r>
+      <w:proofErr w:type="spellEnd"/>
+      <w:r>
+        <w:rPr>
+          <w:lang w:val="es-ES"/>
+        </w:rPr>
+        <w:t xml:space="preserve"> para tener un control de versiones.</w:t>
+      </w:r>
+    </w:p>
+    <w:p>
+      <w:pPr>
+        <w:rPr>
+          <w:lang w:val="es-ES"/>
+        </w:rPr>
+      </w:pPr>
+      <w:r>
+        <w:rPr>
+          <w:lang w:val="es-ES"/>
+        </w:rPr>
+        <w:t xml:space="preserve">--&gt; He trasteado un poco en el </w:t>
+      </w:r>
+      <w:proofErr w:type="spellStart"/>
+      <w:r>
+        <w:rPr>
+          <w:lang w:val="es-ES"/>
+        </w:rPr>
+        <w:t>framework</w:t>
+      </w:r>
+      <w:proofErr w:type="spellEnd"/>
+      <w:r>
+        <w:rPr>
+          <w:lang w:val="es-ES"/>
+        </w:rPr>
+        <w:t xml:space="preserve"> y he ido programando la aplicación, primero poder hacer fotos y videos y luego poder adjuntar cosas de la galería.</w:t>
       </w:r>
     </w:p>
     <w:p>
@@ -379,7 +437,21 @@
         <w:rPr>
           <w:lang w:val="es-ES"/>
         </w:rPr>
-        <w:t>--&gt; la opción de poder cambiar la foto o video subido asi de enviarla al servidor.</w:t>
+        <w:t xml:space="preserve">--&gt; la opción de poder cambiar la foto o video subido </w:t>
+      </w:r>
+      <w:proofErr w:type="spellStart"/>
+      <w:r>
+        <w:rPr>
+          <w:lang w:val="es-ES"/>
+        </w:rPr>
+        <w:t>asi</w:t>
+      </w:r>
+      <w:proofErr w:type="spellEnd"/>
+      <w:r>
+        <w:rPr>
+          <w:lang w:val="es-ES"/>
+        </w:rPr>
+        <w:t xml:space="preserve"> de enviarla al servidor.</w:t>
       </w:r>
     </w:p>
     <w:p>
@@ -431,7 +503,21 @@
         <w:rPr>
           <w:lang w:val="es-ES"/>
         </w:rPr>
-        <w:t>Además, mirar alguna alternativa a openpose.</w:t>
+        <w:t xml:space="preserve">Además, mirar alguna alternativa a </w:t>
+      </w:r>
+      <w:proofErr w:type="spellStart"/>
+      <w:r>
+        <w:rPr>
+          <w:lang w:val="es-ES"/>
+        </w:rPr>
+        <w:t>openpose</w:t>
+      </w:r>
+      <w:proofErr w:type="spellEnd"/>
+      <w:r>
+        <w:rPr>
+          <w:lang w:val="es-ES"/>
+        </w:rPr>
+        <w:t>.</w:t>
       </w:r>
     </w:p>
     <w:p>
@@ -483,20 +569,146 @@
         <w:rPr>
           <w:lang w:val="es-ES"/>
         </w:rPr>
-        <w:t xml:space="preserve">En primer lugar trabajaremos con el análisis de imágenes intentando conseguir los keypoints del cuerpo humano a través de mediapipe. Para ello requiere un análisis he investigación propia, tanto de la propia docimentacion como de repositorios de github los cuales ya han usado esta técnica. </w:t>
-      </w:r>
-    </w:p>
-    <w:p>
-      <w:pPr>
-        <w:rPr>
-          <w:lang w:val="es-ES"/>
-        </w:rPr>
-      </w:pPr>
-      <w:r>
-        <w:rPr>
-          <w:lang w:val="es-ES"/>
-        </w:rPr>
-        <w:t>Una vez obtenido los 33 keypoints intentamos calcular los ángulos de las articulaciones mas importantes del cuerpo como rodilla, codo ,… Una vez obtenidos estos ángulos me doy cuenta de los siguientes problemas:</w:t>
+        <w:t xml:space="preserve">En primer </w:t>
+      </w:r>
+      <w:proofErr w:type="gramStart"/>
+      <w:r>
+        <w:rPr>
+          <w:lang w:val="es-ES"/>
+        </w:rPr>
+        <w:t>lugar</w:t>
+      </w:r>
+      <w:proofErr w:type="gramEnd"/>
+      <w:r>
+        <w:rPr>
+          <w:lang w:val="es-ES"/>
+        </w:rPr>
+        <w:t xml:space="preserve"> trabajaremos con el análisis de imágenes intentando conseguir los </w:t>
+      </w:r>
+      <w:proofErr w:type="spellStart"/>
+      <w:r>
+        <w:rPr>
+          <w:lang w:val="es-ES"/>
+        </w:rPr>
+        <w:t>keypoints</w:t>
+      </w:r>
+      <w:proofErr w:type="spellEnd"/>
+      <w:r>
+        <w:rPr>
+          <w:lang w:val="es-ES"/>
+        </w:rPr>
+        <w:t xml:space="preserve"> del cuerpo humano a través de </w:t>
+      </w:r>
+      <w:proofErr w:type="spellStart"/>
+      <w:r>
+        <w:rPr>
+          <w:lang w:val="es-ES"/>
+        </w:rPr>
+        <w:t>mediapipe</w:t>
+      </w:r>
+      <w:proofErr w:type="spellEnd"/>
+      <w:r>
+        <w:rPr>
+          <w:lang w:val="es-ES"/>
+        </w:rPr>
+        <w:t xml:space="preserve">. Para ello requiere un análisis </w:t>
+      </w:r>
+      <w:proofErr w:type="spellStart"/>
+      <w:r>
+        <w:rPr>
+          <w:lang w:val="es-ES"/>
+        </w:rPr>
+        <w:t>he</w:t>
+      </w:r>
+      <w:proofErr w:type="spellEnd"/>
+      <w:r>
+        <w:rPr>
+          <w:lang w:val="es-ES"/>
+        </w:rPr>
+        <w:t xml:space="preserve"> investigación propia, tanto de la propia </w:t>
+      </w:r>
+      <w:proofErr w:type="spellStart"/>
+      <w:r>
+        <w:rPr>
+          <w:lang w:val="es-ES"/>
+        </w:rPr>
+        <w:t>docimentacion</w:t>
+      </w:r>
+      <w:proofErr w:type="spellEnd"/>
+      <w:r>
+        <w:rPr>
+          <w:lang w:val="es-ES"/>
+        </w:rPr>
+        <w:t xml:space="preserve"> como de repositorios de </w:t>
+      </w:r>
+      <w:proofErr w:type="spellStart"/>
+      <w:r>
+        <w:rPr>
+          <w:lang w:val="es-ES"/>
+        </w:rPr>
+        <w:t>github</w:t>
+      </w:r>
+      <w:proofErr w:type="spellEnd"/>
+      <w:r>
+        <w:rPr>
+          <w:lang w:val="es-ES"/>
+        </w:rPr>
+        <w:t xml:space="preserve"> los cuales ya han usado esta técnica. </w:t>
+      </w:r>
+    </w:p>
+    <w:p>
+      <w:pPr>
+        <w:rPr>
+          <w:lang w:val="es-ES"/>
+        </w:rPr>
+      </w:pPr>
+      <w:r>
+        <w:rPr>
+          <w:lang w:val="es-ES"/>
+        </w:rPr>
+        <w:t xml:space="preserve">Una vez obtenido los 33 </w:t>
+      </w:r>
+      <w:proofErr w:type="spellStart"/>
+      <w:r>
+        <w:rPr>
+          <w:lang w:val="es-ES"/>
+        </w:rPr>
+        <w:t>keypoints</w:t>
+      </w:r>
+      <w:proofErr w:type="spellEnd"/>
+      <w:r>
+        <w:rPr>
+          <w:lang w:val="es-ES"/>
+        </w:rPr>
+        <w:t xml:space="preserve"> intentamos calcular los ángulos de las articulaciones </w:t>
+      </w:r>
+      <w:proofErr w:type="spellStart"/>
+      <w:r>
+        <w:rPr>
+          <w:lang w:val="es-ES"/>
+        </w:rPr>
+        <w:t>mas</w:t>
+      </w:r>
+      <w:proofErr w:type="spellEnd"/>
+      <w:r>
+        <w:rPr>
+          <w:lang w:val="es-ES"/>
+        </w:rPr>
+        <w:t xml:space="preserve"> importantes del cuerpo como rodilla, </w:t>
+      </w:r>
+      <w:proofErr w:type="gramStart"/>
+      <w:r>
+        <w:rPr>
+          <w:lang w:val="es-ES"/>
+        </w:rPr>
+        <w:t>codo ,</w:t>
+      </w:r>
+      <w:proofErr w:type="gramEnd"/>
+      <w:r>
+        <w:rPr>
+          <w:lang w:val="es-ES"/>
+        </w:rPr>
+        <w:t>… Una vez obtenidos estos ángulos me doy cuenta de los siguientes problemas:</w:t>
       </w:r>
     </w:p>
     <w:p>
@@ -532,7 +744,49 @@
         <w:rPr>
           <w:lang w:val="es-ES"/>
         </w:rPr>
-        <w:t>Hay veces que medipipe, aporta ciertos valores con poca fiabilidad (la cual el propio mediapipe te indica a través de un parámetro de fiabilidad), al calcular los ángulos con parámetros poco fiables hay muchos errores, la solución propuesta, es la técnica del espejo, ya que la mayoría de valores poco fiables es debido al perfil de la cámara y la sola obtención de un perfil del usuario.</w:t>
+        <w:t xml:space="preserve">Hay veces que </w:t>
+      </w:r>
+      <w:proofErr w:type="spellStart"/>
+      <w:r>
+        <w:rPr>
+          <w:lang w:val="es-ES"/>
+        </w:rPr>
+        <w:t>medipipe</w:t>
+      </w:r>
+      <w:proofErr w:type="spellEnd"/>
+      <w:r>
+        <w:rPr>
+          <w:lang w:val="es-ES"/>
+        </w:rPr>
+        <w:t xml:space="preserve">, aporta ciertos valores con poca fiabilidad (la cual el propio </w:t>
+      </w:r>
+      <w:proofErr w:type="spellStart"/>
+      <w:r>
+        <w:rPr>
+          <w:lang w:val="es-ES"/>
+        </w:rPr>
+        <w:t>mediapipe</w:t>
+      </w:r>
+      <w:proofErr w:type="spellEnd"/>
+      <w:r>
+        <w:rPr>
+          <w:lang w:val="es-ES"/>
+        </w:rPr>
+        <w:t xml:space="preserve"> te indica a través de un parámetro de fiabilidad), al calcular los ángulos con parámetros poco fiables hay muchos errores, la solución propuesta, es la técnica del espejo, ya que la mayoría de </w:t>
+      </w:r>
+      <w:proofErr w:type="gramStart"/>
+      <w:r>
+        <w:rPr>
+          <w:lang w:val="es-ES"/>
+        </w:rPr>
+        <w:t>valores</w:t>
+      </w:r>
+      <w:proofErr w:type="gramEnd"/>
+      <w:r>
+        <w:rPr>
+          <w:lang w:val="es-ES"/>
+        </w:rPr>
+        <w:t xml:space="preserve"> poco fiables es debido al perfil de la cámara y la sola obtención de un perfil del usuario.</w:t>
       </w:r>
     </w:p>
     <w:p>
@@ -572,46 +826,228 @@
           <w:lang w:val="es-ES"/>
         </w:rPr>
         <w:lastRenderedPageBreak/>
-        <w:t>Antes de todo he decidido conversar con un experto en la materia (graduado den CACYFD) para que me aconseje sobre el trabajo que estoy realizando con respecto a al biomecanica y demás. Me ha sugerido añadir el calculo del centro de sustentación, el cual tiene una serie de ventajas y hace que se pueda profesionalizar el análisis del ejercicio.</w:t>
-      </w:r>
-    </w:p>
-    <w:p>
-      <w:pPr>
-        <w:rPr>
-          <w:lang w:val="es-ES"/>
-        </w:rPr>
-      </w:pPr>
-      <w:r>
-        <w:rPr>
-          <w:lang w:val="es-ES"/>
-        </w:rPr>
-        <w:t>Una vez que tenemos un archivo con todos los ángulos del cuerpo la idea es entrenar a una red neuronal para conseguir que obtenga ciertas conclusiones de los ángulos. Para ello hay que investigar sobre que red es la más adecuada para nuestro caso, y trazar un plan de entrenamiento o fine tunning (a poder ser).</w:t>
-      </w:r>
-    </w:p>
-    <w:p>
-      <w:pPr>
-        <w:rPr>
-          <w:lang w:val="es-ES"/>
-        </w:rPr>
-      </w:pPr>
-      <w:r>
-        <w:rPr>
-          <w:lang w:val="es-ES"/>
-        </w:rPr>
-        <w:t>Han surgido ciertos problemas a la hora de revisar el trabajo realizado y analizar el csv. Además, hablar con el experto en biomecanica me ha llevado a hacer algunos cambios en el código y en la forma de entender el proceso. En cuanto a software he decidido actualizar el código y las dependencias a la versión más nueva de medipipe, ya que ha salido recientemente y he visto que tiene bastantes mejoras, el inconveniente es que me ha tocado cambiar el código. Otro aspecto es en la forma de analizar los datos, mediapipe da un valor junto con cada keypoint de confianza, he decidido filtrar los keypoints por una confianza (variable y en pruebas), para asegurar tener una serie de datos más fiables, dejando espacios vacíos en el conjunto de datos si no se capturan bien en lugar de hacer la técnica del espejo o simplemente valores poco fiables. En cuanto a la técnica del espejo he estado investigando debido al consejo del experto, ya que hemos llegado a la conclusión de que la simetría es un aspecto importante a la hora de analizar un ejercicio y al hacer la técnica del espejo si una parte del cuerpo no se ve estamos asumiendo una simetría inventada que puede dar lugar a errores.</w:t>
-      </w:r>
-    </w:p>
-    <w:p>
-      <w:pPr>
-        <w:rPr>
-          <w:lang w:val="es-ES"/>
-        </w:rPr>
-      </w:pPr>
-      <w:r>
-        <w:rPr>
-          <w:lang w:val="es-ES"/>
-        </w:rPr>
-        <w:t>Al hablar con la tutora después de investigar un poco sobre el ML y como funciona en la parte práctica, nos hemos dado cuenta que es muy difícil entrenar una red neuronal que consiga generalizar y ofrecer técnicas correctas para todos los ejercicios. Por lo que hemos obtado por seguir une esquema híbrido en el que nuestra propia red neuronal sacará unos ciertos parámetros para analizar SOLO el movimiento de sentadilla, mientras que para analizar los demás movimientos la idea ahora es subir el archivo con los ángulos y el punto de sustentación (el cual también hemos añadido gracias al experto) y que una IA externa ya entrenada nos analice el ejercicio para poder otorgar una respuesta al usuario sea el ejercicio que sea.</w:t>
+        <w:t xml:space="preserve">Antes de todo he decidido conversar con un experto en la materia (graduado den CACYFD) para que me aconseje sobre el trabajo que estoy realizando con respecto a </w:t>
+      </w:r>
+      <w:proofErr w:type="spellStart"/>
+      <w:r>
+        <w:rPr>
+          <w:lang w:val="es-ES"/>
+        </w:rPr>
+        <w:t>al</w:t>
+      </w:r>
+      <w:proofErr w:type="spellEnd"/>
+      <w:r>
+        <w:rPr>
+          <w:lang w:val="es-ES"/>
+        </w:rPr>
+        <w:t xml:space="preserve"> </w:t>
+      </w:r>
+      <w:proofErr w:type="spellStart"/>
+      <w:r>
+        <w:rPr>
+          <w:lang w:val="es-ES"/>
+        </w:rPr>
+        <w:t>biomecanica</w:t>
+      </w:r>
+      <w:proofErr w:type="spellEnd"/>
+      <w:r>
+        <w:rPr>
+          <w:lang w:val="es-ES"/>
+        </w:rPr>
+        <w:t xml:space="preserve"> y demás. Me ha sugerido añadir el </w:t>
+      </w:r>
+      <w:proofErr w:type="spellStart"/>
+      <w:r>
+        <w:rPr>
+          <w:lang w:val="es-ES"/>
+        </w:rPr>
+        <w:t>calculo</w:t>
+      </w:r>
+      <w:proofErr w:type="spellEnd"/>
+      <w:r>
+        <w:rPr>
+          <w:lang w:val="es-ES"/>
+        </w:rPr>
+        <w:t xml:space="preserve"> del centro de sustentación, el cual tiene una serie de ventajas y hace que se pueda profesionalizar el análisis del ejercicio.</w:t>
+      </w:r>
+    </w:p>
+    <w:p>
+      <w:pPr>
+        <w:rPr>
+          <w:lang w:val="es-ES"/>
+        </w:rPr>
+      </w:pPr>
+      <w:r>
+        <w:rPr>
+          <w:lang w:val="es-ES"/>
+        </w:rPr>
+        <w:t xml:space="preserve">Una vez que tenemos un archivo con todos los ángulos del cuerpo la idea es entrenar a una red neuronal para conseguir que obtenga ciertas conclusiones de los ángulos. Para ello hay que investigar sobre que red es la más adecuada para nuestro caso, y trazar un plan de entrenamiento o fine </w:t>
+      </w:r>
+      <w:proofErr w:type="spellStart"/>
+      <w:r>
+        <w:rPr>
+          <w:lang w:val="es-ES"/>
+        </w:rPr>
+        <w:t>tunning</w:t>
+      </w:r>
+      <w:proofErr w:type="spellEnd"/>
+      <w:r>
+        <w:rPr>
+          <w:lang w:val="es-ES"/>
+        </w:rPr>
+        <w:t xml:space="preserve"> (a poder ser).</w:t>
+      </w:r>
+    </w:p>
+    <w:p>
+      <w:pPr>
+        <w:rPr>
+          <w:lang w:val="es-ES"/>
+        </w:rPr>
+      </w:pPr>
+      <w:r>
+        <w:rPr>
+          <w:lang w:val="es-ES"/>
+        </w:rPr>
+        <w:t xml:space="preserve">Han surgido ciertos problemas a la hora de revisar el trabajo realizado y analizar el </w:t>
+      </w:r>
+      <w:proofErr w:type="spellStart"/>
+      <w:r>
+        <w:rPr>
+          <w:lang w:val="es-ES"/>
+        </w:rPr>
+        <w:t>csv</w:t>
+      </w:r>
+      <w:proofErr w:type="spellEnd"/>
+      <w:r>
+        <w:rPr>
+          <w:lang w:val="es-ES"/>
+        </w:rPr>
+        <w:t xml:space="preserve">. Además, hablar con el experto en </w:t>
+      </w:r>
+      <w:proofErr w:type="spellStart"/>
+      <w:r>
+        <w:rPr>
+          <w:lang w:val="es-ES"/>
+        </w:rPr>
+        <w:t>biomecanica</w:t>
+      </w:r>
+      <w:proofErr w:type="spellEnd"/>
+      <w:r>
+        <w:rPr>
+          <w:lang w:val="es-ES"/>
+        </w:rPr>
+        <w:t xml:space="preserve"> me ha llevado a hacer algunos cambios en el código y en la forma de entender el proceso. En cuanto a software he decidido actualizar el código y las dependencias a la versión más nueva de </w:t>
+      </w:r>
+      <w:proofErr w:type="spellStart"/>
+      <w:r>
+        <w:rPr>
+          <w:lang w:val="es-ES"/>
+        </w:rPr>
+        <w:t>medipipe</w:t>
+      </w:r>
+      <w:proofErr w:type="spellEnd"/>
+      <w:r>
+        <w:rPr>
+          <w:lang w:val="es-ES"/>
+        </w:rPr>
+        <w:t xml:space="preserve">, ya que ha salido recientemente y he visto que tiene bastantes mejoras, el inconveniente es que me ha tocado cambiar el código. Otro aspecto es en la forma de analizar los datos, </w:t>
+      </w:r>
+      <w:proofErr w:type="spellStart"/>
+      <w:r>
+        <w:rPr>
+          <w:lang w:val="es-ES"/>
+        </w:rPr>
+        <w:t>mediapipe</w:t>
+      </w:r>
+      <w:proofErr w:type="spellEnd"/>
+      <w:r>
+        <w:rPr>
+          <w:lang w:val="es-ES"/>
+        </w:rPr>
+        <w:t xml:space="preserve"> da un valor junto con cada </w:t>
+      </w:r>
+      <w:proofErr w:type="spellStart"/>
+      <w:r>
+        <w:rPr>
+          <w:lang w:val="es-ES"/>
+        </w:rPr>
+        <w:t>keypoint</w:t>
+      </w:r>
+      <w:proofErr w:type="spellEnd"/>
+      <w:r>
+        <w:rPr>
+          <w:lang w:val="es-ES"/>
+        </w:rPr>
+        <w:t xml:space="preserve"> de confianza, he decidido filtrar los </w:t>
+      </w:r>
+      <w:proofErr w:type="spellStart"/>
+      <w:r>
+        <w:rPr>
+          <w:lang w:val="es-ES"/>
+        </w:rPr>
+        <w:t>keypoints</w:t>
+      </w:r>
+      <w:proofErr w:type="spellEnd"/>
+      <w:r>
+        <w:rPr>
+          <w:lang w:val="es-ES"/>
+        </w:rPr>
+        <w:t xml:space="preserve"> por una confianza (variable y en pruebas), para asegurar tener una serie de datos más fiables, dejando espacios vacíos en el conjunto de datos si no se capturan bien en lugar de hacer la técnica del espejo o simplemente valores poco fiables. En cuanto a la técnica del espejo he estado investigando debido al consejo del experto, ya que hemos llegado a la conclusión de que la simetría es un aspecto importante a la hora de analizar un ejercicio y al hacer la técnica del espejo si una parte del cuerpo no se ve estamos asumiendo una simetría inventada que puede dar lugar a errores.</w:t>
+      </w:r>
+    </w:p>
+    <w:p>
+      <w:pPr>
+        <w:rPr>
+          <w:lang w:val="es-ES"/>
+        </w:rPr>
+      </w:pPr>
+      <w:r>
+        <w:rPr>
+          <w:lang w:val="es-ES"/>
+        </w:rPr>
+        <w:t xml:space="preserve">Al hablar con la tutora después de investigar un poco sobre el ML y </w:t>
+      </w:r>
+      <w:proofErr w:type="spellStart"/>
+      <w:r>
+        <w:rPr>
+          <w:lang w:val="es-ES"/>
+        </w:rPr>
+        <w:t>como</w:t>
+      </w:r>
+      <w:proofErr w:type="spellEnd"/>
+      <w:r>
+        <w:rPr>
+          <w:lang w:val="es-ES"/>
+        </w:rPr>
+        <w:t xml:space="preserve"> funciona en la parte práctica, nos hemos dado cuenta </w:t>
+      </w:r>
+      <w:proofErr w:type="gramStart"/>
+      <w:r>
+        <w:rPr>
+          <w:lang w:val="es-ES"/>
+        </w:rPr>
+        <w:t>que</w:t>
+      </w:r>
+      <w:proofErr w:type="gramEnd"/>
+      <w:r>
+        <w:rPr>
+          <w:lang w:val="es-ES"/>
+        </w:rPr>
+        <w:t xml:space="preserve"> es muy difícil entrenar una red neuronal que consiga generalizar y ofrecer técnicas correctas para todos los ejercicios. Por lo que hemos </w:t>
+      </w:r>
+      <w:proofErr w:type="spellStart"/>
+      <w:r>
+        <w:rPr>
+          <w:lang w:val="es-ES"/>
+        </w:rPr>
+        <w:t>obtado</w:t>
+      </w:r>
+      <w:proofErr w:type="spellEnd"/>
+      <w:r>
+        <w:rPr>
+          <w:lang w:val="es-ES"/>
+        </w:rPr>
+        <w:t xml:space="preserve"> por seguir une esquema híbrido en el que nuestra propia red neuronal sacará unos ciertos parámetros para analizar SOLO el movimiento de sentadilla, mientras que para analizar los demás movimientos la idea ahora es subir el archivo con los ángulos y el punto de sustentación (el cual también hemos añadido gracias al experto) y que una IA externa ya entrenada nos analice el ejercicio para poder otorgar una respuesta al usuario sea el ejercicio que sea.</w:t>
       </w:r>
     </w:p>
     <w:p>
@@ -638,7 +1074,35 @@
         <w:rPr>
           <w:lang w:val="es-ES"/>
         </w:rPr>
-        <w:t xml:space="preserve">Creación de la red BILSTM y búsqueda de ejemplos para su entrenamiento, una vez recopilada gran cantidad de datos me doy cuenta de la carencia de datos de ejecuciones de sentadilla erróneas, por lo que la siguiente semana me dispondré a grabrme a mi y algunos compañeros que se han ofrecido a ayudarme, ya que para el entrenamiento de la red necesito tanto ejecuciones correctas como incorrectas. </w:t>
+        <w:t xml:space="preserve">Creación de la red BILSTM y búsqueda de ejemplos para su entrenamiento, una vez recopilada gran cantidad de datos me doy cuenta de la carencia de datos de ejecuciones de sentadilla erróneas, por lo que la siguiente semana me dispondré a </w:t>
+      </w:r>
+      <w:proofErr w:type="spellStart"/>
+      <w:r>
+        <w:rPr>
+          <w:lang w:val="es-ES"/>
+        </w:rPr>
+        <w:t>grabrme</w:t>
+      </w:r>
+      <w:proofErr w:type="spellEnd"/>
+      <w:r>
+        <w:rPr>
+          <w:lang w:val="es-ES"/>
+        </w:rPr>
+        <w:t xml:space="preserve"> a </w:t>
+      </w:r>
+      <w:proofErr w:type="spellStart"/>
+      <w:r>
+        <w:rPr>
+          <w:lang w:val="es-ES"/>
+        </w:rPr>
+        <w:t>mi</w:t>
+      </w:r>
+      <w:proofErr w:type="spellEnd"/>
+      <w:r>
+        <w:rPr>
+          <w:lang w:val="es-ES"/>
+        </w:rPr>
+        <w:t xml:space="preserve"> y algunos compañeros que se han ofrecido a ayudarme, ya que para el entrenamiento de la red necesito tanto ejecuciones correctas como incorrectas. </w:t>
       </w:r>
     </w:p>
     <w:p>
@@ -665,7 +1129,63 @@
           <w:lang w:val="es-ES"/>
         </w:rPr>
         <w:lastRenderedPageBreak/>
-        <w:t>Gracias a mi tutora Carolina, tengo la oportunidad de ir al centro de IA de la empresa BISITE, en el cúal además de enseñarme gran cantidad de proyectos me sirve para preguntar algunas dudas que tenía, contar mi trabajo y recibir recomendaciones las cuales las hemos evaluado y llegado a la siguiente conclusión. Les encanta el proyecto pero un integrante del grupo de investigación me sugiere probar con el siguiente tipo de red XGboost, en caso de algún problema con el tipo de red ya seleccionado obtaremos seguramente por hacer una comparaciñon con este otro tipo de red para obtener un mejor resultado.</w:t>
+        <w:t xml:space="preserve">Gracias a mi tutora Carolina, tengo la oportunidad de ir al centro de IA de la empresa BISITE, en el </w:t>
+      </w:r>
+      <w:proofErr w:type="spellStart"/>
+      <w:r>
+        <w:rPr>
+          <w:lang w:val="es-ES"/>
+        </w:rPr>
+        <w:t>cúal</w:t>
+      </w:r>
+      <w:proofErr w:type="spellEnd"/>
+      <w:r>
+        <w:rPr>
+          <w:lang w:val="es-ES"/>
+        </w:rPr>
+        <w:t xml:space="preserve"> además de enseñarme gran cantidad de proyectos me sirve para preguntar algunas dudas que tenía, contar mi trabajo y recibir recomendaciones las cuales las hemos evaluado y llegado a la siguiente conclusión. Les encanta el proyecto pero un integrante del grupo de investigación me sugiere probar con el siguiente tipo de red </w:t>
+      </w:r>
+      <w:proofErr w:type="spellStart"/>
+      <w:r>
+        <w:rPr>
+          <w:lang w:val="es-ES"/>
+        </w:rPr>
+        <w:t>XGboost</w:t>
+      </w:r>
+      <w:proofErr w:type="spellEnd"/>
+      <w:r>
+        <w:rPr>
+          <w:lang w:val="es-ES"/>
+        </w:rPr>
+        <w:t xml:space="preserve">, en caso de algún problema con el tipo de red ya seleccionado </w:t>
+      </w:r>
+      <w:proofErr w:type="spellStart"/>
+      <w:r>
+        <w:rPr>
+          <w:lang w:val="es-ES"/>
+        </w:rPr>
+        <w:t>obtaremos</w:t>
+      </w:r>
+      <w:proofErr w:type="spellEnd"/>
+      <w:r>
+        <w:rPr>
+          <w:lang w:val="es-ES"/>
+        </w:rPr>
+        <w:t xml:space="preserve"> seguramente por hacer una </w:t>
+      </w:r>
+      <w:proofErr w:type="spellStart"/>
+      <w:r>
+        <w:rPr>
+          <w:lang w:val="es-ES"/>
+        </w:rPr>
+        <w:t>comparaciñon</w:t>
+      </w:r>
+      <w:proofErr w:type="spellEnd"/>
+      <w:r>
+        <w:rPr>
+          <w:lang w:val="es-ES"/>
+        </w:rPr>
+        <w:t xml:space="preserve"> con este otro tipo de red para obtener un mejor resultado.</w:t>
       </w:r>
     </w:p>
     <w:p>
@@ -684,7 +1204,21 @@
         <w:rPr>
           <w:lang w:val="es-ES"/>
         </w:rPr>
-        <w:t xml:space="preserve">dedicar un tiempo a la limpieza del código para mejorar la implementación y que todo quede mejor estructurado, con nombres más sugerentes y profesionales. Además de la realización de una infografía. Es importante mencionar que todos los cambios están siendo registrados en un controlador de versiones, en este caso gitlab. </w:t>
+        <w:t xml:space="preserve">dedicar un tiempo a la limpieza del código para mejorar la implementación y que todo quede mejor estructurado, con nombres más sugerentes y profesionales. Además de la realización de una infografía. Es importante mencionar que todos los cambios están siendo registrados en un controlador de versiones, en este caso </w:t>
+      </w:r>
+      <w:proofErr w:type="spellStart"/>
+      <w:r>
+        <w:rPr>
+          <w:lang w:val="es-ES"/>
+        </w:rPr>
+        <w:t>gitlab</w:t>
+      </w:r>
+      <w:proofErr w:type="spellEnd"/>
+      <w:r>
+        <w:rPr>
+          <w:lang w:val="es-ES"/>
+        </w:rPr>
+        <w:t xml:space="preserve">. </w:t>
       </w:r>
     </w:p>
     <w:p>
@@ -711,7 +1245,105 @@
         <w:rPr>
           <w:lang w:val="es-ES"/>
         </w:rPr>
-        <w:t>Ante la falta de ejemplos de sentadillas realizadas incorrectamente he empezado a grabar a mi mismo haciendo ejemplos concretos como sentadillas que no sean profundas, con inclinación excesiva de espalda etc, además de a otras personas. Una vez armado un dataset de mas de 100 videos viene la parte difícil, la cual es etiquetar cada vídeo y cada frame para entrenar a la red. Para ello he creado una aplicación de Python para ayudarme en este proceso ya que después de una búsqueda no he conseguido encontrar una herramienta similar. Con esta herramienta nos permite ir etiquetando los momentos en la sentadilla (Stand-bajando-abajo-subiendo-stand), además al acabar una repetición nos permite darle valores a los kpis de como ha sido nuestra sentadilla. De esta forma he conseguido agilizar el proceso de etiquetado de los videos.</w:t>
+        <w:t xml:space="preserve">Ante la falta de ejemplos de sentadillas realizadas incorrectamente he empezado a grabar a </w:t>
+      </w:r>
+      <w:proofErr w:type="spellStart"/>
+      <w:r>
+        <w:rPr>
+          <w:lang w:val="es-ES"/>
+        </w:rPr>
+        <w:t>mi</w:t>
+      </w:r>
+      <w:proofErr w:type="spellEnd"/>
+      <w:r>
+        <w:rPr>
+          <w:lang w:val="es-ES"/>
+        </w:rPr>
+        <w:t xml:space="preserve"> mismo haciendo ejemplos concretos como sentadillas que no sean profundas, con inclinación excesiva de espalda </w:t>
+      </w:r>
+      <w:proofErr w:type="spellStart"/>
+      <w:r>
+        <w:rPr>
+          <w:lang w:val="es-ES"/>
+        </w:rPr>
+        <w:t>etc</w:t>
+      </w:r>
+      <w:proofErr w:type="spellEnd"/>
+      <w:r>
+        <w:rPr>
+          <w:lang w:val="es-ES"/>
+        </w:rPr>
+        <w:t xml:space="preserve">, además de a otras personas. Una vez armado un </w:t>
+      </w:r>
+      <w:proofErr w:type="spellStart"/>
+      <w:r>
+        <w:rPr>
+          <w:lang w:val="es-ES"/>
+        </w:rPr>
+        <w:t>dataset</w:t>
+      </w:r>
+      <w:proofErr w:type="spellEnd"/>
+      <w:r>
+        <w:rPr>
+          <w:lang w:val="es-ES"/>
+        </w:rPr>
+        <w:t xml:space="preserve"> de </w:t>
+      </w:r>
+      <w:proofErr w:type="spellStart"/>
+      <w:r>
+        <w:rPr>
+          <w:lang w:val="es-ES"/>
+        </w:rPr>
+        <w:t>mas</w:t>
+      </w:r>
+      <w:proofErr w:type="spellEnd"/>
+      <w:r>
+        <w:rPr>
+          <w:lang w:val="es-ES"/>
+        </w:rPr>
+        <w:t xml:space="preserve"> de 100 videos viene la parte difícil, la cual es etiquetar cada vídeo y cada </w:t>
+      </w:r>
+      <w:proofErr w:type="spellStart"/>
+      <w:r>
+        <w:rPr>
+          <w:lang w:val="es-ES"/>
+        </w:rPr>
+        <w:t>frame</w:t>
+      </w:r>
+      <w:proofErr w:type="spellEnd"/>
+      <w:r>
+        <w:rPr>
+          <w:lang w:val="es-ES"/>
+        </w:rPr>
+        <w:t xml:space="preserve"> para entrenar a la red. Para ello he creado una aplicación de Python para ayudarme en este proceso ya que después de una búsqueda no he conseguido encontrar una herramienta similar. Con esta herramienta nos permite ir etiquetando los momentos en la sentadilla (Stand-bajando-abajo-subiendo-stand), además al acabar una repetición nos permite darle valores a los </w:t>
+      </w:r>
+      <w:proofErr w:type="spellStart"/>
+      <w:r>
+        <w:rPr>
+          <w:lang w:val="es-ES"/>
+        </w:rPr>
+        <w:t>kpis</w:t>
+      </w:r>
+      <w:proofErr w:type="spellEnd"/>
+      <w:r>
+        <w:rPr>
+          <w:lang w:val="es-ES"/>
+        </w:rPr>
+        <w:t xml:space="preserve"> de </w:t>
+      </w:r>
+      <w:proofErr w:type="spellStart"/>
+      <w:r>
+        <w:rPr>
+          <w:lang w:val="es-ES"/>
+        </w:rPr>
+        <w:t>como</w:t>
+      </w:r>
+      <w:proofErr w:type="spellEnd"/>
+      <w:r>
+        <w:rPr>
+          <w:lang w:val="es-ES"/>
+        </w:rPr>
+        <w:t xml:space="preserve"> ha sido nuestra sentadilla. De esta forma he conseguido agilizar el proceso de etiquetado de los videos.</w:t>
       </w:r>
     </w:p>
     <w:p>
@@ -738,7 +1370,21 @@
         <w:rPr>
           <w:lang w:val="es-ES"/>
         </w:rPr>
-        <w:t>Después del etiquetado de los videos hemos empezado con el entreno de la red neuronal, el primer entreno ha sido con unos 40 vídeos, todos etiquetados y pasados por nuestro archivo de visión para extraer los keypoints, ángulos y demás. Las pruebas sobre este entrenamiento no han sido las esperadas ya que no he conseguido un resultado decente.</w:t>
+        <w:t xml:space="preserve">Después del etiquetado de los videos hemos empezado con el entreno de la red neuronal, el primer entreno ha sido con unos 40 vídeos, todos etiquetados y pasados por nuestro archivo de visión para extraer los </w:t>
+      </w:r>
+      <w:proofErr w:type="spellStart"/>
+      <w:r>
+        <w:rPr>
+          <w:lang w:val="es-ES"/>
+        </w:rPr>
+        <w:t>keypoints</w:t>
+      </w:r>
+      <w:proofErr w:type="spellEnd"/>
+      <w:r>
+        <w:rPr>
+          <w:lang w:val="es-ES"/>
+        </w:rPr>
+        <w:t>, ángulos y demás. Las pruebas sobre este entrenamiento no han sido las esperadas ya que no he conseguido un resultado decente.</w:t>
       </w:r>
     </w:p>
     <w:p>
@@ -804,20 +1450,118 @@
           <w:lang w:val="es-ES"/>
         </w:rPr>
         <w:lastRenderedPageBreak/>
-        <w:t>En tercer lugar tenemos que manejar los 0s, ya que cuando no es fiable la información obtenida por mediapipe lo que hacemos es poner la celda correspondiente a NaN, el problema que a la hora de entrenarla esos NaN los convertimos en 0s, lo cual puede dar lugar a que la red se confunda ya que un angulo perfectamente puede ser 0.</w:t>
-      </w:r>
-    </w:p>
-    <w:p>
-      <w:pPr>
-        <w:rPr>
-          <w:lang w:val="es-ES"/>
-        </w:rPr>
-      </w:pPr>
-      <w:r>
-        <w:rPr>
-          <w:lang w:val="es-ES"/>
-        </w:rPr>
-        <w:t>Como última opción si no conseguimos una salida exitosa podemos probar con otro modelo de red neuronal, en este caso como recomendación expresa de uno de los integrantes del departamento de ia de Bisite, usaremos una red de tipo XGBoost.</w:t>
+        <w:t xml:space="preserve">En tercer lugar tenemos que manejar los 0s, ya que cuando no es fiable la información obtenida por </w:t>
+      </w:r>
+      <w:proofErr w:type="spellStart"/>
+      <w:r>
+        <w:rPr>
+          <w:lang w:val="es-ES"/>
+        </w:rPr>
+        <w:t>mediapipe</w:t>
+      </w:r>
+      <w:proofErr w:type="spellEnd"/>
+      <w:r>
+        <w:rPr>
+          <w:lang w:val="es-ES"/>
+        </w:rPr>
+        <w:t xml:space="preserve"> lo que hacemos es poner la celda correspondiente a </w:t>
+      </w:r>
+      <w:proofErr w:type="spellStart"/>
+      <w:r>
+        <w:rPr>
+          <w:lang w:val="es-ES"/>
+        </w:rPr>
+        <w:t>NaN</w:t>
+      </w:r>
+      <w:proofErr w:type="spellEnd"/>
+      <w:r>
+        <w:rPr>
+          <w:lang w:val="es-ES"/>
+        </w:rPr>
+        <w:t xml:space="preserve">, el problema que a la hora de entrenarla esos </w:t>
+      </w:r>
+      <w:proofErr w:type="spellStart"/>
+      <w:r>
+        <w:rPr>
+          <w:lang w:val="es-ES"/>
+        </w:rPr>
+        <w:t>NaN</w:t>
+      </w:r>
+      <w:proofErr w:type="spellEnd"/>
+      <w:r>
+        <w:rPr>
+          <w:lang w:val="es-ES"/>
+        </w:rPr>
+        <w:t xml:space="preserve"> los convertimos en 0s, lo cual puede dar lugar a que la red se confunda ya que un </w:t>
+      </w:r>
+      <w:proofErr w:type="spellStart"/>
+      <w:r>
+        <w:rPr>
+          <w:lang w:val="es-ES"/>
+        </w:rPr>
+        <w:t>angulo</w:t>
+      </w:r>
+      <w:proofErr w:type="spellEnd"/>
+      <w:r>
+        <w:rPr>
+          <w:lang w:val="es-ES"/>
+        </w:rPr>
+        <w:t xml:space="preserve"> perfectamente puede ser 0.</w:t>
+      </w:r>
+    </w:p>
+    <w:p>
+      <w:pPr>
+        <w:rPr>
+          <w:lang w:val="es-ES"/>
+        </w:rPr>
+      </w:pPr>
+      <w:r>
+        <w:rPr>
+          <w:lang w:val="es-ES"/>
+        </w:rPr>
+        <w:t xml:space="preserve">Como última opción si no conseguimos una salida exitosa podemos probar con otro modelo de red neuronal, en este caso como recomendación expresa de uno de los integrantes del departamento de </w:t>
+      </w:r>
+      <w:proofErr w:type="spellStart"/>
+      <w:r>
+        <w:rPr>
+          <w:lang w:val="es-ES"/>
+        </w:rPr>
+        <w:t>ia</w:t>
+      </w:r>
+      <w:proofErr w:type="spellEnd"/>
+      <w:r>
+        <w:rPr>
+          <w:lang w:val="es-ES"/>
+        </w:rPr>
+        <w:t xml:space="preserve"> de </w:t>
+      </w:r>
+      <w:proofErr w:type="spellStart"/>
+      <w:r>
+        <w:rPr>
+          <w:lang w:val="es-ES"/>
+        </w:rPr>
+        <w:t>Bisite</w:t>
+      </w:r>
+      <w:proofErr w:type="spellEnd"/>
+      <w:r>
+        <w:rPr>
+          <w:lang w:val="es-ES"/>
+        </w:rPr>
+        <w:t xml:space="preserve">, usaremos una red de tipo </w:t>
+      </w:r>
+      <w:proofErr w:type="spellStart"/>
+      <w:r>
+        <w:rPr>
+          <w:lang w:val="es-ES"/>
+        </w:rPr>
+        <w:t>XGBoost</w:t>
+      </w:r>
+      <w:proofErr w:type="spellEnd"/>
+      <w:r>
+        <w:rPr>
+          <w:lang w:val="es-ES"/>
+        </w:rPr>
+        <w:t>.</w:t>
       </w:r>
     </w:p>
     <w:p>
@@ -863,20 +1607,48 @@
         <w:rPr>
           <w:lang w:val="es-ES"/>
         </w:rPr>
-        <w:t>Hemos hecho una pequeña prueba con una red de tipo XGBoost pero el resultado ha sido pésimo por lo que de momento hemos descartado esa opción.</w:t>
-      </w:r>
-    </w:p>
-    <w:p>
-      <w:pPr>
-        <w:rPr>
-          <w:lang w:val="es-ES"/>
-        </w:rPr>
-      </w:pPr>
-      <w:r>
-        <w:rPr>
-          <w:lang w:val="es-ES"/>
-        </w:rPr>
-        <w:t>Hemos realizado unos pequeños cambios pasandole a la red solo lo necesario para la sentadilla, es decir, descartando articulaciones de codo y hombro, además de normalizar el centro de sustentación.</w:t>
+        <w:t xml:space="preserve">Hemos hecho una pequeña prueba con una red de tipo </w:t>
+      </w:r>
+      <w:proofErr w:type="spellStart"/>
+      <w:r>
+        <w:rPr>
+          <w:lang w:val="es-ES"/>
+        </w:rPr>
+        <w:t>XGBoost</w:t>
+      </w:r>
+      <w:proofErr w:type="spellEnd"/>
+      <w:r>
+        <w:rPr>
+          <w:lang w:val="es-ES"/>
+        </w:rPr>
+        <w:t xml:space="preserve"> pero el resultado ha sido pésimo por lo que de momento hemos descartado esa opción.</w:t>
+      </w:r>
+    </w:p>
+    <w:p>
+      <w:pPr>
+        <w:rPr>
+          <w:lang w:val="es-ES"/>
+        </w:rPr>
+      </w:pPr>
+      <w:r>
+        <w:rPr>
+          <w:lang w:val="es-ES"/>
+        </w:rPr>
+        <w:t xml:space="preserve">Hemos realizado unos pequeños cambios </w:t>
+      </w:r>
+      <w:proofErr w:type="spellStart"/>
+      <w:r>
+        <w:rPr>
+          <w:lang w:val="es-ES"/>
+        </w:rPr>
+        <w:t>pasandole</w:t>
+      </w:r>
+      <w:proofErr w:type="spellEnd"/>
+      <w:r>
+        <w:rPr>
+          <w:lang w:val="es-ES"/>
+        </w:rPr>
+        <w:t xml:space="preserve"> a la red solo lo necesario para la sentadilla, es decir, descartando articulaciones de codo y hombro, además de normalizar el centro de sustentación.</w:t>
       </w:r>
     </w:p>
     <w:p>
@@ -915,7 +1687,35 @@
         <w:rPr>
           <w:lang w:val="es-ES"/>
         </w:rPr>
-        <w:t>Hemos eitiquetado más videos para hacer un entrenamiento más profundo, hemos conseguido sacar el modelo v9 el cual es el que mejores resultados nos ha dado hasta la fecha. Hay un pequeño análisis de como ha sido este modelo, ahora vamos a buscar mejorarlo.</w:t>
+        <w:t xml:space="preserve">Hemos </w:t>
+      </w:r>
+      <w:proofErr w:type="spellStart"/>
+      <w:r>
+        <w:rPr>
+          <w:lang w:val="es-ES"/>
+        </w:rPr>
+        <w:t>eitiquetado</w:t>
+      </w:r>
+      <w:proofErr w:type="spellEnd"/>
+      <w:r>
+        <w:rPr>
+          <w:lang w:val="es-ES"/>
+        </w:rPr>
+        <w:t xml:space="preserve"> más videos para hacer un entrenamiento más profundo, hemos conseguido sacar el modelo v9 el cual es el que mejores resultados nos ha dado hasta la fecha. Hay un pequeño análisis de </w:t>
+      </w:r>
+      <w:proofErr w:type="spellStart"/>
+      <w:r>
+        <w:rPr>
+          <w:lang w:val="es-ES"/>
+        </w:rPr>
+        <w:t>como</w:t>
+      </w:r>
+      <w:proofErr w:type="spellEnd"/>
+      <w:r>
+        <w:rPr>
+          <w:lang w:val="es-ES"/>
+        </w:rPr>
+        <w:t xml:space="preserve"> ha sido este modelo, ahora vamos a buscar mejorarlo.</w:t>
       </w:r>
     </w:p>
     <w:p>
@@ -1001,7 +1801,15 @@
         <w:t>Redes Neuronales Convolucionales (CNN)</w:t>
       </w:r>
       <w:r>
-        <w:t xml:space="preserve"> sobre OpenCV, concluyendo que las técnicas de barrido (ventana deslizante) son demasiado lentas para tiempo real, recomendando redes de detección de disparo único (como YOLO o SSD). </w:t>
+        <w:t xml:space="preserve"> sobre </w:t>
+      </w:r>
+      <w:proofErr w:type="spellStart"/>
+      <w:r>
+        <w:t>OpenCV</w:t>
+      </w:r>
+      <w:proofErr w:type="spellEnd"/>
+      <w:r>
+        <w:t xml:space="preserve">, concluyendo que las técnicas de barrido (ventana deslizante) son demasiado lentas para tiempo real, recomendando redes de detección de disparo único (como YOLO o SSD). </w:t>
       </w:r>
       <w:hyperlink r:id="rId10" w:history="1">
         <w:r>
@@ -1039,10 +1847,43 @@
           <w:b/>
           <w:bCs/>
         </w:rPr>
-        <w:t>Transfer Learning</w:t>
-      </w:r>
-      <w:r>
-        <w:t xml:space="preserve"> sobre una CNN (ResNet/Inception) para identificar ballenas por su cola; demuestra que el "Data Augmentation" (rotar/deformar imágenes) es vital cuando tienes pocas </w:t>
+        <w:t xml:space="preserve">Transfer </w:t>
+      </w:r>
+      <w:proofErr w:type="spellStart"/>
+      <w:r>
+        <w:rPr>
+          <w:b/>
+          <w:bCs/>
+        </w:rPr>
+        <w:t>Learning</w:t>
+      </w:r>
+      <w:proofErr w:type="spellEnd"/>
+      <w:r>
+        <w:t xml:space="preserve"> sobre una CNN (</w:t>
+      </w:r>
+      <w:proofErr w:type="spellStart"/>
+      <w:r>
+        <w:t>ResNet</w:t>
+      </w:r>
+      <w:proofErr w:type="spellEnd"/>
+      <w:r>
+        <w:t>/</w:t>
+      </w:r>
+      <w:proofErr w:type="spellStart"/>
+      <w:r>
+        <w:t>Inception</w:t>
+      </w:r>
+      <w:proofErr w:type="spellEnd"/>
+      <w:r>
+        <w:t xml:space="preserve">) para identificar ballenas por su cola; demuestra que el "Data </w:t>
+      </w:r>
+      <w:proofErr w:type="spellStart"/>
+      <w:r>
+        <w:t>Augmentation</w:t>
+      </w:r>
+      <w:proofErr w:type="spellEnd"/>
+      <w:r>
+        <w:t xml:space="preserve">" (rotar/deformar imágenes) es vital cuando tienes pocas </w:t>
       </w:r>
       <w:r>
         <w:lastRenderedPageBreak/>
@@ -1097,8 +1938,17 @@
           <w:b/>
           <w:bCs/>
         </w:rPr>
-        <w:t>Momentos de Hu</w:t>
-      </w:r>
+        <w:t xml:space="preserve">Momentos de </w:t>
+      </w:r>
+      <w:proofErr w:type="spellStart"/>
+      <w:r>
+        <w:rPr>
+          <w:b/>
+          <w:bCs/>
+        </w:rPr>
+        <w:t>Hu</w:t>
+      </w:r>
+      <w:proofErr w:type="spellEnd"/>
       <w:r>
         <w:t xml:space="preserve"> (geometría de la forma) y una </w:t>
       </w:r>
@@ -1138,7 +1988,23 @@
           <w:b/>
           <w:bCs/>
         </w:rPr>
-        <w:t>Santa María et al. (Artículo - Admin a2-15-26):</w:t>
+        <w:t xml:space="preserve">Santa María et al. (Artículo - </w:t>
+      </w:r>
+      <w:proofErr w:type="spellStart"/>
+      <w:r>
+        <w:rPr>
+          <w:b/>
+          <w:bCs/>
+        </w:rPr>
+        <w:t>Admin</w:t>
+      </w:r>
+      <w:proofErr w:type="spellEnd"/>
+      <w:r>
+        <w:rPr>
+          <w:b/>
+          <w:bCs/>
+        </w:rPr>
+        <w:t xml:space="preserve"> a2-15-26):</w:t>
       </w:r>
       <w:r>
         <w:t xml:space="preserve"> Implementa un sistema de </w:t>
@@ -1179,7 +2045,39 @@
           <w:b/>
           <w:bCs/>
         </w:rPr>
-        <w:t>Sara Pardo Feijoo (PFC - Bag of Words):</w:t>
+        <w:t xml:space="preserve">Sara Pardo Feijoo (PFC - Bag </w:t>
+      </w:r>
+      <w:proofErr w:type="spellStart"/>
+      <w:r>
+        <w:rPr>
+          <w:b/>
+          <w:bCs/>
+        </w:rPr>
+        <w:t>of</w:t>
+      </w:r>
+      <w:proofErr w:type="spellEnd"/>
+      <w:r>
+        <w:rPr>
+          <w:b/>
+          <w:bCs/>
+        </w:rPr>
+        <w:t xml:space="preserve"> </w:t>
+      </w:r>
+      <w:proofErr w:type="spellStart"/>
+      <w:r>
+        <w:rPr>
+          <w:b/>
+          <w:bCs/>
+        </w:rPr>
+        <w:t>Words</w:t>
+      </w:r>
+      <w:proofErr w:type="spellEnd"/>
+      <w:r>
+        <w:rPr>
+          <w:b/>
+          <w:bCs/>
+        </w:rPr>
+        <w:t>):</w:t>
       </w:r>
       <w:r>
         <w:t xml:space="preserve"> Aplica el modelo </w:t>
@@ -1189,7 +2087,55 @@
           <w:b/>
           <w:bCs/>
         </w:rPr>
-        <w:t>"Bag of Words" (BoW)</w:t>
+        <w:t xml:space="preserve">"Bag </w:t>
+      </w:r>
+      <w:proofErr w:type="spellStart"/>
+      <w:r>
+        <w:rPr>
+          <w:b/>
+          <w:bCs/>
+        </w:rPr>
+        <w:t>of</w:t>
+      </w:r>
+      <w:proofErr w:type="spellEnd"/>
+      <w:r>
+        <w:rPr>
+          <w:b/>
+          <w:bCs/>
+        </w:rPr>
+        <w:t xml:space="preserve"> </w:t>
+      </w:r>
+      <w:proofErr w:type="spellStart"/>
+      <w:r>
+        <w:rPr>
+          <w:b/>
+          <w:bCs/>
+        </w:rPr>
+        <w:t>Words</w:t>
+      </w:r>
+      <w:proofErr w:type="spellEnd"/>
+      <w:r>
+        <w:rPr>
+          <w:b/>
+          <w:bCs/>
+        </w:rPr>
+        <w:t>" (</w:t>
+      </w:r>
+      <w:proofErr w:type="spellStart"/>
+      <w:r>
+        <w:rPr>
+          <w:b/>
+          <w:bCs/>
+        </w:rPr>
+        <w:t>BoW</w:t>
+      </w:r>
+      <w:proofErr w:type="spellEnd"/>
+      <w:r>
+        <w:rPr>
+          <w:b/>
+          <w:bCs/>
+        </w:rPr>
+        <w:t>)</w:t>
       </w:r>
       <w:r>
         <w:t xml:space="preserve">, que trata la imagen como un "saco" de parches visuales desordenados (sin geometría); útil para buscar objetos en bases de datos, pero inservible para detectar posturas donde la posición de las partes es clave. </w:t>
@@ -1289,7 +2235,25 @@
           <w:szCs w:val="24"/>
           <w:lang w:val="es-ES"/>
         </w:rPr>
-        <w:t>La dificultad de entrenar de cero una red neuronal para conseguir el resultado deseado, es mejor usar una ya entrenada como por ejemplo OpenPose o similar.</w:t>
+        <w:t xml:space="preserve">La dificultad de entrenar de cero una red neuronal para conseguir el resultado deseado, es mejor usar una ya entrenada como por ejemplo </w:t>
+      </w:r>
+      <w:proofErr w:type="spellStart"/>
+      <w:r>
+        <w:rPr>
+          <w:sz w:val="24"/>
+          <w:szCs w:val="24"/>
+          <w:lang w:val="es-ES"/>
+        </w:rPr>
+        <w:t>OpenPose</w:t>
+      </w:r>
+      <w:proofErr w:type="spellEnd"/>
+      <w:r>
+        <w:rPr>
+          <w:sz w:val="24"/>
+          <w:szCs w:val="24"/>
+          <w:lang w:val="es-ES"/>
+        </w:rPr>
+        <w:t xml:space="preserve"> o similar.</w:t>
       </w:r>
     </w:p>
     <w:p>
@@ -1311,15 +2275,51 @@
           <w:szCs w:val="24"/>
           <w:lang w:val="es-ES"/>
         </w:rPr>
-        <w:t>La retropropagación es útil para entrenar una de cero ya que es fácilmente entendible pero lo más usado hoy en día son redes convolucionales</w:t>
-      </w:r>
+        <w:t xml:space="preserve">La </w:t>
+      </w:r>
+      <w:proofErr w:type="spellStart"/>
       <w:r>
         <w:rPr>
           <w:sz w:val="24"/>
           <w:szCs w:val="24"/>
           <w:lang w:val="es-ES"/>
         </w:rPr>
-        <w:t>, es decir, deeplearning.</w:t>
+        <w:t>retropropagación</w:t>
+      </w:r>
+      <w:proofErr w:type="spellEnd"/>
+      <w:r>
+        <w:rPr>
+          <w:sz w:val="24"/>
+          <w:szCs w:val="24"/>
+          <w:lang w:val="es-ES"/>
+        </w:rPr>
+        <w:t xml:space="preserve"> es útil para entrenar una de cero ya que es fácilmente entendible pero lo más usado hoy en día son redes convolucionales</w:t>
+      </w:r>
+      <w:r>
+        <w:rPr>
+          <w:sz w:val="24"/>
+          <w:szCs w:val="24"/>
+          <w:lang w:val="es-ES"/>
+        </w:rPr>
+        <w:t xml:space="preserve">, es decir, </w:t>
+      </w:r>
+      <w:proofErr w:type="spellStart"/>
+      <w:r>
+        <w:rPr>
+          <w:sz w:val="24"/>
+          <w:szCs w:val="24"/>
+          <w:lang w:val="es-ES"/>
+        </w:rPr>
+        <w:t>deeplearning</w:t>
+      </w:r>
+      <w:proofErr w:type="spellEnd"/>
+      <w:r>
+        <w:rPr>
+          <w:sz w:val="24"/>
+          <w:szCs w:val="24"/>
+          <w:lang w:val="es-ES"/>
+        </w:rPr>
+        <w:t>.</w:t>
       </w:r>
     </w:p>
     <w:p>
@@ -1341,7 +2341,25 @@
           <w:szCs w:val="24"/>
           <w:lang w:val="es-ES"/>
         </w:rPr>
-        <w:t>La idea de analizar los datos extraídos de las herramientas como openpose a través de un doble enfoque, ya sea a través de ML con las aplicaciones</w:t>
+        <w:t xml:space="preserve">La idea de analizar los datos extraídos de las herramientas como </w:t>
+      </w:r>
+      <w:proofErr w:type="spellStart"/>
+      <w:r>
+        <w:rPr>
+          <w:sz w:val="24"/>
+          <w:szCs w:val="24"/>
+          <w:lang w:val="es-ES"/>
+        </w:rPr>
+        <w:t>openpose</w:t>
+      </w:r>
+      <w:proofErr w:type="spellEnd"/>
+      <w:r>
+        <w:rPr>
+          <w:sz w:val="24"/>
+          <w:szCs w:val="24"/>
+          <w:lang w:val="es-ES"/>
+        </w:rPr>
+        <w:t xml:space="preserve"> a través de un doble enfoque, ya sea a través de ML con las aplicaciones</w:t>
       </w:r>
       <w:r>
         <w:t xml:space="preserve"> </w:t>
@@ -1382,7 +2400,25 @@
           <w:szCs w:val="24"/>
           <w:lang w:val="es-ES"/>
         </w:rPr>
-        <w:t>La importancia de tratar las imágenes con OpenCV antes de pasar a procesarlas.</w:t>
+        <w:t xml:space="preserve">La importancia de tratar las imágenes con </w:t>
+      </w:r>
+      <w:proofErr w:type="spellStart"/>
+      <w:r>
+        <w:rPr>
+          <w:sz w:val="24"/>
+          <w:szCs w:val="24"/>
+          <w:lang w:val="es-ES"/>
+        </w:rPr>
+        <w:t>OpenCV</w:t>
+      </w:r>
+      <w:proofErr w:type="spellEnd"/>
+      <w:r>
+        <w:rPr>
+          <w:sz w:val="24"/>
+          <w:szCs w:val="24"/>
+          <w:lang w:val="es-ES"/>
+        </w:rPr>
+        <w:t xml:space="preserve"> antes de pasar a procesarlas.</w:t>
       </w:r>
     </w:p>
     <w:p>
@@ -1404,7 +2440,43 @@
           <w:szCs w:val="24"/>
           <w:lang w:val="es-ES"/>
         </w:rPr>
-        <w:t>Si en algún momento necesito usar DataSets, Kaggel es una gran fuente de información que puede llegar a ser útil. (Ballenas)</w:t>
+        <w:t xml:space="preserve">Si en algún momento necesito usar </w:t>
+      </w:r>
+      <w:proofErr w:type="spellStart"/>
+      <w:r>
+        <w:rPr>
+          <w:sz w:val="24"/>
+          <w:szCs w:val="24"/>
+          <w:lang w:val="es-ES"/>
+        </w:rPr>
+        <w:t>DataSets</w:t>
+      </w:r>
+      <w:proofErr w:type="spellEnd"/>
+      <w:r>
+        <w:rPr>
+          <w:sz w:val="24"/>
+          <w:szCs w:val="24"/>
+          <w:lang w:val="es-ES"/>
+        </w:rPr>
+        <w:t xml:space="preserve">, </w:t>
+      </w:r>
+      <w:proofErr w:type="spellStart"/>
+      <w:r>
+        <w:rPr>
+          <w:sz w:val="24"/>
+          <w:szCs w:val="24"/>
+          <w:lang w:val="es-ES"/>
+        </w:rPr>
+        <w:t>Kaggel</w:t>
+      </w:r>
+      <w:proofErr w:type="spellEnd"/>
+      <w:r>
+        <w:rPr>
+          <w:sz w:val="24"/>
+          <w:szCs w:val="24"/>
+          <w:lang w:val="es-ES"/>
+        </w:rPr>
+        <w:t xml:space="preserve"> es una gran fuente de información que puede llegar a ser útil. (Ballenas)</w:t>
       </w:r>
     </w:p>
     <w:p>
@@ -1460,7 +2532,23 @@
         <w:t>Pedro Pablo</w:t>
       </w:r>
       <w:r>
-        <w:t xml:space="preserve"> (Hu Moments), </w:t>
+        <w:t xml:space="preserve"> (</w:t>
+      </w:r>
+      <w:proofErr w:type="spellStart"/>
+      <w:r>
+        <w:t>Hu</w:t>
+      </w:r>
+      <w:proofErr w:type="spellEnd"/>
+      <w:r>
+        <w:t xml:space="preserve"> </w:t>
+      </w:r>
+      <w:proofErr w:type="spellStart"/>
+      <w:r>
+        <w:t>Moments</w:t>
+      </w:r>
+      <w:proofErr w:type="spellEnd"/>
+      <w:r>
+        <w:t xml:space="preserve">), </w:t>
       </w:r>
       <w:r>
         <w:rPr>
@@ -1480,7 +2568,23 @@
         <w:t>Sara Pardo</w:t>
       </w:r>
       <w:r>
-        <w:t xml:space="preserve"> (Bag of Words) demuestran enfoques donde el programador debe definir </w:t>
+        <w:t xml:space="preserve"> (Bag </w:t>
+      </w:r>
+      <w:proofErr w:type="spellStart"/>
+      <w:r>
+        <w:t>of</w:t>
+      </w:r>
+      <w:proofErr w:type="spellEnd"/>
+      <w:r>
+        <w:t xml:space="preserve"> </w:t>
+      </w:r>
+      <w:proofErr w:type="spellStart"/>
+      <w:r>
+        <w:t>Words</w:t>
+      </w:r>
+      <w:proofErr w:type="spellEnd"/>
+      <w:r>
+        <w:t xml:space="preserve">) demuestran enfoques donde el programador debe definir </w:t>
       </w:r>
       <w:r>
         <w:rPr>
@@ -1521,7 +2625,39 @@
           <w:b/>
           <w:bCs/>
         </w:rPr>
-        <w:t>Confirma el uso de Deep Learning (CNNs):</w:t>
+        <w:t xml:space="preserve">Confirma el uso de Deep </w:t>
+      </w:r>
+      <w:proofErr w:type="spellStart"/>
+      <w:r>
+        <w:rPr>
+          <w:b/>
+          <w:bCs/>
+        </w:rPr>
+        <w:t>Learning</w:t>
+      </w:r>
+      <w:proofErr w:type="spellEnd"/>
+      <w:r>
+        <w:rPr>
+          <w:b/>
+          <w:bCs/>
+        </w:rPr>
+        <w:t xml:space="preserve"> (</w:t>
+      </w:r>
+      <w:proofErr w:type="spellStart"/>
+      <w:r>
+        <w:rPr>
+          <w:b/>
+          <w:bCs/>
+        </w:rPr>
+        <w:t>CNNs</w:t>
+      </w:r>
+      <w:proofErr w:type="spellEnd"/>
+      <w:r>
+        <w:rPr>
+          <w:b/>
+          <w:bCs/>
+        </w:rPr>
+        <w:t>):</w:t>
       </w:r>
       <w:r>
         <w:t xml:space="preserve"> Los trabajos de </w:t>
@@ -1571,11 +2707,29 @@
           <w:b/>
           <w:bCs/>
         </w:rPr>
-        <w:t>Pose Estimation</w:t>
-      </w:r>
-      <w:r>
-        <w:t xml:space="preserve"> (como la mencionada MoveNet en tu borrador), que detecta </w:t>
-      </w:r>
+        <w:t xml:space="preserve">Pose </w:t>
+      </w:r>
+      <w:proofErr w:type="spellStart"/>
+      <w:r>
+        <w:rPr>
+          <w:b/>
+          <w:bCs/>
+        </w:rPr>
+        <w:t>Estimation</w:t>
+      </w:r>
+      <w:proofErr w:type="spellEnd"/>
+      <w:r>
+        <w:t xml:space="preserve"> (como la mencionada </w:t>
+      </w:r>
+      <w:proofErr w:type="spellStart"/>
+      <w:r>
+        <w:t>MoveNet</w:t>
+      </w:r>
+      <w:proofErr w:type="spellEnd"/>
+      <w:r>
+        <w:t xml:space="preserve"> en tu borrador), que detecta </w:t>
+      </w:r>
+      <w:proofErr w:type="spellStart"/>
       <w:r>
         <w:rPr>
           <w:i/>
@@ -1583,6 +2737,7 @@
         </w:rPr>
         <w:t>keypoints</w:t>
       </w:r>
+      <w:proofErr w:type="spellEnd"/>
       <w:r>
         <w:t xml:space="preserve"> (codos, rodillas) directamente, saltándose la fase de "aprender qué es un brazo" desde cero.</w:t>
       </w:r>
@@ -1601,7 +2756,23 @@
           <w:b/>
           <w:bCs/>
         </w:rPr>
-        <w:t>El Dataset es tu mayor cuello de botella:</w:t>
+        <w:t xml:space="preserve">El </w:t>
+      </w:r>
+      <w:proofErr w:type="spellStart"/>
+      <w:r>
+        <w:rPr>
+          <w:b/>
+          <w:bCs/>
+        </w:rPr>
+        <w:t>Dataset</w:t>
+      </w:r>
+      <w:proofErr w:type="spellEnd"/>
+      <w:r>
+        <w:rPr>
+          <w:b/>
+          <w:bCs/>
+        </w:rPr>
+        <w:t xml:space="preserve"> es tu mayor cuello de botella:</w:t>
       </w:r>
       <w:r>
         <w:t xml:space="preserve"> Todos los autores sufren con la falta de datos.</w:t>
@@ -1641,18 +2812,44 @@
           <w:b/>
           <w:bCs/>
         </w:rPr>
-        <w:t>Transfer Learning</w:t>
-      </w:r>
-      <w:r>
-        <w:t xml:space="preserve">. No entrenes tu red con vídeos tuyos desde cero. Coge un modelo pre-entrenado (en COCO o MPII Human Pose) y úsalo directamente o haz un </w:t>
+        <w:t xml:space="preserve">Transfer </w:t>
+      </w:r>
+      <w:proofErr w:type="spellStart"/>
+      <w:r>
+        <w:rPr>
+          <w:b/>
+          <w:bCs/>
+        </w:rPr>
+        <w:t>Learning</w:t>
+      </w:r>
+      <w:proofErr w:type="spellEnd"/>
+      <w:r>
+        <w:t xml:space="preserve">. No entrenes tu red con vídeos tuyos desde cero. Coge un modelo </w:t>
+      </w:r>
+      <w:proofErr w:type="spellStart"/>
+      <w:r>
+        <w:t>pre-entrenado</w:t>
+      </w:r>
+      <w:proofErr w:type="spellEnd"/>
+      <w:r>
+        <w:t xml:space="preserve"> (en COCO o MPII Human Pose) y úsalo directamente o haz un </w:t>
       </w:r>
       <w:r>
         <w:rPr>
           <w:i/>
           <w:iCs/>
         </w:rPr>
-        <w:t>fine-tuning</w:t>
-      </w:r>
+        <w:t>fine-</w:t>
+      </w:r>
+      <w:proofErr w:type="spellStart"/>
+      <w:r>
+        <w:rPr>
+          <w:i/>
+          <w:iCs/>
+        </w:rPr>
+        <w:t>tuning</w:t>
+      </w:r>
+      <w:proofErr w:type="spellEnd"/>
       <w:r>
         <w:t xml:space="preserve"> ligero. Esto es lo que diferencia un TFG académico viable de uno imposible.</w:t>
       </w:r>
@@ -1684,7 +2881,23 @@
         <w:t>Oliva</w:t>
       </w:r>
       <w:r>
-        <w:t xml:space="preserve"> demostró que técnicas precisas (ventanas deslizantes) hacen el sistema inútil en tiempo real (segundos por frame). Para tu app móvil, la conclusión es clara: sacrifica resolución de entrada (baja a 256x256 o similar) y procesa 1 de cada 5 frames. La fluidez de la app (UX) es más importante que saber si el ángulo de la rodilla es 45.1º o 45.2º.</w:t>
+        <w:t xml:space="preserve"> demostró que técnicas precisas (ventanas deslizantes) hacen el sistema inútil en tiempo real (segundos por </w:t>
+      </w:r>
+      <w:proofErr w:type="spellStart"/>
+      <w:r>
+        <w:t>frame</w:t>
+      </w:r>
+      <w:proofErr w:type="spellEnd"/>
+      <w:r>
+        <w:t xml:space="preserve">). Para tu app móvil, la conclusión es clara: sacrifica resolución de entrada (baja a 256x256 o similar) y procesa 1 de cada 5 </w:t>
+      </w:r>
+      <w:proofErr w:type="spellStart"/>
+      <w:r>
+        <w:t>frames</w:t>
+      </w:r>
+      <w:proofErr w:type="spellEnd"/>
+      <w:r>
+        <w:t>. La fluidez de la app (UX) es más importante que saber si el ángulo de la rodilla es 45.1º o 45.2º.</w:t>
       </w:r>
     </w:p>
     <w:p>
@@ -1695,11 +2908,19 @@
           <w:rFonts w:ascii="Arial" w:hAnsi="Arial" w:cs="Arial"/>
         </w:rPr>
       </w:pPr>
+      <w:proofErr w:type="spellStart"/>
       <w:r>
         <w:rPr>
           <w:rFonts w:ascii="Arial" w:hAnsi="Arial" w:cs="Arial"/>
         </w:rPr>
-        <w:t>Planning y distintas herramientas</w:t>
+        <w:t>Planning</w:t>
+      </w:r>
+      <w:proofErr w:type="spellEnd"/>
+      <w:r>
+        <w:rPr>
+          <w:rFonts w:ascii="Arial" w:hAnsi="Arial" w:cs="Arial"/>
+        </w:rPr>
+        <w:t xml:space="preserve"> y distintas herramientas</w:t>
       </w:r>
     </w:p>
     <w:p>
@@ -1723,7 +2944,35 @@
         <w:rPr>
           <w:rFonts w:ascii="Arial" w:hAnsi="Arial" w:cs="Arial"/>
         </w:rPr>
-        <w:t>1. Pipeline de Visión Artificial (Computer Vision)</w:t>
+        <w:t>1. Pipeline de Visión Artificial (</w:t>
+      </w:r>
+      <w:proofErr w:type="spellStart"/>
+      <w:r>
+        <w:rPr>
+          <w:rFonts w:ascii="Arial" w:hAnsi="Arial" w:cs="Arial"/>
+        </w:rPr>
+        <w:t>Computer</w:t>
+      </w:r>
+      <w:proofErr w:type="spellEnd"/>
+      <w:r>
+        <w:rPr>
+          <w:rFonts w:ascii="Arial" w:hAnsi="Arial" w:cs="Arial"/>
+        </w:rPr>
+        <w:t xml:space="preserve"> </w:t>
+      </w:r>
+      <w:proofErr w:type="spellStart"/>
+      <w:r>
+        <w:rPr>
+          <w:rFonts w:ascii="Arial" w:hAnsi="Arial" w:cs="Arial"/>
+        </w:rPr>
+        <w:t>Vision</w:t>
+      </w:r>
+      <w:proofErr w:type="spellEnd"/>
+      <w:r>
+        <w:rPr>
+          <w:rFonts w:ascii="Arial" w:hAnsi="Arial" w:cs="Arial"/>
+        </w:rPr>
+        <w:t>)</w:t>
       </w:r>
     </w:p>
     <w:p>
@@ -1768,6 +3017,7 @@
         </w:rPr>
         <w:t xml:space="preserve"> </w:t>
       </w:r>
+      <w:proofErr w:type="spellStart"/>
       <w:r>
         <w:rPr>
           <w:rFonts w:cs="Arial"/>
@@ -1776,11 +3026,26 @@
         </w:rPr>
         <w:t>OpenCV</w:t>
       </w:r>
-      <w:r>
-        <w:rPr>
-          <w:rFonts w:cs="Arial"/>
-        </w:rPr>
-        <w:t>. Se utilizará de forma casi exclusiva para la lectura de los frames de la cámara, redimensionado, cambios de espacio de color, y el dibujado (renderizado) posterior del esqueleto y las métricas sobre el video en la interfaz de usuario.</w:t>
+      <w:proofErr w:type="spellEnd"/>
+      <w:r>
+        <w:rPr>
+          <w:rFonts w:cs="Arial"/>
+        </w:rPr>
+        <w:t xml:space="preserve">. Se utilizará de forma casi exclusiva para la lectura de los </w:t>
+      </w:r>
+      <w:proofErr w:type="spellStart"/>
+      <w:r>
+        <w:rPr>
+          <w:rFonts w:cs="Arial"/>
+        </w:rPr>
+        <w:t>frames</w:t>
+      </w:r>
+      <w:proofErr w:type="spellEnd"/>
+      <w:r>
+        <w:rPr>
+          <w:rFonts w:cs="Arial"/>
+        </w:rPr>
+        <w:t xml:space="preserve"> de la cámara, redimensionado, cambios de espacio de color, y el dibujado (renderizado) posterior del esqueleto y las métricas sobre el video en la interfaz de usuario.</w:t>
       </w:r>
     </w:p>
     <w:p>
@@ -1802,7 +3067,25 @@
           <w:b/>
           <w:bCs/>
         </w:rPr>
-        <w:t>Estimación de Postura (Pose Estimation):</w:t>
+        <w:t xml:space="preserve">Estimación de Postura (Pose </w:t>
+      </w:r>
+      <w:proofErr w:type="spellStart"/>
+      <w:r>
+        <w:rPr>
+          <w:rFonts w:cs="Arial"/>
+          <w:b/>
+          <w:bCs/>
+        </w:rPr>
+        <w:t>Estimation</w:t>
+      </w:r>
+      <w:proofErr w:type="spellEnd"/>
+      <w:r>
+        <w:rPr>
+          <w:rFonts w:cs="Arial"/>
+          <w:b/>
+          <w:bCs/>
+        </w:rPr>
+        <w:t>):</w:t>
       </w:r>
       <w:r>
         <w:rPr>
@@ -1824,19 +3107,61 @@
         </w:rPr>
         <w:t xml:space="preserve"> </w:t>
       </w:r>
-      <w:r>
-        <w:rPr>
-          <w:rFonts w:cs="Arial"/>
-          <w:b/>
-          <w:bCs/>
-        </w:rPr>
-        <w:t>BlazePose (MediaPipe)</w:t>
-      </w:r>
-      <w:r>
-        <w:rPr>
-          <w:rFonts w:cs="Arial"/>
-        </w:rPr>
-        <w:t xml:space="preserve">. Se elige como la tecnología core por su capacidad de generar coordenadas en </w:t>
+      <w:proofErr w:type="spellStart"/>
+      <w:r>
+        <w:rPr>
+          <w:rFonts w:cs="Arial"/>
+          <w:b/>
+          <w:bCs/>
+        </w:rPr>
+        <w:t>BlazePose</w:t>
+      </w:r>
+      <w:proofErr w:type="spellEnd"/>
+      <w:r>
+        <w:rPr>
+          <w:rFonts w:cs="Arial"/>
+          <w:b/>
+          <w:bCs/>
+        </w:rPr>
+        <w:t xml:space="preserve"> (</w:t>
+      </w:r>
+      <w:proofErr w:type="spellStart"/>
+      <w:r>
+        <w:rPr>
+          <w:rFonts w:cs="Arial"/>
+          <w:b/>
+          <w:bCs/>
+        </w:rPr>
+        <w:t>MediaPipe</w:t>
+      </w:r>
+      <w:proofErr w:type="spellEnd"/>
+      <w:r>
+        <w:rPr>
+          <w:rFonts w:cs="Arial"/>
+          <w:b/>
+          <w:bCs/>
+        </w:rPr>
+        <w:t>)</w:t>
+      </w:r>
+      <w:r>
+        <w:rPr>
+          <w:rFonts w:cs="Arial"/>
+        </w:rPr>
+        <w:t xml:space="preserve">. Se elige como la tecnología </w:t>
+      </w:r>
+      <w:proofErr w:type="spellStart"/>
+      <w:r>
+        <w:rPr>
+          <w:rFonts w:cs="Arial"/>
+        </w:rPr>
+        <w:t>core</w:t>
+      </w:r>
+      <w:proofErr w:type="spellEnd"/>
+      <w:r>
+        <w:rPr>
+          <w:rFonts w:cs="Arial"/>
+        </w:rPr>
+        <w:t xml:space="preserve"> por su capacidad de generar coordenadas en </w:t>
       </w:r>
       <w:r>
         <w:rPr>
@@ -1888,19 +3213,135 @@
           <w:rFonts w:cs="Arial"/>
         </w:rPr>
       </w:pPr>
+      <w:proofErr w:type="spellStart"/>
       <w:r>
         <w:rPr>
           <w:rFonts w:cs="Arial"/>
           <w:i/>
           <w:iCs/>
         </w:rPr>
-        <w:t>OpenPose / MoveNet / AlphaPose:</w:t>
-      </w:r>
-      <w:r>
-        <w:rPr>
-          <w:rFonts w:cs="Arial"/>
-        </w:rPr>
-        <w:t xml:space="preserve"> Descartados para el core móvil por ser pesados (AlphaPose/OpenPose) o limitar la salida a 2D (MoveNet/OpenPose).</w:t>
+        <w:t>OpenPose</w:t>
+      </w:r>
+      <w:proofErr w:type="spellEnd"/>
+      <w:r>
+        <w:rPr>
+          <w:rFonts w:cs="Arial"/>
+          <w:i/>
+          <w:iCs/>
+        </w:rPr>
+        <w:t xml:space="preserve"> / </w:t>
+      </w:r>
+      <w:proofErr w:type="spellStart"/>
+      <w:r>
+        <w:rPr>
+          <w:rFonts w:cs="Arial"/>
+          <w:i/>
+          <w:iCs/>
+        </w:rPr>
+        <w:t>MoveNet</w:t>
+      </w:r>
+      <w:proofErr w:type="spellEnd"/>
+      <w:r>
+        <w:rPr>
+          <w:rFonts w:cs="Arial"/>
+          <w:i/>
+          <w:iCs/>
+        </w:rPr>
+        <w:t xml:space="preserve"> / </w:t>
+      </w:r>
+      <w:proofErr w:type="spellStart"/>
+      <w:r>
+        <w:rPr>
+          <w:rFonts w:cs="Arial"/>
+          <w:i/>
+          <w:iCs/>
+        </w:rPr>
+        <w:t>AlphaPose</w:t>
+      </w:r>
+      <w:proofErr w:type="spellEnd"/>
+      <w:r>
+        <w:rPr>
+          <w:rFonts w:cs="Arial"/>
+          <w:i/>
+          <w:iCs/>
+        </w:rPr>
+        <w:t>:</w:t>
+      </w:r>
+      <w:r>
+        <w:rPr>
+          <w:rFonts w:cs="Arial"/>
+        </w:rPr>
+        <w:t xml:space="preserve"> Descartados para el </w:t>
+      </w:r>
+      <w:proofErr w:type="spellStart"/>
+      <w:r>
+        <w:rPr>
+          <w:rFonts w:cs="Arial"/>
+        </w:rPr>
+        <w:t>core</w:t>
+      </w:r>
+      <w:proofErr w:type="spellEnd"/>
+      <w:r>
+        <w:rPr>
+          <w:rFonts w:cs="Arial"/>
+        </w:rPr>
+        <w:t xml:space="preserve"> móvil por ser pesados (</w:t>
+      </w:r>
+      <w:proofErr w:type="spellStart"/>
+      <w:r>
+        <w:rPr>
+          <w:rFonts w:cs="Arial"/>
+        </w:rPr>
+        <w:t>AlphaPose</w:t>
+      </w:r>
+      <w:proofErr w:type="spellEnd"/>
+      <w:r>
+        <w:rPr>
+          <w:rFonts w:cs="Arial"/>
+        </w:rPr>
+        <w:t>/</w:t>
+      </w:r>
+      <w:proofErr w:type="spellStart"/>
+      <w:r>
+        <w:rPr>
+          <w:rFonts w:cs="Arial"/>
+        </w:rPr>
+        <w:t>OpenPose</w:t>
+      </w:r>
+      <w:proofErr w:type="spellEnd"/>
+      <w:r>
+        <w:rPr>
+          <w:rFonts w:cs="Arial"/>
+        </w:rPr>
+        <w:t>) o limitar la salida a 2D (</w:t>
+      </w:r>
+      <w:proofErr w:type="spellStart"/>
+      <w:r>
+        <w:rPr>
+          <w:rFonts w:cs="Arial"/>
+        </w:rPr>
+        <w:t>MoveNet</w:t>
+      </w:r>
+      <w:proofErr w:type="spellEnd"/>
+      <w:r>
+        <w:rPr>
+          <w:rFonts w:cs="Arial"/>
+        </w:rPr>
+        <w:t>/</w:t>
+      </w:r>
+      <w:proofErr w:type="spellStart"/>
+      <w:r>
+        <w:rPr>
+          <w:rFonts w:cs="Arial"/>
+        </w:rPr>
+        <w:t>OpenPose</w:t>
+      </w:r>
+      <w:proofErr w:type="spellEnd"/>
+      <w:r>
+        <w:rPr>
+          <w:rFonts w:cs="Arial"/>
+        </w:rPr>
+        <w:t>).</w:t>
       </w:r>
     </w:p>
     <w:p>
@@ -1944,6 +3385,7 @@
           <w:rFonts w:cs="Arial"/>
         </w:rPr>
       </w:pPr>
+      <w:proofErr w:type="spellStart"/>
       <w:r>
         <w:rPr>
           <w:rFonts w:cs="Arial"/>
@@ -1951,7 +3393,34 @@
           <w:iCs/>
         </w:rPr>
         <w:lastRenderedPageBreak/>
-        <w:t>RTMPose / ViTPose:</w:t>
+        <w:t>RTMPose</w:t>
+      </w:r>
+      <w:proofErr w:type="spellEnd"/>
+      <w:r>
+        <w:rPr>
+          <w:rFonts w:cs="Arial"/>
+          <w:i/>
+          <w:iCs/>
+        </w:rPr>
+        <w:t xml:space="preserve"> / </w:t>
+      </w:r>
+      <w:proofErr w:type="spellStart"/>
+      <w:r>
+        <w:rPr>
+          <w:rFonts w:cs="Arial"/>
+          <w:i/>
+          <w:iCs/>
+        </w:rPr>
+        <w:t>ViTPose</w:t>
+      </w:r>
+      <w:proofErr w:type="spellEnd"/>
+      <w:r>
+        <w:rPr>
+          <w:rFonts w:cs="Arial"/>
+          <w:i/>
+          <w:iCs/>
+        </w:rPr>
+        <w:t>:</w:t>
       </w:r>
       <w:r>
         <w:rPr>
@@ -1987,7 +3456,35 @@
         <w:rPr>
           <w:rFonts w:cs="Arial"/>
         </w:rPr>
-        <w:t>Una vez obtenidos los puntos clave (landmarks) de BlazePose, el sistema transforma estos datos en información física y geométrica con significado clínico/deportivo.</w:t>
+        <w:t>Una vez obtenidos los puntos clave (</w:t>
+      </w:r>
+      <w:proofErr w:type="spellStart"/>
+      <w:r>
+        <w:rPr>
+          <w:rFonts w:cs="Arial"/>
+        </w:rPr>
+        <w:t>landmarks</w:t>
+      </w:r>
+      <w:proofErr w:type="spellEnd"/>
+      <w:r>
+        <w:rPr>
+          <w:rFonts w:cs="Arial"/>
+        </w:rPr>
+        <w:t xml:space="preserve">) de </w:t>
+      </w:r>
+      <w:proofErr w:type="spellStart"/>
+      <w:r>
+        <w:rPr>
+          <w:rFonts w:cs="Arial"/>
+        </w:rPr>
+        <w:t>BlazePose</w:t>
+      </w:r>
+      <w:proofErr w:type="spellEnd"/>
+      <w:r>
+        <w:rPr>
+          <w:rFonts w:cs="Arial"/>
+        </w:rPr>
+        <w:t>, el sistema transforma estos datos en información física y geométrica con significado clínico/deportivo.</w:t>
       </w:r>
     </w:p>
     <w:p>
@@ -2057,7 +3554,21 @@
         <w:rPr>
           <w:rFonts w:cs="Arial"/>
         </w:rPr>
-        <w:t xml:space="preserve"> Derivadas de los cambios de posición y ángulos entre frames consecutivos para evaluar la explosividad y el control del movimiento.</w:t>
+        <w:t xml:space="preserve"> Derivadas de los cambios de posición y ángulos entre </w:t>
+      </w:r>
+      <w:proofErr w:type="spellStart"/>
+      <w:r>
+        <w:rPr>
+          <w:rFonts w:cs="Arial"/>
+        </w:rPr>
+        <w:t>frames</w:t>
+      </w:r>
+      <w:proofErr w:type="spellEnd"/>
+      <w:r>
+        <w:rPr>
+          <w:rFonts w:cs="Arial"/>
+        </w:rPr>
+        <w:t xml:space="preserve"> consecutivos para evaluar la explosividad y el control del movimiento.</w:t>
       </w:r>
     </w:p>
     <w:p>
@@ -2072,7 +3583,21 @@
         <w:rPr>
           <w:rFonts w:ascii="Arial" w:hAnsi="Arial" w:cs="Arial"/>
         </w:rPr>
-        <w:t>3. Clasificación y Modelado Predictivo (Machine Learning)</w:t>
+        <w:t xml:space="preserve">3. Clasificación y Modelado Predictivo (Machine </w:t>
+      </w:r>
+      <w:proofErr w:type="spellStart"/>
+      <w:r>
+        <w:rPr>
+          <w:rFonts w:ascii="Arial" w:hAnsi="Arial" w:cs="Arial"/>
+        </w:rPr>
+        <w:t>Learning</w:t>
+      </w:r>
+      <w:proofErr w:type="spellEnd"/>
+      <w:r>
+        <w:rPr>
+          <w:rFonts w:ascii="Arial" w:hAnsi="Arial" w:cs="Arial"/>
+        </w:rPr>
+        <w:t>)</w:t>
       </w:r>
     </w:p>
     <w:p>
@@ -2098,7 +3623,15 @@
         </w:rPr>
       </w:pPr>
       <w:r>
-        <w:t>Modelos de Machine Learning Evaluados</w:t>
+        <w:t xml:space="preserve">Modelos de Machine </w:t>
+      </w:r>
+      <w:proofErr w:type="spellStart"/>
+      <w:r>
+        <w:t>Learning</w:t>
+      </w:r>
+      <w:proofErr w:type="spellEnd"/>
+      <w:r>
+        <w:t xml:space="preserve"> Evaluados</w:t>
       </w:r>
     </w:p>
     <w:p>
@@ -2159,15 +3692,40 @@
         </w:numPr>
         <w:jc w:val="left"/>
       </w:pPr>
-      <w:r>
-        <w:rPr>
-          <w:b/>
-          <w:bCs/>
-        </w:rPr>
-        <w:t>BiLSTM:</w:t>
-      </w:r>
-      <w:r>
-        <w:t xml:space="preserve"> Con complejidad media-alta y requisitos de datos medios, es el modelo ideal para ser ejecutado en el servidor. Destaca en el procesamiento a posteriori (post-entrenamiento), ya que analiza tanto el contexto pasado como el futuro de cada frame de vídeo.</w:t>
+      <w:proofErr w:type="spellStart"/>
+      <w:r>
+        <w:rPr>
+          <w:b/>
+          <w:bCs/>
+        </w:rPr>
+        <w:t>BiLSTM</w:t>
+      </w:r>
+      <w:proofErr w:type="spellEnd"/>
+      <w:r>
+        <w:rPr>
+          <w:b/>
+          <w:bCs/>
+        </w:rPr>
+        <w:t>:</w:t>
+      </w:r>
+      <w:r>
+        <w:t xml:space="preserve"> Con complejidad media-alta y requisitos de datos medios, es el modelo ideal para ser ejecutado en el servidor. Destaca en el procesamiento a posteriori (</w:t>
+      </w:r>
+      <w:proofErr w:type="spellStart"/>
+      <w:r>
+        <w:t>post-entrenamiento</w:t>
+      </w:r>
+      <w:proofErr w:type="spellEnd"/>
+      <w:r>
+        <w:t xml:space="preserve">), ya que analiza tanto el contexto pasado como el futuro de cada </w:t>
+      </w:r>
+      <w:proofErr w:type="spellStart"/>
+      <w:r>
+        <w:t>frame</w:t>
+      </w:r>
+      <w:proofErr w:type="spellEnd"/>
+      <w:r>
+        <w:t xml:space="preserve"> de vídeo.</w:t>
       </w:r>
     </w:p>
     <w:p>
@@ -2179,12 +3737,21 @@
         </w:numPr>
         <w:jc w:val="left"/>
       </w:pPr>
-      <w:r>
-        <w:rPr>
-          <w:b/>
-          <w:bCs/>
-        </w:rPr>
-        <w:t>Transformer:</w:t>
+      <w:proofErr w:type="spellStart"/>
+      <w:r>
+        <w:rPr>
+          <w:b/>
+          <w:bCs/>
+        </w:rPr>
+        <w:t>Transformer</w:t>
+      </w:r>
+      <w:proofErr w:type="spellEnd"/>
+      <w:r>
+        <w:rPr>
+          <w:b/>
+          <w:bCs/>
+        </w:rPr>
+        <w:t>:</w:t>
       </w:r>
       <w:r>
         <w:t xml:space="preserve"> Ofrece una altísima capacidad de modelado, pero con requerimientos muy altos tanto de datos como de complejidad. Resulta demasiado pesado y complejo para la primera versi</w:t>
@@ -2285,8 +3852,23 @@
         <w:rPr>
           <w:rFonts w:cs="Arial"/>
         </w:rPr>
-        <w:t xml:space="preserve"> por su ligereza. Si la aplicación requiere un informe detallado post-entrenamiento, enviar los datos al servidor para pasarlos por una </w:t>
-      </w:r>
+        <w:t xml:space="preserve"> por su ligereza. Si la aplicación requiere un informe detallado </w:t>
+      </w:r>
+      <w:proofErr w:type="spellStart"/>
+      <w:r>
+        <w:rPr>
+          <w:rFonts w:cs="Arial"/>
+        </w:rPr>
+        <w:t>post-entrenamiento</w:t>
+      </w:r>
+      <w:proofErr w:type="spellEnd"/>
+      <w:r>
+        <w:rPr>
+          <w:rFonts w:cs="Arial"/>
+        </w:rPr>
+        <w:t xml:space="preserve">, enviar los datos al servidor para pasarlos por una </w:t>
+      </w:r>
+      <w:proofErr w:type="spellStart"/>
       <w:r>
         <w:rPr>
           <w:rFonts w:cs="Arial"/>
@@ -2295,6 +3877,7 @@
         </w:rPr>
         <w:t>BiLSTM</w:t>
       </w:r>
+      <w:proofErr w:type="spellEnd"/>
       <w:r>
         <w:rPr>
           <w:rFonts w:cs="Arial"/>
@@ -2314,7 +3897,21 @@
         <w:rPr>
           <w:rFonts w:ascii="Arial" w:hAnsi="Arial" w:cs="Arial"/>
         </w:rPr>
-        <w:t>4. Sistema de Inferencia y Retroalimentación (Feedback)</w:t>
+        <w:t>4. Sistema de Inferencia y Retroalimentación (</w:t>
+      </w:r>
+      <w:proofErr w:type="spellStart"/>
+      <w:r>
+        <w:rPr>
+          <w:rFonts w:ascii="Arial" w:hAnsi="Arial" w:cs="Arial"/>
+        </w:rPr>
+        <w:t>Feedback</w:t>
+      </w:r>
+      <w:proofErr w:type="spellEnd"/>
+      <w:r>
+        <w:rPr>
+          <w:rFonts w:ascii="Arial" w:hAnsi="Arial" w:cs="Arial"/>
+        </w:rPr>
+        <w:t>)</w:t>
       </w:r>
     </w:p>
     <w:p>
@@ -2358,7 +3955,21 @@
         <w:rPr>
           <w:rFonts w:cs="Arial"/>
         </w:rPr>
-        <w:t xml:space="preserve"> Reglas clínicas de "hard-code" que actúan como salvavidas inmediatos para evitar lesiones.</w:t>
+        <w:t xml:space="preserve"> Reglas clínicas de "</w:t>
+      </w:r>
+      <w:proofErr w:type="spellStart"/>
+      <w:r>
+        <w:rPr>
+          <w:rFonts w:cs="Arial"/>
+        </w:rPr>
+        <w:t>hard-code</w:t>
+      </w:r>
+      <w:proofErr w:type="spellEnd"/>
+      <w:r>
+        <w:rPr>
+          <w:rFonts w:cs="Arial"/>
+        </w:rPr>
+        <w:t>" que actúan como salvavidas inmediatos para evitar lesiones.</w:t>
       </w:r>
     </w:p>
     <w:p>
@@ -2393,7 +4004,23 @@
           <w:rStyle w:val="HTMLCode"/>
           <w:rFonts w:cs="Arial"/>
         </w:rPr>
-        <w:t>SI (Ejercicio == Sentadilla) Y (Ángulo_Rodilla &lt; 90º) -&gt; "Profundidad correcta"</w:t>
+        <w:t>SI (Ejercicio == Sentadilla) Y (</w:t>
+      </w:r>
+      <w:proofErr w:type="spellStart"/>
+      <w:r>
+        <w:rPr>
+          <w:rStyle w:val="HTMLCode"/>
+          <w:rFonts w:cs="Arial"/>
+        </w:rPr>
+        <w:t>Ángulo_Rodilla</w:t>
+      </w:r>
+      <w:proofErr w:type="spellEnd"/>
+      <w:r>
+        <w:rPr>
+          <w:rStyle w:val="HTMLCode"/>
+          <w:rFonts w:cs="Arial"/>
+        </w:rPr>
+        <w:t xml:space="preserve"> &lt; 90º) -&gt; "Profundidad correcta"</w:t>
       </w:r>
     </w:p>
     <w:p>
@@ -2428,7 +4055,39 @@
           <w:rStyle w:val="HTMLCode"/>
           <w:rFonts w:cs="Arial"/>
         </w:rPr>
-        <w:t>SI (Posición_X_Rodilla &gt; Posición_X_Puntera) -&gt; "</w:t>
+        <w:t>SI (</w:t>
+      </w:r>
+      <w:proofErr w:type="spellStart"/>
+      <w:r>
+        <w:rPr>
+          <w:rStyle w:val="HTMLCode"/>
+          <w:rFonts w:cs="Arial"/>
+        </w:rPr>
+        <w:t>Posición_X_Rodilla</w:t>
+      </w:r>
+      <w:proofErr w:type="spellEnd"/>
+      <w:r>
+        <w:rPr>
+          <w:rStyle w:val="HTMLCode"/>
+          <w:rFonts w:cs="Arial"/>
+        </w:rPr>
+        <w:t xml:space="preserve"> &gt; </w:t>
+      </w:r>
+      <w:proofErr w:type="spellStart"/>
+      <w:r>
+        <w:rPr>
+          <w:rStyle w:val="HTMLCode"/>
+          <w:rFonts w:cs="Arial"/>
+        </w:rPr>
+        <w:t>Posición_X_Puntera</w:t>
+      </w:r>
+      <w:proofErr w:type="spellEnd"/>
+      <w:r>
+        <w:rPr>
+          <w:rStyle w:val="HTMLCode"/>
+          <w:rFonts w:cs="Arial"/>
+        </w:rPr>
+        <w:t>) -&gt; "</w:t>
       </w:r>
       <w:r>
         <w:rPr>
@@ -2528,7 +4187,21 @@
         <w:rPr>
           <w:rFonts w:cs="Arial"/>
         </w:rPr>
-        <w:t>Para que la aplicación fluya en teléfonos móviles de gama media sin sobrecalentamiento ni caídas de frames, se aplicará un estricto protocolo de rendimiento:</w:t>
+        <w:t xml:space="preserve">Para que la aplicación fluya en teléfonos móviles de gama media sin sobrecalentamiento ni caídas de </w:t>
+      </w:r>
+      <w:proofErr w:type="spellStart"/>
+      <w:r>
+        <w:rPr>
+          <w:rFonts w:cs="Arial"/>
+        </w:rPr>
+        <w:t>frames</w:t>
+      </w:r>
+      <w:proofErr w:type="spellEnd"/>
+      <w:r>
+        <w:rPr>
+          <w:rFonts w:cs="Arial"/>
+        </w:rPr>
+        <w:t>, se aplicará un estricto protocolo de rendimiento:</w:t>
       </w:r>
     </w:p>
     <w:p>
@@ -2544,13 +4217,41 @@
           <w:rFonts w:cs="Arial"/>
         </w:rPr>
       </w:pPr>
-      <w:r>
-        <w:rPr>
-          <w:rFonts w:cs="Arial"/>
-          <w:b/>
-          <w:bCs/>
-        </w:rPr>
-        <w:t>Frame Skipping (Salto de Fotogramas):</w:t>
+      <w:proofErr w:type="spellStart"/>
+      <w:r>
+        <w:rPr>
+          <w:rFonts w:cs="Arial"/>
+          <w:b/>
+          <w:bCs/>
+        </w:rPr>
+        <w:t>Frame</w:t>
+      </w:r>
+      <w:proofErr w:type="spellEnd"/>
+      <w:r>
+        <w:rPr>
+          <w:rFonts w:cs="Arial"/>
+          <w:b/>
+          <w:bCs/>
+        </w:rPr>
+        <w:t xml:space="preserve"> </w:t>
+      </w:r>
+      <w:proofErr w:type="spellStart"/>
+      <w:r>
+        <w:rPr>
+          <w:rFonts w:cs="Arial"/>
+          <w:b/>
+          <w:bCs/>
+        </w:rPr>
+        <w:t>Skipping</w:t>
+      </w:r>
+      <w:proofErr w:type="spellEnd"/>
+      <w:r>
+        <w:rPr>
+          <w:rFonts w:cs="Arial"/>
+          <w:b/>
+          <w:bCs/>
+        </w:rPr>
+        <w:t xml:space="preserve"> (Salto de Fotogramas):</w:t>
       </w:r>
       <w:r>
         <w:rPr>
@@ -2564,7 +4265,25 @@
           <w:b/>
           <w:bCs/>
         </w:rPr>
-        <w:t>1 frame de cada 5</w:t>
+        <w:t xml:space="preserve">1 </w:t>
+      </w:r>
+      <w:proofErr w:type="spellStart"/>
+      <w:r>
+        <w:rPr>
+          <w:rFonts w:cs="Arial"/>
+          <w:b/>
+          <w:bCs/>
+        </w:rPr>
+        <w:t>frame</w:t>
+      </w:r>
+      <w:proofErr w:type="spellEnd"/>
+      <w:r>
+        <w:rPr>
+          <w:rFonts w:cs="Arial"/>
+          <w:b/>
+          <w:bCs/>
+        </w:rPr>
+        <w:t xml:space="preserve"> de cada 5</w:t>
       </w:r>
       <w:r>
         <w:rPr>
@@ -2600,27 +4319,88 @@
           <w:rFonts w:cs="Arial"/>
         </w:rPr>
       </w:pPr>
-      <w:r>
-        <w:rPr>
-          <w:rFonts w:cs="Arial"/>
-          <w:b/>
-          <w:bCs/>
-        </w:rPr>
-        <w:t>Downscaling (Redimensionado):</w:t>
-      </w:r>
-      <w:r>
-        <w:rPr>
-          <w:rFonts w:cs="Arial"/>
-        </w:rPr>
-        <w:t xml:space="preserve"> Antes de pasar por la red neuronal de estimación (OpenCV/MediaPipe), el frame original se reducirá a dimensiones óptimas (ej. </w:t>
+      <w:proofErr w:type="spellStart"/>
+      <w:r>
+        <w:rPr>
+          <w:rFonts w:cs="Arial"/>
+          <w:b/>
+          <w:bCs/>
+        </w:rPr>
+        <w:t>Downscaling</w:t>
+      </w:r>
+      <w:proofErr w:type="spellEnd"/>
+      <w:r>
+        <w:rPr>
+          <w:rFonts w:cs="Arial"/>
+          <w:b/>
+          <w:bCs/>
+        </w:rPr>
+        <w:t xml:space="preserve"> (Redimensionado):</w:t>
+      </w:r>
+      <w:r>
+        <w:rPr>
+          <w:rFonts w:cs="Arial"/>
+        </w:rPr>
+        <w:t xml:space="preserve"> Antes de pasar por la red neuronal de estimación (</w:t>
+      </w:r>
+      <w:proofErr w:type="spellStart"/>
+      <w:r>
+        <w:rPr>
+          <w:rFonts w:cs="Arial"/>
+        </w:rPr>
+        <w:t>OpenCV</w:t>
+      </w:r>
+      <w:proofErr w:type="spellEnd"/>
+      <w:r>
+        <w:rPr>
+          <w:rFonts w:cs="Arial"/>
+        </w:rPr>
+        <w:t>/</w:t>
+      </w:r>
+      <w:proofErr w:type="spellStart"/>
+      <w:r>
+        <w:rPr>
+          <w:rFonts w:cs="Arial"/>
+        </w:rPr>
+        <w:t>MediaPipe</w:t>
+      </w:r>
+      <w:proofErr w:type="spellEnd"/>
+      <w:r>
+        <w:rPr>
+          <w:rFonts w:cs="Arial"/>
+        </w:rPr>
+        <w:t xml:space="preserve">), el </w:t>
+      </w:r>
+      <w:proofErr w:type="spellStart"/>
+      <w:r>
+        <w:rPr>
+          <w:rFonts w:cs="Arial"/>
+        </w:rPr>
+        <w:t>frame</w:t>
+      </w:r>
+      <w:proofErr w:type="spellEnd"/>
+      <w:r>
+        <w:rPr>
+          <w:rFonts w:cs="Arial"/>
+        </w:rPr>
+        <w:t xml:space="preserve"> original se reducirá a dimensiones óptimas (ej. </w:t>
       </w:r>
       <w:r>
         <w:rPr>
           <w:rStyle w:val="HTMLCode"/>
           <w:rFonts w:cs="Arial"/>
         </w:rPr>
-        <w:t>256x256 px</w:t>
-      </w:r>
+        <w:t xml:space="preserve">256x256 </w:t>
+      </w:r>
+      <w:proofErr w:type="spellStart"/>
+      <w:r>
+        <w:rPr>
+          <w:rStyle w:val="HTMLCode"/>
+          <w:rFonts w:cs="Arial"/>
+        </w:rPr>
+        <w:t>px</w:t>
+      </w:r>
+      <w:proofErr w:type="spellEnd"/>
       <w:r>
         <w:rPr>
           <w:rFonts w:cs="Arial"/>
@@ -2632,8 +4412,17 @@
           <w:rStyle w:val="HTMLCode"/>
           <w:rFonts w:cs="Arial"/>
         </w:rPr>
-        <w:t>224x224 px</w:t>
-      </w:r>
+        <w:t xml:space="preserve">224x224 </w:t>
+      </w:r>
+      <w:proofErr w:type="spellStart"/>
+      <w:r>
+        <w:rPr>
+          <w:rStyle w:val="HTMLCode"/>
+          <w:rFonts w:cs="Arial"/>
+        </w:rPr>
+        <w:t>px</w:t>
+      </w:r>
+      <w:proofErr w:type="spellEnd"/>
       <w:r>
         <w:rPr>
           <w:rFonts w:cs="Arial"/>
@@ -2934,8 +4723,21 @@
       <w:r>
         <w:t xml:space="preserve"> </w:t>
       </w:r>
-      <w:r>
-        <w:t>git checkout e70954ff1b6983d96228f5b94317b127d854486d</w:t>
+      <w:proofErr w:type="spellStart"/>
+      <w:r>
+        <w:t>git</w:t>
+      </w:r>
+      <w:proofErr w:type="spellEnd"/>
+      <w:r>
+        <w:t xml:space="preserve"> </w:t>
+      </w:r>
+      <w:proofErr w:type="spellStart"/>
+      <w:r>
+        <w:t>checkout</w:t>
+      </w:r>
+      <w:proofErr w:type="spellEnd"/>
+      <w:r>
+        <w:t xml:space="preserve"> e70954ff1b6983d96228f5b94317b127d854486d</w:t>
       </w:r>
     </w:p>
     <w:p>
@@ -2974,7 +4776,15 @@
         <w:sym w:font="Wingdings" w:char="F0E0"/>
       </w:r>
       <w:r>
-        <w:t xml:space="preserve"> el commit de 0s</w:t>
+        <w:t xml:space="preserve"> el </w:t>
+      </w:r>
+      <w:proofErr w:type="spellStart"/>
+      <w:r>
+        <w:t>commit</w:t>
+      </w:r>
+      <w:proofErr w:type="spellEnd"/>
+      <w:r>
+        <w:t xml:space="preserve"> de 0s</w:t>
       </w:r>
     </w:p>
     <w:p>
@@ -2985,8 +4795,13 @@
         <w:sym w:font="Wingdings" w:char="F0E0"/>
       </w:r>
       <w:r>
-        <w:t xml:space="preserve"> ni compula</w:t>
-      </w:r>
+        <w:t xml:space="preserve"> ni </w:t>
+      </w:r>
+      <w:proofErr w:type="spellStart"/>
+      <w:r>
+        <w:t>compula</w:t>
+      </w:r>
+      <w:proofErr w:type="spellEnd"/>
     </w:p>
     <w:p>
       <w:r>
@@ -3125,7 +4940,23 @@
           <w:rFonts w:cs="Arial"/>
           <w:color w:val="1F1F1F"/>
         </w:rPr>
-        <w:t>, interpretando a menudo el ruido visual o pequeños temblores de los landmarks como fallos técnicos graves.</w:t>
+        <w:t xml:space="preserve">, interpretando a menudo el ruido visual o pequeños temblores de los </w:t>
+      </w:r>
+      <w:proofErr w:type="spellStart"/>
+      <w:r>
+        <w:rPr>
+          <w:rFonts w:cs="Arial"/>
+          <w:color w:val="1F1F1F"/>
+        </w:rPr>
+        <w:t>landmarks</w:t>
+      </w:r>
+      <w:proofErr w:type="spellEnd"/>
+      <w:r>
+        <w:rPr>
+          <w:rFonts w:cs="Arial"/>
+          <w:color w:val="1F1F1F"/>
+        </w:rPr>
+        <w:t xml:space="preserve"> como fallos técnicos graves.</w:t>
       </w:r>
     </w:p>
     <w:p>
@@ -3171,7 +5002,51 @@
           <w:szCs w:val="24"/>
           <w:lang w:val="es-ES"/>
         </w:rPr>
-        <w:t xml:space="preserve">, donde el cuello de botella no es la arquitectura BiLSTM, sino la "monotonía" del entrenamiento. Al usar etiquetas planas (el mismo valor para toda la repetición), la red no sabe distinguir qué frames son los que realmente definen la calidad del movimiento. Para que el modelo alcance un nivel de precisión profesional, necesita dejar de ver "fotos de ángulos" y empezar a entender la </w:t>
+        <w:t xml:space="preserve">, donde el cuello de botella no es la arquitectura </w:t>
+      </w:r>
+      <w:proofErr w:type="spellStart"/>
+      <w:r>
+        <w:rPr>
+          <w:rFonts w:eastAsia="Times New Roman" w:cs="Arial"/>
+          <w:color w:val="1F1F1F"/>
+          <w:sz w:val="24"/>
+          <w:szCs w:val="24"/>
+          <w:lang w:val="es-ES"/>
+        </w:rPr>
+        <w:t>BiLSTM</w:t>
+      </w:r>
+      <w:proofErr w:type="spellEnd"/>
+      <w:r>
+        <w:rPr>
+          <w:rFonts w:eastAsia="Times New Roman" w:cs="Arial"/>
+          <w:color w:val="1F1F1F"/>
+          <w:sz w:val="24"/>
+          <w:szCs w:val="24"/>
+          <w:lang w:val="es-ES"/>
+        </w:rPr>
+        <w:t xml:space="preserve">, sino la "monotonía" del entrenamiento. Al usar etiquetas planas (el mismo valor para toda la repetición), la red no sabe distinguir qué </w:t>
+      </w:r>
+      <w:proofErr w:type="spellStart"/>
+      <w:r>
+        <w:rPr>
+          <w:rFonts w:eastAsia="Times New Roman" w:cs="Arial"/>
+          <w:color w:val="1F1F1F"/>
+          <w:sz w:val="24"/>
+          <w:szCs w:val="24"/>
+          <w:lang w:val="es-ES"/>
+        </w:rPr>
+        <w:t>frames</w:t>
+      </w:r>
+      <w:proofErr w:type="spellEnd"/>
+      <w:r>
+        <w:rPr>
+          <w:rFonts w:eastAsia="Times New Roman" w:cs="Arial"/>
+          <w:color w:val="1F1F1F"/>
+          <w:sz w:val="24"/>
+          <w:szCs w:val="24"/>
+          <w:lang w:val="es-ES"/>
+        </w:rPr>
+        <w:t xml:space="preserve"> son los que realmente definen la calidad del movimiento. Para que el modelo alcance un nivel de precisión profesional, necesita dejar de ver "fotos de ángulos" y empezar a entender la </w:t>
       </w:r>
       <w:r>
         <w:rPr>
@@ -3194,10 +5069,890 @@
           <w:szCs w:val="24"/>
           <w:lang w:val="es-ES"/>
         </w:rPr>
-        <w:t xml:space="preserve"> (velocidad y aceleración), permitiendo que los KPIs dejen de ser una respuesta plana y se conviertan en un juicio dinámico basado en los momentos críticos de la sentadilla.</w:t>
-      </w:r>
-    </w:p>
-    <w:p/>
+        <w:t xml:space="preserve"> (velocidad y aceleración), permitiendo que los </w:t>
+      </w:r>
+      <w:proofErr w:type="spellStart"/>
+      <w:r>
+        <w:rPr>
+          <w:rFonts w:eastAsia="Times New Roman" w:cs="Arial"/>
+          <w:color w:val="1F1F1F"/>
+          <w:sz w:val="24"/>
+          <w:szCs w:val="24"/>
+          <w:lang w:val="es-ES"/>
+        </w:rPr>
+        <w:t>KPIs</w:t>
+      </w:r>
+      <w:proofErr w:type="spellEnd"/>
+      <w:r>
+        <w:rPr>
+          <w:rFonts w:eastAsia="Times New Roman" w:cs="Arial"/>
+          <w:color w:val="1F1F1F"/>
+          <w:sz w:val="24"/>
+          <w:szCs w:val="24"/>
+          <w:lang w:val="es-ES"/>
+        </w:rPr>
+        <w:t xml:space="preserve"> dejen de ser una respuesta plana y se conviertan en un juicio dinámico basado en los momentos críticos de la sentadilla.</w:t>
+      </w:r>
+    </w:p>
+    <w:p>
+      <w:pPr>
+        <w:spacing w:before="0" w:line="240" w:lineRule="auto"/>
+        <w:jc w:val="left"/>
+        <w:rPr>
+          <w:rFonts w:eastAsia="Times New Roman" w:cs="Arial"/>
+          <w:color w:val="1F1F1F"/>
+          <w:sz w:val="24"/>
+          <w:szCs w:val="24"/>
+          <w:lang w:val="es-ES"/>
+        </w:rPr>
+      </w:pPr>
+    </w:p>
+    <w:p>
+      <w:pPr>
+        <w:spacing w:before="0" w:line="240" w:lineRule="auto"/>
+        <w:jc w:val="left"/>
+      </w:pPr>
+      <w:r>
+        <w:rPr>
+          <w:rFonts w:eastAsia="Times New Roman" w:cs="Arial"/>
+          <w:color w:val="1F1F1F"/>
+          <w:sz w:val="24"/>
+          <w:szCs w:val="24"/>
+          <w:lang w:val="es-ES"/>
+        </w:rPr>
+        <w:t xml:space="preserve">V10 </w:t>
+      </w:r>
+      <w:r>
+        <w:rPr>
+          <w:rFonts w:eastAsia="Times New Roman" w:cs="Arial"/>
+          <w:color w:val="1F1F1F"/>
+          <w:sz w:val="24"/>
+          <w:szCs w:val="24"/>
+          <w:lang w:val="es-ES"/>
+        </w:rPr>
+        <w:sym w:font="Wingdings" w:char="F0E0"/>
+      </w:r>
+      <w:r>
+        <w:rPr>
+          <w:rFonts w:eastAsia="Times New Roman" w:cs="Arial"/>
+          <w:color w:val="1F1F1F"/>
+          <w:sz w:val="24"/>
+          <w:szCs w:val="24"/>
+          <w:lang w:val="es-ES"/>
+        </w:rPr>
+        <w:t xml:space="preserve"> </w:t>
+      </w:r>
+      <w:proofErr w:type="spellStart"/>
+      <w:r>
+        <w:rPr>
+          <w:rFonts w:eastAsia="Times New Roman" w:cs="Arial"/>
+          <w:color w:val="1F1F1F"/>
+          <w:sz w:val="24"/>
+          <w:szCs w:val="24"/>
+          <w:lang w:val="es-ES"/>
+        </w:rPr>
+        <w:t>version</w:t>
+      </w:r>
+      <w:proofErr w:type="spellEnd"/>
+      <w:r>
+        <w:rPr>
+          <w:rFonts w:eastAsia="Times New Roman" w:cs="Arial"/>
+          <w:color w:val="1F1F1F"/>
+          <w:sz w:val="24"/>
+          <w:szCs w:val="24"/>
+          <w:lang w:val="es-ES"/>
+        </w:rPr>
+        <w:t xml:space="preserve"> con algunos cambios como por ejemplo añadir velocidades para intentar que mejore el ritmo, además de aumentar la importancia de los </w:t>
+      </w:r>
+      <w:proofErr w:type="spellStart"/>
+      <w:r>
+        <w:rPr>
+          <w:rFonts w:eastAsia="Times New Roman" w:cs="Arial"/>
+          <w:color w:val="1F1F1F"/>
+          <w:sz w:val="24"/>
+          <w:szCs w:val="24"/>
+          <w:lang w:val="es-ES"/>
+        </w:rPr>
+        <w:t>kpis</w:t>
+      </w:r>
+      <w:proofErr w:type="spellEnd"/>
+      <w:r>
+        <w:rPr>
+          <w:rFonts w:eastAsia="Times New Roman" w:cs="Arial"/>
+          <w:color w:val="1F1F1F"/>
+          <w:sz w:val="24"/>
+          <w:szCs w:val="24"/>
+          <w:lang w:val="es-ES"/>
+        </w:rPr>
+        <w:t xml:space="preserve"> para intentar que mejore el resultado</w:t>
+      </w:r>
+      <w:r>
+        <w:rPr>
+          <w:rFonts w:eastAsia="Times New Roman" w:cs="Arial"/>
+          <w:color w:val="1F1F1F"/>
+          <w:sz w:val="24"/>
+          <w:szCs w:val="24"/>
+          <w:lang w:val="es-ES"/>
+        </w:rPr>
+        <w:t xml:space="preserve">. </w:t>
+      </w:r>
+      <w:r>
+        <w:rPr>
+          <w:b/>
+          <w:bCs/>
+        </w:rPr>
+        <w:t>:</w:t>
+      </w:r>
+      <w:r>
+        <w:t xml:space="preserve"> La versión </w:t>
+      </w:r>
+      <w:r>
+        <w:rPr>
+          <w:b/>
+          <w:bCs/>
+        </w:rPr>
+        <w:t>V10</w:t>
+      </w:r>
+      <w:r>
+        <w:t xml:space="preserve"> es superior en la detección del movimiento y la técnica general, pero ha perdido el "norte" con la profundidad. Esto confirma que el siguiente paso crítico es aplicar la </w:t>
+      </w:r>
+      <w:r>
+        <w:rPr>
+          <w:b/>
+          <w:bCs/>
+        </w:rPr>
+        <w:t>corrección de la máscara de normalización</w:t>
+      </w:r>
+      <w:r>
+        <w:t xml:space="preserve"> que comentamos; sin ella, la rampa de profundidad está confundiendo al modelo en lugar de ayudarle.</w:t>
+      </w:r>
+      <w:r>
+        <w:t xml:space="preserve"> Además hemos instaurado un cambio en la profundidad para que solo se fije en el momento más bajo de la repetición pero no ha dado un resultado correcto</w:t>
+      </w:r>
+    </w:p>
+    <w:p>
+      <w:pPr>
+        <w:spacing w:before="0" w:line="240" w:lineRule="auto"/>
+        <w:jc w:val="left"/>
+      </w:pPr>
+    </w:p>
+    <w:p>
+      <w:pPr>
+        <w:spacing w:before="0" w:line="240" w:lineRule="auto"/>
+        <w:jc w:val="left"/>
+      </w:pPr>
+      <w:r>
+        <w:t xml:space="preserve">V11 </w:t>
+      </w:r>
+      <w:r>
+        <w:sym w:font="Wingdings" w:char="F0E0"/>
+      </w:r>
+      <w:r>
+        <w:t xml:space="preserve"> corrección en la máscara, nuevo cambiando alguna cosilla para ver si conseguimos mejorar el resultado para la profundidad, ya que el resto de </w:t>
+      </w:r>
+      <w:proofErr w:type="spellStart"/>
+      <w:r>
+        <w:t>kpis</w:t>
+      </w:r>
+      <w:proofErr w:type="spellEnd"/>
+      <w:r>
+        <w:t xml:space="preserve"> v10 fue el modelo más satisfactorio.</w:t>
+      </w:r>
+    </w:p>
+    <w:p>
+      <w:pPr>
+        <w:spacing w:before="0" w:line="240" w:lineRule="auto"/>
+        <w:jc w:val="left"/>
+      </w:pPr>
+      <w:r>
+        <w:lastRenderedPageBreak/>
+        <w:t xml:space="preserve">V12 </w:t>
+      </w:r>
+      <w:r>
+        <w:sym w:font="Wingdings" w:char="F0E0"/>
+      </w:r>
+      <w:r>
+        <w:t xml:space="preserve"> </w:t>
+      </w:r>
+      <w:proofErr w:type="spellStart"/>
+      <w:r>
+        <w:t>algun</w:t>
+      </w:r>
+      <w:proofErr w:type="spellEnd"/>
+      <w:r>
+        <w:t xml:space="preserve"> cambio que no mejora a v11</w:t>
+      </w:r>
+    </w:p>
+    <w:p>
+      <w:pPr>
+        <w:pStyle w:val="Heading3"/>
+        <w:rPr>
+          <w:rFonts w:ascii="Times New Roman" w:hAnsi="Times New Roman"/>
+        </w:rPr>
+      </w:pPr>
+      <w:r>
+        <w:t xml:space="preserve">V13 </w:t>
+      </w:r>
+      <w:r>
+        <w:sym w:font="Wingdings" w:char="F0E0"/>
+      </w:r>
+      <w:r>
+        <w:t xml:space="preserve"> . </w:t>
+      </w:r>
+      <w:r>
+        <w:rPr>
+          <w:rStyle w:val="HTMLCode"/>
+          <w:rFonts w:eastAsia="Proxima Nova"/>
+        </w:rPr>
+        <w:t>training_BILSTM.py</w:t>
+      </w:r>
+      <w:r>
+        <w:t xml:space="preserve"> (El Motor de Aprendizaje)</w:t>
+      </w:r>
+    </w:p>
+    <w:p>
+      <w:pPr>
+        <w:pStyle w:val="NormalWeb"/>
+        <w:numPr>
+          <w:ilvl w:val="0"/>
+          <w:numId w:val="28"/>
+        </w:numPr>
+        <w:jc w:val="left"/>
+      </w:pPr>
+      <w:r>
+        <w:rPr>
+          <w:b/>
+          <w:bCs/>
+        </w:rPr>
+        <w:t>Retorno a la Eficacia:</w:t>
+      </w:r>
+      <w:r>
+        <w:t xml:space="preserve"> Has restaurado correctamente la lógica de </w:t>
+      </w:r>
+      <w:r>
+        <w:rPr>
+          <w:b/>
+          <w:bCs/>
+        </w:rPr>
+        <w:t>etiquetas constantes</w:t>
+      </w:r>
+      <w:r>
+        <w:t xml:space="preserve"> (</w:t>
+      </w:r>
+      <w:proofErr w:type="spellStart"/>
+      <w:r>
+        <w:rPr>
+          <w:rStyle w:val="HTMLCode"/>
+        </w:rPr>
+        <w:t>kpis</w:t>
+      </w:r>
+      <w:proofErr w:type="spellEnd"/>
+      <w:r>
+        <w:rPr>
+          <w:rStyle w:val="HTMLCode"/>
+        </w:rPr>
+        <w:t xml:space="preserve">[s:e+1, :] = </w:t>
+      </w:r>
+      <w:proofErr w:type="spellStart"/>
+      <w:r>
+        <w:rPr>
+          <w:rStyle w:val="HTMLCode"/>
+        </w:rPr>
+        <w:t>kpi_vec</w:t>
+      </w:r>
+      <w:proofErr w:type="spellEnd"/>
+      <w:r>
+        <w:t>), lo que recuperará la precisión de la V9.</w:t>
+      </w:r>
+    </w:p>
+    <w:p>
+      <w:pPr>
+        <w:pStyle w:val="NormalWeb"/>
+        <w:numPr>
+          <w:ilvl w:val="0"/>
+          <w:numId w:val="28"/>
+        </w:numPr>
+        <w:jc w:val="left"/>
+      </w:pPr>
+      <w:r>
+        <w:rPr>
+          <w:b/>
+          <w:bCs/>
+        </w:rPr>
+        <w:t xml:space="preserve">Blindaje </w:t>
+      </w:r>
+      <w:proofErr w:type="spellStart"/>
+      <w:r>
+        <w:rPr>
+          <w:b/>
+          <w:bCs/>
+        </w:rPr>
+        <w:t>Antifallos</w:t>
+      </w:r>
+      <w:proofErr w:type="spellEnd"/>
+      <w:r>
+        <w:rPr>
+          <w:b/>
+          <w:bCs/>
+        </w:rPr>
+        <w:t>:</w:t>
+      </w:r>
+      <w:r>
+        <w:t xml:space="preserve"> La lista de comprensión con </w:t>
+      </w:r>
+      <w:r>
+        <w:rPr>
+          <w:rStyle w:val="HTMLCode"/>
+        </w:rPr>
+        <w:t>min(</w:t>
+      </w:r>
+      <w:proofErr w:type="spellStart"/>
+      <w:r>
+        <w:rPr>
+          <w:rStyle w:val="HTMLCode"/>
+        </w:rPr>
+        <w:t>max</w:t>
+      </w:r>
+      <w:proofErr w:type="spellEnd"/>
+      <w:r>
+        <w:rPr>
+          <w:rStyle w:val="HTMLCode"/>
+        </w:rPr>
+        <w:t xml:space="preserve">(0, </w:t>
+      </w:r>
+      <w:proofErr w:type="spellStart"/>
+      <w:r>
+        <w:rPr>
+          <w:rStyle w:val="HTMLCode"/>
+        </w:rPr>
+        <w:t>int</w:t>
+      </w:r>
+      <w:proofErr w:type="spellEnd"/>
+      <w:r>
+        <w:rPr>
+          <w:rStyle w:val="HTMLCode"/>
+        </w:rPr>
+        <w:t xml:space="preserve">(x)), </w:t>
+      </w:r>
+      <w:proofErr w:type="spellStart"/>
+      <w:r>
+        <w:rPr>
+          <w:rStyle w:val="HTMLCode"/>
+        </w:rPr>
+        <w:t>video_len</w:t>
+      </w:r>
+      <w:proofErr w:type="spellEnd"/>
+      <w:r>
+        <w:rPr>
+          <w:rStyle w:val="HTMLCode"/>
+        </w:rPr>
+        <w:t xml:space="preserve"> - 1)</w:t>
+      </w:r>
+      <w:r>
+        <w:t xml:space="preserve"> asegura que no vuelvas a ver un </w:t>
+      </w:r>
+      <w:proofErr w:type="spellStart"/>
+      <w:r>
+        <w:rPr>
+          <w:rStyle w:val="HTMLCode"/>
+        </w:rPr>
+        <w:t>IndexError</w:t>
+      </w:r>
+      <w:proofErr w:type="spellEnd"/>
+      <w:r>
+        <w:t xml:space="preserve"> aunque el JSON tenga </w:t>
+      </w:r>
+      <w:proofErr w:type="spellStart"/>
+      <w:r>
+        <w:t>frames</w:t>
+      </w:r>
+      <w:proofErr w:type="spellEnd"/>
+      <w:r>
+        <w:t xml:space="preserve"> "imposibles".</w:t>
+      </w:r>
+    </w:p>
+    <w:p>
+      <w:pPr>
+        <w:pStyle w:val="NormalWeb"/>
+        <w:numPr>
+          <w:ilvl w:val="0"/>
+          <w:numId w:val="28"/>
+        </w:numPr>
+        <w:jc w:val="left"/>
+      </w:pPr>
+      <w:r>
+        <w:rPr>
+          <w:b/>
+          <w:bCs/>
+        </w:rPr>
+        <w:t>Entrenamiento Estirado:</w:t>
+      </w:r>
+      <w:r>
+        <w:t xml:space="preserve"> Los </w:t>
+      </w:r>
+      <w:proofErr w:type="spellStart"/>
+      <w:r>
+        <w:t>callbacks</w:t>
+      </w:r>
+      <w:proofErr w:type="spellEnd"/>
+      <w:r>
+        <w:t xml:space="preserve"> ahora tienen la paciencia necesaria (</w:t>
+      </w:r>
+      <w:r>
+        <w:rPr>
+          <w:b/>
+          <w:bCs/>
+        </w:rPr>
+        <w:t xml:space="preserve">20 para </w:t>
+      </w:r>
+      <w:proofErr w:type="spellStart"/>
+      <w:r>
+        <w:rPr>
+          <w:b/>
+          <w:bCs/>
+        </w:rPr>
+        <w:t>EarlyStopping</w:t>
+      </w:r>
+      <w:proofErr w:type="spellEnd"/>
+      <w:r>
+        <w:t xml:space="preserve"> y </w:t>
+      </w:r>
+      <w:r>
+        <w:rPr>
+          <w:b/>
+          <w:bCs/>
+        </w:rPr>
+        <w:t xml:space="preserve">10 para </w:t>
+      </w:r>
+      <w:proofErr w:type="spellStart"/>
+      <w:r>
+        <w:rPr>
+          <w:b/>
+          <w:bCs/>
+        </w:rPr>
+        <w:t>ReduceLROnPlateau</w:t>
+      </w:r>
+      <w:proofErr w:type="spellEnd"/>
+      <w:r>
+        <w:t>) para que la red no se rinda a las 19 épocas.</w:t>
+      </w:r>
+    </w:p>
+    <w:p>
+      <w:pPr>
+        <w:spacing w:before="0" w:line="240" w:lineRule="auto"/>
+        <w:jc w:val="left"/>
+        <w:rPr>
+          <w:rFonts w:eastAsia="Times New Roman" w:cs="Arial"/>
+          <w:color w:val="1F1F1F"/>
+          <w:sz w:val="24"/>
+          <w:szCs w:val="24"/>
+          <w:lang w:val="es-ES"/>
+        </w:rPr>
+      </w:pPr>
+    </w:p>
+    <w:p>
+      <w:pPr>
+        <w:spacing w:before="0" w:after="100" w:afterAutospacing="1" w:line="240" w:lineRule="auto"/>
+        <w:jc w:val="left"/>
+        <w:rPr>
+          <w:rFonts w:eastAsia="Times New Roman" w:cs="Arial"/>
+          <w:sz w:val="24"/>
+          <w:szCs w:val="24"/>
+          <w:lang w:val="es-ES"/>
+        </w:rPr>
+      </w:pPr>
+      <w:r>
+        <w:rPr>
+          <w:rFonts w:eastAsia="Times New Roman" w:cs="Arial"/>
+          <w:sz w:val="24"/>
+          <w:szCs w:val="24"/>
+          <w:lang w:val="es-ES"/>
+        </w:rPr>
+        <w:t xml:space="preserve">La versión V13 representa la consolidación definitiva del sistema, logrando una arquitectura robusta que integra el procesamiento de señales con aprendizaje profundo. El flujo de trabajo comienza con la captura de </w:t>
+      </w:r>
+      <w:proofErr w:type="spellStart"/>
+      <w:r>
+        <w:rPr>
+          <w:rFonts w:eastAsia="Times New Roman" w:cs="Arial"/>
+          <w:i/>
+          <w:iCs/>
+          <w:sz w:val="24"/>
+          <w:szCs w:val="24"/>
+          <w:lang w:val="es-ES"/>
+        </w:rPr>
+        <w:t>landmarks</w:t>
+      </w:r>
+      <w:proofErr w:type="spellEnd"/>
+      <w:r>
+        <w:rPr>
+          <w:rFonts w:eastAsia="Times New Roman" w:cs="Arial"/>
+          <w:sz w:val="24"/>
+          <w:szCs w:val="24"/>
+          <w:lang w:val="es-ES"/>
+        </w:rPr>
+        <w:t xml:space="preserve"> corporales mediante </w:t>
+      </w:r>
+      <w:proofErr w:type="spellStart"/>
+      <w:r>
+        <w:rPr>
+          <w:rFonts w:eastAsia="Times New Roman" w:cs="Arial"/>
+          <w:b/>
+          <w:bCs/>
+          <w:sz w:val="24"/>
+          <w:szCs w:val="24"/>
+          <w:lang w:val="es-ES"/>
+        </w:rPr>
+        <w:t>MediaPipe</w:t>
+      </w:r>
+      <w:proofErr w:type="spellEnd"/>
+      <w:r>
+        <w:rPr>
+          <w:rFonts w:eastAsia="Times New Roman" w:cs="Arial"/>
+          <w:sz w:val="24"/>
+          <w:szCs w:val="24"/>
+          <w:lang w:val="es-ES"/>
+        </w:rPr>
+        <w:t xml:space="preserve">, seguidos de una etapa de ingeniería de características donde se calculan ángulos articulares y coordenadas normalizadas por la longitud del torso para eliminar sesgos por estatura o distancia a la cámara. Para dotar al modelo de una comprensión dinámica, se calculan las velocidades y aceleraciones de cada punto clave, aplicando un filtro de suavizado </w:t>
+      </w:r>
+      <w:proofErr w:type="spellStart"/>
+      <w:r>
+        <w:rPr>
+          <w:rFonts w:eastAsia="Times New Roman" w:cs="Arial"/>
+          <w:b/>
+          <w:bCs/>
+          <w:sz w:val="24"/>
+          <w:szCs w:val="24"/>
+          <w:lang w:val="es-ES"/>
+        </w:rPr>
+        <w:t>Savitzky-Golay</w:t>
+      </w:r>
+      <w:proofErr w:type="spellEnd"/>
+      <w:r>
+        <w:rPr>
+          <w:rFonts w:eastAsia="Times New Roman" w:cs="Arial"/>
+          <w:sz w:val="24"/>
+          <w:szCs w:val="24"/>
+          <w:lang w:val="es-ES"/>
+        </w:rPr>
+        <w:t xml:space="preserve">. Una pieza fundamental de esta versión es la </w:t>
+      </w:r>
+      <w:r>
+        <w:rPr>
+          <w:rFonts w:eastAsia="Times New Roman" w:cs="Arial"/>
+          <w:b/>
+          <w:bCs/>
+          <w:sz w:val="24"/>
+          <w:szCs w:val="24"/>
+          <w:lang w:val="es-ES"/>
+        </w:rPr>
+        <w:t>Normalización Inteligente con Máscara</w:t>
+      </w:r>
+      <w:r>
+        <w:rPr>
+          <w:rFonts w:eastAsia="Times New Roman" w:cs="Arial"/>
+          <w:sz w:val="24"/>
+          <w:szCs w:val="24"/>
+          <w:lang w:val="es-ES"/>
+        </w:rPr>
+        <w:t xml:space="preserve">, que asegura que los datos de entrada mantengan el valor $0.0$ en los </w:t>
+      </w:r>
+      <w:proofErr w:type="spellStart"/>
+      <w:r>
+        <w:rPr>
+          <w:rFonts w:eastAsia="Times New Roman" w:cs="Arial"/>
+          <w:sz w:val="24"/>
+          <w:szCs w:val="24"/>
+          <w:lang w:val="es-ES"/>
+        </w:rPr>
+        <w:t>frames</w:t>
+      </w:r>
+      <w:proofErr w:type="spellEnd"/>
+      <w:r>
+        <w:rPr>
+          <w:rFonts w:eastAsia="Times New Roman" w:cs="Arial"/>
+          <w:sz w:val="24"/>
+          <w:szCs w:val="24"/>
+          <w:lang w:val="es-ES"/>
+        </w:rPr>
+        <w:t xml:space="preserve"> sin detección. Esto permite que la capa de </w:t>
+      </w:r>
+      <w:proofErr w:type="spellStart"/>
+      <w:r>
+        <w:rPr>
+          <w:rFonts w:eastAsia="Times New Roman" w:cs="Arial"/>
+          <w:i/>
+          <w:iCs/>
+          <w:sz w:val="24"/>
+          <w:szCs w:val="24"/>
+          <w:lang w:val="es-ES"/>
+        </w:rPr>
+        <w:t>Masking</w:t>
+      </w:r>
+      <w:proofErr w:type="spellEnd"/>
+      <w:r>
+        <w:rPr>
+          <w:rFonts w:eastAsia="Times New Roman" w:cs="Arial"/>
+          <w:sz w:val="24"/>
+          <w:szCs w:val="24"/>
+          <w:lang w:val="es-ES"/>
+        </w:rPr>
+        <w:t xml:space="preserve"> de la red neuronal ignore el ruido técnico y se sincronice perfectamente tanto en la fase de entrenamiento como en la de inferencia en tiempo real.</w:t>
+      </w:r>
+    </w:p>
+    <w:p>
+      <w:pPr>
+        <w:spacing w:before="0" w:after="100" w:afterAutospacing="1" w:line="240" w:lineRule="auto"/>
+        <w:jc w:val="left"/>
+        <w:rPr>
+          <w:rFonts w:eastAsia="Times New Roman" w:cs="Arial"/>
+          <w:sz w:val="24"/>
+          <w:szCs w:val="24"/>
+          <w:lang w:val="es-ES"/>
+        </w:rPr>
+      </w:pPr>
+      <w:r>
+        <w:rPr>
+          <w:rFonts w:eastAsia="Times New Roman" w:cs="Arial"/>
+          <w:sz w:val="24"/>
+          <w:szCs w:val="24"/>
+          <w:lang w:val="es-ES"/>
+        </w:rPr>
+        <w:t xml:space="preserve">El núcleo de inteligencia reside en una red neuronal </w:t>
+      </w:r>
+      <w:proofErr w:type="spellStart"/>
+      <w:r>
+        <w:rPr>
+          <w:rFonts w:eastAsia="Times New Roman" w:cs="Arial"/>
+          <w:b/>
+          <w:bCs/>
+          <w:sz w:val="24"/>
+          <w:szCs w:val="24"/>
+          <w:lang w:val="es-ES"/>
+        </w:rPr>
+        <w:t>Bidirectional</w:t>
+      </w:r>
+      <w:proofErr w:type="spellEnd"/>
+      <w:r>
+        <w:rPr>
+          <w:rFonts w:eastAsia="Times New Roman" w:cs="Arial"/>
+          <w:b/>
+          <w:bCs/>
+          <w:sz w:val="24"/>
+          <w:szCs w:val="24"/>
+          <w:lang w:val="es-ES"/>
+        </w:rPr>
+        <w:t xml:space="preserve"> LSTM (</w:t>
+      </w:r>
+      <w:proofErr w:type="spellStart"/>
+      <w:r>
+        <w:rPr>
+          <w:rFonts w:eastAsia="Times New Roman" w:cs="Arial"/>
+          <w:b/>
+          <w:bCs/>
+          <w:sz w:val="24"/>
+          <w:szCs w:val="24"/>
+          <w:lang w:val="es-ES"/>
+        </w:rPr>
+        <w:t>BiLSTM</w:t>
+      </w:r>
+      <w:proofErr w:type="spellEnd"/>
+      <w:r>
+        <w:rPr>
+          <w:rFonts w:eastAsia="Times New Roman" w:cs="Arial"/>
+          <w:b/>
+          <w:bCs/>
+          <w:sz w:val="24"/>
+          <w:szCs w:val="24"/>
+          <w:lang w:val="es-ES"/>
+        </w:rPr>
+        <w:t>)</w:t>
+      </w:r>
+      <w:r>
+        <w:rPr>
+          <w:rFonts w:eastAsia="Times New Roman" w:cs="Arial"/>
+          <w:sz w:val="24"/>
+          <w:szCs w:val="24"/>
+          <w:lang w:val="es-ES"/>
+        </w:rPr>
+        <w:t xml:space="preserve"> de doble salida. La primera salida realiza una clasificación multiclase para segmentar el ejercicio en </w:t>
+      </w:r>
+      <w:r>
+        <w:rPr>
+          <w:rFonts w:eastAsia="Times New Roman" w:cs="Arial"/>
+          <w:b/>
+          <w:bCs/>
+          <w:sz w:val="24"/>
+          <w:szCs w:val="24"/>
+          <w:lang w:val="es-ES"/>
+        </w:rPr>
+        <w:t>cinco fases temporales</w:t>
+      </w:r>
+      <w:r>
+        <w:rPr>
+          <w:rFonts w:eastAsia="Times New Roman" w:cs="Arial"/>
+          <w:sz w:val="24"/>
+          <w:szCs w:val="24"/>
+          <w:lang w:val="es-ES"/>
+        </w:rPr>
+        <w:t>: reposo, preparación, descenso, punto de máxima profundidad (</w:t>
+      </w:r>
+      <w:proofErr w:type="spellStart"/>
+      <w:r>
+        <w:rPr>
+          <w:rFonts w:eastAsia="Times New Roman" w:cs="Arial"/>
+          <w:i/>
+          <w:iCs/>
+          <w:sz w:val="24"/>
+          <w:szCs w:val="24"/>
+          <w:lang w:val="es-ES"/>
+        </w:rPr>
+        <w:t>apex</w:t>
+      </w:r>
+      <w:proofErr w:type="spellEnd"/>
+      <w:r>
+        <w:rPr>
+          <w:rFonts w:eastAsia="Times New Roman" w:cs="Arial"/>
+          <w:sz w:val="24"/>
+          <w:szCs w:val="24"/>
+          <w:lang w:val="es-ES"/>
+        </w:rPr>
+        <w:t xml:space="preserve">) y ascenso. La segunda salida ejecuta una regresión lineal para estimar simultáneamente </w:t>
+      </w:r>
+      <w:r>
+        <w:rPr>
+          <w:rFonts w:eastAsia="Times New Roman" w:cs="Arial"/>
+          <w:b/>
+          <w:bCs/>
+          <w:sz w:val="24"/>
+          <w:szCs w:val="24"/>
+          <w:lang w:val="es-ES"/>
+        </w:rPr>
+        <w:t>cinco indicadores clave de rendimiento (</w:t>
+      </w:r>
+      <w:proofErr w:type="spellStart"/>
+      <w:r>
+        <w:rPr>
+          <w:rFonts w:eastAsia="Times New Roman" w:cs="Arial"/>
+          <w:b/>
+          <w:bCs/>
+          <w:sz w:val="24"/>
+          <w:szCs w:val="24"/>
+          <w:lang w:val="es-ES"/>
+        </w:rPr>
+        <w:t>KPIs</w:t>
+      </w:r>
+      <w:proofErr w:type="spellEnd"/>
+      <w:r>
+        <w:rPr>
+          <w:rFonts w:eastAsia="Times New Roman" w:cs="Arial"/>
+          <w:b/>
+          <w:bCs/>
+          <w:sz w:val="24"/>
+          <w:szCs w:val="24"/>
+          <w:lang w:val="es-ES"/>
+        </w:rPr>
+        <w:t>)</w:t>
+      </w:r>
+      <w:r>
+        <w:rPr>
+          <w:rFonts w:eastAsia="Times New Roman" w:cs="Arial"/>
+          <w:sz w:val="24"/>
+          <w:szCs w:val="24"/>
+          <w:lang w:val="es-ES"/>
+        </w:rPr>
+        <w:t xml:space="preserve">: profundidad, inclinación del torso, estabilidad, simetría de rodillas y ritmo. A diferencia de versiones experimentales previas, la V13 emplea una estrategia de </w:t>
+      </w:r>
+      <w:r>
+        <w:rPr>
+          <w:rFonts w:eastAsia="Times New Roman" w:cs="Arial"/>
+          <w:b/>
+          <w:bCs/>
+          <w:sz w:val="24"/>
+          <w:szCs w:val="24"/>
+          <w:lang w:val="es-ES"/>
+        </w:rPr>
+        <w:t>etiquetado constante</w:t>
+      </w:r>
+      <w:r>
+        <w:rPr>
+          <w:rFonts w:eastAsia="Times New Roman" w:cs="Arial"/>
+          <w:sz w:val="24"/>
+          <w:szCs w:val="24"/>
+          <w:lang w:val="es-ES"/>
+        </w:rPr>
+        <w:t xml:space="preserve"> durante toda la repetición, lo que proporciona una señal de aprendizaje más estable y reduce drásticamente el error absoluto medio (MAE), especialmente en la métrica de profundidad, al eliminar la ambigüedad en el entrenamiento del gradiente.</w:t>
+      </w:r>
+    </w:p>
+    <w:p>
+      <w:pPr>
+        <w:spacing w:before="0" w:after="100" w:afterAutospacing="1" w:line="240" w:lineRule="auto"/>
+        <w:jc w:val="left"/>
+        <w:rPr>
+          <w:rFonts w:eastAsia="Times New Roman" w:cs="Arial"/>
+          <w:sz w:val="24"/>
+          <w:szCs w:val="24"/>
+          <w:lang w:val="es-ES"/>
+        </w:rPr>
+      </w:pPr>
+      <w:r>
+        <w:rPr>
+          <w:rFonts w:eastAsia="Times New Roman" w:cs="Arial"/>
+          <w:sz w:val="24"/>
+          <w:szCs w:val="24"/>
+          <w:lang w:val="es-ES"/>
+        </w:rPr>
+        <w:t xml:space="preserve">Finalmente, el sistema se caracteriza por una coherencia técnica total entre el entorno de desarrollo y la ejecución final. Mediante el ajuste fino de </w:t>
+      </w:r>
+      <w:proofErr w:type="spellStart"/>
+      <w:r>
+        <w:rPr>
+          <w:rFonts w:eastAsia="Times New Roman" w:cs="Arial"/>
+          <w:sz w:val="24"/>
+          <w:szCs w:val="24"/>
+          <w:lang w:val="es-ES"/>
+        </w:rPr>
+        <w:t>hiperparámetros</w:t>
+      </w:r>
+      <w:proofErr w:type="spellEnd"/>
+      <w:r>
+        <w:rPr>
+          <w:rFonts w:eastAsia="Times New Roman" w:cs="Arial"/>
+          <w:sz w:val="24"/>
+          <w:szCs w:val="24"/>
+          <w:lang w:val="es-ES"/>
+        </w:rPr>
+        <w:t xml:space="preserve"> —incluyendo una tasa de aprendizaje reducida ($5 \times 10^{-4}$) y una mayor paciencia en el algoritmo de parada temprana (</w:t>
+      </w:r>
+      <w:proofErr w:type="spellStart"/>
+      <w:r>
+        <w:rPr>
+          <w:rFonts w:eastAsia="Times New Roman" w:cs="Arial"/>
+          <w:i/>
+          <w:iCs/>
+          <w:sz w:val="24"/>
+          <w:szCs w:val="24"/>
+          <w:lang w:val="es-ES"/>
+        </w:rPr>
+        <w:t>EarlyStopping</w:t>
+      </w:r>
+      <w:proofErr w:type="spellEnd"/>
+      <w:r>
+        <w:rPr>
+          <w:rFonts w:eastAsia="Times New Roman" w:cs="Arial"/>
+          <w:sz w:val="24"/>
+          <w:szCs w:val="24"/>
+          <w:lang w:val="es-ES"/>
+        </w:rPr>
+        <w:t>)—, el modelo V13 ha demostrado una capacidad de generalización superior. Esta versión no solo optimiza la precisión numérica, sino que establece un marco de trabajo donde la arquitectura de la red entiende la "física" del movimiento a través de las velocidades, resultando en un sistema de evaluación de sentadillas de alta fidelidad capaz de igualar el criterio de un evaluador humano con un margen de error mínimo.</w:t>
+      </w:r>
+    </w:p>
+    <w:p>
+      <w:pPr>
+        <w:rPr>
+          <w:lang w:val="es-ES"/>
+        </w:rPr>
+      </w:pPr>
+    </w:p>
     <w:p/>
     <w:p>
       <w:pPr>
@@ -3221,7 +5976,6 @@
         <w:rPr>
           <w:noProof/>
         </w:rPr>
-        <w:lastRenderedPageBreak/>
         <w:drawing>
           <wp:inline distT="0" distB="0" distL="0" distR="0" wp14:anchorId="55E8FA1D" wp14:editId="5D68251D">
             <wp:extent cx="5943600" cy="3375025"/>
@@ -3327,11 +6081,19 @@
           <w:rFonts w:ascii="Times New Roman" w:hAnsi="Times New Roman"/>
         </w:rPr>
       </w:pPr>
-      <w:r>
-        <w:rPr>
-          <w:rFonts w:cs="Arial"/>
-        </w:rPr>
-        <w:t xml:space="preserve">Codigo pedido a la IA: </w:t>
+      <w:proofErr w:type="spellStart"/>
+      <w:r>
+        <w:rPr>
+          <w:rFonts w:cs="Arial"/>
+        </w:rPr>
+        <w:t>Codigo</w:t>
+      </w:r>
+      <w:proofErr w:type="spellEnd"/>
+      <w:r>
+        <w:rPr>
+          <w:rFonts w:cs="Arial"/>
+        </w:rPr>
+        <w:t xml:space="preserve"> pedido a la IA: </w:t>
       </w:r>
       <w:r>
         <w:t>4️</w:t>
@@ -3356,7 +6118,15 @@
         <w:jc w:val="left"/>
       </w:pPr>
       <w:r>
-        <w:t>Normaliza todos los keypoints por torso/cadera → posición y tamaño</w:t>
+        <w:t xml:space="preserve">Normaliza todos los </w:t>
+      </w:r>
+      <w:proofErr w:type="spellStart"/>
+      <w:r>
+        <w:t>keypoints</w:t>
+      </w:r>
+      <w:proofErr w:type="spellEnd"/>
+      <w:r>
+        <w:t xml:space="preserve"> por torso/cadera → posición y tamaño</w:t>
       </w:r>
     </w:p>
     <w:p>
@@ -3463,11 +6233,19 @@
       <w:r>
         <w:t xml:space="preserve">Extrae </w:t>
       </w:r>
+      <w:proofErr w:type="spellStart"/>
       <w:r>
         <w:rPr>
           <w:rStyle w:val="Strong"/>
         </w:rPr>
-        <w:t>features universales por repetición</w:t>
+        <w:t>features</w:t>
+      </w:r>
+      <w:proofErr w:type="spellEnd"/>
+      <w:r>
+        <w:rPr>
+          <w:rStyle w:val="Strong"/>
+        </w:rPr>
+        <w:t xml:space="preserve"> universales por repetición</w:t>
       </w:r>
       <w:r>
         <w:t>:</w:t>
@@ -3483,8 +6261,13 @@
         <w:jc w:val="left"/>
       </w:pPr>
       <w:r>
-        <w:t>ROM máximo/minimo</w:t>
-      </w:r>
+        <w:t>ROM máximo/</w:t>
+      </w:r>
+      <w:proofErr w:type="spellStart"/>
+      <w:r>
+        <w:t>minimo</w:t>
+      </w:r>
+      <w:proofErr w:type="spellEnd"/>
     </w:p>
     <w:p>
       <w:pPr>
@@ -3522,7 +6305,15 @@
         <w:jc w:val="left"/>
       </w:pPr>
       <w:r>
-        <w:t>Guarda todo en un dataset por repetición → listo para ML o reglas</w:t>
+        <w:t xml:space="preserve">Guarda todo en un </w:t>
+      </w:r>
+      <w:proofErr w:type="spellStart"/>
+      <w:r>
+        <w:t>dataset</w:t>
+      </w:r>
+      <w:proofErr w:type="spellEnd"/>
+      <w:r>
+        <w:t xml:space="preserve"> por repetición → listo para ML o reglas</w:t>
       </w:r>
     </w:p>
     <w:p>
@@ -3550,6 +6341,7 @@
         <w:pStyle w:val="NormalWeb"/>
       </w:pPr>
       <w:r>
+        <w:lastRenderedPageBreak/>
         <w:t>Aquí es donde debemos ser realistas sobre los límites de analizar un video solo con geometría:</w:t>
       </w:r>
     </w:p>
@@ -3567,7 +6359,6 @@
           <w:b/>
           <w:bCs/>
         </w:rPr>
-        <w:lastRenderedPageBreak/>
         <w:t>Activación muscular esperada (El gran problema):</w:t>
       </w:r>
       <w:r>
@@ -3601,7 +6392,15 @@
         <w:t>Balanceos y compensaciones (Estabilidad real):</w:t>
       </w:r>
       <w:r>
-        <w:t xml:space="preserve"> Puedes detectar con MediaPipe si el tronco se inclina hacia adelante, pero ¿cómo sabes si el usuario está perdiendo el equilibrio o simplemente tiene esa anatomía? El equilibrio real se define </w:t>
+        <w:t xml:space="preserve"> Puedes detectar con </w:t>
+      </w:r>
+      <w:proofErr w:type="spellStart"/>
+      <w:r>
+        <w:t>MediaPipe</w:t>
+      </w:r>
+      <w:proofErr w:type="spellEnd"/>
+      <w:r>
+        <w:t xml:space="preserve"> si el tronco se inclina hacia adelante, pero ¿cómo sabes si el usuario está perdiendo el equilibrio o simplemente tiene esa anatomía? El equilibrio real se define </w:t>
       </w:r>
       <w:r>
         <w:rPr>
@@ -3699,10 +6498,72 @@
           <w:color w:val="E3E3E3"/>
           <w:shd w:val="clear" w:color="auto" w:fill="282A2C"/>
         </w:rPr>
-        <w:t> dame el codigo para la red, acuerdate de todos los kpis, extraer repeticiones, y todo lo que hemos hablado.</w:t>
-      </w:r>
-      <w:r>
-        <w:t xml:space="preserve"> Apuntar posteriormente los kpis indicados.</w:t>
+        <w:t xml:space="preserve"> dame el </w:t>
+      </w:r>
+      <w:proofErr w:type="spellStart"/>
+      <w:r>
+        <w:rPr>
+          <w:rFonts w:cs="Arial"/>
+          <w:color w:val="E3E3E3"/>
+          <w:shd w:val="clear" w:color="auto" w:fill="282A2C"/>
+        </w:rPr>
+        <w:t>codigo</w:t>
+      </w:r>
+      <w:proofErr w:type="spellEnd"/>
+      <w:r>
+        <w:rPr>
+          <w:rFonts w:cs="Arial"/>
+          <w:color w:val="E3E3E3"/>
+          <w:shd w:val="clear" w:color="auto" w:fill="282A2C"/>
+        </w:rPr>
+        <w:t xml:space="preserve"> para la red, </w:t>
+      </w:r>
+      <w:proofErr w:type="spellStart"/>
+      <w:r>
+        <w:rPr>
+          <w:rFonts w:cs="Arial"/>
+          <w:color w:val="E3E3E3"/>
+          <w:shd w:val="clear" w:color="auto" w:fill="282A2C"/>
+        </w:rPr>
+        <w:t>acuerdate</w:t>
+      </w:r>
+      <w:proofErr w:type="spellEnd"/>
+      <w:r>
+        <w:rPr>
+          <w:rFonts w:cs="Arial"/>
+          <w:color w:val="E3E3E3"/>
+          <w:shd w:val="clear" w:color="auto" w:fill="282A2C"/>
+        </w:rPr>
+        <w:t xml:space="preserve"> de todos los </w:t>
+      </w:r>
+      <w:proofErr w:type="spellStart"/>
+      <w:r>
+        <w:rPr>
+          <w:rFonts w:cs="Arial"/>
+          <w:color w:val="E3E3E3"/>
+          <w:shd w:val="clear" w:color="auto" w:fill="282A2C"/>
+        </w:rPr>
+        <w:t>kpis</w:t>
+      </w:r>
+      <w:proofErr w:type="spellEnd"/>
+      <w:r>
+        <w:rPr>
+          <w:rFonts w:cs="Arial"/>
+          <w:color w:val="E3E3E3"/>
+          <w:shd w:val="clear" w:color="auto" w:fill="282A2C"/>
+        </w:rPr>
+        <w:t>, extraer repeticiones, y todo lo que hemos hablado.</w:t>
+      </w:r>
+      <w:r>
+        <w:t xml:space="preserve"> Apuntar posteriormente los </w:t>
+      </w:r>
+      <w:proofErr w:type="spellStart"/>
+      <w:r>
+        <w:t>kpis</w:t>
+      </w:r>
+      <w:proofErr w:type="spellEnd"/>
+      <w:r>
+        <w:t xml:space="preserve"> indicados.</w:t>
       </w:r>
     </w:p>
     <w:p>
@@ -3809,7 +6670,119 @@
         <w:jc w:val="left"/>
       </w:pPr>
       <w:r>
-        <w:t>['L_elbow', 'R_elbow', 'L_shoulder', 'R_shoulder', 'L_knee', 'R_knee', 'L_hip', 'R_hip', 'L_ankle', 'R_ankle', 'torso', 'sust_x', 'sust_y', 'sust_z', 'delta_time']</w:t>
+        <w:t>['</w:t>
+      </w:r>
+      <w:proofErr w:type="spellStart"/>
+      <w:r>
+        <w:t>L_elbow</w:t>
+      </w:r>
+      <w:proofErr w:type="spellEnd"/>
+      <w:r>
+        <w:t>', '</w:t>
+      </w:r>
+      <w:proofErr w:type="spellStart"/>
+      <w:r>
+        <w:t>R_elbow</w:t>
+      </w:r>
+      <w:proofErr w:type="spellEnd"/>
+      <w:r>
+        <w:t>', '</w:t>
+      </w:r>
+      <w:proofErr w:type="spellStart"/>
+      <w:r>
+        <w:t>L_shoulder</w:t>
+      </w:r>
+      <w:proofErr w:type="spellEnd"/>
+      <w:r>
+        <w:t>', '</w:t>
+      </w:r>
+      <w:proofErr w:type="spellStart"/>
+      <w:r>
+        <w:t>R_shoulder</w:t>
+      </w:r>
+      <w:proofErr w:type="spellEnd"/>
+      <w:r>
+        <w:t>', '</w:t>
+      </w:r>
+      <w:proofErr w:type="spellStart"/>
+      <w:r>
+        <w:t>L_knee</w:t>
+      </w:r>
+      <w:proofErr w:type="spellEnd"/>
+      <w:r>
+        <w:t>', '</w:t>
+      </w:r>
+      <w:proofErr w:type="spellStart"/>
+      <w:r>
+        <w:t>R_knee</w:t>
+      </w:r>
+      <w:proofErr w:type="spellEnd"/>
+      <w:r>
+        <w:t>', '</w:t>
+      </w:r>
+      <w:proofErr w:type="spellStart"/>
+      <w:r>
+        <w:t>L_hip</w:t>
+      </w:r>
+      <w:proofErr w:type="spellEnd"/>
+      <w:r>
+        <w:t>', '</w:t>
+      </w:r>
+      <w:proofErr w:type="spellStart"/>
+      <w:r>
+        <w:t>R_hip</w:t>
+      </w:r>
+      <w:proofErr w:type="spellEnd"/>
+      <w:r>
+        <w:t>', '</w:t>
+      </w:r>
+      <w:proofErr w:type="spellStart"/>
+      <w:r>
+        <w:t>L_ankle</w:t>
+      </w:r>
+      <w:proofErr w:type="spellEnd"/>
+      <w:r>
+        <w:t>', '</w:t>
+      </w:r>
+      <w:proofErr w:type="spellStart"/>
+      <w:r>
+        <w:t>R_ankle</w:t>
+      </w:r>
+      <w:proofErr w:type="spellEnd"/>
+      <w:r>
+        <w:t>', 'torso', '</w:t>
+      </w:r>
+      <w:proofErr w:type="spellStart"/>
+      <w:r>
+        <w:t>sust_x</w:t>
+      </w:r>
+      <w:proofErr w:type="spellEnd"/>
+      <w:r>
+        <w:t>', '</w:t>
+      </w:r>
+      <w:proofErr w:type="spellStart"/>
+      <w:r>
+        <w:t>sust_y</w:t>
+      </w:r>
+      <w:proofErr w:type="spellEnd"/>
+      <w:r>
+        <w:t>', '</w:t>
+      </w:r>
+      <w:proofErr w:type="spellStart"/>
+      <w:r>
+        <w:t>sust_z</w:t>
+      </w:r>
+      <w:proofErr w:type="spellEnd"/>
+      <w:r>
+        <w:t>', '</w:t>
+      </w:r>
+      <w:proofErr w:type="spellStart"/>
+      <w:r>
+        <w:t>delta_time</w:t>
+      </w:r>
+      <w:proofErr w:type="spellEnd"/>
+      <w:r>
+        <w:t>']</w:t>
       </w:r>
     </w:p>
     <w:p>
@@ -6922,6 +9895,155 @@
     </w:lvl>
   </w:abstractNum>
   <w:abstractNum w:abstractNumId="21" w15:restartNumberingAfterBreak="0">
+    <w:nsid w:val="636F63C7"/>
+    <w:multiLevelType w:val="multilevel"/>
+    <w:tmpl w:val="4EB633A0"/>
+    <w:lvl w:ilvl="0">
+      <w:start w:val="1"/>
+      <w:numFmt w:val="bullet"/>
+      <w:lvlText w:val=""/>
+      <w:lvlJc w:val="left"/>
+      <w:pPr>
+        <w:tabs>
+          <w:tab w:val="num" w:pos="720"/>
+        </w:tabs>
+        <w:ind w:left="720" w:hanging="360"/>
+      </w:pPr>
+      <w:rPr>
+        <w:rFonts w:ascii="Symbol" w:hAnsi="Symbol" w:hint="default"/>
+        <w:sz w:val="20"/>
+      </w:rPr>
+    </w:lvl>
+    <w:lvl w:ilvl="1" w:tentative="1">
+      <w:start w:val="1"/>
+      <w:numFmt w:val="bullet"/>
+      <w:lvlText w:val="o"/>
+      <w:lvlJc w:val="left"/>
+      <w:pPr>
+        <w:tabs>
+          <w:tab w:val="num" w:pos="1440"/>
+        </w:tabs>
+        <w:ind w:left="1440" w:hanging="360"/>
+      </w:pPr>
+      <w:rPr>
+        <w:rFonts w:ascii="Courier New" w:hAnsi="Courier New" w:hint="default"/>
+        <w:sz w:val="20"/>
+      </w:rPr>
+    </w:lvl>
+    <w:lvl w:ilvl="2" w:tentative="1">
+      <w:start w:val="1"/>
+      <w:numFmt w:val="bullet"/>
+      <w:lvlText w:val=""/>
+      <w:lvlJc w:val="left"/>
+      <w:pPr>
+        <w:tabs>
+          <w:tab w:val="num" w:pos="2160"/>
+        </w:tabs>
+        <w:ind w:left="2160" w:hanging="360"/>
+      </w:pPr>
+      <w:rPr>
+        <w:rFonts w:ascii="Wingdings" w:hAnsi="Wingdings" w:hint="default"/>
+        <w:sz w:val="20"/>
+      </w:rPr>
+    </w:lvl>
+    <w:lvl w:ilvl="3" w:tentative="1">
+      <w:start w:val="1"/>
+      <w:numFmt w:val="bullet"/>
+      <w:lvlText w:val=""/>
+      <w:lvlJc w:val="left"/>
+      <w:pPr>
+        <w:tabs>
+          <w:tab w:val="num" w:pos="2880"/>
+        </w:tabs>
+        <w:ind w:left="2880" w:hanging="360"/>
+      </w:pPr>
+      <w:rPr>
+        <w:rFonts w:ascii="Wingdings" w:hAnsi="Wingdings" w:hint="default"/>
+        <w:sz w:val="20"/>
+      </w:rPr>
+    </w:lvl>
+    <w:lvl w:ilvl="4" w:tentative="1">
+      <w:start w:val="1"/>
+      <w:numFmt w:val="bullet"/>
+      <w:lvlText w:val=""/>
+      <w:lvlJc w:val="left"/>
+      <w:pPr>
+        <w:tabs>
+          <w:tab w:val="num" w:pos="3600"/>
+        </w:tabs>
+        <w:ind w:left="3600" w:hanging="360"/>
+      </w:pPr>
+      <w:rPr>
+        <w:rFonts w:ascii="Wingdings" w:hAnsi="Wingdings" w:hint="default"/>
+        <w:sz w:val="20"/>
+      </w:rPr>
+    </w:lvl>
+    <w:lvl w:ilvl="5" w:tentative="1">
+      <w:start w:val="1"/>
+      <w:numFmt w:val="bullet"/>
+      <w:lvlText w:val=""/>
+      <w:lvlJc w:val="left"/>
+      <w:pPr>
+        <w:tabs>
+          <w:tab w:val="num" w:pos="4320"/>
+        </w:tabs>
+        <w:ind w:left="4320" w:hanging="360"/>
+      </w:pPr>
+      <w:rPr>
+        <w:rFonts w:ascii="Wingdings" w:hAnsi="Wingdings" w:hint="default"/>
+        <w:sz w:val="20"/>
+      </w:rPr>
+    </w:lvl>
+    <w:lvl w:ilvl="6" w:tentative="1">
+      <w:start w:val="1"/>
+      <w:numFmt w:val="bullet"/>
+      <w:lvlText w:val=""/>
+      <w:lvlJc w:val="left"/>
+      <w:pPr>
+        <w:tabs>
+          <w:tab w:val="num" w:pos="5040"/>
+        </w:tabs>
+        <w:ind w:left="5040" w:hanging="360"/>
+      </w:pPr>
+      <w:rPr>
+        <w:rFonts w:ascii="Wingdings" w:hAnsi="Wingdings" w:hint="default"/>
+        <w:sz w:val="20"/>
+      </w:rPr>
+    </w:lvl>
+    <w:lvl w:ilvl="7" w:tentative="1">
+      <w:start w:val="1"/>
+      <w:numFmt w:val="bullet"/>
+      <w:lvlText w:val=""/>
+      <w:lvlJc w:val="left"/>
+      <w:pPr>
+        <w:tabs>
+          <w:tab w:val="num" w:pos="5760"/>
+        </w:tabs>
+        <w:ind w:left="5760" w:hanging="360"/>
+      </w:pPr>
+      <w:rPr>
+        <w:rFonts w:ascii="Wingdings" w:hAnsi="Wingdings" w:hint="default"/>
+        <w:sz w:val="20"/>
+      </w:rPr>
+    </w:lvl>
+    <w:lvl w:ilvl="8" w:tentative="1">
+      <w:start w:val="1"/>
+      <w:numFmt w:val="bullet"/>
+      <w:lvlText w:val=""/>
+      <w:lvlJc w:val="left"/>
+      <w:pPr>
+        <w:tabs>
+          <w:tab w:val="num" w:pos="6480"/>
+        </w:tabs>
+        <w:ind w:left="6480" w:hanging="360"/>
+      </w:pPr>
+      <w:rPr>
+        <w:rFonts w:ascii="Wingdings" w:hAnsi="Wingdings" w:hint="default"/>
+        <w:sz w:val="20"/>
+      </w:rPr>
+    </w:lvl>
+  </w:abstractNum>
+  <w:abstractNum w:abstractNumId="22" w15:restartNumberingAfterBreak="0">
     <w:nsid w:val="65F659CC"/>
     <w:multiLevelType w:val="multilevel"/>
     <w:tmpl w:val="3AC8755C"/>
@@ -7038,7 +10160,7 @@
       </w:pPr>
     </w:lvl>
   </w:abstractNum>
-  <w:abstractNum w:abstractNumId="22" w15:restartNumberingAfterBreak="0">
+  <w:abstractNum w:abstractNumId="23" w15:restartNumberingAfterBreak="0">
     <w:nsid w:val="69E013FE"/>
     <w:multiLevelType w:val="hybridMultilevel"/>
     <w:tmpl w:val="AFF82F7E"/>
@@ -7127,7 +10249,7 @@
       </w:pPr>
     </w:lvl>
   </w:abstractNum>
-  <w:abstractNum w:abstractNumId="23" w15:restartNumberingAfterBreak="0">
+  <w:abstractNum w:abstractNumId="24" w15:restartNumberingAfterBreak="0">
     <w:nsid w:val="73531AE1"/>
     <w:multiLevelType w:val="multilevel"/>
     <w:tmpl w:val="BF907102"/>
@@ -7276,7 +10398,7 @@
       </w:rPr>
     </w:lvl>
   </w:abstractNum>
-  <w:abstractNum w:abstractNumId="24" w15:restartNumberingAfterBreak="0">
+  <w:abstractNum w:abstractNumId="25" w15:restartNumberingAfterBreak="0">
     <w:nsid w:val="77B649EA"/>
     <w:multiLevelType w:val="multilevel"/>
     <w:tmpl w:val="D652B070"/>
@@ -7393,7 +10515,7 @@
       </w:pPr>
     </w:lvl>
   </w:abstractNum>
-  <w:abstractNum w:abstractNumId="25" w15:restartNumberingAfterBreak="0">
+  <w:abstractNum w:abstractNumId="26" w15:restartNumberingAfterBreak="0">
     <w:nsid w:val="786337F3"/>
     <w:multiLevelType w:val="hybridMultilevel"/>
     <w:tmpl w:val="EAB02794"/>
@@ -7482,7 +10604,7 @@
       </w:pPr>
     </w:lvl>
   </w:abstractNum>
-  <w:abstractNum w:abstractNumId="26" w15:restartNumberingAfterBreak="0">
+  <w:abstractNum w:abstractNumId="27" w15:restartNumberingAfterBreak="0">
     <w:nsid w:val="7D5169A3"/>
     <w:multiLevelType w:val="multilevel"/>
     <w:tmpl w:val="9CFC0A2A"/>
@@ -7600,19 +10722,19 @@
     </w:lvl>
   </w:abstractNum>
   <w:num w:numId="1" w16cid:durableId="331875490">
-    <w:abstractNumId w:val="22"/>
+    <w:abstractNumId w:val="23"/>
   </w:num>
   <w:num w:numId="2" w16cid:durableId="830371810">
-    <w:abstractNumId w:val="24"/>
+    <w:abstractNumId w:val="25"/>
   </w:num>
   <w:num w:numId="3" w16cid:durableId="2085255341">
-    <w:abstractNumId w:val="26"/>
+    <w:abstractNumId w:val="27"/>
   </w:num>
   <w:num w:numId="4" w16cid:durableId="332076063">
     <w:abstractNumId w:val="0"/>
   </w:num>
   <w:num w:numId="5" w16cid:durableId="1408915824">
-    <w:abstractNumId w:val="25"/>
+    <w:abstractNumId w:val="26"/>
   </w:num>
   <w:num w:numId="6" w16cid:durableId="1426153274">
     <w:abstractNumId w:val="3"/>
@@ -7627,7 +10749,7 @@
     <w:abstractNumId w:val="4"/>
   </w:num>
   <w:num w:numId="10" w16cid:durableId="355890323">
-    <w:abstractNumId w:val="21"/>
+    <w:abstractNumId w:val="22"/>
   </w:num>
   <w:num w:numId="11" w16cid:durableId="1772168063">
     <w:abstractNumId w:val="15"/>
@@ -7642,7 +10764,7 @@
     <w:abstractNumId w:val="12"/>
   </w:num>
   <w:num w:numId="15" w16cid:durableId="17705415">
-    <w:abstractNumId w:val="23"/>
+    <w:abstractNumId w:val="24"/>
   </w:num>
   <w:num w:numId="16" w16cid:durableId="1604609003">
     <w:abstractNumId w:val="1"/>
@@ -7679,6 +10801,9 @@
   </w:num>
   <w:num w:numId="27" w16cid:durableId="955604030">
     <w:abstractNumId w:val="13"/>
+  </w:num>
+  <w:num w:numId="28" w16cid:durableId="148056296">
+    <w:abstractNumId w:val="21"/>
   </w:num>
   <w:numIdMacAtCleanup w:val="3"/>
 </w:numbering>

</xml_diff>